<commit_message>
MRD-3132 Update FTR56 Q4 filling
</commit_message>
<xml_diff>
--- a/src/main/resources/templates/partA/2026-03-31 - FTR56/Part A Template.docx
+++ b/src/main/resources/templates/partA/2026-03-31 - FTR56/Part A Template.docx
@@ -344,67 +344,35 @@
           <w:rFonts w:ascii="Arial" w:hAnsi="Arial" w:cs="Arial"/>
           <w:b/>
         </w:rPr>
-        <w:t xml:space="preserve">an </w:t>
-      </w:r>
-      <w:proofErr w:type="gramStart"/>
-      <w:r>
-        <w:rPr>
-          <w:rFonts w:ascii="Arial" w:hAnsi="Arial" w:cs="Arial"/>
-          <w:b/>
-        </w:rPr>
-        <w:t>Emergency</w:t>
-      </w:r>
-      <w:proofErr w:type="gramEnd"/>
-      <w:r>
-        <w:rPr>
-          <w:rFonts w:ascii="Arial" w:hAnsi="Arial" w:cs="Arial"/>
-          <w:b/>
+        <w:t xml:space="preserve">an Emergency </w:t>
+      </w:r>
+      <w:r>
+        <w:rPr>
+          <w:rFonts w:ascii="Arial" w:hAnsi="Arial" w:cs="Arial"/>
+          <w:b/>
+          <w:bCs/>
+        </w:rPr>
+        <w:t>recall</w:t>
+      </w:r>
+      <w:r>
+        <w:rPr>
+          <w:rFonts w:ascii="Arial" w:hAnsi="Arial" w:cs="Arial"/>
+          <w:b/>
+        </w:rPr>
+        <w:t>?</w:t>
+      </w:r>
+      <w:r>
+        <w:rPr>
+          <w:rFonts w:ascii="Arial" w:hAnsi="Arial" w:cs="Arial"/>
         </w:rPr>
         <w:t xml:space="preserve"> </w:t>
       </w:r>
       <w:r>
         <w:rPr>
           <w:rFonts w:ascii="Arial" w:hAnsi="Arial" w:cs="Arial"/>
-          <w:b/>
-          <w:bCs/>
-        </w:rPr>
-        <w:t>recall</w:t>
-      </w:r>
-      <w:r>
-        <w:rPr>
-          <w:rFonts w:ascii="Arial" w:hAnsi="Arial" w:cs="Arial"/>
-          <w:b/>
-        </w:rPr>
-        <w:t>?</w:t>
-      </w:r>
-      <w:r>
-        <w:rPr>
-          <w:rFonts w:ascii="Arial" w:hAnsi="Arial" w:cs="Arial"/>
-        </w:rPr>
-        <w:t xml:space="preserve"> </w:t>
-      </w:r>
-      <w:r>
-        <w:rPr>
-          <w:rFonts w:ascii="Arial" w:hAnsi="Arial" w:cs="Arial"/>
-          <w:bCs/>
-        </w:rPr>
-        <w:t>{{</w:t>
-      </w:r>
-      <w:proofErr w:type="spellStart"/>
-      <w:r>
-        <w:rPr>
-          <w:rFonts w:ascii="Arial" w:hAnsi="Arial" w:cs="Arial"/>
-          <w:bCs/>
-        </w:rPr>
-        <w:t>is_this_an_emergency_recall</w:t>
-      </w:r>
-      <w:proofErr w:type="spellEnd"/>
-      <w:r>
-        <w:rPr>
-          <w:rFonts w:ascii="Arial" w:hAnsi="Arial" w:cs="Arial"/>
-          <w:bCs/>
-        </w:rPr>
-        <w:t>}}</w:t>
+          <w:bCs/>
+        </w:rPr>
+        <w:t>{{is_this_an_emergency_recall}}</w:t>
       </w:r>
     </w:p>
     <w:p>
@@ -450,23 +418,7 @@
           <w:rFonts w:ascii="Arial" w:hAnsi="Arial" w:cs="Arial"/>
           <w:bCs/>
         </w:rPr>
-        <w:t>{{</w:t>
-      </w:r>
-      <w:proofErr w:type="spellStart"/>
-      <w:r>
-        <w:rPr>
-          <w:rFonts w:ascii="Arial" w:hAnsi="Arial" w:cs="Arial"/>
-          <w:bCs/>
-        </w:rPr>
-        <w:t>indeterminate_sentence_type</w:t>
-      </w:r>
-      <w:proofErr w:type="spellEnd"/>
-      <w:r>
-        <w:rPr>
-          <w:rFonts w:ascii="Arial" w:hAnsi="Arial" w:cs="Arial"/>
-          <w:bCs/>
-        </w:rPr>
-        <w:t xml:space="preserve">}} </w:t>
+        <w:t xml:space="preserve">{{indeterminate_sentence_type}} </w:t>
       </w:r>
       <w:r>
         <w:rPr>
@@ -540,23 +492,7 @@
           <w:rFonts w:ascii="Arial" w:hAnsi="Arial" w:cs="Arial"/>
           <w:bCs/>
         </w:rPr>
-        <w:t>{{</w:t>
-      </w:r>
-      <w:proofErr w:type="spellStart"/>
-      <w:r>
-        <w:rPr>
-          <w:rFonts w:ascii="Arial" w:hAnsi="Arial" w:cs="Arial"/>
-          <w:bCs/>
-        </w:rPr>
-        <w:t>is_extended_sentence</w:t>
-      </w:r>
-      <w:proofErr w:type="spellEnd"/>
-      <w:r>
-        <w:rPr>
-          <w:rFonts w:ascii="Arial" w:hAnsi="Arial" w:cs="Arial"/>
-          <w:bCs/>
-        </w:rPr>
-        <w:t>}}</w:t>
+        <w:t>{{is_extended_sentence}}</w:t>
       </w:r>
       <w:r>
         <w:rPr>
@@ -709,7 +645,28 @@
           <w:rFonts w:ascii="Arial" w:hAnsi="Arial" w:cs="Arial"/>
           <w:bCs/>
         </w:rPr>
-        <w:t xml:space="preserve"> Yes</w:t>
+        <w:t xml:space="preserve"> </w:t>
+      </w:r>
+      <w:r>
+        <w:rPr>
+          <w:rFonts w:ascii="Arial" w:hAnsi="Arial" w:cs="Arial"/>
+          <w:bCs/>
+        </w:rPr>
+        <w:t>{{</w:t>
+      </w:r>
+      <w:r>
+        <w:rPr>
+          <w:rFonts w:ascii="Arial" w:hAnsi="Arial" w:cs="Arial"/>
+          <w:bCs/>
+        </w:rPr>
+        <w:t>is_serving_youth_sentence</w:t>
+      </w:r>
+      <w:r>
+        <w:rPr>
+          <w:rFonts w:ascii="Arial" w:hAnsi="Arial" w:cs="Arial"/>
+          <w:bCs/>
+        </w:rPr>
+        <w:t>}}</w:t>
       </w:r>
     </w:p>
     <w:p>
@@ -824,23 +781,7 @@
           <w:rFonts w:ascii="Arial" w:hAnsi="Arial" w:cs="Arial"/>
           <w:bCs/>
         </w:rPr>
-        <w:t>{{</w:t>
-      </w:r>
-      <w:proofErr w:type="spellStart"/>
-      <w:r>
-        <w:rPr>
-          <w:rFonts w:ascii="Arial" w:hAnsi="Arial" w:cs="Arial"/>
-          <w:bCs/>
-        </w:rPr>
-        <w:t>is_serving_youth_sentence</w:t>
-      </w:r>
-      <w:proofErr w:type="spellEnd"/>
-      <w:r>
-        <w:rPr>
-          <w:rFonts w:ascii="Arial" w:hAnsi="Arial" w:cs="Arial"/>
-          <w:bCs/>
-        </w:rPr>
-        <w:t>}}</w:t>
+        <w:t>{{is_serving_youth_sentence}}</w:t>
       </w:r>
       <w:r>
         <w:rPr>
@@ -1285,15 +1226,7 @@
           <w:rFonts w:ascii="Arial" w:hAnsi="Arial" w:cs="Arial"/>
           <w:bCs/>
         </w:rPr>
-        <w:t>{{</w:t>
-      </w:r>
-      <w:proofErr w:type="spellStart"/>
-      <w:r>
-        <w:rPr>
-          <w:rFonts w:ascii="Arial" w:hAnsi="Arial" w:cs="Arial"/>
-          <w:bCs/>
-        </w:rPr>
-        <w:t>is_</w:t>
+        <w:t>{{is_</w:t>
       </w:r>
       <w:r>
         <w:rPr>
@@ -1321,15 +1254,7 @@
           <w:rFonts w:ascii="Arial" w:hAnsi="Arial" w:cs="Arial"/>
           <w:bCs/>
         </w:rPr>
-        <w:t>_serious_offence</w:t>
-      </w:r>
-      <w:proofErr w:type="spellEnd"/>
-      <w:r>
-        <w:rPr>
-          <w:rFonts w:ascii="Arial" w:hAnsi="Arial" w:cs="Arial"/>
-          <w:bCs/>
-        </w:rPr>
-        <w:t>}}</w:t>
+        <w:t>_serious_offence}}</w:t>
       </w:r>
     </w:p>
     <w:p>
@@ -1490,15 +1415,7 @@
           <w:rFonts w:ascii="Arial" w:hAnsi="Arial" w:cs="Arial"/>
           <w:bCs/>
         </w:rPr>
-        <w:t>{{</w:t>
-      </w:r>
-      <w:proofErr w:type="spellStart"/>
-      <w:r>
-        <w:rPr>
-          <w:rFonts w:ascii="Arial" w:hAnsi="Arial" w:cs="Arial"/>
-          <w:bCs/>
-        </w:rPr>
-        <w:t>is_</w:t>
+        <w:t>{{is_</w:t>
       </w:r>
       <w:r>
         <w:rPr>
@@ -1512,15 +1429,7 @@
           <w:rFonts w:ascii="Arial" w:hAnsi="Arial" w:cs="Arial"/>
           <w:bCs/>
         </w:rPr>
-        <w:t>_offence</w:t>
-      </w:r>
-      <w:proofErr w:type="spellEnd"/>
-      <w:r>
-        <w:rPr>
-          <w:rFonts w:ascii="Arial" w:hAnsi="Arial" w:cs="Arial"/>
-          <w:bCs/>
-        </w:rPr>
-        <w:t>}}</w:t>
+        <w:t>_offence}}</w:t>
       </w:r>
     </w:p>
     <w:p>
@@ -1563,7 +1472,6 @@
         </w:rPr>
         <w:t>{{</w:t>
       </w:r>
-      <w:proofErr w:type="spellStart"/>
       <w:r>
         <w:rPr>
           <w:rFonts w:ascii="Arial" w:hAnsi="Arial" w:cs="Arial"/>
@@ -1590,15 +1498,7 @@
           <w:rFonts w:ascii="Arial" w:hAnsi="Arial" w:cs="Arial"/>
           <w:bCs/>
         </w:rPr>
-        <w:t>SOPC_Sentence</w:t>
-      </w:r>
-      <w:proofErr w:type="spellEnd"/>
-      <w:r>
-        <w:rPr>
-          <w:rFonts w:ascii="Arial" w:hAnsi="Arial" w:cs="Arial"/>
-          <w:bCs/>
-        </w:rPr>
-        <w:t>}}</w:t>
+        <w:t>SOPC_Sentence}}</w:t>
       </w:r>
     </w:p>
     <w:p>
@@ -1629,7 +1529,6 @@
         </w:rPr>
         <w:t>{{</w:t>
       </w:r>
-      <w:proofErr w:type="spellStart"/>
       <w:r>
         <w:rPr>
           <w:rFonts w:ascii="Arial" w:hAnsi="Arial" w:cs="Arial"/>
@@ -1656,15 +1555,7 @@
           <w:rFonts w:ascii="Arial" w:hAnsi="Arial" w:cs="Arial"/>
           <w:bCs/>
         </w:rPr>
-        <w:t>erving_DCR_sentence</w:t>
-      </w:r>
-      <w:proofErr w:type="spellEnd"/>
-      <w:r>
-        <w:rPr>
-          <w:rFonts w:ascii="Arial" w:hAnsi="Arial" w:cs="Arial"/>
-          <w:bCs/>
-        </w:rPr>
-        <w:t>}}</w:t>
+        <w:t>erving_DCR_sentence}}</w:t>
       </w:r>
     </w:p>
     <w:p>
@@ -1784,7 +1675,6 @@
         </w:rPr>
         <w:t>{{</w:t>
       </w:r>
-      <w:proofErr w:type="spellStart"/>
       <w:r>
         <w:rPr>
           <w:rFonts w:ascii="Arial" w:hAnsi="Arial" w:cs="Arial"/>
@@ -1797,15 +1687,7 @@
           <w:rFonts w:ascii="Arial" w:hAnsi="Arial" w:cs="Arial"/>
           <w:bCs/>
         </w:rPr>
-        <w:t>s_repatriated_for_murder</w:t>
-      </w:r>
-      <w:proofErr w:type="spellEnd"/>
-      <w:r>
-        <w:rPr>
-          <w:rFonts w:ascii="Arial" w:hAnsi="Arial" w:cs="Arial"/>
-          <w:bCs/>
-        </w:rPr>
-        <w:t>}}</w:t>
+        <w:t>s_repatriated_for_murder}}</w:t>
       </w:r>
     </w:p>
     <w:p>
@@ -1881,7 +1763,6 @@
         </w:rPr>
         <w:t>{{</w:t>
       </w:r>
-      <w:proofErr w:type="spellStart"/>
       <w:r>
         <w:rPr>
           <w:rFonts w:ascii="Arial" w:hAnsi="Arial" w:cs="Arial"/>
@@ -1908,15 +1789,7 @@
           <w:rFonts w:ascii="Arial" w:hAnsi="Arial" w:cs="Arial"/>
           <w:bCs/>
         </w:rPr>
-        <w:t>involved_in_foreign_power_threat</w:t>
-      </w:r>
-      <w:proofErr w:type="spellEnd"/>
-      <w:r>
-        <w:rPr>
-          <w:rFonts w:ascii="Arial" w:hAnsi="Arial" w:cs="Arial"/>
-          <w:bCs/>
-        </w:rPr>
-        <w:t>}}</w:t>
+        <w:t>involved_in_foreign_power_threat}}</w:t>
       </w:r>
     </w:p>
     <w:p>
@@ -1948,7 +1821,6 @@
         </w:rPr>
         <w:t>{{</w:t>
       </w:r>
-      <w:proofErr w:type="spellStart"/>
       <w:r>
         <w:rPr>
           <w:rFonts w:ascii="Arial" w:hAnsi="Arial" w:cs="Arial"/>
@@ -1963,7 +1835,6 @@
         </w:rPr>
         <w:t>security_offence</w:t>
       </w:r>
-      <w:proofErr w:type="spellEnd"/>
       <w:r>
         <w:rPr>
           <w:rFonts w:ascii="Arial" w:hAnsi="Arial" w:cs="Arial"/>
@@ -2101,23 +1972,7 @@
           <w:rFonts w:ascii="Arial" w:hAnsi="Arial" w:cs="Arial"/>
           <w:bCs/>
         </w:rPr>
-        <w:t>{{</w:t>
-      </w:r>
-      <w:proofErr w:type="spellStart"/>
-      <w:r>
-        <w:rPr>
-          <w:rFonts w:ascii="Arial" w:hAnsi="Arial" w:cs="Arial"/>
-          <w:bCs/>
-        </w:rPr>
-        <w:t>date_of_birth</w:t>
-      </w:r>
-      <w:proofErr w:type="spellEnd"/>
-      <w:r>
-        <w:rPr>
-          <w:rFonts w:ascii="Arial" w:hAnsi="Arial" w:cs="Arial"/>
-          <w:bCs/>
-        </w:rPr>
-        <w:t>}}</w:t>
+        <w:t>{{date_of_birth}}</w:t>
       </w:r>
     </w:p>
     <w:p>
@@ -2187,23 +2042,7 @@
           <w:rFonts w:ascii="Arial" w:hAnsi="Arial" w:cs="Arial"/>
           <w:bCs/>
         </w:rPr>
-        <w:t>{{</w:t>
-      </w:r>
-      <w:proofErr w:type="spellStart"/>
-      <w:r>
-        <w:rPr>
-          <w:rFonts w:ascii="Arial" w:hAnsi="Arial" w:cs="Arial"/>
-          <w:bCs/>
-        </w:rPr>
-        <w:t>primary_language</w:t>
-      </w:r>
-      <w:proofErr w:type="spellEnd"/>
-      <w:r>
-        <w:rPr>
-          <w:rFonts w:ascii="Arial" w:hAnsi="Arial" w:cs="Arial"/>
-          <w:bCs/>
-        </w:rPr>
-        <w:t>}}</w:t>
+        <w:t>{{primary_language}}</w:t>
       </w:r>
       <w:r>
         <w:rPr>
@@ -2217,23 +2056,7 @@
           <w:rFonts w:ascii="Arial" w:hAnsi="Arial" w:cs="Arial"/>
           <w:bCs/>
         </w:rPr>
-        <w:t>{{</w:t>
-      </w:r>
-      <w:proofErr w:type="spellStart"/>
-      <w:r>
-        <w:rPr>
-          <w:rFonts w:ascii="Arial" w:hAnsi="Arial" w:cs="Arial"/>
-          <w:bCs/>
-        </w:rPr>
-        <w:t>primary_language</w:t>
-      </w:r>
-      <w:proofErr w:type="spellEnd"/>
-      <w:r>
-        <w:rPr>
-          <w:rFonts w:ascii="Arial" w:hAnsi="Arial" w:cs="Arial"/>
-          <w:bCs/>
-        </w:rPr>
-        <w:t>}}</w:t>
+        <w:t>{{primary_language}}</w:t>
       </w:r>
     </w:p>
     <w:p>
@@ -2331,23 +2154,7 @@
           <w:rFonts w:ascii="Arial" w:hAnsi="Arial" w:cs="Arial"/>
           <w:bCs/>
         </w:rPr>
-        <w:t>{{</w:t>
-      </w:r>
-      <w:proofErr w:type="spellStart"/>
-      <w:r>
-        <w:rPr>
-          <w:rFonts w:ascii="Arial" w:hAnsi="Arial" w:cs="Arial"/>
-          <w:bCs/>
-        </w:rPr>
-        <w:t>crn</w:t>
-      </w:r>
-      <w:proofErr w:type="spellEnd"/>
-      <w:r>
-        <w:rPr>
-          <w:rFonts w:ascii="Arial" w:hAnsi="Arial" w:cs="Arial"/>
-          <w:bCs/>
-        </w:rPr>
-        <w:t>}}</w:t>
+        <w:t>{{crn}}</w:t>
       </w:r>
     </w:p>
     <w:p>
@@ -2387,23 +2194,7 @@
           <w:rFonts w:ascii="Arial" w:hAnsi="Arial" w:cs="Arial"/>
           <w:bCs/>
         </w:rPr>
-        <w:t>{{</w:t>
-      </w:r>
-      <w:proofErr w:type="spellStart"/>
-      <w:r>
-        <w:rPr>
-          <w:rFonts w:ascii="Arial" w:hAnsi="Arial" w:cs="Arial"/>
-          <w:bCs/>
-        </w:rPr>
-        <w:t>cro_number</w:t>
-      </w:r>
-      <w:proofErr w:type="spellEnd"/>
-      <w:r>
-        <w:rPr>
-          <w:rFonts w:ascii="Arial" w:hAnsi="Arial" w:cs="Arial"/>
-          <w:bCs/>
-        </w:rPr>
-        <w:t>}}</w:t>
+        <w:t>{{cro_number}}</w:t>
       </w:r>
     </w:p>
     <w:p>
@@ -2436,23 +2227,7 @@
           <w:rFonts w:ascii="Arial" w:hAnsi="Arial" w:cs="Arial"/>
           <w:bCs/>
         </w:rPr>
-        <w:t>{{</w:t>
-      </w:r>
-      <w:proofErr w:type="spellStart"/>
-      <w:r>
-        <w:rPr>
-          <w:rFonts w:ascii="Arial" w:hAnsi="Arial" w:cs="Arial"/>
-          <w:bCs/>
-        </w:rPr>
-        <w:t>pnc_number</w:t>
-      </w:r>
-      <w:proofErr w:type="spellEnd"/>
-      <w:r>
-        <w:rPr>
-          <w:rFonts w:ascii="Arial" w:hAnsi="Arial" w:cs="Arial"/>
-          <w:bCs/>
-        </w:rPr>
-        <w:t>}}</w:t>
+        <w:t>{{pnc_number}}</w:t>
       </w:r>
     </w:p>
     <w:p>
@@ -2484,23 +2259,7 @@
           <w:rFonts w:ascii="Arial" w:hAnsi="Arial" w:cs="Arial"/>
           <w:bCs/>
         </w:rPr>
-        <w:t>{{</w:t>
-      </w:r>
-      <w:proofErr w:type="spellStart"/>
-      <w:r>
-        <w:rPr>
-          <w:rFonts w:ascii="Arial" w:hAnsi="Arial" w:cs="Arial"/>
-          <w:bCs/>
-        </w:rPr>
-        <w:t>most_recent_prisoner_number</w:t>
-      </w:r>
-      <w:proofErr w:type="spellEnd"/>
-      <w:r>
-        <w:rPr>
-          <w:rFonts w:ascii="Arial" w:hAnsi="Arial" w:cs="Arial"/>
-          <w:bCs/>
-        </w:rPr>
-        <w:t>}}</w:t>
+        <w:t>{{most_recent_prisoner_number}}</w:t>
       </w:r>
     </w:p>
     <w:p>
@@ -2540,23 +2299,7 @@
           <w:rFonts w:ascii="Arial" w:hAnsi="Arial" w:cs="Arial"/>
           <w:bCs/>
         </w:rPr>
-        <w:t>{{</w:t>
-      </w:r>
-      <w:proofErr w:type="spellStart"/>
-      <w:r>
-        <w:rPr>
-          <w:rFonts w:ascii="Arial" w:hAnsi="Arial" w:cs="Arial"/>
-          <w:bCs/>
-        </w:rPr>
-        <w:t>noms_number</w:t>
-      </w:r>
-      <w:proofErr w:type="spellEnd"/>
-      <w:r>
-        <w:rPr>
-          <w:rFonts w:ascii="Arial" w:hAnsi="Arial" w:cs="Arial"/>
-          <w:bCs/>
-        </w:rPr>
-        <w:t>}}</w:t>
+        <w:t>{{noms_number}}</w:t>
       </w:r>
     </w:p>
     <w:p>
@@ -2588,23 +2331,7 @@
           <w:rFonts w:ascii="Arial" w:hAnsi="Arial" w:cs="Arial"/>
           <w:bCs/>
         </w:rPr>
-        <w:t>{{</w:t>
-      </w:r>
-      <w:proofErr w:type="spellStart"/>
-      <w:r>
-        <w:rPr>
-          <w:rFonts w:ascii="Arial" w:hAnsi="Arial" w:cs="Arial"/>
-          <w:bCs/>
-        </w:rPr>
-        <w:t>last_releasing_prison</w:t>
-      </w:r>
-      <w:proofErr w:type="spellEnd"/>
-      <w:r>
-        <w:rPr>
-          <w:rFonts w:ascii="Arial" w:hAnsi="Arial" w:cs="Arial"/>
-          <w:bCs/>
-        </w:rPr>
-        <w:t>}}</w:t>
+        <w:t>{{last_releasing_prison}}</w:t>
       </w:r>
     </w:p>
     <w:p>
@@ -2665,23 +2392,7 @@
           <w:rFonts w:ascii="Arial" w:hAnsi="Arial" w:cs="Arial"/>
           <w:bCs/>
         </w:rPr>
-        <w:t>{{</w:t>
-      </w:r>
-      <w:proofErr w:type="spellStart"/>
-      <w:r>
-        <w:rPr>
-          <w:rFonts w:ascii="Arial" w:hAnsi="Arial" w:cs="Arial"/>
-          <w:bCs/>
-        </w:rPr>
-        <w:t>date_of_release</w:t>
-      </w:r>
-      <w:proofErr w:type="spellEnd"/>
-      <w:r>
-        <w:rPr>
-          <w:rFonts w:ascii="Arial" w:hAnsi="Arial" w:cs="Arial"/>
-          <w:bCs/>
-        </w:rPr>
-        <w:t>}}</w:t>
+        <w:t>{{date_of_release}}</w:t>
       </w:r>
     </w:p>
     <w:p>
@@ -2793,23 +2504,7 @@
           <w:rFonts w:ascii="Arial" w:hAnsi="Arial" w:cs="Arial"/>
           <w:bCs/>
         </w:rPr>
-        <w:t>{{</w:t>
-      </w:r>
-      <w:proofErr w:type="spellStart"/>
-      <w:r>
-        <w:rPr>
-          <w:rFonts w:ascii="Arial" w:hAnsi="Arial" w:cs="Arial"/>
-          <w:bCs/>
-        </w:rPr>
-        <w:t>index_offence_description</w:t>
-      </w:r>
-      <w:proofErr w:type="spellEnd"/>
-      <w:r>
-        <w:rPr>
-          <w:rFonts w:ascii="Arial" w:hAnsi="Arial" w:cs="Arial"/>
-          <w:bCs/>
-        </w:rPr>
-        <w:t>}}</w:t>
+        <w:t>{{index_offence_description}}</w:t>
       </w:r>
       <w:r>
         <w:rPr>
@@ -2907,23 +2602,7 @@
           <w:rFonts w:ascii="Arial" w:hAnsi="Arial" w:cs="Arial"/>
           <w:bCs/>
         </w:rPr>
-        <w:t>{{</w:t>
-      </w:r>
-      <w:proofErr w:type="spellStart"/>
-      <w:r>
-        <w:rPr>
-          <w:rFonts w:ascii="Arial" w:hAnsi="Arial" w:cs="Arial"/>
-          <w:bCs/>
-        </w:rPr>
-        <w:t>date_of_original_offence</w:t>
-      </w:r>
-      <w:proofErr w:type="spellEnd"/>
-      <w:r>
-        <w:rPr>
-          <w:rFonts w:ascii="Arial" w:hAnsi="Arial" w:cs="Arial"/>
-          <w:bCs/>
-        </w:rPr>
-        <w:t>}}</w:t>
+        <w:t>{{date_of_original_offence}}</w:t>
       </w:r>
     </w:p>
     <w:p>
@@ -2964,23 +2643,7 @@
           <w:rFonts w:ascii="Arial" w:hAnsi="Arial" w:cs="Arial"/>
           <w:bCs/>
         </w:rPr>
-        <w:t>{{</w:t>
-      </w:r>
-      <w:proofErr w:type="spellStart"/>
-      <w:r>
-        <w:rPr>
-          <w:rFonts w:ascii="Arial" w:hAnsi="Arial" w:cs="Arial"/>
-          <w:bCs/>
-        </w:rPr>
-        <w:t>date_of_sentence</w:t>
-      </w:r>
-      <w:proofErr w:type="spellEnd"/>
-      <w:r>
-        <w:rPr>
-          <w:rFonts w:ascii="Arial" w:hAnsi="Arial" w:cs="Arial"/>
-          <w:bCs/>
-        </w:rPr>
-        <w:t>}}</w:t>
+        <w:t>{{date_of_sentence}}</w:t>
       </w:r>
     </w:p>
     <w:p>
@@ -3021,23 +2684,7 @@
           <w:rFonts w:ascii="Arial" w:hAnsi="Arial" w:cs="Arial"/>
           <w:bCs/>
         </w:rPr>
-        <w:t>{{</w:t>
-      </w:r>
-      <w:proofErr w:type="spellStart"/>
-      <w:r>
-        <w:rPr>
-          <w:rFonts w:ascii="Arial" w:hAnsi="Arial" w:cs="Arial"/>
-          <w:bCs/>
-        </w:rPr>
-        <w:t>length_of_sentence</w:t>
-      </w:r>
-      <w:proofErr w:type="spellEnd"/>
-      <w:r>
-        <w:rPr>
-          <w:rFonts w:ascii="Arial" w:hAnsi="Arial" w:cs="Arial"/>
-          <w:bCs/>
-        </w:rPr>
-        <w:t>}}</w:t>
+        <w:t>{{length_of_sentence}}</w:t>
       </w:r>
     </w:p>
     <w:p>
@@ -3079,23 +2726,7 @@
           <w:rFonts w:ascii="Arial" w:hAnsi="Arial" w:cs="Arial"/>
           <w:bCs/>
         </w:rPr>
-        <w:t>{{</w:t>
-      </w:r>
-      <w:proofErr w:type="spellStart"/>
-      <w:r>
-        <w:rPr>
-          <w:rFonts w:ascii="Arial" w:hAnsi="Arial" w:cs="Arial"/>
-          <w:bCs/>
-        </w:rPr>
-        <w:t>licence_expiry_date</w:t>
-      </w:r>
-      <w:proofErr w:type="spellEnd"/>
-      <w:r>
-        <w:rPr>
-          <w:rFonts w:ascii="Arial" w:hAnsi="Arial" w:cs="Arial"/>
-          <w:bCs/>
-        </w:rPr>
-        <w:t>}}</w:t>
+        <w:t>{{licence_expiry_date}}</w:t>
       </w:r>
     </w:p>
     <w:p>
@@ -3137,23 +2768,7 @@
           <w:rFonts w:ascii="Arial" w:hAnsi="Arial" w:cs="Arial"/>
           <w:bCs/>
         </w:rPr>
-        <w:t>{{</w:t>
-      </w:r>
-      <w:proofErr w:type="spellStart"/>
-      <w:r>
-        <w:rPr>
-          <w:rFonts w:ascii="Arial" w:hAnsi="Arial" w:cs="Arial"/>
-          <w:bCs/>
-        </w:rPr>
-        <w:t>sentence_expiry_date</w:t>
-      </w:r>
-      <w:proofErr w:type="spellEnd"/>
-      <w:r>
-        <w:rPr>
-          <w:rFonts w:ascii="Arial" w:hAnsi="Arial" w:cs="Arial"/>
-          <w:bCs/>
-        </w:rPr>
-        <w:t>}}</w:t>
+        <w:t>{{sentence_expiry_date}}</w:t>
       </w:r>
     </w:p>
     <w:p>
@@ -3226,23 +2841,7 @@
           <w:rFonts w:ascii="Arial" w:hAnsi="Arial" w:cs="Arial"/>
           <w:bCs/>
         </w:rPr>
-        <w:t>{{</w:t>
-      </w:r>
-      <w:proofErr w:type="spellStart"/>
-      <w:r>
-        <w:rPr>
-          <w:rFonts w:ascii="Arial" w:hAnsi="Arial" w:cs="Arial"/>
-          <w:bCs/>
-        </w:rPr>
-        <w:t>custodial_term</w:t>
-      </w:r>
-      <w:proofErr w:type="spellEnd"/>
-      <w:r>
-        <w:rPr>
-          <w:rFonts w:ascii="Arial" w:hAnsi="Arial" w:cs="Arial"/>
-          <w:bCs/>
-        </w:rPr>
-        <w:t>}}</w:t>
+        <w:t>{{custodial_term}}</w:t>
       </w:r>
     </w:p>
     <w:p>
@@ -3295,23 +2894,7 @@
           <w:rFonts w:ascii="Arial" w:hAnsi="Arial" w:cs="Arial"/>
           <w:bCs/>
         </w:rPr>
-        <w:t>{{</w:t>
-      </w:r>
-      <w:proofErr w:type="spellStart"/>
-      <w:r>
-        <w:rPr>
-          <w:rFonts w:ascii="Arial" w:hAnsi="Arial" w:cs="Arial"/>
-          <w:bCs/>
-        </w:rPr>
-        <w:t>extended_term</w:t>
-      </w:r>
-      <w:proofErr w:type="spellEnd"/>
-      <w:r>
-        <w:rPr>
-          <w:rFonts w:ascii="Arial" w:hAnsi="Arial" w:cs="Arial"/>
-          <w:bCs/>
-        </w:rPr>
-        <w:t>}}</w:t>
+        <w:t>{{extended_term}}</w:t>
       </w:r>
     </w:p>
     <w:p>
@@ -3359,23 +2942,7 @@
           <w:rFonts w:ascii="Arial" w:hAnsi="Arial" w:cs="Arial"/>
           <w:bCs/>
         </w:rPr>
-        <w:t xml:space="preserve">(Any information presented here should be disclosable to the </w:t>
-      </w:r>
-      <w:proofErr w:type="gramStart"/>
-      <w:r>
-        <w:rPr>
-          <w:rFonts w:ascii="Arial" w:hAnsi="Arial" w:cs="Arial"/>
-          <w:bCs/>
-        </w:rPr>
-        <w:t xml:space="preserve">prisoner)   </w:t>
-      </w:r>
-      <w:proofErr w:type="gramEnd"/>
-      <w:r>
-        <w:rPr>
-          <w:rFonts w:ascii="Arial" w:hAnsi="Arial" w:cs="Arial"/>
-          <w:bCs/>
-        </w:rPr>
-        <w:t xml:space="preserve">   </w:t>
+        <w:t xml:space="preserve">(Any information presented here should be disclosable to the prisoner)      </w:t>
       </w:r>
       <w:r>
         <w:rPr>
@@ -3389,39 +2956,14 @@
           <w:rFonts w:ascii="Arial" w:hAnsi="Arial" w:cs="Arial"/>
           <w:bCs/>
         </w:rPr>
-        <w:t>{{</w:t>
-      </w:r>
-      <w:proofErr w:type="spellStart"/>
-      <w:r>
-        <w:rPr>
-          <w:rFonts w:ascii="Arial" w:hAnsi="Arial" w:cs="Arial"/>
-          <w:bCs/>
-        </w:rPr>
-        <w:t>has_victims_in_contact_scheme</w:t>
-      </w:r>
-      <w:proofErr w:type="spellEnd"/>
-      <w:proofErr w:type="gramStart"/>
-      <w:r>
-        <w:rPr>
-          <w:rFonts w:ascii="Arial" w:hAnsi="Arial" w:cs="Arial"/>
-          <w:bCs/>
-        </w:rPr>
-        <w:t>}}</w:t>
-      </w:r>
-      <w:r>
-        <w:rPr>
-          <w:rFonts w:ascii="Arial" w:hAnsi="Arial" w:cs="Arial"/>
-          <w:b/>
-        </w:rPr>
-        <w:t>Date</w:t>
-      </w:r>
-      <w:proofErr w:type="gramEnd"/>
-      <w:r>
-        <w:rPr>
-          <w:rFonts w:ascii="Arial" w:hAnsi="Arial" w:cs="Arial"/>
-          <w:b/>
-        </w:rPr>
-        <w:t xml:space="preserve"> contact was </w:t>
+        <w:t>{{has_victims_in_contact_scheme}}</w:t>
+      </w:r>
+      <w:r>
+        <w:rPr>
+          <w:rFonts w:ascii="Arial" w:hAnsi="Arial" w:cs="Arial"/>
+          <w:b/>
+        </w:rPr>
+        <w:t xml:space="preserve">Date contact was </w:t>
       </w:r>
       <w:r>
         <w:rPr>
@@ -3443,23 +2985,7 @@
           <w:rFonts w:ascii="Arial" w:hAnsi="Arial" w:cs="Arial"/>
           <w:bCs/>
         </w:rPr>
-        <w:t>{{</w:t>
-      </w:r>
-      <w:proofErr w:type="spellStart"/>
-      <w:r>
-        <w:rPr>
-          <w:rFonts w:ascii="Arial" w:hAnsi="Arial" w:cs="Arial"/>
-          <w:bCs/>
-        </w:rPr>
-        <w:t>date_vlo_informed</w:t>
-      </w:r>
-      <w:proofErr w:type="spellEnd"/>
-      <w:r>
-        <w:rPr>
-          <w:rFonts w:ascii="Arial" w:hAnsi="Arial" w:cs="Arial"/>
-          <w:bCs/>
-        </w:rPr>
-        <w:t>}}</w:t>
+        <w:t>{{date_vlo_informed}}</w:t>
       </w:r>
       <w:r>
         <w:rPr>
@@ -3552,23 +3078,7 @@
           <w:rFonts w:ascii="Arial" w:hAnsi="Arial" w:cs="Arial"/>
           <w:bCs/>
         </w:rPr>
-        <w:t>{{</w:t>
-      </w:r>
-      <w:proofErr w:type="spellStart"/>
-      <w:r>
-        <w:rPr>
-          <w:rFonts w:ascii="Arial" w:hAnsi="Arial" w:cs="Arial"/>
-          <w:bCs/>
-        </w:rPr>
-        <w:t>custody_status</w:t>
-      </w:r>
-      <w:proofErr w:type="spellEnd"/>
-      <w:r>
-        <w:rPr>
-          <w:rFonts w:ascii="Arial" w:hAnsi="Arial" w:cs="Arial"/>
-          <w:bCs/>
-        </w:rPr>
-        <w:t>}}</w:t>
+        <w:t>{{custody_status}}</w:t>
       </w:r>
     </w:p>
     <w:p>
@@ -3601,23 +3111,7 @@
           <w:rFonts w:ascii="Arial" w:hAnsi="Arial" w:cs="Arial"/>
           <w:bCs/>
         </w:rPr>
-        <w:t>{{</w:t>
-      </w:r>
-      <w:proofErr w:type="spellStart"/>
-      <w:r>
-        <w:rPr>
-          <w:rFonts w:ascii="Arial" w:hAnsi="Arial" w:cs="Arial"/>
-          <w:bCs/>
-        </w:rPr>
-        <w:t>has_arrest_issues</w:t>
-      </w:r>
-      <w:proofErr w:type="spellEnd"/>
-      <w:r>
-        <w:rPr>
-          <w:rFonts w:ascii="Arial" w:hAnsi="Arial" w:cs="Arial"/>
-          <w:bCs/>
-        </w:rPr>
-        <w:t>}}</w:t>
+        <w:t>{{has_arrest_issues}}</w:t>
       </w:r>
     </w:p>
     <w:p>
@@ -3657,23 +3151,7 @@
           <w:rFonts w:ascii="Arial" w:hAnsi="Arial" w:cs="Arial"/>
           <w:bCs/>
         </w:rPr>
-        <w:t>{{</w:t>
-      </w:r>
-      <w:proofErr w:type="spellStart"/>
-      <w:r>
-        <w:rPr>
-          <w:rFonts w:ascii="Arial" w:hAnsi="Arial" w:cs="Arial"/>
-          <w:bCs/>
-        </w:rPr>
-        <w:t>has_arrest_issues_details</w:t>
-      </w:r>
-      <w:proofErr w:type="spellEnd"/>
-      <w:r>
-        <w:rPr>
-          <w:rFonts w:ascii="Arial" w:hAnsi="Arial" w:cs="Arial"/>
-          <w:bCs/>
-        </w:rPr>
-        <w:t>}}</w:t>
+        <w:t>{{has_arrest_issues_details}}</w:t>
       </w:r>
     </w:p>
     <w:p>
@@ -3712,23 +3190,7 @@
           <w:rFonts w:ascii="Arial" w:hAnsi="Arial" w:cs="Arial"/>
           <w:bCs/>
         </w:rPr>
-        <w:t>{{</w:t>
-      </w:r>
-      <w:proofErr w:type="spellStart"/>
-      <w:r>
-        <w:rPr>
-          <w:rFonts w:ascii="Arial" w:hAnsi="Arial" w:cs="Arial"/>
-          <w:bCs/>
-        </w:rPr>
-        <w:t>contact_name</w:t>
-      </w:r>
-      <w:proofErr w:type="spellEnd"/>
-      <w:r>
-        <w:rPr>
-          <w:rFonts w:ascii="Arial" w:hAnsi="Arial" w:cs="Arial"/>
-          <w:bCs/>
-        </w:rPr>
-        <w:t>}}</w:t>
+        <w:t>{{contact_name}}</w:t>
       </w:r>
     </w:p>
     <w:p>
@@ -3767,23 +3229,7 @@
           <w:rFonts w:ascii="Arial" w:hAnsi="Arial" w:cs="Arial"/>
           <w:bCs/>
         </w:rPr>
-        <w:t>{{</w:t>
-      </w:r>
-      <w:proofErr w:type="spellStart"/>
-      <w:r>
-        <w:rPr>
-          <w:rFonts w:ascii="Arial" w:hAnsi="Arial" w:cs="Arial"/>
-          <w:bCs/>
-        </w:rPr>
-        <w:t>email_address</w:t>
-      </w:r>
-      <w:proofErr w:type="spellEnd"/>
-      <w:r>
-        <w:rPr>
-          <w:rFonts w:ascii="Arial" w:hAnsi="Arial" w:cs="Arial"/>
-          <w:bCs/>
-        </w:rPr>
-        <w:t>}}</w:t>
+        <w:t>{{email_address}}</w:t>
       </w:r>
     </w:p>
     <w:p>
@@ -3848,23 +3294,7 @@
           <w:rFonts w:ascii="Arial" w:hAnsi="Arial" w:cs="Arial"/>
           <w:bCs/>
         </w:rPr>
-        <w:t>{{</w:t>
-      </w:r>
-      <w:proofErr w:type="spellStart"/>
-      <w:r>
-        <w:rPr>
-          <w:rFonts w:ascii="Arial" w:hAnsi="Arial" w:cs="Arial"/>
-          <w:bCs/>
-        </w:rPr>
-        <w:t>last_recorded_address</w:t>
-      </w:r>
-      <w:proofErr w:type="spellEnd"/>
-      <w:r>
-        <w:rPr>
-          <w:rFonts w:ascii="Arial" w:hAnsi="Arial" w:cs="Arial"/>
-          <w:bCs/>
-        </w:rPr>
-        <w:t>}}</w:t>
+        <w:t>{{last_recorded_address}}</w:t>
       </w:r>
     </w:p>
     <w:p>
@@ -3896,23 +3326,7 @@
           <w:rFonts w:ascii="Arial" w:hAnsi="Arial" w:cs="Arial"/>
           <w:bCs/>
         </w:rPr>
-        <w:t>{{</w:t>
-      </w:r>
-      <w:proofErr w:type="spellStart"/>
-      <w:r>
-        <w:rPr>
-          <w:rFonts w:ascii="Arial" w:hAnsi="Arial" w:cs="Arial"/>
-          <w:bCs/>
-        </w:rPr>
-        <w:t>no_fixed_abode</w:t>
-      </w:r>
-      <w:proofErr w:type="spellEnd"/>
-      <w:r>
-        <w:rPr>
-          <w:rFonts w:ascii="Arial" w:hAnsi="Arial" w:cs="Arial"/>
-          <w:bCs/>
-        </w:rPr>
-        <w:t>}}</w:t>
+        <w:t>{{no_fixed_abode}}</w:t>
       </w:r>
     </w:p>
     <w:p>
@@ -3944,23 +3358,7 @@
           <w:rFonts w:ascii="Arial" w:hAnsi="Arial" w:cs="Arial"/>
           <w:bCs/>
         </w:rPr>
-        <w:t>{{</w:t>
-      </w:r>
-      <w:proofErr w:type="spellStart"/>
-      <w:r>
-        <w:rPr>
-          <w:rFonts w:ascii="Arial" w:hAnsi="Arial" w:cs="Arial"/>
-          <w:bCs/>
-        </w:rPr>
-        <w:t>other_possible_addresses</w:t>
-      </w:r>
-      <w:proofErr w:type="spellEnd"/>
-      <w:r>
-        <w:rPr>
-          <w:rFonts w:ascii="Arial" w:hAnsi="Arial" w:cs="Arial"/>
-          <w:bCs/>
-        </w:rPr>
-        <w:t>}}</w:t>
+        <w:t>{{other_possible_addresses}}</w:t>
       </w:r>
     </w:p>
     <w:p>
@@ -4068,23 +3466,7 @@
           <w:rFonts w:ascii="Arial" w:hAnsi="Arial" w:cs="Arial"/>
           <w:bCs/>
         </w:rPr>
-        <w:t>{{</w:t>
-      </w:r>
-      <w:proofErr w:type="spellStart"/>
-      <w:r>
-        <w:rPr>
-          <w:rFonts w:ascii="Arial" w:hAnsi="Arial" w:cs="Arial"/>
-          <w:bCs/>
-        </w:rPr>
-        <w:t>has_vulnerabilities</w:t>
-      </w:r>
-      <w:proofErr w:type="spellEnd"/>
-      <w:r>
-        <w:rPr>
-          <w:rFonts w:ascii="Arial" w:hAnsi="Arial" w:cs="Arial"/>
-          <w:bCs/>
-        </w:rPr>
-        <w:t>}}</w:t>
+        <w:t>{{has_vulnerabilities}}</w:t>
       </w:r>
     </w:p>
     <w:p>
@@ -4170,23 +3552,7 @@
           <w:rFonts w:ascii="Arial" w:hAnsi="Arial" w:cs="Arial"/>
           <w:bCs/>
         </w:rPr>
-        <w:t>{{</w:t>
-      </w:r>
-      <w:proofErr w:type="spellStart"/>
-      <w:r>
-        <w:rPr>
-          <w:rFonts w:ascii="Arial" w:hAnsi="Arial" w:cs="Arial"/>
-          <w:bCs/>
-        </w:rPr>
-        <w:t>has_contraband_risk</w:t>
-      </w:r>
-      <w:proofErr w:type="spellEnd"/>
-      <w:r>
-        <w:rPr>
-          <w:rFonts w:ascii="Arial" w:hAnsi="Arial" w:cs="Arial"/>
-          <w:bCs/>
-        </w:rPr>
-        <w:t>}}</w:t>
+        <w:t>{{has_contraband_risk}}</w:t>
       </w:r>
       <w:r>
         <w:rPr>
@@ -4224,23 +3590,7 @@
           <w:rFonts w:ascii="Arial" w:hAnsi="Arial" w:cs="Arial"/>
           <w:bCs/>
         </w:rPr>
-        <w:t>{{</w:t>
-      </w:r>
-      <w:proofErr w:type="spellStart"/>
-      <w:r>
-        <w:rPr>
-          <w:rFonts w:ascii="Arial" w:hAnsi="Arial" w:cs="Arial"/>
-          <w:bCs/>
-        </w:rPr>
-        <w:t>has_contraband_risk_details</w:t>
-      </w:r>
-      <w:proofErr w:type="spellEnd"/>
-      <w:r>
-        <w:rPr>
-          <w:rFonts w:ascii="Arial" w:hAnsi="Arial" w:cs="Arial"/>
-          <w:bCs/>
-        </w:rPr>
-        <w:t>}}</w:t>
+        <w:t>{{has_contraband_risk_details}}</w:t>
       </w:r>
     </w:p>
     <w:p>
@@ -4316,23 +3666,7 @@
           <w:rFonts w:ascii="Arial" w:hAnsi="Arial" w:cs="Arial"/>
           <w:bCs/>
         </w:rPr>
-        <w:t>{{</w:t>
-      </w:r>
-      <w:proofErr w:type="spellStart"/>
-      <w:r>
-        <w:rPr>
-          <w:rFonts w:ascii="Arial" w:hAnsi="Arial" w:cs="Arial"/>
-          <w:bCs/>
-        </w:rPr>
-        <w:t>mappa_category</w:t>
-      </w:r>
-      <w:proofErr w:type="spellEnd"/>
-      <w:r>
-        <w:rPr>
-          <w:rFonts w:ascii="Arial" w:hAnsi="Arial" w:cs="Arial"/>
-          <w:bCs/>
-        </w:rPr>
-        <w:t>}}</w:t>
+        <w:t>{{mappa_category}}</w:t>
       </w:r>
     </w:p>
     <w:p>
@@ -4363,23 +3697,7 @@
           <w:rFonts w:ascii="Arial" w:hAnsi="Arial" w:cs="Arial"/>
           <w:bCs/>
         </w:rPr>
-        <w:t>{{</w:t>
-      </w:r>
-      <w:proofErr w:type="spellStart"/>
-      <w:r>
-        <w:rPr>
-          <w:rFonts w:ascii="Arial" w:hAnsi="Arial" w:cs="Arial"/>
-          <w:bCs/>
-        </w:rPr>
-        <w:t>mappa_level</w:t>
-      </w:r>
-      <w:proofErr w:type="spellEnd"/>
-      <w:r>
-        <w:rPr>
-          <w:rFonts w:ascii="Arial" w:hAnsi="Arial" w:cs="Arial"/>
-          <w:bCs/>
-        </w:rPr>
-        <w:t>}}</w:t>
+        <w:t>{{mappa_level}}</w:t>
       </w:r>
     </w:p>
     <w:p>
@@ -4439,23 +3757,7 @@
           <w:rFonts w:ascii="Arial" w:hAnsi="Arial" w:cs="Arial"/>
           <w:bCs/>
         </w:rPr>
-        <w:t>{{</w:t>
-      </w:r>
-      <w:proofErr w:type="spellStart"/>
-      <w:r>
-        <w:rPr>
-          <w:rFonts w:ascii="Arial" w:hAnsi="Arial" w:cs="Arial"/>
-          <w:bCs/>
-        </w:rPr>
-        <w:t>risk_to_public</w:t>
-      </w:r>
-      <w:proofErr w:type="spellEnd"/>
-      <w:r>
-        <w:rPr>
-          <w:rFonts w:ascii="Arial" w:hAnsi="Arial" w:cs="Arial"/>
-          <w:bCs/>
-        </w:rPr>
-        <w:t>}}</w:t>
+        <w:t>{{risk_to_public}}</w:t>
       </w:r>
     </w:p>
     <w:p>
@@ -4494,23 +3796,7 @@
           <w:rFonts w:ascii="Arial" w:hAnsi="Arial" w:cs="Arial"/>
           <w:bCs/>
         </w:rPr>
-        <w:t>{{</w:t>
-      </w:r>
-      <w:proofErr w:type="spellStart"/>
-      <w:r>
-        <w:rPr>
-          <w:rFonts w:ascii="Arial" w:hAnsi="Arial" w:cs="Arial"/>
-          <w:bCs/>
-        </w:rPr>
-        <w:t>risk_to_known_adult</w:t>
-      </w:r>
-      <w:proofErr w:type="spellEnd"/>
-      <w:r>
-        <w:rPr>
-          <w:rFonts w:ascii="Arial" w:hAnsi="Arial" w:cs="Arial"/>
-          <w:bCs/>
-        </w:rPr>
-        <w:t>}}</w:t>
+        <w:t>{{risk_to_known_adult}}</w:t>
       </w:r>
       <w:r>
         <w:tab/>
@@ -4556,23 +3842,7 @@
           <w:rFonts w:ascii="Arial" w:hAnsi="Arial" w:cs="Arial"/>
           <w:bCs/>
         </w:rPr>
-        <w:t>{{</w:t>
-      </w:r>
-      <w:proofErr w:type="spellStart"/>
-      <w:r>
-        <w:rPr>
-          <w:rFonts w:ascii="Arial" w:hAnsi="Arial" w:cs="Arial"/>
-          <w:bCs/>
-        </w:rPr>
-        <w:t>risk_to_children</w:t>
-      </w:r>
-      <w:proofErr w:type="spellEnd"/>
-      <w:r>
-        <w:rPr>
-          <w:rFonts w:ascii="Arial" w:hAnsi="Arial" w:cs="Arial"/>
-          <w:bCs/>
-        </w:rPr>
-        <w:t>}}</w:t>
+        <w:t>{{risk_to_children}}</w:t>
       </w:r>
     </w:p>
     <w:p>
@@ -4615,23 +3885,7 @@
           <w:rFonts w:ascii="Arial" w:hAnsi="Arial" w:cs="Arial"/>
           <w:bCs/>
         </w:rPr>
-        <w:t>{{</w:t>
-      </w:r>
-      <w:proofErr w:type="spellStart"/>
-      <w:r>
-        <w:rPr>
-          <w:rFonts w:ascii="Arial" w:hAnsi="Arial" w:cs="Arial"/>
-          <w:bCs/>
-        </w:rPr>
-        <w:t>risk_to_prisoners</w:t>
-      </w:r>
-      <w:proofErr w:type="spellEnd"/>
-      <w:r>
-        <w:rPr>
-          <w:rFonts w:ascii="Arial" w:hAnsi="Arial" w:cs="Arial"/>
-          <w:bCs/>
-        </w:rPr>
-        <w:t>}}</w:t>
+        <w:t>{{risk_to_prisoners}}</w:t>
       </w:r>
     </w:p>
     <w:p>
@@ -4667,23 +3921,7 @@
           <w:rFonts w:ascii="Arial" w:hAnsi="Arial" w:cs="Arial"/>
           <w:bCs/>
         </w:rPr>
-        <w:t>{{</w:t>
-      </w:r>
-      <w:proofErr w:type="spellStart"/>
-      <w:r>
-        <w:rPr>
-          <w:rFonts w:ascii="Arial" w:hAnsi="Arial" w:cs="Arial"/>
-          <w:bCs/>
-        </w:rPr>
-        <w:t>risk_to_staff</w:t>
-      </w:r>
-      <w:proofErr w:type="spellEnd"/>
-      <w:r>
-        <w:rPr>
-          <w:rFonts w:ascii="Arial" w:hAnsi="Arial" w:cs="Arial"/>
-          <w:bCs/>
-        </w:rPr>
-        <w:t>}}</w:t>
+        <w:t>{{risk_to_staff}}</w:t>
       </w:r>
     </w:p>
     <w:p>
@@ -4764,23 +4002,7 @@
           <w:rFonts w:ascii="Arial" w:hAnsi="Arial" w:cs="Arial"/>
           <w:bCs/>
         </w:rPr>
-        <w:t>{{</w:t>
-      </w:r>
-      <w:proofErr w:type="spellStart"/>
-      <w:r>
-        <w:rPr>
-          <w:rFonts w:ascii="Arial" w:hAnsi="Arial" w:cs="Arial"/>
-          <w:bCs/>
-        </w:rPr>
-        <w:t>index_offence_details</w:t>
-      </w:r>
-      <w:proofErr w:type="spellEnd"/>
-      <w:r>
-        <w:rPr>
-          <w:rFonts w:ascii="Arial" w:hAnsi="Arial" w:cs="Arial"/>
-          <w:bCs/>
-        </w:rPr>
-        <w:t>}}</w:t>
+        <w:t>{{index_offence_details}}</w:t>
       </w:r>
     </w:p>
     <w:p>
@@ -4893,27 +4115,7 @@
                 <w:sz w:val="22"/>
                 <w:szCs w:val="22"/>
               </w:rPr>
-              <w:t>{{</w:t>
-            </w:r>
-            <w:proofErr w:type="spellStart"/>
-            <w:r>
-              <w:rPr>
-                <w:rFonts w:ascii="Arial" w:hAnsi="Arial" w:cs="Arial"/>
-                <w:bCs/>
-                <w:sz w:val="22"/>
-                <w:szCs w:val="22"/>
-              </w:rPr>
-              <w:t>good_behaviour_condition</w:t>
-            </w:r>
-            <w:proofErr w:type="spellEnd"/>
-            <w:r>
-              <w:rPr>
-                <w:rFonts w:ascii="Arial" w:hAnsi="Arial" w:cs="Arial"/>
-                <w:bCs/>
-                <w:sz w:val="22"/>
-                <w:szCs w:val="22"/>
-              </w:rPr>
-              <w:t>}}</w:t>
+              <w:t>{{good_behaviour_condition}}</w:t>
             </w:r>
             <w:r>
               <w:rPr>
@@ -4958,27 +4160,7 @@
                 <w:sz w:val="22"/>
                 <w:szCs w:val="22"/>
               </w:rPr>
-              <w:t>{{</w:t>
-            </w:r>
-            <w:proofErr w:type="spellStart"/>
-            <w:r>
-              <w:rPr>
-                <w:rFonts w:ascii="Arial" w:hAnsi="Arial" w:cs="Arial"/>
-                <w:bCs/>
-                <w:sz w:val="22"/>
-                <w:szCs w:val="22"/>
-              </w:rPr>
-              <w:t>no_offence_condition</w:t>
-            </w:r>
-            <w:proofErr w:type="spellEnd"/>
-            <w:r>
-              <w:rPr>
-                <w:rFonts w:ascii="Arial" w:hAnsi="Arial" w:cs="Arial"/>
-                <w:bCs/>
-                <w:sz w:val="22"/>
-                <w:szCs w:val="22"/>
-              </w:rPr>
-              <w:t xml:space="preserve">}} </w:t>
+              <w:t xml:space="preserve">{{no_offence_condition}} </w:t>
             </w:r>
             <w:r>
               <w:rPr>
@@ -5013,27 +4195,7 @@
                 <w:sz w:val="22"/>
                 <w:szCs w:val="22"/>
               </w:rPr>
-              <w:t>{{</w:t>
-            </w:r>
-            <w:proofErr w:type="spellStart"/>
-            <w:r>
-              <w:rPr>
-                <w:rFonts w:ascii="Arial" w:hAnsi="Arial" w:cs="Arial"/>
-                <w:bCs/>
-                <w:sz w:val="22"/>
-                <w:szCs w:val="22"/>
-              </w:rPr>
-              <w:t>keep_in_touch_condition</w:t>
-            </w:r>
-            <w:proofErr w:type="spellEnd"/>
-            <w:r>
-              <w:rPr>
-                <w:rFonts w:ascii="Arial" w:hAnsi="Arial" w:cs="Arial"/>
-                <w:bCs/>
-                <w:sz w:val="22"/>
-                <w:szCs w:val="22"/>
-              </w:rPr>
-              <w:t xml:space="preserve">}} </w:t>
+              <w:t xml:space="preserve">{{keep_in_touch_condition}} </w:t>
             </w:r>
             <w:r>
               <w:rPr>
@@ -5068,27 +4230,7 @@
                 <w:sz w:val="22"/>
                 <w:szCs w:val="22"/>
               </w:rPr>
-              <w:t>{{</w:t>
-            </w:r>
-            <w:proofErr w:type="spellStart"/>
-            <w:r>
-              <w:rPr>
-                <w:rFonts w:ascii="Arial" w:hAnsi="Arial" w:cs="Arial"/>
-                <w:bCs/>
-                <w:sz w:val="22"/>
-                <w:szCs w:val="22"/>
-              </w:rPr>
-              <w:t>officer_visit_condition</w:t>
-            </w:r>
-            <w:proofErr w:type="spellEnd"/>
-            <w:r>
-              <w:rPr>
-                <w:rFonts w:ascii="Arial" w:hAnsi="Arial" w:cs="Arial"/>
-                <w:bCs/>
-                <w:sz w:val="22"/>
-                <w:szCs w:val="22"/>
-              </w:rPr>
-              <w:t xml:space="preserve">}} </w:t>
+              <w:t xml:space="preserve">{{officer_visit_condition}} </w:t>
             </w:r>
             <w:r>
               <w:rPr>
@@ -5123,27 +4265,7 @@
                 <w:sz w:val="22"/>
                 <w:szCs w:val="22"/>
               </w:rPr>
-              <w:t>{{</w:t>
-            </w:r>
-            <w:proofErr w:type="spellStart"/>
-            <w:r>
-              <w:rPr>
-                <w:rFonts w:ascii="Arial" w:hAnsi="Arial" w:cs="Arial"/>
-                <w:bCs/>
-                <w:sz w:val="22"/>
-                <w:szCs w:val="22"/>
-              </w:rPr>
-              <w:t>address_approved_condition</w:t>
-            </w:r>
-            <w:proofErr w:type="spellEnd"/>
-            <w:r>
-              <w:rPr>
-                <w:rFonts w:ascii="Arial" w:hAnsi="Arial" w:cs="Arial"/>
-                <w:bCs/>
-                <w:sz w:val="22"/>
-                <w:szCs w:val="22"/>
-              </w:rPr>
-              <w:t xml:space="preserve">}} </w:t>
+              <w:t xml:space="preserve">{{address_approved_condition}} </w:t>
             </w:r>
             <w:r>
               <w:rPr>
@@ -5188,27 +4310,7 @@
                 <w:szCs w:val="22"/>
               </w:rPr>
               <w:lastRenderedPageBreak/>
-              <w:t>{{</w:t>
-            </w:r>
-            <w:proofErr w:type="spellStart"/>
-            <w:r>
-              <w:rPr>
-                <w:rFonts w:ascii="Arial" w:hAnsi="Arial" w:cs="Arial"/>
-                <w:bCs/>
-                <w:sz w:val="22"/>
-                <w:szCs w:val="22"/>
-              </w:rPr>
-              <w:t>no_work_undertaken_condition</w:t>
-            </w:r>
-            <w:proofErr w:type="spellEnd"/>
-            <w:r>
-              <w:rPr>
-                <w:rFonts w:ascii="Arial" w:hAnsi="Arial" w:cs="Arial"/>
-                <w:bCs/>
-                <w:sz w:val="22"/>
-                <w:szCs w:val="22"/>
-              </w:rPr>
-              <w:t xml:space="preserve">}} </w:t>
+              <w:t xml:space="preserve">{{no_work_undertaken_condition}} </w:t>
             </w:r>
             <w:r>
               <w:rPr>
@@ -5243,27 +4345,7 @@
                 <w:sz w:val="22"/>
                 <w:szCs w:val="22"/>
               </w:rPr>
-              <w:t>{{</w:t>
-            </w:r>
-            <w:proofErr w:type="spellStart"/>
-            <w:r>
-              <w:rPr>
-                <w:rFonts w:ascii="Arial" w:hAnsi="Arial" w:cs="Arial"/>
-                <w:bCs/>
-                <w:sz w:val="22"/>
-                <w:szCs w:val="22"/>
-              </w:rPr>
-              <w:t>no_travel_condition</w:t>
-            </w:r>
-            <w:proofErr w:type="spellEnd"/>
-            <w:r>
-              <w:rPr>
-                <w:rFonts w:ascii="Arial" w:hAnsi="Arial" w:cs="Arial"/>
-                <w:bCs/>
-                <w:sz w:val="22"/>
-                <w:szCs w:val="22"/>
-              </w:rPr>
-              <w:t>}}</w:t>
+              <w:t>{{no_travel_condition}}</w:t>
             </w:r>
             <w:r>
               <w:rPr>
@@ -5309,27 +4391,7 @@
                 <w:sz w:val="22"/>
                 <w:szCs w:val="22"/>
               </w:rPr>
-              <w:t>{{</w:t>
-            </w:r>
-            <w:proofErr w:type="spellStart"/>
-            <w:r>
-              <w:rPr>
-                <w:rFonts w:ascii="Arial" w:hAnsi="Arial" w:cs="Arial"/>
-                <w:bCs/>
-                <w:sz w:val="22"/>
-                <w:szCs w:val="22"/>
-              </w:rPr>
-              <w:t>other_name_known_by</w:t>
-            </w:r>
-            <w:proofErr w:type="spellEnd"/>
-            <w:r>
-              <w:rPr>
-                <w:rFonts w:ascii="Arial" w:hAnsi="Arial" w:cs="Arial"/>
-                <w:bCs/>
-                <w:sz w:val="22"/>
-                <w:szCs w:val="22"/>
-              </w:rPr>
-              <w:t>}}</w:t>
+              <w:t>{{other_name_known_by}}</w:t>
             </w:r>
             <w:r>
               <w:rPr>
@@ -5386,27 +4448,7 @@
                 <w:sz w:val="22"/>
                 <w:szCs w:val="22"/>
               </w:rPr>
-              <w:t>{{</w:t>
-            </w:r>
-            <w:proofErr w:type="spellStart"/>
-            <w:r>
-              <w:rPr>
-                <w:rFonts w:ascii="Arial" w:hAnsi="Arial" w:cs="Arial"/>
-                <w:bCs/>
-                <w:sz w:val="22"/>
-                <w:szCs w:val="22"/>
-              </w:rPr>
-              <w:t>contact_details_changed</w:t>
-            </w:r>
-            <w:proofErr w:type="spellEnd"/>
-            <w:r>
-              <w:rPr>
-                <w:rFonts w:ascii="Arial" w:hAnsi="Arial" w:cs="Arial"/>
-                <w:bCs/>
-                <w:sz w:val="22"/>
-                <w:szCs w:val="22"/>
-              </w:rPr>
-              <w:t>}}</w:t>
+              <w:t>{{contact_details_changed}}</w:t>
             </w:r>
             <w:r>
               <w:rPr>
@@ -5529,23 +4571,7 @@
           <w:rFonts w:ascii="Arial" w:hAnsi="Arial" w:cs="Arial"/>
           <w:bCs/>
         </w:rPr>
-        <w:t>{{</w:t>
-      </w:r>
-      <w:proofErr w:type="spellStart"/>
-      <w:r>
-        <w:rPr>
-          <w:rFonts w:ascii="Arial" w:hAnsi="Arial" w:cs="Arial"/>
-          <w:bCs/>
-        </w:rPr>
-        <w:t>additional_conditions_breached</w:t>
-      </w:r>
-      <w:proofErr w:type="spellEnd"/>
-      <w:r>
-        <w:rPr>
-          <w:rFonts w:ascii="Arial" w:hAnsi="Arial" w:cs="Arial"/>
-          <w:bCs/>
-        </w:rPr>
-        <w:t>}}</w:t>
+        <w:t>{{additional_conditions_breached}}</w:t>
       </w:r>
     </w:p>
     <w:p>
@@ -5699,23 +4725,7 @@
           <w:rFonts w:ascii="Arial" w:hAnsi="Arial" w:cs="Arial"/>
           <w:bCs/>
         </w:rPr>
-        <w:t>{{</w:t>
-      </w:r>
-      <w:proofErr w:type="spellStart"/>
-      <w:r>
-        <w:rPr>
-          <w:rFonts w:ascii="Arial" w:hAnsi="Arial" w:cs="Arial"/>
-          <w:bCs/>
-        </w:rPr>
-        <w:t>what_led_to_recall</w:t>
-      </w:r>
-      <w:proofErr w:type="spellEnd"/>
-      <w:r>
-        <w:rPr>
-          <w:rFonts w:ascii="Arial" w:hAnsi="Arial" w:cs="Arial"/>
-          <w:bCs/>
-        </w:rPr>
-        <w:t>}}</w:t>
+        <w:t>{{what_led_to_recall}}</w:t>
       </w:r>
     </w:p>
     <w:tbl>
@@ -5970,27 +4980,7 @@
                 <w:sz w:val="22"/>
                 <w:szCs w:val="22"/>
               </w:rPr>
-              <w:t>{{</w:t>
-            </w:r>
-            <w:proofErr w:type="spellStart"/>
-            <w:r>
-              <w:rPr>
-                <w:rFonts w:ascii="Arial" w:hAnsi="Arial" w:cs="Arial"/>
-                <w:bCs/>
-                <w:sz w:val="22"/>
-                <w:szCs w:val="22"/>
-              </w:rPr>
-              <w:t>warning_letter_details</w:t>
-            </w:r>
-            <w:proofErr w:type="spellEnd"/>
-            <w:r>
-              <w:rPr>
-                <w:rFonts w:ascii="Arial" w:hAnsi="Arial" w:cs="Arial"/>
-                <w:bCs/>
-                <w:sz w:val="22"/>
-                <w:szCs w:val="22"/>
-              </w:rPr>
-              <w:t>}}</w:t>
+              <w:t>{{warning_letter_details}}</w:t>
             </w:r>
           </w:p>
         </w:tc>
@@ -6047,27 +5037,7 @@
                 <w:sz w:val="22"/>
                 <w:szCs w:val="22"/>
               </w:rPr>
-              <w:t>{{</w:t>
-            </w:r>
-            <w:proofErr w:type="spellStart"/>
-            <w:r>
-              <w:rPr>
-                <w:rFonts w:ascii="Arial" w:hAnsi="Arial" w:cs="Arial"/>
-                <w:bCs/>
-                <w:sz w:val="22"/>
-                <w:szCs w:val="22"/>
-              </w:rPr>
-              <w:t>increased_frequency_details</w:t>
-            </w:r>
-            <w:proofErr w:type="spellEnd"/>
-            <w:r>
-              <w:rPr>
-                <w:rFonts w:ascii="Arial" w:hAnsi="Arial" w:cs="Arial"/>
-                <w:bCs/>
-                <w:sz w:val="22"/>
-                <w:szCs w:val="22"/>
-              </w:rPr>
-              <w:t>}}</w:t>
+              <w:t>{{increased_frequency_details}}</w:t>
             </w:r>
           </w:p>
         </w:tc>
@@ -6124,27 +5094,7 @@
                 <w:sz w:val="22"/>
                 <w:szCs w:val="22"/>
               </w:rPr>
-              <w:t>{{</w:t>
-            </w:r>
-            <w:proofErr w:type="spellStart"/>
-            <w:r>
-              <w:rPr>
-                <w:rFonts w:ascii="Arial" w:hAnsi="Arial" w:cs="Arial"/>
-                <w:bCs/>
-                <w:sz w:val="22"/>
-                <w:szCs w:val="22"/>
-              </w:rPr>
-              <w:t>extra_licence_conditions_details</w:t>
-            </w:r>
-            <w:proofErr w:type="spellEnd"/>
-            <w:r>
-              <w:rPr>
-                <w:rFonts w:ascii="Arial" w:hAnsi="Arial" w:cs="Arial"/>
-                <w:bCs/>
-                <w:sz w:val="22"/>
-                <w:szCs w:val="22"/>
-              </w:rPr>
-              <w:t>}}</w:t>
+              <w:t>{{extra_licence_conditions_details}}</w:t>
             </w:r>
           </w:p>
         </w:tc>
@@ -6201,27 +5151,7 @@
                 <w:sz w:val="22"/>
                 <w:szCs w:val="22"/>
               </w:rPr>
-              <w:t>{{</w:t>
-            </w:r>
-            <w:proofErr w:type="spellStart"/>
-            <w:r>
-              <w:rPr>
-                <w:rFonts w:ascii="Arial" w:hAnsi="Arial" w:cs="Arial"/>
-                <w:bCs/>
-                <w:sz w:val="22"/>
-                <w:szCs w:val="22"/>
-              </w:rPr>
-              <w:t>referral_to_other_teams_details</w:t>
-            </w:r>
-            <w:proofErr w:type="spellEnd"/>
-            <w:r>
-              <w:rPr>
-                <w:rFonts w:ascii="Arial" w:hAnsi="Arial" w:cs="Arial"/>
-                <w:bCs/>
-                <w:sz w:val="22"/>
-                <w:szCs w:val="22"/>
-              </w:rPr>
-              <w:t>}}</w:t>
+              <w:t>{{referral_to_other_teams_details}}</w:t>
             </w:r>
           </w:p>
         </w:tc>
@@ -6278,27 +5208,7 @@
                 <w:sz w:val="22"/>
                 <w:szCs w:val="22"/>
               </w:rPr>
-              <w:t>{{</w:t>
-            </w:r>
-            <w:proofErr w:type="spellStart"/>
-            <w:r>
-              <w:rPr>
-                <w:rFonts w:ascii="Arial" w:hAnsi="Arial" w:cs="Arial"/>
-                <w:bCs/>
-                <w:sz w:val="22"/>
-                <w:szCs w:val="22"/>
-              </w:rPr>
-              <w:t>referral_to_partnership_agencies_details</w:t>
-            </w:r>
-            <w:proofErr w:type="spellEnd"/>
-            <w:r>
-              <w:rPr>
-                <w:rFonts w:ascii="Arial" w:hAnsi="Arial" w:cs="Arial"/>
-                <w:bCs/>
-                <w:sz w:val="22"/>
-                <w:szCs w:val="22"/>
-              </w:rPr>
-              <w:t>}}</w:t>
+              <w:t>{{referral_to_partnership_agencies_details}}</w:t>
             </w:r>
           </w:p>
         </w:tc>
@@ -6355,27 +5265,7 @@
                 <w:sz w:val="22"/>
                 <w:szCs w:val="22"/>
               </w:rPr>
-              <w:t>{{</w:t>
-            </w:r>
-            <w:proofErr w:type="spellStart"/>
-            <w:r>
-              <w:rPr>
-                <w:rFonts w:ascii="Arial" w:hAnsi="Arial" w:cs="Arial"/>
-                <w:bCs/>
-                <w:sz w:val="22"/>
-                <w:szCs w:val="22"/>
-              </w:rPr>
-              <w:t>referral_to_approved_premises_details</w:t>
-            </w:r>
-            <w:proofErr w:type="spellEnd"/>
-            <w:r>
-              <w:rPr>
-                <w:rFonts w:ascii="Arial" w:hAnsi="Arial" w:cs="Arial"/>
-                <w:bCs/>
-                <w:sz w:val="22"/>
-                <w:szCs w:val="22"/>
-              </w:rPr>
-              <w:t>}}</w:t>
+              <w:t>{{referral_to_approved_premises_details}}</w:t>
             </w:r>
           </w:p>
         </w:tc>
@@ -6432,27 +5322,7 @@
                 <w:sz w:val="22"/>
                 <w:szCs w:val="22"/>
               </w:rPr>
-              <w:t>{{</w:t>
-            </w:r>
-            <w:proofErr w:type="spellStart"/>
-            <w:r>
-              <w:rPr>
-                <w:rFonts w:ascii="Arial" w:hAnsi="Arial" w:cs="Arial"/>
-                <w:bCs/>
-                <w:sz w:val="22"/>
-                <w:szCs w:val="22"/>
-              </w:rPr>
-              <w:t>drug_testing_details</w:t>
-            </w:r>
-            <w:proofErr w:type="spellEnd"/>
-            <w:r>
-              <w:rPr>
-                <w:rFonts w:ascii="Arial" w:hAnsi="Arial" w:cs="Arial"/>
-                <w:bCs/>
-                <w:sz w:val="22"/>
-                <w:szCs w:val="22"/>
-              </w:rPr>
-              <w:t>}}</w:t>
+              <w:t>{{drug_testing_details}}</w:t>
             </w:r>
           </w:p>
         </w:tc>
@@ -6509,27 +5379,7 @@
                 <w:sz w:val="22"/>
                 <w:szCs w:val="22"/>
               </w:rPr>
-              <w:t>{{</w:t>
-            </w:r>
-            <w:proofErr w:type="spellStart"/>
-            <w:r>
-              <w:rPr>
-                <w:rFonts w:ascii="Arial" w:hAnsi="Arial" w:cs="Arial"/>
-                <w:bCs/>
-                <w:sz w:val="22"/>
-                <w:szCs w:val="22"/>
-              </w:rPr>
-              <w:t>alternative_to_recall_other_details</w:t>
-            </w:r>
-            <w:proofErr w:type="spellEnd"/>
-            <w:r>
-              <w:rPr>
-                <w:rFonts w:ascii="Arial" w:hAnsi="Arial" w:cs="Arial"/>
-                <w:bCs/>
-                <w:sz w:val="22"/>
-                <w:szCs w:val="22"/>
-              </w:rPr>
-              <w:t>}}</w:t>
+              <w:t>{{alternative_to_recall_other_details}}</w:t>
             </w:r>
           </w:p>
         </w:tc>
@@ -6680,23 +5530,7 @@
           <w:rFonts w:ascii="Arial" w:hAnsi="Arial" w:cs="Arial"/>
           <w:bCs/>
         </w:rPr>
-        <w:t>{{</w:t>
-      </w:r>
-      <w:proofErr w:type="spellStart"/>
-      <w:r>
-        <w:rPr>
-          <w:rFonts w:ascii="Arial" w:hAnsi="Arial" w:cs="Arial"/>
-          <w:bCs/>
-        </w:rPr>
-        <w:t>recall_type</w:t>
-      </w:r>
-      <w:proofErr w:type="spellEnd"/>
-      <w:r>
-        <w:rPr>
-          <w:rFonts w:ascii="Arial" w:hAnsi="Arial" w:cs="Arial"/>
-          <w:bCs/>
-        </w:rPr>
-        <w:t>}}</w:t>
+        <w:t>{{recall_type}}</w:t>
       </w:r>
       <w:r>
         <w:rPr>
@@ -6737,24 +5571,14 @@
           <w:rFonts w:ascii="Arial" w:hAnsi="Arial" w:cs="Arial"/>
           <w:bCs/>
         </w:rPr>
-        <w:t>{{</w:t>
-      </w:r>
-      <w:proofErr w:type="spellStart"/>
-      <w:r>
-        <w:rPr>
-          <w:rFonts w:ascii="Arial" w:hAnsi="Arial" w:cs="Arial"/>
-          <w:bCs/>
-        </w:rPr>
-        <w:t>recall_type_details</w:t>
-      </w:r>
-      <w:proofErr w:type="spellEnd"/>
-      <w:proofErr w:type="gramStart"/>
-      <w:r>
-        <w:rPr>
-          <w:rFonts w:ascii="Arial" w:hAnsi="Arial" w:cs="Arial"/>
-          <w:bCs/>
-        </w:rPr>
-        <w:t>}}</w:t>
+        <w:t>{{recall_type_details}}</w:t>
+      </w:r>
+      <w:r>
+        <w:rPr>
+          <w:rFonts w:ascii="Arial" w:hAnsi="Arial" w:cs="Arial"/>
+          <w:b/>
+        </w:rPr>
+        <w:t xml:space="preserve">                          </w:t>
       </w:r>
       <w:r>
         <w:rPr>
@@ -6763,21 +5587,6 @@
         </w:rPr>
         <w:t xml:space="preserve">   </w:t>
       </w:r>
-      <w:proofErr w:type="gramEnd"/>
-      <w:r>
-        <w:rPr>
-          <w:rFonts w:ascii="Arial" w:hAnsi="Arial" w:cs="Arial"/>
-          <w:b/>
-        </w:rPr>
-        <w:t xml:space="preserve">                       </w:t>
-      </w:r>
-      <w:r>
-        <w:rPr>
-          <w:rFonts w:ascii="Arial" w:hAnsi="Arial" w:cs="Arial"/>
-          <w:b/>
-        </w:rPr>
-        <w:t xml:space="preserve">   </w:t>
-      </w:r>
       <w:r>
         <w:rPr>
           <w:rFonts w:ascii="Arial" w:hAnsi="Arial" w:cs="Arial"/>
@@ -6909,23 +5718,7 @@
           <w:rFonts w:ascii="Arial" w:hAnsi="Arial" w:cs="Arial"/>
           <w:bCs/>
         </w:rPr>
-        <w:t>{{</w:t>
-      </w:r>
-      <w:proofErr w:type="spellStart"/>
-      <w:r>
-        <w:rPr>
-          <w:rFonts w:ascii="Arial" w:hAnsi="Arial" w:cs="Arial"/>
-          <w:bCs/>
-        </w:rPr>
-        <w:t>fixed_term_additional_licence_conditions</w:t>
-      </w:r>
-      <w:proofErr w:type="spellEnd"/>
-      <w:r>
-        <w:rPr>
-          <w:rFonts w:ascii="Arial" w:hAnsi="Arial" w:cs="Arial"/>
-          <w:bCs/>
-        </w:rPr>
-        <w:t>}}</w:t>
+        <w:t>{{fixed_term_additional_licence_conditions}}</w:t>
       </w:r>
     </w:p>
     <w:p>
@@ -7123,37 +5916,12 @@
           <w:rFonts w:ascii="Arial" w:hAnsi="Arial" w:cs="Arial"/>
         </w:rPr>
       </w:pPr>
-      <w:proofErr w:type="spellStart"/>
-      <w:r>
-        <w:rPr>
-          <w:rFonts w:ascii="Arial" w:hAnsi="Arial" w:cs="Arial"/>
-          <w:b/>
-        </w:rPr>
-        <w:t>i</w:t>
-      </w:r>
-      <w:proofErr w:type="spellEnd"/>
-      <w:r>
-        <w:rPr>
-          <w:rFonts w:ascii="Arial" w:hAnsi="Arial" w:cs="Arial"/>
-          <w:b/>
-        </w:rPr>
-        <w:t xml:space="preserve">) Has the offender exhibited behaviour </w:t>
-      </w:r>
-      <w:proofErr w:type="gramStart"/>
-      <w:r>
-        <w:rPr>
-          <w:rFonts w:ascii="Arial" w:hAnsi="Arial" w:cs="Arial"/>
-          <w:b/>
-        </w:rPr>
-        <w:t>similar to</w:t>
-      </w:r>
-      <w:proofErr w:type="gramEnd"/>
-      <w:r>
-        <w:rPr>
-          <w:rFonts w:ascii="Arial" w:hAnsi="Arial" w:cs="Arial"/>
-          <w:b/>
-        </w:rPr>
-        <w:t xml:space="preserve"> the circumstances surrounding the index offence</w:t>
+      <w:r>
+        <w:rPr>
+          <w:rFonts w:ascii="Arial" w:hAnsi="Arial" w:cs="Arial"/>
+          <w:b/>
+        </w:rPr>
+        <w:t>i) Has the offender exhibited behaviour similar to the circumstances surrounding the index offence</w:t>
       </w:r>
       <w:r>
         <w:rPr>
@@ -7174,23 +5942,7 @@
           <w:rFonts w:ascii="Arial" w:hAnsi="Arial" w:cs="Arial"/>
           <w:bCs/>
         </w:rPr>
-        <w:t>{{</w:t>
-      </w:r>
-      <w:proofErr w:type="spellStart"/>
-      <w:r>
-        <w:rPr>
-          <w:rFonts w:ascii="Arial" w:hAnsi="Arial" w:cs="Arial"/>
-          <w:bCs/>
-        </w:rPr>
-        <w:t>behaviour_similar_to_index_offence_present</w:t>
-      </w:r>
-      <w:proofErr w:type="spellEnd"/>
-      <w:r>
-        <w:rPr>
-          <w:rFonts w:ascii="Arial" w:hAnsi="Arial" w:cs="Arial"/>
-          <w:bCs/>
-        </w:rPr>
-        <w:t>}}</w:t>
+        <w:t>{{behaviour_similar_to_index_offence_present}}</w:t>
       </w:r>
       <w:r>
         <w:rPr>
@@ -7225,23 +5977,7 @@
           <w:rFonts w:ascii="Arial" w:hAnsi="Arial" w:cs="Arial"/>
           <w:bCs/>
         </w:rPr>
-        <w:t>{{</w:t>
-      </w:r>
-      <w:proofErr w:type="spellStart"/>
-      <w:r>
-        <w:rPr>
-          <w:rFonts w:ascii="Arial" w:hAnsi="Arial" w:cs="Arial"/>
-          <w:bCs/>
-        </w:rPr>
-        <w:t>behaviour_similar_to_index_offence</w:t>
-      </w:r>
-      <w:proofErr w:type="spellEnd"/>
-      <w:r>
-        <w:rPr>
-          <w:rFonts w:ascii="Arial" w:hAnsi="Arial" w:cs="Arial"/>
-          <w:bCs/>
-        </w:rPr>
-        <w:t>}}</w:t>
+        <w:t>{{behaviour_similar_to_index_offence}}</w:t>
       </w:r>
     </w:p>
     <w:p>
@@ -7278,23 +6014,63 @@
           <w:rFonts w:ascii="Arial" w:hAnsi="Arial" w:cs="Arial"/>
           <w:b/>
         </w:rPr>
-        <w:t xml:space="preserve">ii) Has the offender exhibited behaviour likely to give rise, or does give rise </w:t>
-      </w:r>
-      <w:proofErr w:type="gramStart"/>
-      <w:r>
-        <w:rPr>
-          <w:rFonts w:ascii="Arial" w:hAnsi="Arial" w:cs="Arial"/>
-          <w:b/>
-        </w:rPr>
-        <w:t>to  a</w:t>
-      </w:r>
-      <w:proofErr w:type="gramEnd"/>
-      <w:r>
-        <w:rPr>
-          <w:rFonts w:ascii="Arial" w:hAnsi="Arial" w:cs="Arial"/>
-          <w:b/>
-        </w:rPr>
-        <w:t xml:space="preserve"> sexual or violent offence? </w:t>
+        <w:t xml:space="preserve">ii) Has the offender exhibited behaviour likely to give rise, or does give rise to  a sexual or violent offence? </w:t>
+      </w:r>
+      <w:r>
+        <w:rPr>
+          <w:rFonts w:ascii="Arial" w:hAnsi="Arial" w:cs="Arial"/>
+          <w:bCs/>
+        </w:rPr>
+        <w:t>{{behaviour_</w:t>
+      </w:r>
+      <w:r>
+        <w:rPr>
+          <w:rFonts w:ascii="Arial" w:hAnsi="Arial" w:cs="Arial"/>
+          <w:bCs/>
+        </w:rPr>
+        <w:t>likely</w:t>
+      </w:r>
+      <w:r>
+        <w:rPr>
+          <w:rFonts w:ascii="Arial" w:hAnsi="Arial" w:cs="Arial"/>
+          <w:bCs/>
+        </w:rPr>
+        <w:t>_to</w:t>
+      </w:r>
+      <w:r>
+        <w:rPr>
+          <w:rFonts w:ascii="Arial" w:hAnsi="Arial" w:cs="Arial"/>
+          <w:bCs/>
+        </w:rPr>
+        <w:t>_result</w:t>
+      </w:r>
+      <w:r>
+        <w:rPr>
+          <w:rFonts w:ascii="Arial" w:hAnsi="Arial" w:cs="Arial"/>
+          <w:bCs/>
+        </w:rPr>
+        <w:t>_sexual_or_violent_offence_present}}</w:t>
+      </w:r>
+      <w:r>
+        <w:rPr>
+          <w:rFonts w:ascii="Arial" w:hAnsi="Arial" w:cs="Arial"/>
+          <w:b/>
+        </w:rPr>
+        <w:t xml:space="preserve"> </w:t>
+      </w:r>
+      <w:r>
+        <w:rPr>
+          <w:rFonts w:ascii="Arial" w:hAnsi="Arial" w:cs="Arial"/>
+          <w:b/>
+        </w:rPr>
+        <w:t>Provide details</w:t>
+      </w:r>
+      <w:r>
+        <w:rPr>
+          <w:rFonts w:ascii="Arial" w:hAnsi="Arial" w:cs="Arial"/>
+          <w:b/>
+        </w:rPr>
+        <w:t xml:space="preserve">: </w:t>
       </w:r>
       <w:r>
         <w:rPr>
@@ -7303,79 +6079,6 @@
         </w:rPr>
         <w:t>{{</w:t>
       </w:r>
-      <w:proofErr w:type="spellStart"/>
-      <w:r>
-        <w:rPr>
-          <w:rFonts w:ascii="Arial" w:hAnsi="Arial" w:cs="Arial"/>
-          <w:bCs/>
-        </w:rPr>
-        <w:t>behaviour_</w:t>
-      </w:r>
-      <w:r>
-        <w:rPr>
-          <w:rFonts w:ascii="Arial" w:hAnsi="Arial" w:cs="Arial"/>
-          <w:bCs/>
-        </w:rPr>
-        <w:t>likely</w:t>
-      </w:r>
-      <w:r>
-        <w:rPr>
-          <w:rFonts w:ascii="Arial" w:hAnsi="Arial" w:cs="Arial"/>
-          <w:bCs/>
-        </w:rPr>
-        <w:t>_to</w:t>
-      </w:r>
-      <w:r>
-        <w:rPr>
-          <w:rFonts w:ascii="Arial" w:hAnsi="Arial" w:cs="Arial"/>
-          <w:bCs/>
-        </w:rPr>
-        <w:t>_result</w:t>
-      </w:r>
-      <w:r>
-        <w:rPr>
-          <w:rFonts w:ascii="Arial" w:hAnsi="Arial" w:cs="Arial"/>
-          <w:bCs/>
-        </w:rPr>
-        <w:t>_sexual_or_violent_offence_present</w:t>
-      </w:r>
-      <w:proofErr w:type="spellEnd"/>
-      <w:r>
-        <w:rPr>
-          <w:rFonts w:ascii="Arial" w:hAnsi="Arial" w:cs="Arial"/>
-          <w:bCs/>
-        </w:rPr>
-        <w:t>}}</w:t>
-      </w:r>
-      <w:r>
-        <w:rPr>
-          <w:rFonts w:ascii="Arial" w:hAnsi="Arial" w:cs="Arial"/>
-          <w:b/>
-        </w:rPr>
-        <w:t xml:space="preserve"> </w:t>
-      </w:r>
-      <w:r>
-        <w:rPr>
-          <w:rFonts w:ascii="Arial" w:hAnsi="Arial" w:cs="Arial"/>
-          <w:b/>
-        </w:rPr>
-        <w:t>Provide details</w:t>
-      </w:r>
-      <w:r>
-        <w:rPr>
-          <w:rFonts w:ascii="Arial" w:hAnsi="Arial" w:cs="Arial"/>
-          <w:b/>
-        </w:rPr>
-        <w:t xml:space="preserve">: </w:t>
-      </w:r>
-      <w:r>
-        <w:rPr>
-          <w:rFonts w:ascii="Arial" w:hAnsi="Arial" w:cs="Arial"/>
-          <w:bCs/>
-        </w:rPr>
-        <w:t>{{</w:t>
-      </w:r>
-      <w:proofErr w:type="spellStart"/>
       <w:r>
         <w:rPr>
           <w:rFonts w:ascii="Arial" w:hAnsi="Arial" w:cs="Arial"/>
@@ -7388,15 +6091,7 @@
           <w:rFonts w:ascii="Arial" w:hAnsi="Arial" w:cs="Arial"/>
           <w:bCs/>
         </w:rPr>
-        <w:t>_sexual_or_violent_offence</w:t>
-      </w:r>
-      <w:proofErr w:type="spellEnd"/>
-      <w:r>
-        <w:rPr>
-          <w:rFonts w:ascii="Arial" w:hAnsi="Arial" w:cs="Arial"/>
-          <w:bCs/>
-        </w:rPr>
-        <w:t>}}</w:t>
+        <w:t>_sexual_or_violent_offence}}</w:t>
       </w:r>
     </w:p>
     <w:p>
@@ -7454,23 +6149,7 @@
           <w:rFonts w:ascii="Arial" w:hAnsi="Arial" w:cs="Arial"/>
           <w:bCs/>
         </w:rPr>
-        <w:t>{{</w:t>
-      </w:r>
-      <w:proofErr w:type="spellStart"/>
-      <w:r>
-        <w:rPr>
-          <w:rFonts w:ascii="Arial" w:hAnsi="Arial" w:cs="Arial"/>
-          <w:bCs/>
-        </w:rPr>
-        <w:t>behaviour_leading_to_sexual_or_violent_offence_present</w:t>
-      </w:r>
-      <w:proofErr w:type="spellEnd"/>
-      <w:r>
-        <w:rPr>
-          <w:rFonts w:ascii="Arial" w:hAnsi="Arial" w:cs="Arial"/>
-          <w:bCs/>
-        </w:rPr>
-        <w:t>}}</w:t>
+        <w:t>{{behaviour_leading_to_sexual_or_violent_offence_present}}</w:t>
       </w:r>
       <w:r>
         <w:rPr>
@@ -7491,23 +6170,7 @@
           <w:rFonts w:ascii="Arial" w:hAnsi="Arial" w:cs="Arial"/>
           <w:bCs/>
         </w:rPr>
-        <w:t>{{</w:t>
-      </w:r>
-      <w:proofErr w:type="spellStart"/>
-      <w:r>
-        <w:rPr>
-          <w:rFonts w:ascii="Arial" w:hAnsi="Arial" w:cs="Arial"/>
-          <w:bCs/>
-        </w:rPr>
-        <w:t>behaviour_leading_to_sexual_or_violent_offence</w:t>
-      </w:r>
-      <w:proofErr w:type="spellEnd"/>
-      <w:r>
-        <w:rPr>
-          <w:rFonts w:ascii="Arial" w:hAnsi="Arial" w:cs="Arial"/>
-          <w:bCs/>
-        </w:rPr>
-        <w:t>}}</w:t>
+        <w:t>{{behaviour_leading_to_sexual_or_violent_offence}}</w:t>
       </w:r>
     </w:p>
     <w:p>
@@ -7552,24 +6215,7 @@
           <w:rFonts w:ascii="Arial" w:hAnsi="Arial" w:cs="Arial"/>
           <w:bCs/>
         </w:rPr>
-        <w:t>{{</w:t>
-      </w:r>
-      <w:proofErr w:type="spellStart"/>
-      <w:r>
-        <w:rPr>
-          <w:rFonts w:ascii="Arial" w:hAnsi="Arial" w:cs="Arial"/>
-          <w:bCs/>
-        </w:rPr>
-        <w:t>out_of_touch_present</w:t>
-      </w:r>
-      <w:proofErr w:type="spellEnd"/>
-      <w:proofErr w:type="gramStart"/>
-      <w:r>
-        <w:rPr>
-          <w:rFonts w:ascii="Arial" w:hAnsi="Arial" w:cs="Arial"/>
-          <w:bCs/>
-        </w:rPr>
-        <w:t>}}</w:t>
+        <w:t>{{out_of_touch_present}}</w:t>
       </w:r>
       <w:r>
         <w:rPr>
@@ -7583,38 +6229,14 @@
           <w:rFonts w:ascii="Arial" w:hAnsi="Arial" w:cs="Arial"/>
           <w:b/>
         </w:rPr>
-        <w:t xml:space="preserve"> Provide</w:t>
-      </w:r>
-      <w:proofErr w:type="gramEnd"/>
-      <w:r>
-        <w:rPr>
-          <w:rFonts w:ascii="Arial" w:hAnsi="Arial" w:cs="Arial"/>
-          <w:b/>
-        </w:rPr>
-        <w:t xml:space="preserve"> details: </w:t>
-      </w:r>
-      <w:r>
-        <w:rPr>
-          <w:rFonts w:ascii="Arial" w:hAnsi="Arial" w:cs="Arial"/>
-          <w:bCs/>
-        </w:rPr>
-        <w:t>{{</w:t>
-      </w:r>
-      <w:proofErr w:type="spellStart"/>
-      <w:r>
-        <w:rPr>
-          <w:rFonts w:ascii="Arial" w:hAnsi="Arial" w:cs="Arial"/>
-          <w:bCs/>
-        </w:rPr>
-        <w:t>out_of_touch</w:t>
-      </w:r>
-      <w:proofErr w:type="spellEnd"/>
-      <w:r>
-        <w:rPr>
-          <w:rFonts w:ascii="Arial" w:hAnsi="Arial" w:cs="Arial"/>
-          <w:bCs/>
-        </w:rPr>
-        <w:t>}}</w:t>
+        <w:t xml:space="preserve"> Provide details: </w:t>
+      </w:r>
+      <w:r>
+        <w:rPr>
+          <w:rFonts w:ascii="Arial" w:hAnsi="Arial" w:cs="Arial"/>
+          <w:bCs/>
+        </w:rPr>
+        <w:t>{{out_of_touch}}</w:t>
       </w:r>
       <w:r>
         <w:rPr>
@@ -7672,46 +6294,14 @@
           <w:rFonts w:ascii="Arial" w:hAnsi="Arial" w:cs="Arial"/>
           <w:b/>
         </w:rPr>
-        <w:t>be made that (</w:t>
-      </w:r>
-      <w:proofErr w:type="spellStart"/>
-      <w:r>
-        <w:rPr>
-          <w:rFonts w:ascii="Arial" w:hAnsi="Arial" w:cs="Arial"/>
-          <w:b/>
-        </w:rPr>
-        <w:t>i</w:t>
-      </w:r>
-      <w:proofErr w:type="spellEnd"/>
-      <w:r>
-        <w:rPr>
-          <w:rFonts w:ascii="Arial" w:hAnsi="Arial" w:cs="Arial"/>
-          <w:b/>
-        </w:rPr>
-        <w:t xml:space="preserve">), (ii) or (iii) may arise? </w:t>
-      </w:r>
-      <w:r>
-        <w:rPr>
-          <w:rFonts w:ascii="Arial" w:hAnsi="Arial" w:cs="Arial"/>
-          <w:bCs/>
-        </w:rPr>
-        <w:t>{{</w:t>
-      </w:r>
-      <w:proofErr w:type="spellStart"/>
-      <w:r>
-        <w:rPr>
-          <w:rFonts w:ascii="Arial" w:hAnsi="Arial" w:cs="Arial"/>
-          <w:bCs/>
-        </w:rPr>
-        <w:t>out_of_touch</w:t>
-      </w:r>
-      <w:proofErr w:type="spellEnd"/>
-      <w:r>
-        <w:rPr>
-          <w:rFonts w:ascii="Arial" w:hAnsi="Arial" w:cs="Arial"/>
-          <w:bCs/>
-        </w:rPr>
-        <w:t>}}</w:t>
+        <w:t xml:space="preserve">be made that (i), (ii) or (iii) may arise? </w:t>
+      </w:r>
+      <w:r>
+        <w:rPr>
+          <w:rFonts w:ascii="Arial" w:hAnsi="Arial" w:cs="Arial"/>
+          <w:bCs/>
+        </w:rPr>
+        <w:t>{{out_of_touch}}</w:t>
       </w:r>
     </w:p>
     <w:p>
@@ -7893,23 +6483,7 @@
           <w:rFonts w:ascii="Arial" w:hAnsi="Arial" w:cs="Arial"/>
           <w:bCs/>
         </w:rPr>
-        <w:t>{{</w:t>
-      </w:r>
-      <w:proofErr w:type="spellStart"/>
-      <w:r>
-        <w:rPr>
-          <w:rFonts w:ascii="Arial" w:hAnsi="Arial" w:cs="Arial"/>
-          <w:bCs/>
-        </w:rPr>
-        <w:t>practitioner_name</w:t>
-      </w:r>
-      <w:proofErr w:type="spellEnd"/>
-      <w:r>
-        <w:rPr>
-          <w:rFonts w:ascii="Arial" w:hAnsi="Arial" w:cs="Arial"/>
-          <w:bCs/>
-        </w:rPr>
-        <w:t>}}</w:t>
+        <w:t>{{practitioner_name}}</w:t>
       </w:r>
     </w:p>
     <w:p>
@@ -7940,23 +6514,7 @@
           <w:rFonts w:ascii="Arial" w:hAnsi="Arial" w:cs="Arial"/>
           <w:bCs/>
         </w:rPr>
-        <w:t>{{</w:t>
-      </w:r>
-      <w:proofErr w:type="spellStart"/>
-      <w:r>
-        <w:rPr>
-          <w:rFonts w:ascii="Arial" w:hAnsi="Arial" w:cs="Arial"/>
-          <w:bCs/>
-        </w:rPr>
-        <w:t>practitioner_telephone</w:t>
-      </w:r>
-      <w:proofErr w:type="spellEnd"/>
-      <w:r>
-        <w:rPr>
-          <w:rFonts w:ascii="Arial" w:hAnsi="Arial" w:cs="Arial"/>
-          <w:bCs/>
-        </w:rPr>
-        <w:t>}}</w:t>
+        <w:t>{{practitioner_telephone}}</w:t>
       </w:r>
     </w:p>
     <w:p>
@@ -7987,23 +6545,7 @@
           <w:rFonts w:ascii="Arial" w:hAnsi="Arial" w:cs="Arial"/>
           <w:bCs/>
         </w:rPr>
-        <w:t>{{</w:t>
-      </w:r>
-      <w:proofErr w:type="spellStart"/>
-      <w:r>
-        <w:rPr>
-          <w:rFonts w:ascii="Arial" w:hAnsi="Arial" w:cs="Arial"/>
-          <w:bCs/>
-        </w:rPr>
-        <w:t>practitioner_email</w:t>
-      </w:r>
-      <w:proofErr w:type="spellEnd"/>
-      <w:r>
-        <w:rPr>
-          <w:rFonts w:ascii="Arial" w:hAnsi="Arial" w:cs="Arial"/>
-          <w:bCs/>
-        </w:rPr>
-        <w:t>}}</w:t>
+        <w:t>{{practitioner_email}}</w:t>
       </w:r>
       <w:r>
         <w:rPr>
@@ -8054,23 +6596,7 @@
           <w:rFonts w:ascii="Arial" w:hAnsi="Arial" w:cs="Arial"/>
           <w:bCs/>
         </w:rPr>
-        <w:t>{{</w:t>
-      </w:r>
-      <w:proofErr w:type="spellStart"/>
-      <w:r>
-        <w:rPr>
-          <w:rFonts w:ascii="Arial" w:hAnsi="Arial" w:cs="Arial"/>
-          <w:bCs/>
-        </w:rPr>
-        <w:t>completed_by_name</w:t>
-      </w:r>
-      <w:proofErr w:type="spellEnd"/>
-      <w:r>
-        <w:rPr>
-          <w:rFonts w:ascii="Arial" w:hAnsi="Arial" w:cs="Arial"/>
-          <w:bCs/>
-        </w:rPr>
-        <w:t>}}</w:t>
+        <w:t>{{completed_by_name}}</w:t>
       </w:r>
     </w:p>
     <w:p>
@@ -8108,23 +6634,7 @@
           <w:rFonts w:ascii="Arial" w:hAnsi="Arial" w:cs="Arial"/>
           <w:bCs/>
         </w:rPr>
-        <w:t>{{</w:t>
-      </w:r>
-      <w:proofErr w:type="spellStart"/>
-      <w:r>
-        <w:rPr>
-          <w:rFonts w:ascii="Arial" w:hAnsi="Arial" w:cs="Arial"/>
-          <w:bCs/>
-        </w:rPr>
-        <w:t>completed_by_telephone</w:t>
-      </w:r>
-      <w:proofErr w:type="spellEnd"/>
-      <w:r>
-        <w:rPr>
-          <w:rFonts w:ascii="Arial" w:hAnsi="Arial" w:cs="Arial"/>
-          <w:bCs/>
-        </w:rPr>
-        <w:t>}}</w:t>
+        <w:t>{{completed_by_telephone}}</w:t>
       </w:r>
     </w:p>
     <w:p>
@@ -8162,23 +6672,7 @@
           <w:rFonts w:ascii="Arial" w:hAnsi="Arial" w:cs="Arial"/>
           <w:bCs/>
         </w:rPr>
-        <w:t>{{</w:t>
-      </w:r>
-      <w:proofErr w:type="spellStart"/>
-      <w:r>
-        <w:rPr>
-          <w:rFonts w:ascii="Arial" w:hAnsi="Arial" w:cs="Arial"/>
-          <w:bCs/>
-        </w:rPr>
-        <w:t>completed_by_email</w:t>
-      </w:r>
-      <w:proofErr w:type="spellEnd"/>
-      <w:r>
-        <w:rPr>
-          <w:rFonts w:ascii="Arial" w:hAnsi="Arial" w:cs="Arial"/>
-          <w:bCs/>
-        </w:rPr>
-        <w:t>}}</w:t>
+        <w:t>{{completed_by_email}}</w:t>
       </w:r>
     </w:p>
     <w:p>
@@ -8216,23 +6710,7 @@
           <w:rFonts w:ascii="Arial" w:hAnsi="Arial" w:cs="Arial"/>
           <w:bCs/>
         </w:rPr>
-        <w:t>{{</w:t>
-      </w:r>
-      <w:proofErr w:type="spellStart"/>
-      <w:r>
-        <w:rPr>
-          <w:rFonts w:ascii="Arial" w:hAnsi="Arial" w:cs="Arial"/>
-          <w:bCs/>
-        </w:rPr>
-        <w:t>completed_by_region</w:t>
-      </w:r>
-      <w:proofErr w:type="spellEnd"/>
-      <w:r>
-        <w:rPr>
-          <w:rFonts w:ascii="Arial" w:hAnsi="Arial" w:cs="Arial"/>
-          <w:bCs/>
-        </w:rPr>
-        <w:t>}}</w:t>
+        <w:t>{{completed_by_region}}</w:t>
       </w:r>
     </w:p>
     <w:p>
@@ -8287,23 +6765,7 @@
           <w:rFonts w:ascii="Arial" w:hAnsi="Arial" w:cs="Arial"/>
           <w:bCs/>
         </w:rPr>
-        <w:t>{{</w:t>
-      </w:r>
-      <w:proofErr w:type="spellStart"/>
-      <w:r>
-        <w:rPr>
-          <w:rFonts w:ascii="Arial" w:hAnsi="Arial" w:cs="Arial"/>
-          <w:bCs/>
-        </w:rPr>
-        <w:t>completed_by_local_delivery_unit</w:t>
-      </w:r>
-      <w:proofErr w:type="spellEnd"/>
-      <w:r>
-        <w:rPr>
-          <w:rFonts w:ascii="Arial" w:hAnsi="Arial" w:cs="Arial"/>
-          <w:bCs/>
-        </w:rPr>
-        <w:t>}}</w:t>
+        <w:t>{{completed_by_local_delivery_unit}}</w:t>
       </w:r>
     </w:p>
     <w:p>
@@ -8364,23 +6826,7 @@
           <w:rFonts w:ascii="Arial" w:hAnsi="Arial" w:cs="Arial"/>
           <w:bCs/>
         </w:rPr>
-        <w:t>{{</w:t>
-      </w:r>
-      <w:proofErr w:type="spellStart"/>
-      <w:r>
-        <w:rPr>
-          <w:rFonts w:ascii="Arial" w:hAnsi="Arial" w:cs="Arial"/>
-          <w:bCs/>
-        </w:rPr>
-        <w:t>completed_by_ppcs_query_emails</w:t>
-      </w:r>
-      <w:proofErr w:type="spellEnd"/>
-      <w:r>
-        <w:rPr>
-          <w:rFonts w:ascii="Arial" w:hAnsi="Arial" w:cs="Arial"/>
-          <w:bCs/>
-        </w:rPr>
-        <w:t>}}</w:t>
+        <w:t>{{completed_by_ppcs_query_emails}}</w:t>
       </w:r>
     </w:p>
     <w:p>
@@ -8418,23 +6864,7 @@
           <w:rFonts w:ascii="Arial" w:hAnsi="Arial" w:cs="Arial"/>
           <w:bCs/>
         </w:rPr>
-        <w:t>{{</w:t>
-      </w:r>
-      <w:proofErr w:type="spellStart"/>
-      <w:r>
-        <w:rPr>
-          <w:rFonts w:ascii="Arial" w:hAnsi="Arial" w:cs="Arial"/>
-          <w:bCs/>
-        </w:rPr>
-        <w:t>date_of_decision</w:t>
-      </w:r>
-      <w:proofErr w:type="spellEnd"/>
-      <w:r>
-        <w:rPr>
-          <w:rFonts w:ascii="Arial" w:hAnsi="Arial" w:cs="Arial"/>
-          <w:bCs/>
-        </w:rPr>
-        <w:t>}}</w:t>
+        <w:t>{{date_of_decision}}</w:t>
       </w:r>
     </w:p>
     <w:p>
@@ -8471,23 +6901,7 @@
           <w:rFonts w:ascii="Arial" w:hAnsi="Arial" w:cs="Arial"/>
           <w:bCs/>
         </w:rPr>
-        <w:t>{{</w:t>
-      </w:r>
-      <w:proofErr w:type="spellStart"/>
-      <w:r>
-        <w:rPr>
-          <w:rFonts w:ascii="Arial" w:hAnsi="Arial" w:cs="Arial"/>
-          <w:bCs/>
-        </w:rPr>
-        <w:t>time_of_decision</w:t>
-      </w:r>
-      <w:proofErr w:type="spellEnd"/>
-      <w:r>
-        <w:rPr>
-          <w:rFonts w:ascii="Arial" w:hAnsi="Arial" w:cs="Arial"/>
-          <w:bCs/>
-        </w:rPr>
-        <w:t>}}</w:t>
+        <w:t>{{time_of_decision}}</w:t>
       </w:r>
     </w:p>
     <w:p>
@@ -8599,23 +7013,7 @@
           <w:rFonts w:ascii="Arial" w:hAnsi="Arial" w:cs="Arial"/>
           <w:bCs/>
         </w:rPr>
-        <w:t>{{</w:t>
-      </w:r>
-      <w:proofErr w:type="spellStart"/>
-      <w:r>
-        <w:rPr>
-          <w:rFonts w:ascii="Arial" w:hAnsi="Arial" w:cs="Arial"/>
-          <w:bCs/>
-        </w:rPr>
-        <w:t>spo_countersign_complete</w:t>
-      </w:r>
-      <w:proofErr w:type="spellEnd"/>
-      <w:r>
-        <w:rPr>
-          <w:rFonts w:ascii="Arial" w:hAnsi="Arial" w:cs="Arial"/>
-          <w:bCs/>
-        </w:rPr>
-        <w:t>}}</w:t>
+        <w:t>{{spo_countersign_complete}}</w:t>
       </w:r>
       <w:r>
         <w:rPr>
@@ -8704,23 +7102,7 @@
           <w:rFonts w:ascii="Arial" w:hAnsi="Arial" w:cs="Arial"/>
           <w:bCs/>
         </w:rPr>
-        <w:t>{{</w:t>
-      </w:r>
-      <w:proofErr w:type="spellStart"/>
-      <w:r>
-        <w:rPr>
-          <w:rFonts w:ascii="Arial" w:hAnsi="Arial" w:cs="Arial"/>
-          <w:bCs/>
-        </w:rPr>
-        <w:t>spo_countersign_complete</w:t>
-      </w:r>
-      <w:proofErr w:type="spellEnd"/>
-      <w:r>
-        <w:rPr>
-          <w:rFonts w:ascii="Arial" w:hAnsi="Arial" w:cs="Arial"/>
-          <w:bCs/>
-        </w:rPr>
-        <w:t>}}</w:t>
+        <w:t>{{spo_countersign_complete}}</w:t>
       </w:r>
       <w:r>
         <w:rPr>
@@ -8761,23 +7143,7 @@
           <w:rFonts w:ascii="Arial" w:hAnsi="Arial" w:cs="Arial"/>
           <w:bCs/>
         </w:rPr>
-        <w:t>{{</w:t>
-      </w:r>
-      <w:proofErr w:type="spellStart"/>
-      <w:r>
-        <w:rPr>
-          <w:rFonts w:ascii="Arial" w:hAnsi="Arial" w:cs="Arial"/>
-          <w:bCs/>
-        </w:rPr>
-        <w:t>spo_countersign_complete</w:t>
-      </w:r>
-      <w:proofErr w:type="spellEnd"/>
-      <w:r>
-        <w:rPr>
-          <w:rFonts w:ascii="Arial" w:hAnsi="Arial" w:cs="Arial"/>
-          <w:bCs/>
-        </w:rPr>
-        <w:t>}}</w:t>
+        <w:t>{{spo_countersign_complete}}</w:t>
       </w:r>
       <w:r>
         <w:rPr>
@@ -8821,23 +7187,7 @@
           <w:rFonts w:ascii="Arial" w:hAnsi="Arial" w:cs="Arial"/>
           <w:bCs/>
         </w:rPr>
-        <w:t>{{</w:t>
-      </w:r>
-      <w:proofErr w:type="spellStart"/>
-      <w:r>
-        <w:rPr>
-          <w:rFonts w:ascii="Arial" w:hAnsi="Arial" w:cs="Arial"/>
-          <w:bCs/>
-        </w:rPr>
-        <w:t>spo_countersign_complete</w:t>
-      </w:r>
-      <w:proofErr w:type="spellEnd"/>
-      <w:r>
-        <w:rPr>
-          <w:rFonts w:ascii="Arial" w:hAnsi="Arial" w:cs="Arial"/>
-          <w:bCs/>
-        </w:rPr>
-        <w:t>}}</w:t>
+        <w:t>{{spo_countersign_complete}}</w:t>
       </w:r>
       <w:r>
         <w:rPr>
@@ -8878,23 +7228,7 @@
           <w:rFonts w:ascii="Arial" w:hAnsi="Arial" w:cs="Arial"/>
           <w:bCs/>
         </w:rPr>
-        <w:t>{{</w:t>
-      </w:r>
-      <w:proofErr w:type="spellStart"/>
-      <w:r>
-        <w:rPr>
-          <w:rFonts w:ascii="Arial" w:hAnsi="Arial" w:cs="Arial"/>
-          <w:bCs/>
-        </w:rPr>
-        <w:t>spo_countersign_complete</w:t>
-      </w:r>
-      <w:proofErr w:type="spellEnd"/>
-      <w:r>
-        <w:rPr>
-          <w:rFonts w:ascii="Arial" w:hAnsi="Arial" w:cs="Arial"/>
-          <w:bCs/>
-        </w:rPr>
-        <w:t>}}</w:t>
+        <w:t>{{spo_countersign_complete}}</w:t>
       </w:r>
       <w:r>
         <w:rPr>
@@ -8962,23 +7296,7 @@
           <w:rFonts w:ascii="Arial" w:hAnsi="Arial" w:cs="Arial"/>
           <w:bCs/>
         </w:rPr>
-        <w:t>{{</w:t>
-      </w:r>
-      <w:proofErr w:type="spellStart"/>
-      <w:r>
-        <w:rPr>
-          <w:rFonts w:ascii="Arial" w:hAnsi="Arial" w:cs="Arial"/>
-          <w:bCs/>
-        </w:rPr>
-        <w:t>countersign_spo_exposition</w:t>
-      </w:r>
-      <w:proofErr w:type="spellEnd"/>
-      <w:r>
-        <w:rPr>
-          <w:rFonts w:ascii="Arial" w:hAnsi="Arial" w:cs="Arial"/>
-          <w:bCs/>
-        </w:rPr>
-        <w:t>}</w:t>
+        <w:t>{{countersign_spo_exposition}</w:t>
       </w:r>
       <w:r>
         <w:rPr>
@@ -9017,23 +7335,7 @@
           <w:rFonts w:ascii="Arial" w:hAnsi="Arial" w:cs="Arial"/>
           <w:bCs/>
         </w:rPr>
-        <w:t>{{</w:t>
-      </w:r>
-      <w:proofErr w:type="spellStart"/>
-      <w:r>
-        <w:rPr>
-          <w:rFonts w:ascii="Arial" w:hAnsi="Arial" w:cs="Arial"/>
-          <w:bCs/>
-        </w:rPr>
-        <w:t>countersign_spo_name</w:t>
-      </w:r>
-      <w:proofErr w:type="spellEnd"/>
-      <w:r>
-        <w:rPr>
-          <w:rFonts w:ascii="Arial" w:hAnsi="Arial" w:cs="Arial"/>
-          <w:bCs/>
-        </w:rPr>
-        <w:t>}}</w:t>
+        <w:t>{{countersign_spo_name}}</w:t>
       </w:r>
     </w:p>
     <w:p>
@@ -9064,23 +7366,7 @@
           <w:rFonts w:ascii="Arial" w:hAnsi="Arial" w:cs="Arial"/>
           <w:bCs/>
         </w:rPr>
-        <w:t>{{</w:t>
-      </w:r>
-      <w:proofErr w:type="spellStart"/>
-      <w:r>
-        <w:rPr>
-          <w:rFonts w:ascii="Arial" w:hAnsi="Arial" w:cs="Arial"/>
-          <w:bCs/>
-        </w:rPr>
-        <w:t>countersign_spo_email</w:t>
-      </w:r>
-      <w:proofErr w:type="spellEnd"/>
-      <w:r>
-        <w:rPr>
-          <w:rFonts w:ascii="Arial" w:hAnsi="Arial" w:cs="Arial"/>
-          <w:bCs/>
-        </w:rPr>
-        <w:t>}}</w:t>
+        <w:t>{{countersign_spo_email}}</w:t>
       </w:r>
     </w:p>
     <w:p>
@@ -9118,23 +7404,7 @@
           <w:rFonts w:ascii="Arial" w:hAnsi="Arial" w:cs="Arial"/>
           <w:bCs/>
         </w:rPr>
-        <w:t>{{</w:t>
-      </w:r>
-      <w:proofErr w:type="spellStart"/>
-      <w:r>
-        <w:rPr>
-          <w:rFonts w:ascii="Arial" w:hAnsi="Arial" w:cs="Arial"/>
-          <w:bCs/>
-        </w:rPr>
-        <w:t>countersign_spo_telephone</w:t>
-      </w:r>
-      <w:proofErr w:type="spellEnd"/>
-      <w:r>
-        <w:rPr>
-          <w:rFonts w:ascii="Arial" w:hAnsi="Arial" w:cs="Arial"/>
-          <w:bCs/>
-        </w:rPr>
-        <w:t>}}</w:t>
+        <w:t>{{countersign_spo_telephone}}</w:t>
       </w:r>
     </w:p>
     <w:p>
@@ -9201,23 +7471,7 @@
           <w:rFonts w:ascii="Arial" w:hAnsi="Arial" w:cs="Arial"/>
           <w:bCs/>
         </w:rPr>
-        <w:t>{{</w:t>
-      </w:r>
-      <w:proofErr w:type="spellStart"/>
-      <w:r>
-        <w:rPr>
-          <w:rFonts w:ascii="Arial" w:hAnsi="Arial" w:cs="Arial"/>
-          <w:bCs/>
-        </w:rPr>
-        <w:t>date_of_decision</w:t>
-      </w:r>
-      <w:proofErr w:type="spellEnd"/>
-      <w:r>
-        <w:rPr>
-          <w:rFonts w:ascii="Arial" w:hAnsi="Arial" w:cs="Arial"/>
-          <w:bCs/>
-        </w:rPr>
-        <w:t>}}</w:t>
+        <w:t>{{date_of_decision}}</w:t>
       </w:r>
       <w:r>
         <w:rPr>
@@ -9231,23 +7485,7 @@
           <w:rFonts w:ascii="Arial" w:hAnsi="Arial" w:cs="Arial"/>
           <w:bCs/>
         </w:rPr>
-        <w:t>{{</w:t>
-      </w:r>
-      <w:proofErr w:type="spellStart"/>
-      <w:r>
-        <w:rPr>
-          <w:rFonts w:ascii="Arial" w:hAnsi="Arial" w:cs="Arial"/>
-          <w:bCs/>
-        </w:rPr>
-        <w:t>time_of_decision</w:t>
-      </w:r>
-      <w:proofErr w:type="spellEnd"/>
-      <w:r>
-        <w:rPr>
-          <w:rFonts w:ascii="Arial" w:hAnsi="Arial" w:cs="Arial"/>
-          <w:bCs/>
-        </w:rPr>
-        <w:t>}}</w:t>
+        <w:t>{{time_of_decision}}</w:t>
       </w:r>
     </w:p>
     <w:p>
@@ -9305,23 +7543,7 @@
           <w:rFonts w:ascii="Arial" w:hAnsi="Arial" w:cs="Arial"/>
           <w:bCs/>
         </w:rPr>
-        <w:t>{{</w:t>
-      </w:r>
-      <w:proofErr w:type="spellStart"/>
-      <w:r>
-        <w:rPr>
-          <w:rFonts w:ascii="Arial" w:hAnsi="Arial" w:cs="Arial"/>
-          <w:bCs/>
-        </w:rPr>
-        <w:t>countersign_spo_date</w:t>
-      </w:r>
-      <w:proofErr w:type="spellEnd"/>
-      <w:r>
-        <w:rPr>
-          <w:rFonts w:ascii="Arial" w:hAnsi="Arial" w:cs="Arial"/>
-          <w:bCs/>
-        </w:rPr>
-        <w:t>}}</w:t>
+        <w:t>{{countersign_spo_date}}</w:t>
       </w:r>
     </w:p>
     <w:p>
@@ -9375,23 +7597,7 @@
           <w:rFonts w:ascii="Arial" w:hAnsi="Arial" w:cs="Arial"/>
           <w:bCs/>
         </w:rPr>
-        <w:t>{{</w:t>
-      </w:r>
-      <w:proofErr w:type="spellStart"/>
-      <w:r>
-        <w:rPr>
-          <w:rFonts w:ascii="Arial" w:hAnsi="Arial" w:cs="Arial"/>
-          <w:bCs/>
-        </w:rPr>
-        <w:t>countersign_spo_time</w:t>
-      </w:r>
-      <w:proofErr w:type="spellEnd"/>
-      <w:r>
-        <w:rPr>
-          <w:rFonts w:ascii="Arial" w:hAnsi="Arial" w:cs="Arial"/>
-          <w:bCs/>
-        </w:rPr>
-        <w:t>}}</w:t>
+        <w:t>{{countersign_spo_time}}</w:t>
       </w:r>
     </w:p>
     <w:p>
@@ -9505,23 +7711,7 @@
           <w:rFonts w:ascii="Arial" w:hAnsi="Arial" w:cs="Arial"/>
           <w:bCs/>
         </w:rPr>
-        <w:t>{{</w:t>
-      </w:r>
-      <w:proofErr w:type="spellStart"/>
-      <w:r>
-        <w:rPr>
-          <w:rFonts w:ascii="Arial" w:hAnsi="Arial" w:cs="Arial"/>
-          <w:bCs/>
-        </w:rPr>
-        <w:t>aco_countersign_complete</w:t>
-      </w:r>
-      <w:proofErr w:type="spellEnd"/>
-      <w:r>
-        <w:rPr>
-          <w:rFonts w:ascii="Arial" w:hAnsi="Arial" w:cs="Arial"/>
-          <w:bCs/>
-        </w:rPr>
-        <w:t>}}</w:t>
+        <w:t>{{aco_countersign_complete}}</w:t>
       </w:r>
       <w:r>
         <w:rPr>
@@ -9647,23 +7837,7 @@
           <w:rFonts w:ascii="Arial" w:hAnsi="Arial" w:cs="Arial"/>
           <w:bCs/>
         </w:rPr>
-        <w:t>{{</w:t>
-      </w:r>
-      <w:proofErr w:type="spellStart"/>
-      <w:r>
-        <w:rPr>
-          <w:rFonts w:ascii="Arial" w:hAnsi="Arial" w:cs="Arial"/>
-          <w:bCs/>
-        </w:rPr>
-        <w:t>countersign_aco_exposition</w:t>
-      </w:r>
-      <w:proofErr w:type="spellEnd"/>
-      <w:r>
-        <w:rPr>
-          <w:rFonts w:ascii="Arial" w:hAnsi="Arial" w:cs="Arial"/>
-          <w:bCs/>
-        </w:rPr>
-        <w:t>}}</w:t>
+        <w:t>{{countersign_aco_exposition}}</w:t>
       </w:r>
     </w:p>
     <w:p>
@@ -9695,23 +7869,7 @@
           <w:rFonts w:ascii="Arial" w:hAnsi="Arial" w:cs="Arial"/>
           <w:bCs/>
         </w:rPr>
-        <w:t>{{</w:t>
-      </w:r>
-      <w:proofErr w:type="spellStart"/>
-      <w:r>
-        <w:rPr>
-          <w:rFonts w:ascii="Arial" w:hAnsi="Arial" w:cs="Arial"/>
-          <w:bCs/>
-        </w:rPr>
-        <w:t>countersign_aco_name</w:t>
-      </w:r>
-      <w:proofErr w:type="spellEnd"/>
-      <w:r>
-        <w:rPr>
-          <w:rFonts w:ascii="Arial" w:hAnsi="Arial" w:cs="Arial"/>
-          <w:bCs/>
-        </w:rPr>
-        <w:t>}}</w:t>
+        <w:t>{{countersign_aco_name}}</w:t>
       </w:r>
     </w:p>
     <w:p>
@@ -9743,23 +7901,7 @@
           <w:rFonts w:ascii="Arial" w:hAnsi="Arial" w:cs="Arial"/>
           <w:bCs/>
         </w:rPr>
-        <w:t>{{</w:t>
-      </w:r>
-      <w:proofErr w:type="spellStart"/>
-      <w:r>
-        <w:rPr>
-          <w:rFonts w:ascii="Arial" w:hAnsi="Arial" w:cs="Arial"/>
-          <w:bCs/>
-        </w:rPr>
-        <w:t>countersign_aco_telephone</w:t>
-      </w:r>
-      <w:proofErr w:type="spellEnd"/>
-      <w:r>
-        <w:rPr>
-          <w:rFonts w:ascii="Arial" w:hAnsi="Arial" w:cs="Arial"/>
-          <w:bCs/>
-        </w:rPr>
-        <w:t>}}</w:t>
+        <w:t>{{countersign_aco_telephone}}</w:t>
       </w:r>
     </w:p>
     <w:p>
@@ -9791,23 +7933,7 @@
           <w:rFonts w:ascii="Arial" w:hAnsi="Arial" w:cs="Arial"/>
           <w:bCs/>
         </w:rPr>
-        <w:t>{{</w:t>
-      </w:r>
-      <w:proofErr w:type="spellStart"/>
-      <w:r>
-        <w:rPr>
-          <w:rFonts w:ascii="Arial" w:hAnsi="Arial" w:cs="Arial"/>
-          <w:bCs/>
-        </w:rPr>
-        <w:t>countersign_aco_email</w:t>
-      </w:r>
-      <w:proofErr w:type="spellEnd"/>
-      <w:r>
-        <w:rPr>
-          <w:rFonts w:ascii="Arial" w:hAnsi="Arial" w:cs="Arial"/>
-          <w:bCs/>
-        </w:rPr>
-        <w:t>}}</w:t>
+        <w:t>{{countersign_aco_email}}</w:t>
       </w:r>
     </w:p>
     <w:p>
@@ -9839,23 +7965,7 @@
           <w:rFonts w:ascii="Arial" w:hAnsi="Arial" w:cs="Arial"/>
           <w:bCs/>
         </w:rPr>
-        <w:t>{{</w:t>
-      </w:r>
-      <w:proofErr w:type="spellStart"/>
-      <w:r>
-        <w:rPr>
-          <w:rFonts w:ascii="Arial" w:hAnsi="Arial" w:cs="Arial"/>
-          <w:bCs/>
-        </w:rPr>
-        <w:t>countersign_aco_date</w:t>
-      </w:r>
-      <w:proofErr w:type="spellEnd"/>
-      <w:r>
-        <w:rPr>
-          <w:rFonts w:ascii="Arial" w:hAnsi="Arial" w:cs="Arial"/>
-          <w:bCs/>
-        </w:rPr>
-        <w:t>}}</w:t>
+        <w:t>{{countersign_aco_date}}</w:t>
       </w:r>
     </w:p>
     <w:p>
@@ -9887,23 +7997,7 @@
           <w:rFonts w:ascii="Arial" w:hAnsi="Arial" w:cs="Arial"/>
           <w:bCs/>
         </w:rPr>
-        <w:t>{{</w:t>
-      </w:r>
-      <w:proofErr w:type="spellStart"/>
-      <w:r>
-        <w:rPr>
-          <w:rFonts w:ascii="Arial" w:hAnsi="Arial" w:cs="Arial"/>
-          <w:bCs/>
-        </w:rPr>
-        <w:t>countersign_aco_time</w:t>
-      </w:r>
-      <w:proofErr w:type="spellEnd"/>
-      <w:r>
-        <w:rPr>
-          <w:rFonts w:ascii="Arial" w:hAnsi="Arial" w:cs="Arial"/>
-          <w:bCs/>
-        </w:rPr>
-        <w:t>}}</w:t>
+        <w:t>{{countersign_aco_time}}</w:t>
       </w:r>
     </w:p>
     <w:p>
@@ -9934,23 +8028,7 @@
           <w:rFonts w:ascii="Arial" w:hAnsi="Arial" w:cs="Arial"/>
           <w:bCs/>
         </w:rPr>
-        <w:t>{{</w:t>
-      </w:r>
-      <w:proofErr w:type="spellStart"/>
-      <w:r>
-        <w:rPr>
-          <w:rFonts w:ascii="Arial" w:hAnsi="Arial" w:cs="Arial"/>
-          <w:bCs/>
-        </w:rPr>
-        <w:t>revocation_order_recipients</w:t>
-      </w:r>
-      <w:proofErr w:type="spellEnd"/>
-      <w:r>
-        <w:rPr>
-          <w:rFonts w:ascii="Arial" w:hAnsi="Arial" w:cs="Arial"/>
-          <w:bCs/>
-        </w:rPr>
-        <w:t>}}</w:t>
+        <w:t>{{revocation_order_recipients}}</w:t>
       </w:r>
     </w:p>
     <w:p>
@@ -18478,6 +16556,7 @@
     <w:rsid w:val="004D7232"/>
     <w:rsid w:val="004D7B0C"/>
     <w:rsid w:val="004F6B84"/>
+    <w:rsid w:val="00510E43"/>
     <w:rsid w:val="0051613B"/>
     <w:rsid w:val="00561FFB"/>
     <w:rsid w:val="0056357E"/>
@@ -18526,8 +16605,10 @@
     <w:rsid w:val="00C45073"/>
     <w:rsid w:val="00C73BA4"/>
     <w:rsid w:val="00C827E2"/>
+    <w:rsid w:val="00CD3DCA"/>
     <w:rsid w:val="00CE5DE0"/>
     <w:rsid w:val="00CF7AD2"/>
+    <w:rsid w:val="00D004B7"/>
     <w:rsid w:val="00D13037"/>
     <w:rsid w:val="00D64F8F"/>
     <w:rsid w:val="00D72393"/>
@@ -19327,10 +17408,19 @@
 </file>
 
 <file path=customXml/item1.xml><?xml version="1.0" encoding="utf-8"?>
+<?mso-contentType ?>
+<FormTemplates xmlns="http://schemas.microsoft.com/sharepoint/v3/contenttype/forms">
+  <Display>DocumentLibraryForm</Display>
+  <Edit>DocumentLibraryForm</Edit>
+  <New>DocumentLibraryForm</New>
+</FormTemplates>
+</file>
+
+<file path=customXml/item2.xml><?xml version="1.0" encoding="utf-8"?>
 <b:Sources xmlns:b="http://schemas.openxmlformats.org/officeDocument/2006/bibliography" xmlns="http://schemas.openxmlformats.org/officeDocument/2006/bibliography" SelectedStyle="" StyleName="" Version="0"/>
 </file>
 
-<file path=customXml/item2.xml><?xml version="1.0" encoding="utf-8"?>
+<file path=customXml/item3.xml><?xml version="1.0" encoding="utf-8"?>
 <p:properties xmlns:p="http://schemas.microsoft.com/office/2006/metadata/properties" xmlns:xsi="http://www.w3.org/2001/XMLSchema-instance" xmlns:pc="http://schemas.microsoft.com/office/infopath/2007/PartnerControls">
   <documentManagement>
     <lcf76f155ced4ddcb4097134ff3c332f xmlns="2244256a-353e-4aaa-84de-68fbd58bc0b5">
@@ -19342,7 +17432,7 @@
 </p:properties>
 </file>
 
-<file path=customXml/item3.xml><?xml version="1.0" encoding="utf-8"?>
+<file path=customXml/item4.xml><?xml version="1.0" encoding="utf-8"?>
 <ct:contentTypeSchema xmlns:ct="http://schemas.microsoft.com/office/2006/metadata/contentType" xmlns:ma="http://schemas.microsoft.com/office/2006/metadata/properties/metaAttributes" ct:_="" ma:_="" ma:contentTypeName="Document" ma:contentTypeID="0x010100BB15E224CEB19F4BA17DCD08B156C20E" ma:contentTypeVersion="14" ma:contentTypeDescription="Create a new document." ma:contentTypeScope="" ma:versionID="7cd304efa23d0061db26e2f05b6414b1">
   <xsd:schema xmlns:xsd="http://www.w3.org/2001/XMLSchema" xmlns:xs="http://www.w3.org/2001/XMLSchema" xmlns:p="http://schemas.microsoft.com/office/2006/metadata/properties" xmlns:ns2="2244256a-353e-4aaa-84de-68fbd58bc0b5" xmlns:ns3="461e5654-0e9a-4527-837d-fdc364c1f1ed" targetNamespace="http://schemas.microsoft.com/office/2006/metadata/properties" ma:root="true" ma:fieldsID="44df93feef4834377720eaaf16faf4fa" ns2:_="" ns3:_="">
     <xsd:import namespace="2244256a-353e-4aaa-84de-68fbd58bc0b5"/>
@@ -19555,16 +17645,15 @@
 </ct:contentTypeSchema>
 </file>
 
-<file path=customXml/item4.xml><?xml version="1.0" encoding="utf-8"?>
-<?mso-contentType ?>
-<FormTemplates xmlns="http://schemas.microsoft.com/sharepoint/v3/contenttype/forms">
-  <Display>DocumentLibraryForm</Display>
-  <Edit>DocumentLibraryForm</Edit>
-  <New>DocumentLibraryForm</New>
-</FormTemplates>
+<file path=customXml/itemProps1.xml><?xml version="1.0" encoding="utf-8"?>
+<ds:datastoreItem xmlns:ds="http://schemas.openxmlformats.org/officeDocument/2006/customXml" ds:itemID="{9C893AAC-1781-44C1-940F-A467E506D9D1}">
+  <ds:schemaRefs>
+    <ds:schemaRef ds:uri="http://schemas.microsoft.com/sharepoint/v3/contenttype/forms"/>
+  </ds:schemaRefs>
+</ds:datastoreItem>
 </file>
 
-<file path=customXml/itemProps1.xml><?xml version="1.0" encoding="utf-8"?>
+<file path=customXml/itemProps2.xml><?xml version="1.0" encoding="utf-8"?>
 <ds:datastoreItem xmlns:ds="http://schemas.openxmlformats.org/officeDocument/2006/customXml" ds:itemID="{1AA002EC-9FAC-469B-886C-4AD0DF10DF17}">
   <ds:schemaRefs>
     <ds:schemaRef ds:uri="http://schemas.openxmlformats.org/officeDocument/2006/bibliography"/>
@@ -19572,7 +17661,7 @@
 </ds:datastoreItem>
 </file>
 
-<file path=customXml/itemProps2.xml><?xml version="1.0" encoding="utf-8"?>
+<file path=customXml/itemProps3.xml><?xml version="1.0" encoding="utf-8"?>
 <ds:datastoreItem xmlns:ds="http://schemas.openxmlformats.org/officeDocument/2006/customXml" ds:itemID="{D6602E3C-70F5-412B-A646-0548AF3EB1F8}">
   <ds:schemaRefs>
     <ds:schemaRef ds:uri="http://schemas.microsoft.com/office/2006/metadata/properties"/>
@@ -19583,7 +17672,7 @@
 </ds:datastoreItem>
 </file>
 
-<file path=customXml/itemProps3.xml><?xml version="1.0" encoding="utf-8"?>
+<file path=customXml/itemProps4.xml><?xml version="1.0" encoding="utf-8"?>
 <ds:datastoreItem xmlns:ds="http://schemas.openxmlformats.org/officeDocument/2006/customXml" ds:itemID="{79C448BA-7A2C-492D-9615-F080CE57201F}">
   <ds:schemaRefs>
     <ds:schemaRef ds:uri="http://schemas.microsoft.com/office/2006/metadata/contentType"/>
@@ -19600,12 +17689,4 @@
     <ds:schemaRef ds:uri="http://schemas.microsoft.com/internal/obd"/>
   </ds:schemaRefs>
 </ds:datastoreItem>
-</file>
-
-<file path=customXml/itemProps4.xml><?xml version="1.0" encoding="utf-8"?>
-<ds:datastoreItem xmlns:ds="http://schemas.openxmlformats.org/officeDocument/2006/customXml" ds:itemID="{9C893AAC-1781-44C1-940F-A467E506D9D1}">
-  <ds:schemaRefs>
-    <ds:schemaRef ds:uri="http://schemas.microsoft.com/sharepoint/v3/contenttype/forms"/>
-  </ds:schemaRefs>
-</ds:datastoreItem>
 </file>
</xml_diff>

<commit_message>
MRD-3133 fix the SOPC and DCR fields not displaying in exclusion criteria
</commit_message>
<xml_diff>
--- a/src/main/resources/templates/partA/2026-03-31 - FTR56/Part A Template.docx
+++ b/src/main/resources/templates/partA/2026-03-31 - FTR56/Part A Template.docx
@@ -344,67 +344,35 @@
           <w:rFonts w:ascii="Arial" w:hAnsi="Arial" w:cs="Arial"/>
           <w:b/>
         </w:rPr>
-        <w:t xml:space="preserve">an </w:t>
-      </w:r>
-      <w:proofErr w:type="gramStart"/>
-      <w:r>
-        <w:rPr>
-          <w:rFonts w:ascii="Arial" w:hAnsi="Arial" w:cs="Arial"/>
-          <w:b/>
-        </w:rPr>
-        <w:t>Emergency</w:t>
-      </w:r>
-      <w:proofErr w:type="gramEnd"/>
-      <w:r>
-        <w:rPr>
-          <w:rFonts w:ascii="Arial" w:hAnsi="Arial" w:cs="Arial"/>
-          <w:b/>
+        <w:t xml:space="preserve">an Emergency </w:t>
+      </w:r>
+      <w:r>
+        <w:rPr>
+          <w:rFonts w:ascii="Arial" w:hAnsi="Arial" w:cs="Arial"/>
+          <w:b/>
+          <w:bCs/>
+        </w:rPr>
+        <w:t>recall</w:t>
+      </w:r>
+      <w:r>
+        <w:rPr>
+          <w:rFonts w:ascii="Arial" w:hAnsi="Arial" w:cs="Arial"/>
+          <w:b/>
+        </w:rPr>
+        <w:t>?</w:t>
+      </w:r>
+      <w:r>
+        <w:rPr>
+          <w:rFonts w:ascii="Arial" w:hAnsi="Arial" w:cs="Arial"/>
         </w:rPr>
         <w:t xml:space="preserve"> </w:t>
       </w:r>
       <w:r>
         <w:rPr>
           <w:rFonts w:ascii="Arial" w:hAnsi="Arial" w:cs="Arial"/>
-          <w:b/>
-          <w:bCs/>
-        </w:rPr>
-        <w:t>recall</w:t>
-      </w:r>
-      <w:r>
-        <w:rPr>
-          <w:rFonts w:ascii="Arial" w:hAnsi="Arial" w:cs="Arial"/>
-          <w:b/>
-        </w:rPr>
-        <w:t>?</w:t>
-      </w:r>
-      <w:r>
-        <w:rPr>
-          <w:rFonts w:ascii="Arial" w:hAnsi="Arial" w:cs="Arial"/>
-        </w:rPr>
-        <w:t xml:space="preserve"> </w:t>
-      </w:r>
-      <w:r>
-        <w:rPr>
-          <w:rFonts w:ascii="Arial" w:hAnsi="Arial" w:cs="Arial"/>
-          <w:bCs/>
-        </w:rPr>
-        <w:t>{{</w:t>
-      </w:r>
-      <w:proofErr w:type="spellStart"/>
-      <w:r>
-        <w:rPr>
-          <w:rFonts w:ascii="Arial" w:hAnsi="Arial" w:cs="Arial"/>
-          <w:bCs/>
-        </w:rPr>
-        <w:t>is_this_an_emergency_recall</w:t>
-      </w:r>
-      <w:proofErr w:type="spellEnd"/>
-      <w:r>
-        <w:rPr>
-          <w:rFonts w:ascii="Arial" w:hAnsi="Arial" w:cs="Arial"/>
-          <w:bCs/>
-        </w:rPr>
-        <w:t>}}</w:t>
+          <w:bCs/>
+        </w:rPr>
+        <w:t>{{is_this_an_emergency_recall}}</w:t>
       </w:r>
     </w:p>
     <w:p>
@@ -450,23 +418,7 @@
           <w:rFonts w:ascii="Arial" w:hAnsi="Arial" w:cs="Arial"/>
           <w:bCs/>
         </w:rPr>
-        <w:t>{{</w:t>
-      </w:r>
-      <w:proofErr w:type="spellStart"/>
-      <w:r>
-        <w:rPr>
-          <w:rFonts w:ascii="Arial" w:hAnsi="Arial" w:cs="Arial"/>
-          <w:bCs/>
-        </w:rPr>
-        <w:t>indeterminate_sentence_type</w:t>
-      </w:r>
-      <w:proofErr w:type="spellEnd"/>
-      <w:r>
-        <w:rPr>
-          <w:rFonts w:ascii="Arial" w:hAnsi="Arial" w:cs="Arial"/>
-          <w:bCs/>
-        </w:rPr>
-        <w:t xml:space="preserve">}} </w:t>
+        <w:t xml:space="preserve">{{indeterminate_sentence_type}} </w:t>
       </w:r>
       <w:r>
         <w:rPr>
@@ -540,23 +492,7 @@
           <w:rFonts w:ascii="Arial" w:hAnsi="Arial" w:cs="Arial"/>
           <w:bCs/>
         </w:rPr>
-        <w:t>{{</w:t>
-      </w:r>
-      <w:proofErr w:type="spellStart"/>
-      <w:r>
-        <w:rPr>
-          <w:rFonts w:ascii="Arial" w:hAnsi="Arial" w:cs="Arial"/>
-          <w:bCs/>
-        </w:rPr>
-        <w:t>is_extended_sentence</w:t>
-      </w:r>
-      <w:proofErr w:type="spellEnd"/>
-      <w:r>
-        <w:rPr>
-          <w:rFonts w:ascii="Arial" w:hAnsi="Arial" w:cs="Arial"/>
-          <w:bCs/>
-        </w:rPr>
-        <w:t>}}</w:t>
+        <w:t>{{is_extended_sentence}}</w:t>
       </w:r>
       <w:r>
         <w:rPr>
@@ -824,23 +760,7 @@
           <w:rFonts w:ascii="Arial" w:hAnsi="Arial" w:cs="Arial"/>
           <w:bCs/>
         </w:rPr>
-        <w:t>{{</w:t>
-      </w:r>
-      <w:proofErr w:type="spellStart"/>
-      <w:r>
-        <w:rPr>
-          <w:rFonts w:ascii="Arial" w:hAnsi="Arial" w:cs="Arial"/>
-          <w:bCs/>
-        </w:rPr>
-        <w:t>is_serving_youth_sentence</w:t>
-      </w:r>
-      <w:proofErr w:type="spellEnd"/>
-      <w:r>
-        <w:rPr>
-          <w:rFonts w:ascii="Arial" w:hAnsi="Arial" w:cs="Arial"/>
-          <w:bCs/>
-        </w:rPr>
-        <w:t>}}</w:t>
+        <w:t>{{is_serving_youth_sentence}}</w:t>
       </w:r>
       <w:r>
         <w:rPr>
@@ -1285,15 +1205,7 @@
           <w:rFonts w:ascii="Arial" w:hAnsi="Arial" w:cs="Arial"/>
           <w:bCs/>
         </w:rPr>
-        <w:t>{{</w:t>
-      </w:r>
-      <w:proofErr w:type="spellStart"/>
-      <w:r>
-        <w:rPr>
-          <w:rFonts w:ascii="Arial" w:hAnsi="Arial" w:cs="Arial"/>
-          <w:bCs/>
-        </w:rPr>
-        <w:t>is_</w:t>
+        <w:t>{{is_</w:t>
       </w:r>
       <w:r>
         <w:rPr>
@@ -1321,15 +1233,7 @@
           <w:rFonts w:ascii="Arial" w:hAnsi="Arial" w:cs="Arial"/>
           <w:bCs/>
         </w:rPr>
-        <w:t>_serious_offence</w:t>
-      </w:r>
-      <w:proofErr w:type="spellEnd"/>
-      <w:r>
-        <w:rPr>
-          <w:rFonts w:ascii="Arial" w:hAnsi="Arial" w:cs="Arial"/>
-          <w:bCs/>
-        </w:rPr>
-        <w:t>}}</w:t>
+        <w:t>_serious_offence}}</w:t>
       </w:r>
     </w:p>
     <w:p>
@@ -1490,15 +1394,7 @@
           <w:rFonts w:ascii="Arial" w:hAnsi="Arial" w:cs="Arial"/>
           <w:bCs/>
         </w:rPr>
-        <w:t>{{</w:t>
-      </w:r>
-      <w:proofErr w:type="spellStart"/>
-      <w:r>
-        <w:rPr>
-          <w:rFonts w:ascii="Arial" w:hAnsi="Arial" w:cs="Arial"/>
-          <w:bCs/>
-        </w:rPr>
-        <w:t>is_</w:t>
+        <w:t>{{is_</w:t>
       </w:r>
       <w:r>
         <w:rPr>
@@ -1512,15 +1408,7 @@
           <w:rFonts w:ascii="Arial" w:hAnsi="Arial" w:cs="Arial"/>
           <w:bCs/>
         </w:rPr>
-        <w:t>_offence</w:t>
-      </w:r>
-      <w:proofErr w:type="spellEnd"/>
-      <w:r>
-        <w:rPr>
-          <w:rFonts w:ascii="Arial" w:hAnsi="Arial" w:cs="Arial"/>
-          <w:bCs/>
-        </w:rPr>
-        <w:t>}}</w:t>
+        <w:t>_offence}}</w:t>
       </w:r>
     </w:p>
     <w:p>
@@ -1563,7 +1451,6 @@
         </w:rPr>
         <w:t>{{</w:t>
       </w:r>
-      <w:proofErr w:type="spellStart"/>
       <w:r>
         <w:rPr>
           <w:rFonts w:ascii="Arial" w:hAnsi="Arial" w:cs="Arial"/>
@@ -1590,15 +1477,28 @@
           <w:rFonts w:ascii="Arial" w:hAnsi="Arial" w:cs="Arial"/>
           <w:bCs/>
         </w:rPr>
-        <w:t>SOPC_Sentence</w:t>
-      </w:r>
-      <w:proofErr w:type="spellEnd"/>
-      <w:r>
-        <w:rPr>
-          <w:rFonts w:ascii="Arial" w:hAnsi="Arial" w:cs="Arial"/>
-          <w:bCs/>
-        </w:rPr>
-        <w:t>}}</w:t>
+        <w:t>sopc</w:t>
+      </w:r>
+      <w:r>
+        <w:rPr>
+          <w:rFonts w:ascii="Arial" w:hAnsi="Arial" w:cs="Arial"/>
+          <w:bCs/>
+        </w:rPr>
+        <w:t>_</w:t>
+      </w:r>
+      <w:r>
+        <w:rPr>
+          <w:rFonts w:ascii="Arial" w:hAnsi="Arial" w:cs="Arial"/>
+          <w:bCs/>
+        </w:rPr>
+        <w:t>s</w:t>
+      </w:r>
+      <w:r>
+        <w:rPr>
+          <w:rFonts w:ascii="Arial" w:hAnsi="Arial" w:cs="Arial"/>
+          <w:bCs/>
+        </w:rPr>
+        <w:t>entence}}</w:t>
       </w:r>
     </w:p>
     <w:p>
@@ -1629,7 +1529,6 @@
         </w:rPr>
         <w:t>{{</w:t>
       </w:r>
-      <w:proofErr w:type="spellStart"/>
       <w:r>
         <w:rPr>
           <w:rFonts w:ascii="Arial" w:hAnsi="Arial" w:cs="Arial"/>
@@ -1656,15 +1555,21 @@
           <w:rFonts w:ascii="Arial" w:hAnsi="Arial" w:cs="Arial"/>
           <w:bCs/>
         </w:rPr>
-        <w:t>erving_DCR_sentence</w:t>
-      </w:r>
-      <w:proofErr w:type="spellEnd"/>
-      <w:r>
-        <w:rPr>
-          <w:rFonts w:ascii="Arial" w:hAnsi="Arial" w:cs="Arial"/>
-          <w:bCs/>
-        </w:rPr>
-        <w:t>}}</w:t>
+        <w:t>erving_</w:t>
+      </w:r>
+      <w:r>
+        <w:rPr>
+          <w:rFonts w:ascii="Arial" w:hAnsi="Arial" w:cs="Arial"/>
+          <w:bCs/>
+        </w:rPr>
+        <w:t>dcr</w:t>
+      </w:r>
+      <w:r>
+        <w:rPr>
+          <w:rFonts w:ascii="Arial" w:hAnsi="Arial" w:cs="Arial"/>
+          <w:bCs/>
+        </w:rPr>
+        <w:t>_sentence}}</w:t>
       </w:r>
     </w:p>
     <w:p>
@@ -1784,7 +1689,6 @@
         </w:rPr>
         <w:t>{{</w:t>
       </w:r>
-      <w:proofErr w:type="spellStart"/>
       <w:r>
         <w:rPr>
           <w:rFonts w:ascii="Arial" w:hAnsi="Arial" w:cs="Arial"/>
@@ -1797,15 +1701,7 @@
           <w:rFonts w:ascii="Arial" w:hAnsi="Arial" w:cs="Arial"/>
           <w:bCs/>
         </w:rPr>
-        <w:t>s_repatriated_for_murder</w:t>
-      </w:r>
-      <w:proofErr w:type="spellEnd"/>
-      <w:r>
-        <w:rPr>
-          <w:rFonts w:ascii="Arial" w:hAnsi="Arial" w:cs="Arial"/>
-          <w:bCs/>
-        </w:rPr>
-        <w:t>}}</w:t>
+        <w:t>s_repatriated_for_murder}}</w:t>
       </w:r>
     </w:p>
     <w:p>
@@ -1881,7 +1777,6 @@
         </w:rPr>
         <w:t>{{</w:t>
       </w:r>
-      <w:proofErr w:type="spellStart"/>
       <w:r>
         <w:rPr>
           <w:rFonts w:ascii="Arial" w:hAnsi="Arial" w:cs="Arial"/>
@@ -1908,15 +1803,7 @@
           <w:rFonts w:ascii="Arial" w:hAnsi="Arial" w:cs="Arial"/>
           <w:bCs/>
         </w:rPr>
-        <w:t>involved_in_foreign_power_threat</w:t>
-      </w:r>
-      <w:proofErr w:type="spellEnd"/>
-      <w:r>
-        <w:rPr>
-          <w:rFonts w:ascii="Arial" w:hAnsi="Arial" w:cs="Arial"/>
-          <w:bCs/>
-        </w:rPr>
-        <w:t>}}</w:t>
+        <w:t>involved_in_foreign_power_threat}}</w:t>
       </w:r>
     </w:p>
     <w:p>
@@ -1948,7 +1835,6 @@
         </w:rPr>
         <w:t>{{</w:t>
       </w:r>
-      <w:proofErr w:type="spellStart"/>
       <w:r>
         <w:rPr>
           <w:rFonts w:ascii="Arial" w:hAnsi="Arial" w:cs="Arial"/>
@@ -1963,7 +1849,6 @@
         </w:rPr>
         <w:t>security_offence</w:t>
       </w:r>
-      <w:proofErr w:type="spellEnd"/>
       <w:r>
         <w:rPr>
           <w:rFonts w:ascii="Arial" w:hAnsi="Arial" w:cs="Arial"/>
@@ -2101,23 +1986,7 @@
           <w:rFonts w:ascii="Arial" w:hAnsi="Arial" w:cs="Arial"/>
           <w:bCs/>
         </w:rPr>
-        <w:t>{{</w:t>
-      </w:r>
-      <w:proofErr w:type="spellStart"/>
-      <w:r>
-        <w:rPr>
-          <w:rFonts w:ascii="Arial" w:hAnsi="Arial" w:cs="Arial"/>
-          <w:bCs/>
-        </w:rPr>
-        <w:t>date_of_birth</w:t>
-      </w:r>
-      <w:proofErr w:type="spellEnd"/>
-      <w:r>
-        <w:rPr>
-          <w:rFonts w:ascii="Arial" w:hAnsi="Arial" w:cs="Arial"/>
-          <w:bCs/>
-        </w:rPr>
-        <w:t>}}</w:t>
+        <w:t>{{date_of_birth}}</w:t>
       </w:r>
     </w:p>
     <w:p>
@@ -2187,23 +2056,7 @@
           <w:rFonts w:ascii="Arial" w:hAnsi="Arial" w:cs="Arial"/>
           <w:bCs/>
         </w:rPr>
-        <w:t>{{</w:t>
-      </w:r>
-      <w:proofErr w:type="spellStart"/>
-      <w:r>
-        <w:rPr>
-          <w:rFonts w:ascii="Arial" w:hAnsi="Arial" w:cs="Arial"/>
-          <w:bCs/>
-        </w:rPr>
-        <w:t>primary_language</w:t>
-      </w:r>
-      <w:proofErr w:type="spellEnd"/>
-      <w:r>
-        <w:rPr>
-          <w:rFonts w:ascii="Arial" w:hAnsi="Arial" w:cs="Arial"/>
-          <w:bCs/>
-        </w:rPr>
-        <w:t>}}</w:t>
+        <w:t>{{primary_language}}</w:t>
       </w:r>
       <w:r>
         <w:rPr>
@@ -2217,23 +2070,7 @@
           <w:rFonts w:ascii="Arial" w:hAnsi="Arial" w:cs="Arial"/>
           <w:bCs/>
         </w:rPr>
-        <w:t>{{</w:t>
-      </w:r>
-      <w:proofErr w:type="spellStart"/>
-      <w:r>
-        <w:rPr>
-          <w:rFonts w:ascii="Arial" w:hAnsi="Arial" w:cs="Arial"/>
-          <w:bCs/>
-        </w:rPr>
-        <w:t>primary_language</w:t>
-      </w:r>
-      <w:proofErr w:type="spellEnd"/>
-      <w:r>
-        <w:rPr>
-          <w:rFonts w:ascii="Arial" w:hAnsi="Arial" w:cs="Arial"/>
-          <w:bCs/>
-        </w:rPr>
-        <w:t>}}</w:t>
+        <w:t>{{primary_language}}</w:t>
       </w:r>
     </w:p>
     <w:p>
@@ -2331,23 +2168,7 @@
           <w:rFonts w:ascii="Arial" w:hAnsi="Arial" w:cs="Arial"/>
           <w:bCs/>
         </w:rPr>
-        <w:t>{{</w:t>
-      </w:r>
-      <w:proofErr w:type="spellStart"/>
-      <w:r>
-        <w:rPr>
-          <w:rFonts w:ascii="Arial" w:hAnsi="Arial" w:cs="Arial"/>
-          <w:bCs/>
-        </w:rPr>
-        <w:t>crn</w:t>
-      </w:r>
-      <w:proofErr w:type="spellEnd"/>
-      <w:r>
-        <w:rPr>
-          <w:rFonts w:ascii="Arial" w:hAnsi="Arial" w:cs="Arial"/>
-          <w:bCs/>
-        </w:rPr>
-        <w:t>}}</w:t>
+        <w:t>{{crn}}</w:t>
       </w:r>
     </w:p>
     <w:p>
@@ -2387,23 +2208,7 @@
           <w:rFonts w:ascii="Arial" w:hAnsi="Arial" w:cs="Arial"/>
           <w:bCs/>
         </w:rPr>
-        <w:t>{{</w:t>
-      </w:r>
-      <w:proofErr w:type="spellStart"/>
-      <w:r>
-        <w:rPr>
-          <w:rFonts w:ascii="Arial" w:hAnsi="Arial" w:cs="Arial"/>
-          <w:bCs/>
-        </w:rPr>
-        <w:t>cro_number</w:t>
-      </w:r>
-      <w:proofErr w:type="spellEnd"/>
-      <w:r>
-        <w:rPr>
-          <w:rFonts w:ascii="Arial" w:hAnsi="Arial" w:cs="Arial"/>
-          <w:bCs/>
-        </w:rPr>
-        <w:t>}}</w:t>
+        <w:t>{{cro_number}}</w:t>
       </w:r>
     </w:p>
     <w:p>
@@ -2436,23 +2241,7 @@
           <w:rFonts w:ascii="Arial" w:hAnsi="Arial" w:cs="Arial"/>
           <w:bCs/>
         </w:rPr>
-        <w:t>{{</w:t>
-      </w:r>
-      <w:proofErr w:type="spellStart"/>
-      <w:r>
-        <w:rPr>
-          <w:rFonts w:ascii="Arial" w:hAnsi="Arial" w:cs="Arial"/>
-          <w:bCs/>
-        </w:rPr>
-        <w:t>pnc_number</w:t>
-      </w:r>
-      <w:proofErr w:type="spellEnd"/>
-      <w:r>
-        <w:rPr>
-          <w:rFonts w:ascii="Arial" w:hAnsi="Arial" w:cs="Arial"/>
-          <w:bCs/>
-        </w:rPr>
-        <w:t>}}</w:t>
+        <w:t>{{pnc_number}}</w:t>
       </w:r>
     </w:p>
     <w:p>
@@ -2484,23 +2273,7 @@
           <w:rFonts w:ascii="Arial" w:hAnsi="Arial" w:cs="Arial"/>
           <w:bCs/>
         </w:rPr>
-        <w:t>{{</w:t>
-      </w:r>
-      <w:proofErr w:type="spellStart"/>
-      <w:r>
-        <w:rPr>
-          <w:rFonts w:ascii="Arial" w:hAnsi="Arial" w:cs="Arial"/>
-          <w:bCs/>
-        </w:rPr>
-        <w:t>most_recent_prisoner_number</w:t>
-      </w:r>
-      <w:proofErr w:type="spellEnd"/>
-      <w:r>
-        <w:rPr>
-          <w:rFonts w:ascii="Arial" w:hAnsi="Arial" w:cs="Arial"/>
-          <w:bCs/>
-        </w:rPr>
-        <w:t>}}</w:t>
+        <w:t>{{most_recent_prisoner_number}}</w:t>
       </w:r>
     </w:p>
     <w:p>
@@ -2540,23 +2313,7 @@
           <w:rFonts w:ascii="Arial" w:hAnsi="Arial" w:cs="Arial"/>
           <w:bCs/>
         </w:rPr>
-        <w:t>{{</w:t>
-      </w:r>
-      <w:proofErr w:type="spellStart"/>
-      <w:r>
-        <w:rPr>
-          <w:rFonts w:ascii="Arial" w:hAnsi="Arial" w:cs="Arial"/>
-          <w:bCs/>
-        </w:rPr>
-        <w:t>noms_number</w:t>
-      </w:r>
-      <w:proofErr w:type="spellEnd"/>
-      <w:r>
-        <w:rPr>
-          <w:rFonts w:ascii="Arial" w:hAnsi="Arial" w:cs="Arial"/>
-          <w:bCs/>
-        </w:rPr>
-        <w:t>}}</w:t>
+        <w:t>{{noms_number}}</w:t>
       </w:r>
     </w:p>
     <w:p>
@@ -2588,23 +2345,7 @@
           <w:rFonts w:ascii="Arial" w:hAnsi="Arial" w:cs="Arial"/>
           <w:bCs/>
         </w:rPr>
-        <w:t>{{</w:t>
-      </w:r>
-      <w:proofErr w:type="spellStart"/>
-      <w:r>
-        <w:rPr>
-          <w:rFonts w:ascii="Arial" w:hAnsi="Arial" w:cs="Arial"/>
-          <w:bCs/>
-        </w:rPr>
-        <w:t>last_releasing_prison</w:t>
-      </w:r>
-      <w:proofErr w:type="spellEnd"/>
-      <w:r>
-        <w:rPr>
-          <w:rFonts w:ascii="Arial" w:hAnsi="Arial" w:cs="Arial"/>
-          <w:bCs/>
-        </w:rPr>
-        <w:t>}}</w:t>
+        <w:t>{{last_releasing_prison}}</w:t>
       </w:r>
     </w:p>
     <w:p>
@@ -2665,23 +2406,7 @@
           <w:rFonts w:ascii="Arial" w:hAnsi="Arial" w:cs="Arial"/>
           <w:bCs/>
         </w:rPr>
-        <w:t>{{</w:t>
-      </w:r>
-      <w:proofErr w:type="spellStart"/>
-      <w:r>
-        <w:rPr>
-          <w:rFonts w:ascii="Arial" w:hAnsi="Arial" w:cs="Arial"/>
-          <w:bCs/>
-        </w:rPr>
-        <w:t>date_of_release</w:t>
-      </w:r>
-      <w:proofErr w:type="spellEnd"/>
-      <w:r>
-        <w:rPr>
-          <w:rFonts w:ascii="Arial" w:hAnsi="Arial" w:cs="Arial"/>
-          <w:bCs/>
-        </w:rPr>
-        <w:t>}}</w:t>
+        <w:t>{{date_of_release}}</w:t>
       </w:r>
     </w:p>
     <w:p>
@@ -2793,23 +2518,7 @@
           <w:rFonts w:ascii="Arial" w:hAnsi="Arial" w:cs="Arial"/>
           <w:bCs/>
         </w:rPr>
-        <w:t>{{</w:t>
-      </w:r>
-      <w:proofErr w:type="spellStart"/>
-      <w:r>
-        <w:rPr>
-          <w:rFonts w:ascii="Arial" w:hAnsi="Arial" w:cs="Arial"/>
-          <w:bCs/>
-        </w:rPr>
-        <w:t>index_offence_description</w:t>
-      </w:r>
-      <w:proofErr w:type="spellEnd"/>
-      <w:r>
-        <w:rPr>
-          <w:rFonts w:ascii="Arial" w:hAnsi="Arial" w:cs="Arial"/>
-          <w:bCs/>
-        </w:rPr>
-        <w:t>}}</w:t>
+        <w:t>{{index_offence_description}}</w:t>
       </w:r>
       <w:r>
         <w:rPr>
@@ -2907,23 +2616,7 @@
           <w:rFonts w:ascii="Arial" w:hAnsi="Arial" w:cs="Arial"/>
           <w:bCs/>
         </w:rPr>
-        <w:t>{{</w:t>
-      </w:r>
-      <w:proofErr w:type="spellStart"/>
-      <w:r>
-        <w:rPr>
-          <w:rFonts w:ascii="Arial" w:hAnsi="Arial" w:cs="Arial"/>
-          <w:bCs/>
-        </w:rPr>
-        <w:t>date_of_original_offence</w:t>
-      </w:r>
-      <w:proofErr w:type="spellEnd"/>
-      <w:r>
-        <w:rPr>
-          <w:rFonts w:ascii="Arial" w:hAnsi="Arial" w:cs="Arial"/>
-          <w:bCs/>
-        </w:rPr>
-        <w:t>}}</w:t>
+        <w:t>{{date_of_original_offence}}</w:t>
       </w:r>
     </w:p>
     <w:p>
@@ -2964,23 +2657,7 @@
           <w:rFonts w:ascii="Arial" w:hAnsi="Arial" w:cs="Arial"/>
           <w:bCs/>
         </w:rPr>
-        <w:t>{{</w:t>
-      </w:r>
-      <w:proofErr w:type="spellStart"/>
-      <w:r>
-        <w:rPr>
-          <w:rFonts w:ascii="Arial" w:hAnsi="Arial" w:cs="Arial"/>
-          <w:bCs/>
-        </w:rPr>
-        <w:t>date_of_sentence</w:t>
-      </w:r>
-      <w:proofErr w:type="spellEnd"/>
-      <w:r>
-        <w:rPr>
-          <w:rFonts w:ascii="Arial" w:hAnsi="Arial" w:cs="Arial"/>
-          <w:bCs/>
-        </w:rPr>
-        <w:t>}}</w:t>
+        <w:t>{{date_of_sentence}}</w:t>
       </w:r>
     </w:p>
     <w:p>
@@ -3021,23 +2698,7 @@
           <w:rFonts w:ascii="Arial" w:hAnsi="Arial" w:cs="Arial"/>
           <w:bCs/>
         </w:rPr>
-        <w:t>{{</w:t>
-      </w:r>
-      <w:proofErr w:type="spellStart"/>
-      <w:r>
-        <w:rPr>
-          <w:rFonts w:ascii="Arial" w:hAnsi="Arial" w:cs="Arial"/>
-          <w:bCs/>
-        </w:rPr>
-        <w:t>length_of_sentence</w:t>
-      </w:r>
-      <w:proofErr w:type="spellEnd"/>
-      <w:r>
-        <w:rPr>
-          <w:rFonts w:ascii="Arial" w:hAnsi="Arial" w:cs="Arial"/>
-          <w:bCs/>
-        </w:rPr>
-        <w:t>}}</w:t>
+        <w:t>{{length_of_sentence}}</w:t>
       </w:r>
     </w:p>
     <w:p>
@@ -3079,23 +2740,7 @@
           <w:rFonts w:ascii="Arial" w:hAnsi="Arial" w:cs="Arial"/>
           <w:bCs/>
         </w:rPr>
-        <w:t>{{</w:t>
-      </w:r>
-      <w:proofErr w:type="spellStart"/>
-      <w:r>
-        <w:rPr>
-          <w:rFonts w:ascii="Arial" w:hAnsi="Arial" w:cs="Arial"/>
-          <w:bCs/>
-        </w:rPr>
-        <w:t>licence_expiry_date</w:t>
-      </w:r>
-      <w:proofErr w:type="spellEnd"/>
-      <w:r>
-        <w:rPr>
-          <w:rFonts w:ascii="Arial" w:hAnsi="Arial" w:cs="Arial"/>
-          <w:bCs/>
-        </w:rPr>
-        <w:t>}}</w:t>
+        <w:t>{{licence_expiry_date}}</w:t>
       </w:r>
     </w:p>
     <w:p>
@@ -3137,23 +2782,7 @@
           <w:rFonts w:ascii="Arial" w:hAnsi="Arial" w:cs="Arial"/>
           <w:bCs/>
         </w:rPr>
-        <w:t>{{</w:t>
-      </w:r>
-      <w:proofErr w:type="spellStart"/>
-      <w:r>
-        <w:rPr>
-          <w:rFonts w:ascii="Arial" w:hAnsi="Arial" w:cs="Arial"/>
-          <w:bCs/>
-        </w:rPr>
-        <w:t>sentence_expiry_date</w:t>
-      </w:r>
-      <w:proofErr w:type="spellEnd"/>
-      <w:r>
-        <w:rPr>
-          <w:rFonts w:ascii="Arial" w:hAnsi="Arial" w:cs="Arial"/>
-          <w:bCs/>
-        </w:rPr>
-        <w:t>}}</w:t>
+        <w:t>{{sentence_expiry_date}}</w:t>
       </w:r>
     </w:p>
     <w:p>
@@ -3226,23 +2855,7 @@
           <w:rFonts w:ascii="Arial" w:hAnsi="Arial" w:cs="Arial"/>
           <w:bCs/>
         </w:rPr>
-        <w:t>{{</w:t>
-      </w:r>
-      <w:proofErr w:type="spellStart"/>
-      <w:r>
-        <w:rPr>
-          <w:rFonts w:ascii="Arial" w:hAnsi="Arial" w:cs="Arial"/>
-          <w:bCs/>
-        </w:rPr>
-        <w:t>custodial_term</w:t>
-      </w:r>
-      <w:proofErr w:type="spellEnd"/>
-      <w:r>
-        <w:rPr>
-          <w:rFonts w:ascii="Arial" w:hAnsi="Arial" w:cs="Arial"/>
-          <w:bCs/>
-        </w:rPr>
-        <w:t>}}</w:t>
+        <w:t>{{custodial_term}}</w:t>
       </w:r>
     </w:p>
     <w:p>
@@ -3295,23 +2908,7 @@
           <w:rFonts w:ascii="Arial" w:hAnsi="Arial" w:cs="Arial"/>
           <w:bCs/>
         </w:rPr>
-        <w:t>{{</w:t>
-      </w:r>
-      <w:proofErr w:type="spellStart"/>
-      <w:r>
-        <w:rPr>
-          <w:rFonts w:ascii="Arial" w:hAnsi="Arial" w:cs="Arial"/>
-          <w:bCs/>
-        </w:rPr>
-        <w:t>extended_term</w:t>
-      </w:r>
-      <w:proofErr w:type="spellEnd"/>
-      <w:r>
-        <w:rPr>
-          <w:rFonts w:ascii="Arial" w:hAnsi="Arial" w:cs="Arial"/>
-          <w:bCs/>
-        </w:rPr>
-        <w:t>}}</w:t>
+        <w:t>{{extended_term}}</w:t>
       </w:r>
     </w:p>
     <w:p>
@@ -3359,23 +2956,7 @@
           <w:rFonts w:ascii="Arial" w:hAnsi="Arial" w:cs="Arial"/>
           <w:bCs/>
         </w:rPr>
-        <w:t xml:space="preserve">(Any information presented here should be disclosable to the </w:t>
-      </w:r>
-      <w:proofErr w:type="gramStart"/>
-      <w:r>
-        <w:rPr>
-          <w:rFonts w:ascii="Arial" w:hAnsi="Arial" w:cs="Arial"/>
-          <w:bCs/>
-        </w:rPr>
-        <w:t xml:space="preserve">prisoner)   </w:t>
-      </w:r>
-      <w:proofErr w:type="gramEnd"/>
-      <w:r>
-        <w:rPr>
-          <w:rFonts w:ascii="Arial" w:hAnsi="Arial" w:cs="Arial"/>
-          <w:bCs/>
-        </w:rPr>
-        <w:t xml:space="preserve">   </w:t>
+        <w:t xml:space="preserve">(Any information presented here should be disclosable to the prisoner)      </w:t>
       </w:r>
       <w:r>
         <w:rPr>
@@ -3389,39 +2970,14 @@
           <w:rFonts w:ascii="Arial" w:hAnsi="Arial" w:cs="Arial"/>
           <w:bCs/>
         </w:rPr>
-        <w:t>{{</w:t>
-      </w:r>
-      <w:proofErr w:type="spellStart"/>
-      <w:r>
-        <w:rPr>
-          <w:rFonts w:ascii="Arial" w:hAnsi="Arial" w:cs="Arial"/>
-          <w:bCs/>
-        </w:rPr>
-        <w:t>has_victims_in_contact_scheme</w:t>
-      </w:r>
-      <w:proofErr w:type="spellEnd"/>
-      <w:proofErr w:type="gramStart"/>
-      <w:r>
-        <w:rPr>
-          <w:rFonts w:ascii="Arial" w:hAnsi="Arial" w:cs="Arial"/>
-          <w:bCs/>
-        </w:rPr>
-        <w:t>}}</w:t>
-      </w:r>
-      <w:r>
-        <w:rPr>
-          <w:rFonts w:ascii="Arial" w:hAnsi="Arial" w:cs="Arial"/>
-          <w:b/>
-        </w:rPr>
-        <w:t>Date</w:t>
-      </w:r>
-      <w:proofErr w:type="gramEnd"/>
-      <w:r>
-        <w:rPr>
-          <w:rFonts w:ascii="Arial" w:hAnsi="Arial" w:cs="Arial"/>
-          <w:b/>
-        </w:rPr>
-        <w:t xml:space="preserve"> contact was </w:t>
+        <w:t>{{has_victims_in_contact_scheme}}</w:t>
+      </w:r>
+      <w:r>
+        <w:rPr>
+          <w:rFonts w:ascii="Arial" w:hAnsi="Arial" w:cs="Arial"/>
+          <w:b/>
+        </w:rPr>
+        <w:t xml:space="preserve">Date contact was </w:t>
       </w:r>
       <w:r>
         <w:rPr>
@@ -3443,23 +2999,7 @@
           <w:rFonts w:ascii="Arial" w:hAnsi="Arial" w:cs="Arial"/>
           <w:bCs/>
         </w:rPr>
-        <w:t>{{</w:t>
-      </w:r>
-      <w:proofErr w:type="spellStart"/>
-      <w:r>
-        <w:rPr>
-          <w:rFonts w:ascii="Arial" w:hAnsi="Arial" w:cs="Arial"/>
-          <w:bCs/>
-        </w:rPr>
-        <w:t>date_vlo_informed</w:t>
-      </w:r>
-      <w:proofErr w:type="spellEnd"/>
-      <w:r>
-        <w:rPr>
-          <w:rFonts w:ascii="Arial" w:hAnsi="Arial" w:cs="Arial"/>
-          <w:bCs/>
-        </w:rPr>
-        <w:t>}}</w:t>
+        <w:t>{{date_vlo_informed}}</w:t>
       </w:r>
       <w:r>
         <w:rPr>
@@ -3552,23 +3092,7 @@
           <w:rFonts w:ascii="Arial" w:hAnsi="Arial" w:cs="Arial"/>
           <w:bCs/>
         </w:rPr>
-        <w:t>{{</w:t>
-      </w:r>
-      <w:proofErr w:type="spellStart"/>
-      <w:r>
-        <w:rPr>
-          <w:rFonts w:ascii="Arial" w:hAnsi="Arial" w:cs="Arial"/>
-          <w:bCs/>
-        </w:rPr>
-        <w:t>custody_status</w:t>
-      </w:r>
-      <w:proofErr w:type="spellEnd"/>
-      <w:r>
-        <w:rPr>
-          <w:rFonts w:ascii="Arial" w:hAnsi="Arial" w:cs="Arial"/>
-          <w:bCs/>
-        </w:rPr>
-        <w:t>}}</w:t>
+        <w:t>{{custody_status}}</w:t>
       </w:r>
     </w:p>
     <w:p>
@@ -3601,23 +3125,7 @@
           <w:rFonts w:ascii="Arial" w:hAnsi="Arial" w:cs="Arial"/>
           <w:bCs/>
         </w:rPr>
-        <w:t>{{</w:t>
-      </w:r>
-      <w:proofErr w:type="spellStart"/>
-      <w:r>
-        <w:rPr>
-          <w:rFonts w:ascii="Arial" w:hAnsi="Arial" w:cs="Arial"/>
-          <w:bCs/>
-        </w:rPr>
-        <w:t>has_arrest_issues</w:t>
-      </w:r>
-      <w:proofErr w:type="spellEnd"/>
-      <w:r>
-        <w:rPr>
-          <w:rFonts w:ascii="Arial" w:hAnsi="Arial" w:cs="Arial"/>
-          <w:bCs/>
-        </w:rPr>
-        <w:t>}}</w:t>
+        <w:t>{{has_arrest_issues}}</w:t>
       </w:r>
     </w:p>
     <w:p>
@@ -3657,23 +3165,7 @@
           <w:rFonts w:ascii="Arial" w:hAnsi="Arial" w:cs="Arial"/>
           <w:bCs/>
         </w:rPr>
-        <w:t>{{</w:t>
-      </w:r>
-      <w:proofErr w:type="spellStart"/>
-      <w:r>
-        <w:rPr>
-          <w:rFonts w:ascii="Arial" w:hAnsi="Arial" w:cs="Arial"/>
-          <w:bCs/>
-        </w:rPr>
-        <w:t>has_arrest_issues_details</w:t>
-      </w:r>
-      <w:proofErr w:type="spellEnd"/>
-      <w:r>
-        <w:rPr>
-          <w:rFonts w:ascii="Arial" w:hAnsi="Arial" w:cs="Arial"/>
-          <w:bCs/>
-        </w:rPr>
-        <w:t>}}</w:t>
+        <w:t>{{has_arrest_issues_details}}</w:t>
       </w:r>
     </w:p>
     <w:p>
@@ -3712,23 +3204,7 @@
           <w:rFonts w:ascii="Arial" w:hAnsi="Arial" w:cs="Arial"/>
           <w:bCs/>
         </w:rPr>
-        <w:t>{{</w:t>
-      </w:r>
-      <w:proofErr w:type="spellStart"/>
-      <w:r>
-        <w:rPr>
-          <w:rFonts w:ascii="Arial" w:hAnsi="Arial" w:cs="Arial"/>
-          <w:bCs/>
-        </w:rPr>
-        <w:t>contact_name</w:t>
-      </w:r>
-      <w:proofErr w:type="spellEnd"/>
-      <w:r>
-        <w:rPr>
-          <w:rFonts w:ascii="Arial" w:hAnsi="Arial" w:cs="Arial"/>
-          <w:bCs/>
-        </w:rPr>
-        <w:t>}}</w:t>
+        <w:t>{{contact_name}}</w:t>
       </w:r>
     </w:p>
     <w:p>
@@ -3767,23 +3243,7 @@
           <w:rFonts w:ascii="Arial" w:hAnsi="Arial" w:cs="Arial"/>
           <w:bCs/>
         </w:rPr>
-        <w:t>{{</w:t>
-      </w:r>
-      <w:proofErr w:type="spellStart"/>
-      <w:r>
-        <w:rPr>
-          <w:rFonts w:ascii="Arial" w:hAnsi="Arial" w:cs="Arial"/>
-          <w:bCs/>
-        </w:rPr>
-        <w:t>email_address</w:t>
-      </w:r>
-      <w:proofErr w:type="spellEnd"/>
-      <w:r>
-        <w:rPr>
-          <w:rFonts w:ascii="Arial" w:hAnsi="Arial" w:cs="Arial"/>
-          <w:bCs/>
-        </w:rPr>
-        <w:t>}}</w:t>
+        <w:t>{{email_address}}</w:t>
       </w:r>
     </w:p>
     <w:p>
@@ -3848,23 +3308,7 @@
           <w:rFonts w:ascii="Arial" w:hAnsi="Arial" w:cs="Arial"/>
           <w:bCs/>
         </w:rPr>
-        <w:t>{{</w:t>
-      </w:r>
-      <w:proofErr w:type="spellStart"/>
-      <w:r>
-        <w:rPr>
-          <w:rFonts w:ascii="Arial" w:hAnsi="Arial" w:cs="Arial"/>
-          <w:bCs/>
-        </w:rPr>
-        <w:t>last_recorded_address</w:t>
-      </w:r>
-      <w:proofErr w:type="spellEnd"/>
-      <w:r>
-        <w:rPr>
-          <w:rFonts w:ascii="Arial" w:hAnsi="Arial" w:cs="Arial"/>
-          <w:bCs/>
-        </w:rPr>
-        <w:t>}}</w:t>
+        <w:t>{{last_recorded_address}}</w:t>
       </w:r>
     </w:p>
     <w:p>
@@ -3896,23 +3340,7 @@
           <w:rFonts w:ascii="Arial" w:hAnsi="Arial" w:cs="Arial"/>
           <w:bCs/>
         </w:rPr>
-        <w:t>{{</w:t>
-      </w:r>
-      <w:proofErr w:type="spellStart"/>
-      <w:r>
-        <w:rPr>
-          <w:rFonts w:ascii="Arial" w:hAnsi="Arial" w:cs="Arial"/>
-          <w:bCs/>
-        </w:rPr>
-        <w:t>no_fixed_abode</w:t>
-      </w:r>
-      <w:proofErr w:type="spellEnd"/>
-      <w:r>
-        <w:rPr>
-          <w:rFonts w:ascii="Arial" w:hAnsi="Arial" w:cs="Arial"/>
-          <w:bCs/>
-        </w:rPr>
-        <w:t>}}</w:t>
+        <w:t>{{no_fixed_abode}}</w:t>
       </w:r>
     </w:p>
     <w:p>
@@ -3944,23 +3372,7 @@
           <w:rFonts w:ascii="Arial" w:hAnsi="Arial" w:cs="Arial"/>
           <w:bCs/>
         </w:rPr>
-        <w:t>{{</w:t>
-      </w:r>
-      <w:proofErr w:type="spellStart"/>
-      <w:r>
-        <w:rPr>
-          <w:rFonts w:ascii="Arial" w:hAnsi="Arial" w:cs="Arial"/>
-          <w:bCs/>
-        </w:rPr>
-        <w:t>other_possible_addresses</w:t>
-      </w:r>
-      <w:proofErr w:type="spellEnd"/>
-      <w:r>
-        <w:rPr>
-          <w:rFonts w:ascii="Arial" w:hAnsi="Arial" w:cs="Arial"/>
-          <w:bCs/>
-        </w:rPr>
-        <w:t>}}</w:t>
+        <w:t>{{other_possible_addresses}}</w:t>
       </w:r>
     </w:p>
     <w:p>
@@ -4068,23 +3480,7 @@
           <w:rFonts w:ascii="Arial" w:hAnsi="Arial" w:cs="Arial"/>
           <w:bCs/>
         </w:rPr>
-        <w:t>{{</w:t>
-      </w:r>
-      <w:proofErr w:type="spellStart"/>
-      <w:r>
-        <w:rPr>
-          <w:rFonts w:ascii="Arial" w:hAnsi="Arial" w:cs="Arial"/>
-          <w:bCs/>
-        </w:rPr>
-        <w:t>has_vulnerabilities</w:t>
-      </w:r>
-      <w:proofErr w:type="spellEnd"/>
-      <w:r>
-        <w:rPr>
-          <w:rFonts w:ascii="Arial" w:hAnsi="Arial" w:cs="Arial"/>
-          <w:bCs/>
-        </w:rPr>
-        <w:t>}}</w:t>
+        <w:t>{{has_vulnerabilities}}</w:t>
       </w:r>
     </w:p>
     <w:p>
@@ -4170,23 +3566,7 @@
           <w:rFonts w:ascii="Arial" w:hAnsi="Arial" w:cs="Arial"/>
           <w:bCs/>
         </w:rPr>
-        <w:t>{{</w:t>
-      </w:r>
-      <w:proofErr w:type="spellStart"/>
-      <w:r>
-        <w:rPr>
-          <w:rFonts w:ascii="Arial" w:hAnsi="Arial" w:cs="Arial"/>
-          <w:bCs/>
-        </w:rPr>
-        <w:t>has_contraband_risk</w:t>
-      </w:r>
-      <w:proofErr w:type="spellEnd"/>
-      <w:r>
-        <w:rPr>
-          <w:rFonts w:ascii="Arial" w:hAnsi="Arial" w:cs="Arial"/>
-          <w:bCs/>
-        </w:rPr>
-        <w:t>}}</w:t>
+        <w:t>{{has_contraband_risk}}</w:t>
       </w:r>
       <w:r>
         <w:rPr>
@@ -4224,23 +3604,7 @@
           <w:rFonts w:ascii="Arial" w:hAnsi="Arial" w:cs="Arial"/>
           <w:bCs/>
         </w:rPr>
-        <w:t>{{</w:t>
-      </w:r>
-      <w:proofErr w:type="spellStart"/>
-      <w:r>
-        <w:rPr>
-          <w:rFonts w:ascii="Arial" w:hAnsi="Arial" w:cs="Arial"/>
-          <w:bCs/>
-        </w:rPr>
-        <w:t>has_contraband_risk_details</w:t>
-      </w:r>
-      <w:proofErr w:type="spellEnd"/>
-      <w:r>
-        <w:rPr>
-          <w:rFonts w:ascii="Arial" w:hAnsi="Arial" w:cs="Arial"/>
-          <w:bCs/>
-        </w:rPr>
-        <w:t>}}</w:t>
+        <w:t>{{has_contraband_risk_details}}</w:t>
       </w:r>
     </w:p>
     <w:p>
@@ -4316,23 +3680,7 @@
           <w:rFonts w:ascii="Arial" w:hAnsi="Arial" w:cs="Arial"/>
           <w:bCs/>
         </w:rPr>
-        <w:t>{{</w:t>
-      </w:r>
-      <w:proofErr w:type="spellStart"/>
-      <w:r>
-        <w:rPr>
-          <w:rFonts w:ascii="Arial" w:hAnsi="Arial" w:cs="Arial"/>
-          <w:bCs/>
-        </w:rPr>
-        <w:t>mappa_category</w:t>
-      </w:r>
-      <w:proofErr w:type="spellEnd"/>
-      <w:r>
-        <w:rPr>
-          <w:rFonts w:ascii="Arial" w:hAnsi="Arial" w:cs="Arial"/>
-          <w:bCs/>
-        </w:rPr>
-        <w:t>}}</w:t>
+        <w:t>{{mappa_category}}</w:t>
       </w:r>
     </w:p>
     <w:p>
@@ -4363,23 +3711,7 @@
           <w:rFonts w:ascii="Arial" w:hAnsi="Arial" w:cs="Arial"/>
           <w:bCs/>
         </w:rPr>
-        <w:t>{{</w:t>
-      </w:r>
-      <w:proofErr w:type="spellStart"/>
-      <w:r>
-        <w:rPr>
-          <w:rFonts w:ascii="Arial" w:hAnsi="Arial" w:cs="Arial"/>
-          <w:bCs/>
-        </w:rPr>
-        <w:t>mappa_level</w:t>
-      </w:r>
-      <w:proofErr w:type="spellEnd"/>
-      <w:r>
-        <w:rPr>
-          <w:rFonts w:ascii="Arial" w:hAnsi="Arial" w:cs="Arial"/>
-          <w:bCs/>
-        </w:rPr>
-        <w:t>}}</w:t>
+        <w:t>{{mappa_level}}</w:t>
       </w:r>
     </w:p>
     <w:p>
@@ -4439,23 +3771,7 @@
           <w:rFonts w:ascii="Arial" w:hAnsi="Arial" w:cs="Arial"/>
           <w:bCs/>
         </w:rPr>
-        <w:t>{{</w:t>
-      </w:r>
-      <w:proofErr w:type="spellStart"/>
-      <w:r>
-        <w:rPr>
-          <w:rFonts w:ascii="Arial" w:hAnsi="Arial" w:cs="Arial"/>
-          <w:bCs/>
-        </w:rPr>
-        <w:t>risk_to_public</w:t>
-      </w:r>
-      <w:proofErr w:type="spellEnd"/>
-      <w:r>
-        <w:rPr>
-          <w:rFonts w:ascii="Arial" w:hAnsi="Arial" w:cs="Arial"/>
-          <w:bCs/>
-        </w:rPr>
-        <w:t>}}</w:t>
+        <w:t>{{risk_to_public}}</w:t>
       </w:r>
     </w:p>
     <w:p>
@@ -4494,23 +3810,7 @@
           <w:rFonts w:ascii="Arial" w:hAnsi="Arial" w:cs="Arial"/>
           <w:bCs/>
         </w:rPr>
-        <w:t>{{</w:t>
-      </w:r>
-      <w:proofErr w:type="spellStart"/>
-      <w:r>
-        <w:rPr>
-          <w:rFonts w:ascii="Arial" w:hAnsi="Arial" w:cs="Arial"/>
-          <w:bCs/>
-        </w:rPr>
-        <w:t>risk_to_known_adult</w:t>
-      </w:r>
-      <w:proofErr w:type="spellEnd"/>
-      <w:r>
-        <w:rPr>
-          <w:rFonts w:ascii="Arial" w:hAnsi="Arial" w:cs="Arial"/>
-          <w:bCs/>
-        </w:rPr>
-        <w:t>}}</w:t>
+        <w:t>{{risk_to_known_adult}}</w:t>
       </w:r>
       <w:r>
         <w:tab/>
@@ -4556,23 +3856,7 @@
           <w:rFonts w:ascii="Arial" w:hAnsi="Arial" w:cs="Arial"/>
           <w:bCs/>
         </w:rPr>
-        <w:t>{{</w:t>
-      </w:r>
-      <w:proofErr w:type="spellStart"/>
-      <w:r>
-        <w:rPr>
-          <w:rFonts w:ascii="Arial" w:hAnsi="Arial" w:cs="Arial"/>
-          <w:bCs/>
-        </w:rPr>
-        <w:t>risk_to_children</w:t>
-      </w:r>
-      <w:proofErr w:type="spellEnd"/>
-      <w:r>
-        <w:rPr>
-          <w:rFonts w:ascii="Arial" w:hAnsi="Arial" w:cs="Arial"/>
-          <w:bCs/>
-        </w:rPr>
-        <w:t>}}</w:t>
+        <w:t>{{risk_to_children}}</w:t>
       </w:r>
     </w:p>
     <w:p>
@@ -4615,23 +3899,7 @@
           <w:rFonts w:ascii="Arial" w:hAnsi="Arial" w:cs="Arial"/>
           <w:bCs/>
         </w:rPr>
-        <w:t>{{</w:t>
-      </w:r>
-      <w:proofErr w:type="spellStart"/>
-      <w:r>
-        <w:rPr>
-          <w:rFonts w:ascii="Arial" w:hAnsi="Arial" w:cs="Arial"/>
-          <w:bCs/>
-        </w:rPr>
-        <w:t>risk_to_prisoners</w:t>
-      </w:r>
-      <w:proofErr w:type="spellEnd"/>
-      <w:r>
-        <w:rPr>
-          <w:rFonts w:ascii="Arial" w:hAnsi="Arial" w:cs="Arial"/>
-          <w:bCs/>
-        </w:rPr>
-        <w:t>}}</w:t>
+        <w:t>{{risk_to_prisoners}}</w:t>
       </w:r>
     </w:p>
     <w:p>
@@ -4667,23 +3935,7 @@
           <w:rFonts w:ascii="Arial" w:hAnsi="Arial" w:cs="Arial"/>
           <w:bCs/>
         </w:rPr>
-        <w:t>{{</w:t>
-      </w:r>
-      <w:proofErr w:type="spellStart"/>
-      <w:r>
-        <w:rPr>
-          <w:rFonts w:ascii="Arial" w:hAnsi="Arial" w:cs="Arial"/>
-          <w:bCs/>
-        </w:rPr>
-        <w:t>risk_to_staff</w:t>
-      </w:r>
-      <w:proofErr w:type="spellEnd"/>
-      <w:r>
-        <w:rPr>
-          <w:rFonts w:ascii="Arial" w:hAnsi="Arial" w:cs="Arial"/>
-          <w:bCs/>
-        </w:rPr>
-        <w:t>}}</w:t>
+        <w:t>{{risk_to_staff}}</w:t>
       </w:r>
     </w:p>
     <w:p>
@@ -4764,23 +4016,7 @@
           <w:rFonts w:ascii="Arial" w:hAnsi="Arial" w:cs="Arial"/>
           <w:bCs/>
         </w:rPr>
-        <w:t>{{</w:t>
-      </w:r>
-      <w:proofErr w:type="spellStart"/>
-      <w:r>
-        <w:rPr>
-          <w:rFonts w:ascii="Arial" w:hAnsi="Arial" w:cs="Arial"/>
-          <w:bCs/>
-        </w:rPr>
-        <w:t>index_offence_details</w:t>
-      </w:r>
-      <w:proofErr w:type="spellEnd"/>
-      <w:r>
-        <w:rPr>
-          <w:rFonts w:ascii="Arial" w:hAnsi="Arial" w:cs="Arial"/>
-          <w:bCs/>
-        </w:rPr>
-        <w:t>}}</w:t>
+        <w:t>{{index_offence_details}}</w:t>
       </w:r>
     </w:p>
     <w:p>
@@ -4893,27 +4129,7 @@
                 <w:sz w:val="22"/>
                 <w:szCs w:val="22"/>
               </w:rPr>
-              <w:t>{{</w:t>
-            </w:r>
-            <w:proofErr w:type="spellStart"/>
-            <w:r>
-              <w:rPr>
-                <w:rFonts w:ascii="Arial" w:hAnsi="Arial" w:cs="Arial"/>
-                <w:bCs/>
-                <w:sz w:val="22"/>
-                <w:szCs w:val="22"/>
-              </w:rPr>
-              <w:t>good_behaviour_condition</w:t>
-            </w:r>
-            <w:proofErr w:type="spellEnd"/>
-            <w:r>
-              <w:rPr>
-                <w:rFonts w:ascii="Arial" w:hAnsi="Arial" w:cs="Arial"/>
-                <w:bCs/>
-                <w:sz w:val="22"/>
-                <w:szCs w:val="22"/>
-              </w:rPr>
-              <w:t>}}</w:t>
+              <w:t>{{good_behaviour_condition}}</w:t>
             </w:r>
             <w:r>
               <w:rPr>
@@ -4958,27 +4174,7 @@
                 <w:sz w:val="22"/>
                 <w:szCs w:val="22"/>
               </w:rPr>
-              <w:t>{{</w:t>
-            </w:r>
-            <w:proofErr w:type="spellStart"/>
-            <w:r>
-              <w:rPr>
-                <w:rFonts w:ascii="Arial" w:hAnsi="Arial" w:cs="Arial"/>
-                <w:bCs/>
-                <w:sz w:val="22"/>
-                <w:szCs w:val="22"/>
-              </w:rPr>
-              <w:t>no_offence_condition</w:t>
-            </w:r>
-            <w:proofErr w:type="spellEnd"/>
-            <w:r>
-              <w:rPr>
-                <w:rFonts w:ascii="Arial" w:hAnsi="Arial" w:cs="Arial"/>
-                <w:bCs/>
-                <w:sz w:val="22"/>
-                <w:szCs w:val="22"/>
-              </w:rPr>
-              <w:t xml:space="preserve">}} </w:t>
+              <w:t xml:space="preserve">{{no_offence_condition}} </w:t>
             </w:r>
             <w:r>
               <w:rPr>
@@ -5013,27 +4209,7 @@
                 <w:sz w:val="22"/>
                 <w:szCs w:val="22"/>
               </w:rPr>
-              <w:t>{{</w:t>
-            </w:r>
-            <w:proofErr w:type="spellStart"/>
-            <w:r>
-              <w:rPr>
-                <w:rFonts w:ascii="Arial" w:hAnsi="Arial" w:cs="Arial"/>
-                <w:bCs/>
-                <w:sz w:val="22"/>
-                <w:szCs w:val="22"/>
-              </w:rPr>
-              <w:t>keep_in_touch_condition</w:t>
-            </w:r>
-            <w:proofErr w:type="spellEnd"/>
-            <w:r>
-              <w:rPr>
-                <w:rFonts w:ascii="Arial" w:hAnsi="Arial" w:cs="Arial"/>
-                <w:bCs/>
-                <w:sz w:val="22"/>
-                <w:szCs w:val="22"/>
-              </w:rPr>
-              <w:t xml:space="preserve">}} </w:t>
+              <w:t xml:space="preserve">{{keep_in_touch_condition}} </w:t>
             </w:r>
             <w:r>
               <w:rPr>
@@ -5068,27 +4244,7 @@
                 <w:sz w:val="22"/>
                 <w:szCs w:val="22"/>
               </w:rPr>
-              <w:t>{{</w:t>
-            </w:r>
-            <w:proofErr w:type="spellStart"/>
-            <w:r>
-              <w:rPr>
-                <w:rFonts w:ascii="Arial" w:hAnsi="Arial" w:cs="Arial"/>
-                <w:bCs/>
-                <w:sz w:val="22"/>
-                <w:szCs w:val="22"/>
-              </w:rPr>
-              <w:t>officer_visit_condition</w:t>
-            </w:r>
-            <w:proofErr w:type="spellEnd"/>
-            <w:r>
-              <w:rPr>
-                <w:rFonts w:ascii="Arial" w:hAnsi="Arial" w:cs="Arial"/>
-                <w:bCs/>
-                <w:sz w:val="22"/>
-                <w:szCs w:val="22"/>
-              </w:rPr>
-              <w:t xml:space="preserve">}} </w:t>
+              <w:t xml:space="preserve">{{officer_visit_condition}} </w:t>
             </w:r>
             <w:r>
               <w:rPr>
@@ -5123,27 +4279,7 @@
                 <w:sz w:val="22"/>
                 <w:szCs w:val="22"/>
               </w:rPr>
-              <w:t>{{</w:t>
-            </w:r>
-            <w:proofErr w:type="spellStart"/>
-            <w:r>
-              <w:rPr>
-                <w:rFonts w:ascii="Arial" w:hAnsi="Arial" w:cs="Arial"/>
-                <w:bCs/>
-                <w:sz w:val="22"/>
-                <w:szCs w:val="22"/>
-              </w:rPr>
-              <w:t>address_approved_condition</w:t>
-            </w:r>
-            <w:proofErr w:type="spellEnd"/>
-            <w:r>
-              <w:rPr>
-                <w:rFonts w:ascii="Arial" w:hAnsi="Arial" w:cs="Arial"/>
-                <w:bCs/>
-                <w:sz w:val="22"/>
-                <w:szCs w:val="22"/>
-              </w:rPr>
-              <w:t xml:space="preserve">}} </w:t>
+              <w:t xml:space="preserve">{{address_approved_condition}} </w:t>
             </w:r>
             <w:r>
               <w:rPr>
@@ -5188,27 +4324,7 @@
                 <w:szCs w:val="22"/>
               </w:rPr>
               <w:lastRenderedPageBreak/>
-              <w:t>{{</w:t>
-            </w:r>
-            <w:proofErr w:type="spellStart"/>
-            <w:r>
-              <w:rPr>
-                <w:rFonts w:ascii="Arial" w:hAnsi="Arial" w:cs="Arial"/>
-                <w:bCs/>
-                <w:sz w:val="22"/>
-                <w:szCs w:val="22"/>
-              </w:rPr>
-              <w:t>no_work_undertaken_condition</w:t>
-            </w:r>
-            <w:proofErr w:type="spellEnd"/>
-            <w:r>
-              <w:rPr>
-                <w:rFonts w:ascii="Arial" w:hAnsi="Arial" w:cs="Arial"/>
-                <w:bCs/>
-                <w:sz w:val="22"/>
-                <w:szCs w:val="22"/>
-              </w:rPr>
-              <w:t xml:space="preserve">}} </w:t>
+              <w:t xml:space="preserve">{{no_work_undertaken_condition}} </w:t>
             </w:r>
             <w:r>
               <w:rPr>
@@ -5243,27 +4359,7 @@
                 <w:sz w:val="22"/>
                 <w:szCs w:val="22"/>
               </w:rPr>
-              <w:t>{{</w:t>
-            </w:r>
-            <w:proofErr w:type="spellStart"/>
-            <w:r>
-              <w:rPr>
-                <w:rFonts w:ascii="Arial" w:hAnsi="Arial" w:cs="Arial"/>
-                <w:bCs/>
-                <w:sz w:val="22"/>
-                <w:szCs w:val="22"/>
-              </w:rPr>
-              <w:t>no_travel_condition</w:t>
-            </w:r>
-            <w:proofErr w:type="spellEnd"/>
-            <w:r>
-              <w:rPr>
-                <w:rFonts w:ascii="Arial" w:hAnsi="Arial" w:cs="Arial"/>
-                <w:bCs/>
-                <w:sz w:val="22"/>
-                <w:szCs w:val="22"/>
-              </w:rPr>
-              <w:t>}}</w:t>
+              <w:t>{{no_travel_condition}}</w:t>
             </w:r>
             <w:r>
               <w:rPr>
@@ -5309,27 +4405,7 @@
                 <w:sz w:val="22"/>
                 <w:szCs w:val="22"/>
               </w:rPr>
-              <w:t>{{</w:t>
-            </w:r>
-            <w:proofErr w:type="spellStart"/>
-            <w:r>
-              <w:rPr>
-                <w:rFonts w:ascii="Arial" w:hAnsi="Arial" w:cs="Arial"/>
-                <w:bCs/>
-                <w:sz w:val="22"/>
-                <w:szCs w:val="22"/>
-              </w:rPr>
-              <w:t>other_name_known_by</w:t>
-            </w:r>
-            <w:proofErr w:type="spellEnd"/>
-            <w:r>
-              <w:rPr>
-                <w:rFonts w:ascii="Arial" w:hAnsi="Arial" w:cs="Arial"/>
-                <w:bCs/>
-                <w:sz w:val="22"/>
-                <w:szCs w:val="22"/>
-              </w:rPr>
-              <w:t>}}</w:t>
+              <w:t>{{other_name_known_by}}</w:t>
             </w:r>
             <w:r>
               <w:rPr>
@@ -5386,27 +4462,7 @@
                 <w:sz w:val="22"/>
                 <w:szCs w:val="22"/>
               </w:rPr>
-              <w:t>{{</w:t>
-            </w:r>
-            <w:proofErr w:type="spellStart"/>
-            <w:r>
-              <w:rPr>
-                <w:rFonts w:ascii="Arial" w:hAnsi="Arial" w:cs="Arial"/>
-                <w:bCs/>
-                <w:sz w:val="22"/>
-                <w:szCs w:val="22"/>
-              </w:rPr>
-              <w:t>contact_details_changed</w:t>
-            </w:r>
-            <w:proofErr w:type="spellEnd"/>
-            <w:r>
-              <w:rPr>
-                <w:rFonts w:ascii="Arial" w:hAnsi="Arial" w:cs="Arial"/>
-                <w:bCs/>
-                <w:sz w:val="22"/>
-                <w:szCs w:val="22"/>
-              </w:rPr>
-              <w:t>}}</w:t>
+              <w:t>{{contact_details_changed}}</w:t>
             </w:r>
             <w:r>
               <w:rPr>
@@ -5529,23 +4585,7 @@
           <w:rFonts w:ascii="Arial" w:hAnsi="Arial" w:cs="Arial"/>
           <w:bCs/>
         </w:rPr>
-        <w:t>{{</w:t>
-      </w:r>
-      <w:proofErr w:type="spellStart"/>
-      <w:r>
-        <w:rPr>
-          <w:rFonts w:ascii="Arial" w:hAnsi="Arial" w:cs="Arial"/>
-          <w:bCs/>
-        </w:rPr>
-        <w:t>additional_conditions_breached</w:t>
-      </w:r>
-      <w:proofErr w:type="spellEnd"/>
-      <w:r>
-        <w:rPr>
-          <w:rFonts w:ascii="Arial" w:hAnsi="Arial" w:cs="Arial"/>
-          <w:bCs/>
-        </w:rPr>
-        <w:t>}}</w:t>
+        <w:t>{{additional_conditions_breached}}</w:t>
       </w:r>
     </w:p>
     <w:p>
@@ -5699,23 +4739,7 @@
           <w:rFonts w:ascii="Arial" w:hAnsi="Arial" w:cs="Arial"/>
           <w:bCs/>
         </w:rPr>
-        <w:t>{{</w:t>
-      </w:r>
-      <w:proofErr w:type="spellStart"/>
-      <w:r>
-        <w:rPr>
-          <w:rFonts w:ascii="Arial" w:hAnsi="Arial" w:cs="Arial"/>
-          <w:bCs/>
-        </w:rPr>
-        <w:t>what_led_to_recall</w:t>
-      </w:r>
-      <w:proofErr w:type="spellEnd"/>
-      <w:r>
-        <w:rPr>
-          <w:rFonts w:ascii="Arial" w:hAnsi="Arial" w:cs="Arial"/>
-          <w:bCs/>
-        </w:rPr>
-        <w:t>}}</w:t>
+        <w:t>{{what_led_to_recall}}</w:t>
       </w:r>
     </w:p>
     <w:tbl>
@@ -5970,27 +4994,7 @@
                 <w:sz w:val="22"/>
                 <w:szCs w:val="22"/>
               </w:rPr>
-              <w:t>{{</w:t>
-            </w:r>
-            <w:proofErr w:type="spellStart"/>
-            <w:r>
-              <w:rPr>
-                <w:rFonts w:ascii="Arial" w:hAnsi="Arial" w:cs="Arial"/>
-                <w:bCs/>
-                <w:sz w:val="22"/>
-                <w:szCs w:val="22"/>
-              </w:rPr>
-              <w:t>warning_letter_details</w:t>
-            </w:r>
-            <w:proofErr w:type="spellEnd"/>
-            <w:r>
-              <w:rPr>
-                <w:rFonts w:ascii="Arial" w:hAnsi="Arial" w:cs="Arial"/>
-                <w:bCs/>
-                <w:sz w:val="22"/>
-                <w:szCs w:val="22"/>
-              </w:rPr>
-              <w:t>}}</w:t>
+              <w:t>{{warning_letter_details}}</w:t>
             </w:r>
           </w:p>
         </w:tc>
@@ -6047,27 +5051,7 @@
                 <w:sz w:val="22"/>
                 <w:szCs w:val="22"/>
               </w:rPr>
-              <w:t>{{</w:t>
-            </w:r>
-            <w:proofErr w:type="spellStart"/>
-            <w:r>
-              <w:rPr>
-                <w:rFonts w:ascii="Arial" w:hAnsi="Arial" w:cs="Arial"/>
-                <w:bCs/>
-                <w:sz w:val="22"/>
-                <w:szCs w:val="22"/>
-              </w:rPr>
-              <w:t>increased_frequency_details</w:t>
-            </w:r>
-            <w:proofErr w:type="spellEnd"/>
-            <w:r>
-              <w:rPr>
-                <w:rFonts w:ascii="Arial" w:hAnsi="Arial" w:cs="Arial"/>
-                <w:bCs/>
-                <w:sz w:val="22"/>
-                <w:szCs w:val="22"/>
-              </w:rPr>
-              <w:t>}}</w:t>
+              <w:t>{{increased_frequency_details}}</w:t>
             </w:r>
           </w:p>
         </w:tc>
@@ -6124,27 +5108,7 @@
                 <w:sz w:val="22"/>
                 <w:szCs w:val="22"/>
               </w:rPr>
-              <w:t>{{</w:t>
-            </w:r>
-            <w:proofErr w:type="spellStart"/>
-            <w:r>
-              <w:rPr>
-                <w:rFonts w:ascii="Arial" w:hAnsi="Arial" w:cs="Arial"/>
-                <w:bCs/>
-                <w:sz w:val="22"/>
-                <w:szCs w:val="22"/>
-              </w:rPr>
-              <w:t>extra_licence_conditions_details</w:t>
-            </w:r>
-            <w:proofErr w:type="spellEnd"/>
-            <w:r>
-              <w:rPr>
-                <w:rFonts w:ascii="Arial" w:hAnsi="Arial" w:cs="Arial"/>
-                <w:bCs/>
-                <w:sz w:val="22"/>
-                <w:szCs w:val="22"/>
-              </w:rPr>
-              <w:t>}}</w:t>
+              <w:t>{{extra_licence_conditions_details}}</w:t>
             </w:r>
           </w:p>
         </w:tc>
@@ -6201,27 +5165,7 @@
                 <w:sz w:val="22"/>
                 <w:szCs w:val="22"/>
               </w:rPr>
-              <w:t>{{</w:t>
-            </w:r>
-            <w:proofErr w:type="spellStart"/>
-            <w:r>
-              <w:rPr>
-                <w:rFonts w:ascii="Arial" w:hAnsi="Arial" w:cs="Arial"/>
-                <w:bCs/>
-                <w:sz w:val="22"/>
-                <w:szCs w:val="22"/>
-              </w:rPr>
-              <w:t>referral_to_other_teams_details</w:t>
-            </w:r>
-            <w:proofErr w:type="spellEnd"/>
-            <w:r>
-              <w:rPr>
-                <w:rFonts w:ascii="Arial" w:hAnsi="Arial" w:cs="Arial"/>
-                <w:bCs/>
-                <w:sz w:val="22"/>
-                <w:szCs w:val="22"/>
-              </w:rPr>
-              <w:t>}}</w:t>
+              <w:t>{{referral_to_other_teams_details}}</w:t>
             </w:r>
           </w:p>
         </w:tc>
@@ -6278,27 +5222,7 @@
                 <w:sz w:val="22"/>
                 <w:szCs w:val="22"/>
               </w:rPr>
-              <w:t>{{</w:t>
-            </w:r>
-            <w:proofErr w:type="spellStart"/>
-            <w:r>
-              <w:rPr>
-                <w:rFonts w:ascii="Arial" w:hAnsi="Arial" w:cs="Arial"/>
-                <w:bCs/>
-                <w:sz w:val="22"/>
-                <w:szCs w:val="22"/>
-              </w:rPr>
-              <w:t>referral_to_partnership_agencies_details</w:t>
-            </w:r>
-            <w:proofErr w:type="spellEnd"/>
-            <w:r>
-              <w:rPr>
-                <w:rFonts w:ascii="Arial" w:hAnsi="Arial" w:cs="Arial"/>
-                <w:bCs/>
-                <w:sz w:val="22"/>
-                <w:szCs w:val="22"/>
-              </w:rPr>
-              <w:t>}}</w:t>
+              <w:t>{{referral_to_partnership_agencies_details}}</w:t>
             </w:r>
           </w:p>
         </w:tc>
@@ -6355,27 +5279,7 @@
                 <w:sz w:val="22"/>
                 <w:szCs w:val="22"/>
               </w:rPr>
-              <w:t>{{</w:t>
-            </w:r>
-            <w:proofErr w:type="spellStart"/>
-            <w:r>
-              <w:rPr>
-                <w:rFonts w:ascii="Arial" w:hAnsi="Arial" w:cs="Arial"/>
-                <w:bCs/>
-                <w:sz w:val="22"/>
-                <w:szCs w:val="22"/>
-              </w:rPr>
-              <w:t>referral_to_approved_premises_details</w:t>
-            </w:r>
-            <w:proofErr w:type="spellEnd"/>
-            <w:r>
-              <w:rPr>
-                <w:rFonts w:ascii="Arial" w:hAnsi="Arial" w:cs="Arial"/>
-                <w:bCs/>
-                <w:sz w:val="22"/>
-                <w:szCs w:val="22"/>
-              </w:rPr>
-              <w:t>}}</w:t>
+              <w:t>{{referral_to_approved_premises_details}}</w:t>
             </w:r>
           </w:p>
         </w:tc>
@@ -6432,27 +5336,7 @@
                 <w:sz w:val="22"/>
                 <w:szCs w:val="22"/>
               </w:rPr>
-              <w:t>{{</w:t>
-            </w:r>
-            <w:proofErr w:type="spellStart"/>
-            <w:r>
-              <w:rPr>
-                <w:rFonts w:ascii="Arial" w:hAnsi="Arial" w:cs="Arial"/>
-                <w:bCs/>
-                <w:sz w:val="22"/>
-                <w:szCs w:val="22"/>
-              </w:rPr>
-              <w:t>drug_testing_details</w:t>
-            </w:r>
-            <w:proofErr w:type="spellEnd"/>
-            <w:r>
-              <w:rPr>
-                <w:rFonts w:ascii="Arial" w:hAnsi="Arial" w:cs="Arial"/>
-                <w:bCs/>
-                <w:sz w:val="22"/>
-                <w:szCs w:val="22"/>
-              </w:rPr>
-              <w:t>}}</w:t>
+              <w:t>{{drug_testing_details}}</w:t>
             </w:r>
           </w:p>
         </w:tc>
@@ -6509,27 +5393,7 @@
                 <w:sz w:val="22"/>
                 <w:szCs w:val="22"/>
               </w:rPr>
-              <w:t>{{</w:t>
-            </w:r>
-            <w:proofErr w:type="spellStart"/>
-            <w:r>
-              <w:rPr>
-                <w:rFonts w:ascii="Arial" w:hAnsi="Arial" w:cs="Arial"/>
-                <w:bCs/>
-                <w:sz w:val="22"/>
-                <w:szCs w:val="22"/>
-              </w:rPr>
-              <w:t>alternative_to_recall_other_details</w:t>
-            </w:r>
-            <w:proofErr w:type="spellEnd"/>
-            <w:r>
-              <w:rPr>
-                <w:rFonts w:ascii="Arial" w:hAnsi="Arial" w:cs="Arial"/>
-                <w:bCs/>
-                <w:sz w:val="22"/>
-                <w:szCs w:val="22"/>
-              </w:rPr>
-              <w:t>}}</w:t>
+              <w:t>{{alternative_to_recall_other_details}}</w:t>
             </w:r>
           </w:p>
         </w:tc>
@@ -6680,23 +5544,7 @@
           <w:rFonts w:ascii="Arial" w:hAnsi="Arial" w:cs="Arial"/>
           <w:bCs/>
         </w:rPr>
-        <w:t>{{</w:t>
-      </w:r>
-      <w:proofErr w:type="spellStart"/>
-      <w:r>
-        <w:rPr>
-          <w:rFonts w:ascii="Arial" w:hAnsi="Arial" w:cs="Arial"/>
-          <w:bCs/>
-        </w:rPr>
-        <w:t>recall_type</w:t>
-      </w:r>
-      <w:proofErr w:type="spellEnd"/>
-      <w:r>
-        <w:rPr>
-          <w:rFonts w:ascii="Arial" w:hAnsi="Arial" w:cs="Arial"/>
-          <w:bCs/>
-        </w:rPr>
-        <w:t>}}</w:t>
+        <w:t>{{recall_type}}</w:t>
       </w:r>
       <w:r>
         <w:rPr>
@@ -6737,24 +5585,14 @@
           <w:rFonts w:ascii="Arial" w:hAnsi="Arial" w:cs="Arial"/>
           <w:bCs/>
         </w:rPr>
-        <w:t>{{</w:t>
-      </w:r>
-      <w:proofErr w:type="spellStart"/>
-      <w:r>
-        <w:rPr>
-          <w:rFonts w:ascii="Arial" w:hAnsi="Arial" w:cs="Arial"/>
-          <w:bCs/>
-        </w:rPr>
-        <w:t>recall_type_details</w:t>
-      </w:r>
-      <w:proofErr w:type="spellEnd"/>
-      <w:proofErr w:type="gramStart"/>
-      <w:r>
-        <w:rPr>
-          <w:rFonts w:ascii="Arial" w:hAnsi="Arial" w:cs="Arial"/>
-          <w:bCs/>
-        </w:rPr>
-        <w:t>}}</w:t>
+        <w:t>{{recall_type_details}}</w:t>
+      </w:r>
+      <w:r>
+        <w:rPr>
+          <w:rFonts w:ascii="Arial" w:hAnsi="Arial" w:cs="Arial"/>
+          <w:b/>
+        </w:rPr>
+        <w:t xml:space="preserve">                          </w:t>
       </w:r>
       <w:r>
         <w:rPr>
@@ -6763,21 +5601,6 @@
         </w:rPr>
         <w:t xml:space="preserve">   </w:t>
       </w:r>
-      <w:proofErr w:type="gramEnd"/>
-      <w:r>
-        <w:rPr>
-          <w:rFonts w:ascii="Arial" w:hAnsi="Arial" w:cs="Arial"/>
-          <w:b/>
-        </w:rPr>
-        <w:t xml:space="preserve">                       </w:t>
-      </w:r>
-      <w:r>
-        <w:rPr>
-          <w:rFonts w:ascii="Arial" w:hAnsi="Arial" w:cs="Arial"/>
-          <w:b/>
-        </w:rPr>
-        <w:t xml:space="preserve">   </w:t>
-      </w:r>
       <w:r>
         <w:rPr>
           <w:rFonts w:ascii="Arial" w:hAnsi="Arial" w:cs="Arial"/>
@@ -6909,23 +5732,7 @@
           <w:rFonts w:ascii="Arial" w:hAnsi="Arial" w:cs="Arial"/>
           <w:bCs/>
         </w:rPr>
-        <w:t>{{</w:t>
-      </w:r>
-      <w:proofErr w:type="spellStart"/>
-      <w:r>
-        <w:rPr>
-          <w:rFonts w:ascii="Arial" w:hAnsi="Arial" w:cs="Arial"/>
-          <w:bCs/>
-        </w:rPr>
-        <w:t>fixed_term_additional_licence_conditions</w:t>
-      </w:r>
-      <w:proofErr w:type="spellEnd"/>
-      <w:r>
-        <w:rPr>
-          <w:rFonts w:ascii="Arial" w:hAnsi="Arial" w:cs="Arial"/>
-          <w:bCs/>
-        </w:rPr>
-        <w:t>}}</w:t>
+        <w:t>{{fixed_term_additional_licence_conditions}}</w:t>
       </w:r>
     </w:p>
     <w:p>
@@ -7123,37 +5930,12 @@
           <w:rFonts w:ascii="Arial" w:hAnsi="Arial" w:cs="Arial"/>
         </w:rPr>
       </w:pPr>
-      <w:proofErr w:type="spellStart"/>
-      <w:r>
-        <w:rPr>
-          <w:rFonts w:ascii="Arial" w:hAnsi="Arial" w:cs="Arial"/>
-          <w:b/>
-        </w:rPr>
-        <w:t>i</w:t>
-      </w:r>
-      <w:proofErr w:type="spellEnd"/>
-      <w:r>
-        <w:rPr>
-          <w:rFonts w:ascii="Arial" w:hAnsi="Arial" w:cs="Arial"/>
-          <w:b/>
-        </w:rPr>
-        <w:t xml:space="preserve">) Has the offender exhibited behaviour </w:t>
-      </w:r>
-      <w:proofErr w:type="gramStart"/>
-      <w:r>
-        <w:rPr>
-          <w:rFonts w:ascii="Arial" w:hAnsi="Arial" w:cs="Arial"/>
-          <w:b/>
-        </w:rPr>
-        <w:t>similar to</w:t>
-      </w:r>
-      <w:proofErr w:type="gramEnd"/>
-      <w:r>
-        <w:rPr>
-          <w:rFonts w:ascii="Arial" w:hAnsi="Arial" w:cs="Arial"/>
-          <w:b/>
-        </w:rPr>
-        <w:t xml:space="preserve"> the circumstances surrounding the index offence</w:t>
+      <w:r>
+        <w:rPr>
+          <w:rFonts w:ascii="Arial" w:hAnsi="Arial" w:cs="Arial"/>
+          <w:b/>
+        </w:rPr>
+        <w:t>i) Has the offender exhibited behaviour similar to the circumstances surrounding the index offence</w:t>
       </w:r>
       <w:r>
         <w:rPr>
@@ -7174,23 +5956,7 @@
           <w:rFonts w:ascii="Arial" w:hAnsi="Arial" w:cs="Arial"/>
           <w:bCs/>
         </w:rPr>
-        <w:t>{{</w:t>
-      </w:r>
-      <w:proofErr w:type="spellStart"/>
-      <w:r>
-        <w:rPr>
-          <w:rFonts w:ascii="Arial" w:hAnsi="Arial" w:cs="Arial"/>
-          <w:bCs/>
-        </w:rPr>
-        <w:t>behaviour_similar_to_index_offence_present</w:t>
-      </w:r>
-      <w:proofErr w:type="spellEnd"/>
-      <w:r>
-        <w:rPr>
-          <w:rFonts w:ascii="Arial" w:hAnsi="Arial" w:cs="Arial"/>
-          <w:bCs/>
-        </w:rPr>
-        <w:t>}}</w:t>
+        <w:t>{{behaviour_similar_to_index_offence_present}}</w:t>
       </w:r>
       <w:r>
         <w:rPr>
@@ -7225,23 +5991,7 @@
           <w:rFonts w:ascii="Arial" w:hAnsi="Arial" w:cs="Arial"/>
           <w:bCs/>
         </w:rPr>
-        <w:t>{{</w:t>
-      </w:r>
-      <w:proofErr w:type="spellStart"/>
-      <w:r>
-        <w:rPr>
-          <w:rFonts w:ascii="Arial" w:hAnsi="Arial" w:cs="Arial"/>
-          <w:bCs/>
-        </w:rPr>
-        <w:t>behaviour_similar_to_index_offence</w:t>
-      </w:r>
-      <w:proofErr w:type="spellEnd"/>
-      <w:r>
-        <w:rPr>
-          <w:rFonts w:ascii="Arial" w:hAnsi="Arial" w:cs="Arial"/>
-          <w:bCs/>
-        </w:rPr>
-        <w:t>}}</w:t>
+        <w:t>{{behaviour_similar_to_index_offence}}</w:t>
       </w:r>
     </w:p>
     <w:p>
@@ -7278,23 +6028,63 @@
           <w:rFonts w:ascii="Arial" w:hAnsi="Arial" w:cs="Arial"/>
           <w:b/>
         </w:rPr>
-        <w:t xml:space="preserve">ii) Has the offender exhibited behaviour likely to give rise, or does give rise </w:t>
-      </w:r>
-      <w:proofErr w:type="gramStart"/>
-      <w:r>
-        <w:rPr>
-          <w:rFonts w:ascii="Arial" w:hAnsi="Arial" w:cs="Arial"/>
-          <w:b/>
-        </w:rPr>
-        <w:t>to  a</w:t>
-      </w:r>
-      <w:proofErr w:type="gramEnd"/>
-      <w:r>
-        <w:rPr>
-          <w:rFonts w:ascii="Arial" w:hAnsi="Arial" w:cs="Arial"/>
-          <w:b/>
-        </w:rPr>
-        <w:t xml:space="preserve"> sexual or violent offence? </w:t>
+        <w:t xml:space="preserve">ii) Has the offender exhibited behaviour likely to give rise, or does give rise to  a sexual or violent offence? </w:t>
+      </w:r>
+      <w:r>
+        <w:rPr>
+          <w:rFonts w:ascii="Arial" w:hAnsi="Arial" w:cs="Arial"/>
+          <w:bCs/>
+        </w:rPr>
+        <w:t>{{behaviour_</w:t>
+      </w:r>
+      <w:r>
+        <w:rPr>
+          <w:rFonts w:ascii="Arial" w:hAnsi="Arial" w:cs="Arial"/>
+          <w:bCs/>
+        </w:rPr>
+        <w:t>likely</w:t>
+      </w:r>
+      <w:r>
+        <w:rPr>
+          <w:rFonts w:ascii="Arial" w:hAnsi="Arial" w:cs="Arial"/>
+          <w:bCs/>
+        </w:rPr>
+        <w:t>_to</w:t>
+      </w:r>
+      <w:r>
+        <w:rPr>
+          <w:rFonts w:ascii="Arial" w:hAnsi="Arial" w:cs="Arial"/>
+          <w:bCs/>
+        </w:rPr>
+        <w:t>_result</w:t>
+      </w:r>
+      <w:r>
+        <w:rPr>
+          <w:rFonts w:ascii="Arial" w:hAnsi="Arial" w:cs="Arial"/>
+          <w:bCs/>
+        </w:rPr>
+        <w:t>_sexual_or_violent_offence_present}}</w:t>
+      </w:r>
+      <w:r>
+        <w:rPr>
+          <w:rFonts w:ascii="Arial" w:hAnsi="Arial" w:cs="Arial"/>
+          <w:b/>
+        </w:rPr>
+        <w:t xml:space="preserve"> </w:t>
+      </w:r>
+      <w:r>
+        <w:rPr>
+          <w:rFonts w:ascii="Arial" w:hAnsi="Arial" w:cs="Arial"/>
+          <w:b/>
+        </w:rPr>
+        <w:t>Provide details</w:t>
+      </w:r>
+      <w:r>
+        <w:rPr>
+          <w:rFonts w:ascii="Arial" w:hAnsi="Arial" w:cs="Arial"/>
+          <w:b/>
+        </w:rPr>
+        <w:t xml:space="preserve">: </w:t>
       </w:r>
       <w:r>
         <w:rPr>
@@ -7303,79 +6093,6 @@
         </w:rPr>
         <w:t>{{</w:t>
       </w:r>
-      <w:proofErr w:type="spellStart"/>
-      <w:r>
-        <w:rPr>
-          <w:rFonts w:ascii="Arial" w:hAnsi="Arial" w:cs="Arial"/>
-          <w:bCs/>
-        </w:rPr>
-        <w:t>behaviour_</w:t>
-      </w:r>
-      <w:r>
-        <w:rPr>
-          <w:rFonts w:ascii="Arial" w:hAnsi="Arial" w:cs="Arial"/>
-          <w:bCs/>
-        </w:rPr>
-        <w:t>likely</w:t>
-      </w:r>
-      <w:r>
-        <w:rPr>
-          <w:rFonts w:ascii="Arial" w:hAnsi="Arial" w:cs="Arial"/>
-          <w:bCs/>
-        </w:rPr>
-        <w:t>_to</w:t>
-      </w:r>
-      <w:r>
-        <w:rPr>
-          <w:rFonts w:ascii="Arial" w:hAnsi="Arial" w:cs="Arial"/>
-          <w:bCs/>
-        </w:rPr>
-        <w:t>_result</w:t>
-      </w:r>
-      <w:r>
-        <w:rPr>
-          <w:rFonts w:ascii="Arial" w:hAnsi="Arial" w:cs="Arial"/>
-          <w:bCs/>
-        </w:rPr>
-        <w:t>_sexual_or_violent_offence_present</w:t>
-      </w:r>
-      <w:proofErr w:type="spellEnd"/>
-      <w:r>
-        <w:rPr>
-          <w:rFonts w:ascii="Arial" w:hAnsi="Arial" w:cs="Arial"/>
-          <w:bCs/>
-        </w:rPr>
-        <w:t>}}</w:t>
-      </w:r>
-      <w:r>
-        <w:rPr>
-          <w:rFonts w:ascii="Arial" w:hAnsi="Arial" w:cs="Arial"/>
-          <w:b/>
-        </w:rPr>
-        <w:t xml:space="preserve"> </w:t>
-      </w:r>
-      <w:r>
-        <w:rPr>
-          <w:rFonts w:ascii="Arial" w:hAnsi="Arial" w:cs="Arial"/>
-          <w:b/>
-        </w:rPr>
-        <w:t>Provide details</w:t>
-      </w:r>
-      <w:r>
-        <w:rPr>
-          <w:rFonts w:ascii="Arial" w:hAnsi="Arial" w:cs="Arial"/>
-          <w:b/>
-        </w:rPr>
-        <w:t xml:space="preserve">: </w:t>
-      </w:r>
-      <w:r>
-        <w:rPr>
-          <w:rFonts w:ascii="Arial" w:hAnsi="Arial" w:cs="Arial"/>
-          <w:bCs/>
-        </w:rPr>
-        <w:t>{{</w:t>
-      </w:r>
-      <w:proofErr w:type="spellStart"/>
       <w:r>
         <w:rPr>
           <w:rFonts w:ascii="Arial" w:hAnsi="Arial" w:cs="Arial"/>
@@ -7388,15 +6105,7 @@
           <w:rFonts w:ascii="Arial" w:hAnsi="Arial" w:cs="Arial"/>
           <w:bCs/>
         </w:rPr>
-        <w:t>_sexual_or_violent_offence</w:t>
-      </w:r>
-      <w:proofErr w:type="spellEnd"/>
-      <w:r>
-        <w:rPr>
-          <w:rFonts w:ascii="Arial" w:hAnsi="Arial" w:cs="Arial"/>
-          <w:bCs/>
-        </w:rPr>
-        <w:t>}}</w:t>
+        <w:t>_sexual_or_violent_offence}}</w:t>
       </w:r>
     </w:p>
     <w:p>
@@ -7454,23 +6163,7 @@
           <w:rFonts w:ascii="Arial" w:hAnsi="Arial" w:cs="Arial"/>
           <w:bCs/>
         </w:rPr>
-        <w:t>{{</w:t>
-      </w:r>
-      <w:proofErr w:type="spellStart"/>
-      <w:r>
-        <w:rPr>
-          <w:rFonts w:ascii="Arial" w:hAnsi="Arial" w:cs="Arial"/>
-          <w:bCs/>
-        </w:rPr>
-        <w:t>behaviour_leading_to_sexual_or_violent_offence_present</w:t>
-      </w:r>
-      <w:proofErr w:type="spellEnd"/>
-      <w:r>
-        <w:rPr>
-          <w:rFonts w:ascii="Arial" w:hAnsi="Arial" w:cs="Arial"/>
-          <w:bCs/>
-        </w:rPr>
-        <w:t>}}</w:t>
+        <w:t>{{behaviour_leading_to_sexual_or_violent_offence_present}}</w:t>
       </w:r>
       <w:r>
         <w:rPr>
@@ -7491,23 +6184,7 @@
           <w:rFonts w:ascii="Arial" w:hAnsi="Arial" w:cs="Arial"/>
           <w:bCs/>
         </w:rPr>
-        <w:t>{{</w:t>
-      </w:r>
-      <w:proofErr w:type="spellStart"/>
-      <w:r>
-        <w:rPr>
-          <w:rFonts w:ascii="Arial" w:hAnsi="Arial" w:cs="Arial"/>
-          <w:bCs/>
-        </w:rPr>
-        <w:t>behaviour_leading_to_sexual_or_violent_offence</w:t>
-      </w:r>
-      <w:proofErr w:type="spellEnd"/>
-      <w:r>
-        <w:rPr>
-          <w:rFonts w:ascii="Arial" w:hAnsi="Arial" w:cs="Arial"/>
-          <w:bCs/>
-        </w:rPr>
-        <w:t>}}</w:t>
+        <w:t>{{behaviour_leading_to_sexual_or_violent_offence}}</w:t>
       </w:r>
     </w:p>
     <w:p>
@@ -7552,24 +6229,7 @@
           <w:rFonts w:ascii="Arial" w:hAnsi="Arial" w:cs="Arial"/>
           <w:bCs/>
         </w:rPr>
-        <w:t>{{</w:t>
-      </w:r>
-      <w:proofErr w:type="spellStart"/>
-      <w:r>
-        <w:rPr>
-          <w:rFonts w:ascii="Arial" w:hAnsi="Arial" w:cs="Arial"/>
-          <w:bCs/>
-        </w:rPr>
-        <w:t>out_of_touch_present</w:t>
-      </w:r>
-      <w:proofErr w:type="spellEnd"/>
-      <w:proofErr w:type="gramStart"/>
-      <w:r>
-        <w:rPr>
-          <w:rFonts w:ascii="Arial" w:hAnsi="Arial" w:cs="Arial"/>
-          <w:bCs/>
-        </w:rPr>
-        <w:t>}}</w:t>
+        <w:t>{{out_of_touch_present}}</w:t>
       </w:r>
       <w:r>
         <w:rPr>
@@ -7583,38 +6243,14 @@
           <w:rFonts w:ascii="Arial" w:hAnsi="Arial" w:cs="Arial"/>
           <w:b/>
         </w:rPr>
-        <w:t xml:space="preserve"> Provide</w:t>
-      </w:r>
-      <w:proofErr w:type="gramEnd"/>
-      <w:r>
-        <w:rPr>
-          <w:rFonts w:ascii="Arial" w:hAnsi="Arial" w:cs="Arial"/>
-          <w:b/>
-        </w:rPr>
-        <w:t xml:space="preserve"> details: </w:t>
-      </w:r>
-      <w:r>
-        <w:rPr>
-          <w:rFonts w:ascii="Arial" w:hAnsi="Arial" w:cs="Arial"/>
-          <w:bCs/>
-        </w:rPr>
-        <w:t>{{</w:t>
-      </w:r>
-      <w:proofErr w:type="spellStart"/>
-      <w:r>
-        <w:rPr>
-          <w:rFonts w:ascii="Arial" w:hAnsi="Arial" w:cs="Arial"/>
-          <w:bCs/>
-        </w:rPr>
-        <w:t>out_of_touch</w:t>
-      </w:r>
-      <w:proofErr w:type="spellEnd"/>
-      <w:r>
-        <w:rPr>
-          <w:rFonts w:ascii="Arial" w:hAnsi="Arial" w:cs="Arial"/>
-          <w:bCs/>
-        </w:rPr>
-        <w:t>}}</w:t>
+        <w:t xml:space="preserve"> Provide details: </w:t>
+      </w:r>
+      <w:r>
+        <w:rPr>
+          <w:rFonts w:ascii="Arial" w:hAnsi="Arial" w:cs="Arial"/>
+          <w:bCs/>
+        </w:rPr>
+        <w:t>{{out_of_touch}}</w:t>
       </w:r>
       <w:r>
         <w:rPr>
@@ -7672,46 +6308,14 @@
           <w:rFonts w:ascii="Arial" w:hAnsi="Arial" w:cs="Arial"/>
           <w:b/>
         </w:rPr>
-        <w:t>be made that (</w:t>
-      </w:r>
-      <w:proofErr w:type="spellStart"/>
-      <w:r>
-        <w:rPr>
-          <w:rFonts w:ascii="Arial" w:hAnsi="Arial" w:cs="Arial"/>
-          <w:b/>
-        </w:rPr>
-        <w:t>i</w:t>
-      </w:r>
-      <w:proofErr w:type="spellEnd"/>
-      <w:r>
-        <w:rPr>
-          <w:rFonts w:ascii="Arial" w:hAnsi="Arial" w:cs="Arial"/>
-          <w:b/>
-        </w:rPr>
-        <w:t xml:space="preserve">), (ii) or (iii) may arise? </w:t>
-      </w:r>
-      <w:r>
-        <w:rPr>
-          <w:rFonts w:ascii="Arial" w:hAnsi="Arial" w:cs="Arial"/>
-          <w:bCs/>
-        </w:rPr>
-        <w:t>{{</w:t>
-      </w:r>
-      <w:proofErr w:type="spellStart"/>
-      <w:r>
-        <w:rPr>
-          <w:rFonts w:ascii="Arial" w:hAnsi="Arial" w:cs="Arial"/>
-          <w:bCs/>
-        </w:rPr>
-        <w:t>out_of_touch</w:t>
-      </w:r>
-      <w:proofErr w:type="spellEnd"/>
-      <w:r>
-        <w:rPr>
-          <w:rFonts w:ascii="Arial" w:hAnsi="Arial" w:cs="Arial"/>
-          <w:bCs/>
-        </w:rPr>
-        <w:t>}}</w:t>
+        <w:t xml:space="preserve">be made that (i), (ii) or (iii) may arise? </w:t>
+      </w:r>
+      <w:r>
+        <w:rPr>
+          <w:rFonts w:ascii="Arial" w:hAnsi="Arial" w:cs="Arial"/>
+          <w:bCs/>
+        </w:rPr>
+        <w:t>{{out_of_touch}}</w:t>
       </w:r>
     </w:p>
     <w:p>
@@ -7893,23 +6497,7 @@
           <w:rFonts w:ascii="Arial" w:hAnsi="Arial" w:cs="Arial"/>
           <w:bCs/>
         </w:rPr>
-        <w:t>{{</w:t>
-      </w:r>
-      <w:proofErr w:type="spellStart"/>
-      <w:r>
-        <w:rPr>
-          <w:rFonts w:ascii="Arial" w:hAnsi="Arial" w:cs="Arial"/>
-          <w:bCs/>
-        </w:rPr>
-        <w:t>practitioner_name</w:t>
-      </w:r>
-      <w:proofErr w:type="spellEnd"/>
-      <w:r>
-        <w:rPr>
-          <w:rFonts w:ascii="Arial" w:hAnsi="Arial" w:cs="Arial"/>
-          <w:bCs/>
-        </w:rPr>
-        <w:t>}}</w:t>
+        <w:t>{{practitioner_name}}</w:t>
       </w:r>
     </w:p>
     <w:p>
@@ -7940,23 +6528,7 @@
           <w:rFonts w:ascii="Arial" w:hAnsi="Arial" w:cs="Arial"/>
           <w:bCs/>
         </w:rPr>
-        <w:t>{{</w:t>
-      </w:r>
-      <w:proofErr w:type="spellStart"/>
-      <w:r>
-        <w:rPr>
-          <w:rFonts w:ascii="Arial" w:hAnsi="Arial" w:cs="Arial"/>
-          <w:bCs/>
-        </w:rPr>
-        <w:t>practitioner_telephone</w:t>
-      </w:r>
-      <w:proofErr w:type="spellEnd"/>
-      <w:r>
-        <w:rPr>
-          <w:rFonts w:ascii="Arial" w:hAnsi="Arial" w:cs="Arial"/>
-          <w:bCs/>
-        </w:rPr>
-        <w:t>}}</w:t>
+        <w:t>{{practitioner_telephone}}</w:t>
       </w:r>
     </w:p>
     <w:p>
@@ -7987,23 +6559,7 @@
           <w:rFonts w:ascii="Arial" w:hAnsi="Arial" w:cs="Arial"/>
           <w:bCs/>
         </w:rPr>
-        <w:t>{{</w:t>
-      </w:r>
-      <w:proofErr w:type="spellStart"/>
-      <w:r>
-        <w:rPr>
-          <w:rFonts w:ascii="Arial" w:hAnsi="Arial" w:cs="Arial"/>
-          <w:bCs/>
-        </w:rPr>
-        <w:t>practitioner_email</w:t>
-      </w:r>
-      <w:proofErr w:type="spellEnd"/>
-      <w:r>
-        <w:rPr>
-          <w:rFonts w:ascii="Arial" w:hAnsi="Arial" w:cs="Arial"/>
-          <w:bCs/>
-        </w:rPr>
-        <w:t>}}</w:t>
+        <w:t>{{practitioner_email}}</w:t>
       </w:r>
       <w:r>
         <w:rPr>
@@ -8054,23 +6610,7 @@
           <w:rFonts w:ascii="Arial" w:hAnsi="Arial" w:cs="Arial"/>
           <w:bCs/>
         </w:rPr>
-        <w:t>{{</w:t>
-      </w:r>
-      <w:proofErr w:type="spellStart"/>
-      <w:r>
-        <w:rPr>
-          <w:rFonts w:ascii="Arial" w:hAnsi="Arial" w:cs="Arial"/>
-          <w:bCs/>
-        </w:rPr>
-        <w:t>completed_by_name</w:t>
-      </w:r>
-      <w:proofErr w:type="spellEnd"/>
-      <w:r>
-        <w:rPr>
-          <w:rFonts w:ascii="Arial" w:hAnsi="Arial" w:cs="Arial"/>
-          <w:bCs/>
-        </w:rPr>
-        <w:t>}}</w:t>
+        <w:t>{{completed_by_name}}</w:t>
       </w:r>
     </w:p>
     <w:p>
@@ -8108,23 +6648,7 @@
           <w:rFonts w:ascii="Arial" w:hAnsi="Arial" w:cs="Arial"/>
           <w:bCs/>
         </w:rPr>
-        <w:t>{{</w:t>
-      </w:r>
-      <w:proofErr w:type="spellStart"/>
-      <w:r>
-        <w:rPr>
-          <w:rFonts w:ascii="Arial" w:hAnsi="Arial" w:cs="Arial"/>
-          <w:bCs/>
-        </w:rPr>
-        <w:t>completed_by_telephone</w:t>
-      </w:r>
-      <w:proofErr w:type="spellEnd"/>
-      <w:r>
-        <w:rPr>
-          <w:rFonts w:ascii="Arial" w:hAnsi="Arial" w:cs="Arial"/>
-          <w:bCs/>
-        </w:rPr>
-        <w:t>}}</w:t>
+        <w:t>{{completed_by_telephone}}</w:t>
       </w:r>
     </w:p>
     <w:p>
@@ -8162,23 +6686,7 @@
           <w:rFonts w:ascii="Arial" w:hAnsi="Arial" w:cs="Arial"/>
           <w:bCs/>
         </w:rPr>
-        <w:t>{{</w:t>
-      </w:r>
-      <w:proofErr w:type="spellStart"/>
-      <w:r>
-        <w:rPr>
-          <w:rFonts w:ascii="Arial" w:hAnsi="Arial" w:cs="Arial"/>
-          <w:bCs/>
-        </w:rPr>
-        <w:t>completed_by_email</w:t>
-      </w:r>
-      <w:proofErr w:type="spellEnd"/>
-      <w:r>
-        <w:rPr>
-          <w:rFonts w:ascii="Arial" w:hAnsi="Arial" w:cs="Arial"/>
-          <w:bCs/>
-        </w:rPr>
-        <w:t>}}</w:t>
+        <w:t>{{completed_by_email}}</w:t>
       </w:r>
     </w:p>
     <w:p>
@@ -8216,23 +6724,7 @@
           <w:rFonts w:ascii="Arial" w:hAnsi="Arial" w:cs="Arial"/>
           <w:bCs/>
         </w:rPr>
-        <w:t>{{</w:t>
-      </w:r>
-      <w:proofErr w:type="spellStart"/>
-      <w:r>
-        <w:rPr>
-          <w:rFonts w:ascii="Arial" w:hAnsi="Arial" w:cs="Arial"/>
-          <w:bCs/>
-        </w:rPr>
-        <w:t>completed_by_region</w:t>
-      </w:r>
-      <w:proofErr w:type="spellEnd"/>
-      <w:r>
-        <w:rPr>
-          <w:rFonts w:ascii="Arial" w:hAnsi="Arial" w:cs="Arial"/>
-          <w:bCs/>
-        </w:rPr>
-        <w:t>}}</w:t>
+        <w:t>{{completed_by_region}}</w:t>
       </w:r>
     </w:p>
     <w:p>
@@ -8287,23 +6779,7 @@
           <w:rFonts w:ascii="Arial" w:hAnsi="Arial" w:cs="Arial"/>
           <w:bCs/>
         </w:rPr>
-        <w:t>{{</w:t>
-      </w:r>
-      <w:proofErr w:type="spellStart"/>
-      <w:r>
-        <w:rPr>
-          <w:rFonts w:ascii="Arial" w:hAnsi="Arial" w:cs="Arial"/>
-          <w:bCs/>
-        </w:rPr>
-        <w:t>completed_by_local_delivery_unit</w:t>
-      </w:r>
-      <w:proofErr w:type="spellEnd"/>
-      <w:r>
-        <w:rPr>
-          <w:rFonts w:ascii="Arial" w:hAnsi="Arial" w:cs="Arial"/>
-          <w:bCs/>
-        </w:rPr>
-        <w:t>}}</w:t>
+        <w:t>{{completed_by_local_delivery_unit}}</w:t>
       </w:r>
     </w:p>
     <w:p>
@@ -8364,23 +6840,7 @@
           <w:rFonts w:ascii="Arial" w:hAnsi="Arial" w:cs="Arial"/>
           <w:bCs/>
         </w:rPr>
-        <w:t>{{</w:t>
-      </w:r>
-      <w:proofErr w:type="spellStart"/>
-      <w:r>
-        <w:rPr>
-          <w:rFonts w:ascii="Arial" w:hAnsi="Arial" w:cs="Arial"/>
-          <w:bCs/>
-        </w:rPr>
-        <w:t>completed_by_ppcs_query_emails</w:t>
-      </w:r>
-      <w:proofErr w:type="spellEnd"/>
-      <w:r>
-        <w:rPr>
-          <w:rFonts w:ascii="Arial" w:hAnsi="Arial" w:cs="Arial"/>
-          <w:bCs/>
-        </w:rPr>
-        <w:t>}}</w:t>
+        <w:t>{{completed_by_ppcs_query_emails}}</w:t>
       </w:r>
     </w:p>
     <w:p>
@@ -8418,23 +6878,7 @@
           <w:rFonts w:ascii="Arial" w:hAnsi="Arial" w:cs="Arial"/>
           <w:bCs/>
         </w:rPr>
-        <w:t>{{</w:t>
-      </w:r>
-      <w:proofErr w:type="spellStart"/>
-      <w:r>
-        <w:rPr>
-          <w:rFonts w:ascii="Arial" w:hAnsi="Arial" w:cs="Arial"/>
-          <w:bCs/>
-        </w:rPr>
-        <w:t>date_of_decision</w:t>
-      </w:r>
-      <w:proofErr w:type="spellEnd"/>
-      <w:r>
-        <w:rPr>
-          <w:rFonts w:ascii="Arial" w:hAnsi="Arial" w:cs="Arial"/>
-          <w:bCs/>
-        </w:rPr>
-        <w:t>}}</w:t>
+        <w:t>{{date_of_decision}}</w:t>
       </w:r>
     </w:p>
     <w:p>
@@ -8471,23 +6915,7 @@
           <w:rFonts w:ascii="Arial" w:hAnsi="Arial" w:cs="Arial"/>
           <w:bCs/>
         </w:rPr>
-        <w:t>{{</w:t>
-      </w:r>
-      <w:proofErr w:type="spellStart"/>
-      <w:r>
-        <w:rPr>
-          <w:rFonts w:ascii="Arial" w:hAnsi="Arial" w:cs="Arial"/>
-          <w:bCs/>
-        </w:rPr>
-        <w:t>time_of_decision</w:t>
-      </w:r>
-      <w:proofErr w:type="spellEnd"/>
-      <w:r>
-        <w:rPr>
-          <w:rFonts w:ascii="Arial" w:hAnsi="Arial" w:cs="Arial"/>
-          <w:bCs/>
-        </w:rPr>
-        <w:t>}}</w:t>
+        <w:t>{{time_of_decision}}</w:t>
       </w:r>
     </w:p>
     <w:p>
@@ -8599,23 +7027,7 @@
           <w:rFonts w:ascii="Arial" w:hAnsi="Arial" w:cs="Arial"/>
           <w:bCs/>
         </w:rPr>
-        <w:t>{{</w:t>
-      </w:r>
-      <w:proofErr w:type="spellStart"/>
-      <w:r>
-        <w:rPr>
-          <w:rFonts w:ascii="Arial" w:hAnsi="Arial" w:cs="Arial"/>
-          <w:bCs/>
-        </w:rPr>
-        <w:t>spo_countersign_complete</w:t>
-      </w:r>
-      <w:proofErr w:type="spellEnd"/>
-      <w:r>
-        <w:rPr>
-          <w:rFonts w:ascii="Arial" w:hAnsi="Arial" w:cs="Arial"/>
-          <w:bCs/>
-        </w:rPr>
-        <w:t>}}</w:t>
+        <w:t>{{spo_countersign_complete}}</w:t>
       </w:r>
       <w:r>
         <w:rPr>
@@ -8704,23 +7116,7 @@
           <w:rFonts w:ascii="Arial" w:hAnsi="Arial" w:cs="Arial"/>
           <w:bCs/>
         </w:rPr>
-        <w:t>{{</w:t>
-      </w:r>
-      <w:proofErr w:type="spellStart"/>
-      <w:r>
-        <w:rPr>
-          <w:rFonts w:ascii="Arial" w:hAnsi="Arial" w:cs="Arial"/>
-          <w:bCs/>
-        </w:rPr>
-        <w:t>spo_countersign_complete</w:t>
-      </w:r>
-      <w:proofErr w:type="spellEnd"/>
-      <w:r>
-        <w:rPr>
-          <w:rFonts w:ascii="Arial" w:hAnsi="Arial" w:cs="Arial"/>
-          <w:bCs/>
-        </w:rPr>
-        <w:t>}}</w:t>
+        <w:t>{{spo_countersign_complete}}</w:t>
       </w:r>
       <w:r>
         <w:rPr>
@@ -8761,23 +7157,7 @@
           <w:rFonts w:ascii="Arial" w:hAnsi="Arial" w:cs="Arial"/>
           <w:bCs/>
         </w:rPr>
-        <w:t>{{</w:t>
-      </w:r>
-      <w:proofErr w:type="spellStart"/>
-      <w:r>
-        <w:rPr>
-          <w:rFonts w:ascii="Arial" w:hAnsi="Arial" w:cs="Arial"/>
-          <w:bCs/>
-        </w:rPr>
-        <w:t>spo_countersign_complete</w:t>
-      </w:r>
-      <w:proofErr w:type="spellEnd"/>
-      <w:r>
-        <w:rPr>
-          <w:rFonts w:ascii="Arial" w:hAnsi="Arial" w:cs="Arial"/>
-          <w:bCs/>
-        </w:rPr>
-        <w:t>}}</w:t>
+        <w:t>{{spo_countersign_complete}}</w:t>
       </w:r>
       <w:r>
         <w:rPr>
@@ -8821,23 +7201,7 @@
           <w:rFonts w:ascii="Arial" w:hAnsi="Arial" w:cs="Arial"/>
           <w:bCs/>
         </w:rPr>
-        <w:t>{{</w:t>
-      </w:r>
-      <w:proofErr w:type="spellStart"/>
-      <w:r>
-        <w:rPr>
-          <w:rFonts w:ascii="Arial" w:hAnsi="Arial" w:cs="Arial"/>
-          <w:bCs/>
-        </w:rPr>
-        <w:t>spo_countersign_complete</w:t>
-      </w:r>
-      <w:proofErr w:type="spellEnd"/>
-      <w:r>
-        <w:rPr>
-          <w:rFonts w:ascii="Arial" w:hAnsi="Arial" w:cs="Arial"/>
-          <w:bCs/>
-        </w:rPr>
-        <w:t>}}</w:t>
+        <w:t>{{spo_countersign_complete}}</w:t>
       </w:r>
       <w:r>
         <w:rPr>
@@ -8878,23 +7242,7 @@
           <w:rFonts w:ascii="Arial" w:hAnsi="Arial" w:cs="Arial"/>
           <w:bCs/>
         </w:rPr>
-        <w:t>{{</w:t>
-      </w:r>
-      <w:proofErr w:type="spellStart"/>
-      <w:r>
-        <w:rPr>
-          <w:rFonts w:ascii="Arial" w:hAnsi="Arial" w:cs="Arial"/>
-          <w:bCs/>
-        </w:rPr>
-        <w:t>spo_countersign_complete</w:t>
-      </w:r>
-      <w:proofErr w:type="spellEnd"/>
-      <w:r>
-        <w:rPr>
-          <w:rFonts w:ascii="Arial" w:hAnsi="Arial" w:cs="Arial"/>
-          <w:bCs/>
-        </w:rPr>
-        <w:t>}}</w:t>
+        <w:t>{{spo_countersign_complete}}</w:t>
       </w:r>
       <w:r>
         <w:rPr>
@@ -8962,23 +7310,7 @@
           <w:rFonts w:ascii="Arial" w:hAnsi="Arial" w:cs="Arial"/>
           <w:bCs/>
         </w:rPr>
-        <w:t>{{</w:t>
-      </w:r>
-      <w:proofErr w:type="spellStart"/>
-      <w:r>
-        <w:rPr>
-          <w:rFonts w:ascii="Arial" w:hAnsi="Arial" w:cs="Arial"/>
-          <w:bCs/>
-        </w:rPr>
-        <w:t>countersign_spo_exposition</w:t>
-      </w:r>
-      <w:proofErr w:type="spellEnd"/>
-      <w:r>
-        <w:rPr>
-          <w:rFonts w:ascii="Arial" w:hAnsi="Arial" w:cs="Arial"/>
-          <w:bCs/>
-        </w:rPr>
-        <w:t>}</w:t>
+        <w:t>{{countersign_spo_exposition}</w:t>
       </w:r>
       <w:r>
         <w:rPr>
@@ -9017,23 +7349,7 @@
           <w:rFonts w:ascii="Arial" w:hAnsi="Arial" w:cs="Arial"/>
           <w:bCs/>
         </w:rPr>
-        <w:t>{{</w:t>
-      </w:r>
-      <w:proofErr w:type="spellStart"/>
-      <w:r>
-        <w:rPr>
-          <w:rFonts w:ascii="Arial" w:hAnsi="Arial" w:cs="Arial"/>
-          <w:bCs/>
-        </w:rPr>
-        <w:t>countersign_spo_name</w:t>
-      </w:r>
-      <w:proofErr w:type="spellEnd"/>
-      <w:r>
-        <w:rPr>
-          <w:rFonts w:ascii="Arial" w:hAnsi="Arial" w:cs="Arial"/>
-          <w:bCs/>
-        </w:rPr>
-        <w:t>}}</w:t>
+        <w:t>{{countersign_spo_name}}</w:t>
       </w:r>
     </w:p>
     <w:p>
@@ -9064,23 +7380,7 @@
           <w:rFonts w:ascii="Arial" w:hAnsi="Arial" w:cs="Arial"/>
           <w:bCs/>
         </w:rPr>
-        <w:t>{{</w:t>
-      </w:r>
-      <w:proofErr w:type="spellStart"/>
-      <w:r>
-        <w:rPr>
-          <w:rFonts w:ascii="Arial" w:hAnsi="Arial" w:cs="Arial"/>
-          <w:bCs/>
-        </w:rPr>
-        <w:t>countersign_spo_email</w:t>
-      </w:r>
-      <w:proofErr w:type="spellEnd"/>
-      <w:r>
-        <w:rPr>
-          <w:rFonts w:ascii="Arial" w:hAnsi="Arial" w:cs="Arial"/>
-          <w:bCs/>
-        </w:rPr>
-        <w:t>}}</w:t>
+        <w:t>{{countersign_spo_email}}</w:t>
       </w:r>
     </w:p>
     <w:p>
@@ -9118,23 +7418,7 @@
           <w:rFonts w:ascii="Arial" w:hAnsi="Arial" w:cs="Arial"/>
           <w:bCs/>
         </w:rPr>
-        <w:t>{{</w:t>
-      </w:r>
-      <w:proofErr w:type="spellStart"/>
-      <w:r>
-        <w:rPr>
-          <w:rFonts w:ascii="Arial" w:hAnsi="Arial" w:cs="Arial"/>
-          <w:bCs/>
-        </w:rPr>
-        <w:t>countersign_spo_telephone</w:t>
-      </w:r>
-      <w:proofErr w:type="spellEnd"/>
-      <w:r>
-        <w:rPr>
-          <w:rFonts w:ascii="Arial" w:hAnsi="Arial" w:cs="Arial"/>
-          <w:bCs/>
-        </w:rPr>
-        <w:t>}}</w:t>
+        <w:t>{{countersign_spo_telephone}}</w:t>
       </w:r>
     </w:p>
     <w:p>
@@ -9201,23 +7485,7 @@
           <w:rFonts w:ascii="Arial" w:hAnsi="Arial" w:cs="Arial"/>
           <w:bCs/>
         </w:rPr>
-        <w:t>{{</w:t>
-      </w:r>
-      <w:proofErr w:type="spellStart"/>
-      <w:r>
-        <w:rPr>
-          <w:rFonts w:ascii="Arial" w:hAnsi="Arial" w:cs="Arial"/>
-          <w:bCs/>
-        </w:rPr>
-        <w:t>date_of_decision</w:t>
-      </w:r>
-      <w:proofErr w:type="spellEnd"/>
-      <w:r>
-        <w:rPr>
-          <w:rFonts w:ascii="Arial" w:hAnsi="Arial" w:cs="Arial"/>
-          <w:bCs/>
-        </w:rPr>
-        <w:t>}}</w:t>
+        <w:t>{{date_of_decision}}</w:t>
       </w:r>
       <w:r>
         <w:rPr>
@@ -9231,23 +7499,7 @@
           <w:rFonts w:ascii="Arial" w:hAnsi="Arial" w:cs="Arial"/>
           <w:bCs/>
         </w:rPr>
-        <w:t>{{</w:t>
-      </w:r>
-      <w:proofErr w:type="spellStart"/>
-      <w:r>
-        <w:rPr>
-          <w:rFonts w:ascii="Arial" w:hAnsi="Arial" w:cs="Arial"/>
-          <w:bCs/>
-        </w:rPr>
-        <w:t>time_of_decision</w:t>
-      </w:r>
-      <w:proofErr w:type="spellEnd"/>
-      <w:r>
-        <w:rPr>
-          <w:rFonts w:ascii="Arial" w:hAnsi="Arial" w:cs="Arial"/>
-          <w:bCs/>
-        </w:rPr>
-        <w:t>}}</w:t>
+        <w:t>{{time_of_decision}}</w:t>
       </w:r>
     </w:p>
     <w:p>
@@ -9305,23 +7557,7 @@
           <w:rFonts w:ascii="Arial" w:hAnsi="Arial" w:cs="Arial"/>
           <w:bCs/>
         </w:rPr>
-        <w:t>{{</w:t>
-      </w:r>
-      <w:proofErr w:type="spellStart"/>
-      <w:r>
-        <w:rPr>
-          <w:rFonts w:ascii="Arial" w:hAnsi="Arial" w:cs="Arial"/>
-          <w:bCs/>
-        </w:rPr>
-        <w:t>countersign_spo_date</w:t>
-      </w:r>
-      <w:proofErr w:type="spellEnd"/>
-      <w:r>
-        <w:rPr>
-          <w:rFonts w:ascii="Arial" w:hAnsi="Arial" w:cs="Arial"/>
-          <w:bCs/>
-        </w:rPr>
-        <w:t>}}</w:t>
+        <w:t>{{countersign_spo_date}}</w:t>
       </w:r>
     </w:p>
     <w:p>
@@ -9375,23 +7611,7 @@
           <w:rFonts w:ascii="Arial" w:hAnsi="Arial" w:cs="Arial"/>
           <w:bCs/>
         </w:rPr>
-        <w:t>{{</w:t>
-      </w:r>
-      <w:proofErr w:type="spellStart"/>
-      <w:r>
-        <w:rPr>
-          <w:rFonts w:ascii="Arial" w:hAnsi="Arial" w:cs="Arial"/>
-          <w:bCs/>
-        </w:rPr>
-        <w:t>countersign_spo_time</w:t>
-      </w:r>
-      <w:proofErr w:type="spellEnd"/>
-      <w:r>
-        <w:rPr>
-          <w:rFonts w:ascii="Arial" w:hAnsi="Arial" w:cs="Arial"/>
-          <w:bCs/>
-        </w:rPr>
-        <w:t>}}</w:t>
+        <w:t>{{countersign_spo_time}}</w:t>
       </w:r>
     </w:p>
     <w:p>
@@ -9505,23 +7725,7 @@
           <w:rFonts w:ascii="Arial" w:hAnsi="Arial" w:cs="Arial"/>
           <w:bCs/>
         </w:rPr>
-        <w:t>{{</w:t>
-      </w:r>
-      <w:proofErr w:type="spellStart"/>
-      <w:r>
-        <w:rPr>
-          <w:rFonts w:ascii="Arial" w:hAnsi="Arial" w:cs="Arial"/>
-          <w:bCs/>
-        </w:rPr>
-        <w:t>aco_countersign_complete</w:t>
-      </w:r>
-      <w:proofErr w:type="spellEnd"/>
-      <w:r>
-        <w:rPr>
-          <w:rFonts w:ascii="Arial" w:hAnsi="Arial" w:cs="Arial"/>
-          <w:bCs/>
-        </w:rPr>
-        <w:t>}}</w:t>
+        <w:t>{{aco_countersign_complete}}</w:t>
       </w:r>
       <w:r>
         <w:rPr>
@@ -9647,23 +7851,7 @@
           <w:rFonts w:ascii="Arial" w:hAnsi="Arial" w:cs="Arial"/>
           <w:bCs/>
         </w:rPr>
-        <w:t>{{</w:t>
-      </w:r>
-      <w:proofErr w:type="spellStart"/>
-      <w:r>
-        <w:rPr>
-          <w:rFonts w:ascii="Arial" w:hAnsi="Arial" w:cs="Arial"/>
-          <w:bCs/>
-        </w:rPr>
-        <w:t>countersign_aco_exposition</w:t>
-      </w:r>
-      <w:proofErr w:type="spellEnd"/>
-      <w:r>
-        <w:rPr>
-          <w:rFonts w:ascii="Arial" w:hAnsi="Arial" w:cs="Arial"/>
-          <w:bCs/>
-        </w:rPr>
-        <w:t>}}</w:t>
+        <w:t>{{countersign_aco_exposition}}</w:t>
       </w:r>
     </w:p>
     <w:p>
@@ -9695,23 +7883,7 @@
           <w:rFonts w:ascii="Arial" w:hAnsi="Arial" w:cs="Arial"/>
           <w:bCs/>
         </w:rPr>
-        <w:t>{{</w:t>
-      </w:r>
-      <w:proofErr w:type="spellStart"/>
-      <w:r>
-        <w:rPr>
-          <w:rFonts w:ascii="Arial" w:hAnsi="Arial" w:cs="Arial"/>
-          <w:bCs/>
-        </w:rPr>
-        <w:t>countersign_aco_name</w:t>
-      </w:r>
-      <w:proofErr w:type="spellEnd"/>
-      <w:r>
-        <w:rPr>
-          <w:rFonts w:ascii="Arial" w:hAnsi="Arial" w:cs="Arial"/>
-          <w:bCs/>
-        </w:rPr>
-        <w:t>}}</w:t>
+        <w:t>{{countersign_aco_name}}</w:t>
       </w:r>
     </w:p>
     <w:p>
@@ -9743,23 +7915,7 @@
           <w:rFonts w:ascii="Arial" w:hAnsi="Arial" w:cs="Arial"/>
           <w:bCs/>
         </w:rPr>
-        <w:t>{{</w:t>
-      </w:r>
-      <w:proofErr w:type="spellStart"/>
-      <w:r>
-        <w:rPr>
-          <w:rFonts w:ascii="Arial" w:hAnsi="Arial" w:cs="Arial"/>
-          <w:bCs/>
-        </w:rPr>
-        <w:t>countersign_aco_telephone</w:t>
-      </w:r>
-      <w:proofErr w:type="spellEnd"/>
-      <w:r>
-        <w:rPr>
-          <w:rFonts w:ascii="Arial" w:hAnsi="Arial" w:cs="Arial"/>
-          <w:bCs/>
-        </w:rPr>
-        <w:t>}}</w:t>
+        <w:t>{{countersign_aco_telephone}}</w:t>
       </w:r>
     </w:p>
     <w:p>
@@ -9791,23 +7947,7 @@
           <w:rFonts w:ascii="Arial" w:hAnsi="Arial" w:cs="Arial"/>
           <w:bCs/>
         </w:rPr>
-        <w:t>{{</w:t>
-      </w:r>
-      <w:proofErr w:type="spellStart"/>
-      <w:r>
-        <w:rPr>
-          <w:rFonts w:ascii="Arial" w:hAnsi="Arial" w:cs="Arial"/>
-          <w:bCs/>
-        </w:rPr>
-        <w:t>countersign_aco_email</w:t>
-      </w:r>
-      <w:proofErr w:type="spellEnd"/>
-      <w:r>
-        <w:rPr>
-          <w:rFonts w:ascii="Arial" w:hAnsi="Arial" w:cs="Arial"/>
-          <w:bCs/>
-        </w:rPr>
-        <w:t>}}</w:t>
+        <w:t>{{countersign_aco_email}}</w:t>
       </w:r>
     </w:p>
     <w:p>
@@ -9839,23 +7979,7 @@
           <w:rFonts w:ascii="Arial" w:hAnsi="Arial" w:cs="Arial"/>
           <w:bCs/>
         </w:rPr>
-        <w:t>{{</w:t>
-      </w:r>
-      <w:proofErr w:type="spellStart"/>
-      <w:r>
-        <w:rPr>
-          <w:rFonts w:ascii="Arial" w:hAnsi="Arial" w:cs="Arial"/>
-          <w:bCs/>
-        </w:rPr>
-        <w:t>countersign_aco_date</w:t>
-      </w:r>
-      <w:proofErr w:type="spellEnd"/>
-      <w:r>
-        <w:rPr>
-          <w:rFonts w:ascii="Arial" w:hAnsi="Arial" w:cs="Arial"/>
-          <w:bCs/>
-        </w:rPr>
-        <w:t>}}</w:t>
+        <w:t>{{countersign_aco_date}}</w:t>
       </w:r>
     </w:p>
     <w:p>
@@ -9887,23 +8011,7 @@
           <w:rFonts w:ascii="Arial" w:hAnsi="Arial" w:cs="Arial"/>
           <w:bCs/>
         </w:rPr>
-        <w:t>{{</w:t>
-      </w:r>
-      <w:proofErr w:type="spellStart"/>
-      <w:r>
-        <w:rPr>
-          <w:rFonts w:ascii="Arial" w:hAnsi="Arial" w:cs="Arial"/>
-          <w:bCs/>
-        </w:rPr>
-        <w:t>countersign_aco_time</w:t>
-      </w:r>
-      <w:proofErr w:type="spellEnd"/>
-      <w:r>
-        <w:rPr>
-          <w:rFonts w:ascii="Arial" w:hAnsi="Arial" w:cs="Arial"/>
-          <w:bCs/>
-        </w:rPr>
-        <w:t>}}</w:t>
+        <w:t>{{countersign_aco_time}}</w:t>
       </w:r>
     </w:p>
     <w:p>
@@ -9934,23 +8042,7 @@
           <w:rFonts w:ascii="Arial" w:hAnsi="Arial" w:cs="Arial"/>
           <w:bCs/>
         </w:rPr>
-        <w:t>{{</w:t>
-      </w:r>
-      <w:proofErr w:type="spellStart"/>
-      <w:r>
-        <w:rPr>
-          <w:rFonts w:ascii="Arial" w:hAnsi="Arial" w:cs="Arial"/>
-          <w:bCs/>
-        </w:rPr>
-        <w:t>revocation_order_recipients</w:t>
-      </w:r>
-      <w:proofErr w:type="spellEnd"/>
-      <w:r>
-        <w:rPr>
-          <w:rFonts w:ascii="Arial" w:hAnsi="Arial" w:cs="Arial"/>
-          <w:bCs/>
-        </w:rPr>
-        <w:t>}}</w:t>
+        <w:t>{{revocation_order_recipients}}</w:t>
       </w:r>
     </w:p>
     <w:p>
@@ -18495,6 +16587,7 @@
     <w:rsid w:val="00773BF2"/>
     <w:rsid w:val="00784076"/>
     <w:rsid w:val="007A179D"/>
+    <w:rsid w:val="007A4FA3"/>
     <w:rsid w:val="007B2F8D"/>
     <w:rsid w:val="00843451"/>
     <w:rsid w:val="008456B3"/>
@@ -18526,6 +16619,7 @@
     <w:rsid w:val="00C45073"/>
     <w:rsid w:val="00C73BA4"/>
     <w:rsid w:val="00C827E2"/>
+    <w:rsid w:val="00CC41EB"/>
     <w:rsid w:val="00CE5DE0"/>
     <w:rsid w:val="00CF7AD2"/>
     <w:rsid w:val="00D13037"/>
@@ -19327,22 +17421,6 @@
 </file>
 
 <file path=customXml/item1.xml><?xml version="1.0" encoding="utf-8"?>
-<b:Sources xmlns:b="http://schemas.openxmlformats.org/officeDocument/2006/bibliography" xmlns="http://schemas.openxmlformats.org/officeDocument/2006/bibliography" SelectedStyle="" StyleName="" Version="0"/>
-</file>
-
-<file path=customXml/item2.xml><?xml version="1.0" encoding="utf-8"?>
-<p:properties xmlns:p="http://schemas.microsoft.com/office/2006/metadata/properties" xmlns:xsi="http://www.w3.org/2001/XMLSchema-instance" xmlns:pc="http://schemas.microsoft.com/office/infopath/2007/PartnerControls">
-  <documentManagement>
-    <lcf76f155ced4ddcb4097134ff3c332f xmlns="2244256a-353e-4aaa-84de-68fbd58bc0b5">
-      <Terms xmlns="http://schemas.microsoft.com/office/infopath/2007/PartnerControls"/>
-    </lcf76f155ced4ddcb4097134ff3c332f>
-    <TaxCatchAll xmlns="461e5654-0e9a-4527-837d-fdc364c1f1ed" xsi:nil="true"/>
-    <Number xmlns="2244256a-353e-4aaa-84de-68fbd58bc0b5" xsi:nil="true"/>
-  </documentManagement>
-</p:properties>
-</file>
-
-<file path=customXml/item3.xml><?xml version="1.0" encoding="utf-8"?>
 <ct:contentTypeSchema xmlns:ct="http://schemas.microsoft.com/office/2006/metadata/contentType" xmlns:ma="http://schemas.microsoft.com/office/2006/metadata/properties/metaAttributes" ct:_="" ma:_="" ma:contentTypeName="Document" ma:contentTypeID="0x010100BB15E224CEB19F4BA17DCD08B156C20E" ma:contentTypeVersion="14" ma:contentTypeDescription="Create a new document." ma:contentTypeScope="" ma:versionID="7cd304efa23d0061db26e2f05b6414b1">
   <xsd:schema xmlns:xsd="http://www.w3.org/2001/XMLSchema" xmlns:xs="http://www.w3.org/2001/XMLSchema" xmlns:p="http://schemas.microsoft.com/office/2006/metadata/properties" xmlns:ns2="2244256a-353e-4aaa-84de-68fbd58bc0b5" xmlns:ns3="461e5654-0e9a-4527-837d-fdc364c1f1ed" targetNamespace="http://schemas.microsoft.com/office/2006/metadata/properties" ma:root="true" ma:fieldsID="44df93feef4834377720eaaf16faf4fa" ns2:_="" ns3:_="">
     <xsd:import namespace="2244256a-353e-4aaa-84de-68fbd58bc0b5"/>
@@ -19555,6 +17633,22 @@
 </ct:contentTypeSchema>
 </file>
 
+<file path=customXml/item2.xml><?xml version="1.0" encoding="utf-8"?>
+<p:properties xmlns:p="http://schemas.microsoft.com/office/2006/metadata/properties" xmlns:xsi="http://www.w3.org/2001/XMLSchema-instance" xmlns:pc="http://schemas.microsoft.com/office/infopath/2007/PartnerControls">
+  <documentManagement>
+    <lcf76f155ced4ddcb4097134ff3c332f xmlns="2244256a-353e-4aaa-84de-68fbd58bc0b5">
+      <Terms xmlns="http://schemas.microsoft.com/office/infopath/2007/PartnerControls"/>
+    </lcf76f155ced4ddcb4097134ff3c332f>
+    <TaxCatchAll xmlns="461e5654-0e9a-4527-837d-fdc364c1f1ed" xsi:nil="true"/>
+    <Number xmlns="2244256a-353e-4aaa-84de-68fbd58bc0b5" xsi:nil="true"/>
+  </documentManagement>
+</p:properties>
+</file>
+
+<file path=customXml/item3.xml><?xml version="1.0" encoding="utf-8"?>
+<b:Sources xmlns:b="http://schemas.openxmlformats.org/officeDocument/2006/bibliography" xmlns="http://schemas.openxmlformats.org/officeDocument/2006/bibliography" SelectedStyle="" StyleName="" Version="0"/>
+</file>
+
 <file path=customXml/item4.xml><?xml version="1.0" encoding="utf-8"?>
 <?mso-contentType ?>
 <FormTemplates xmlns="http://schemas.microsoft.com/sharepoint/v3/contenttype/forms">
@@ -19565,25 +17659,6 @@
 </file>
 
 <file path=customXml/itemProps1.xml><?xml version="1.0" encoding="utf-8"?>
-<ds:datastoreItem xmlns:ds="http://schemas.openxmlformats.org/officeDocument/2006/customXml" ds:itemID="{1AA002EC-9FAC-469B-886C-4AD0DF10DF17}">
-  <ds:schemaRefs>
-    <ds:schemaRef ds:uri="http://schemas.openxmlformats.org/officeDocument/2006/bibliography"/>
-  </ds:schemaRefs>
-</ds:datastoreItem>
-</file>
-
-<file path=customXml/itemProps2.xml><?xml version="1.0" encoding="utf-8"?>
-<ds:datastoreItem xmlns:ds="http://schemas.openxmlformats.org/officeDocument/2006/customXml" ds:itemID="{D6602E3C-70F5-412B-A646-0548AF3EB1F8}">
-  <ds:schemaRefs>
-    <ds:schemaRef ds:uri="http://schemas.microsoft.com/office/2006/metadata/properties"/>
-    <ds:schemaRef ds:uri="http://schemas.microsoft.com/office/infopath/2007/PartnerControls"/>
-    <ds:schemaRef ds:uri="2244256a-353e-4aaa-84de-68fbd58bc0b5"/>
-    <ds:schemaRef ds:uri="461e5654-0e9a-4527-837d-fdc364c1f1ed"/>
-  </ds:schemaRefs>
-</ds:datastoreItem>
-</file>
-
-<file path=customXml/itemProps3.xml><?xml version="1.0" encoding="utf-8"?>
 <ds:datastoreItem xmlns:ds="http://schemas.openxmlformats.org/officeDocument/2006/customXml" ds:itemID="{79C448BA-7A2C-492D-9615-F080CE57201F}">
   <ds:schemaRefs>
     <ds:schemaRef ds:uri="http://schemas.microsoft.com/office/2006/metadata/contentType"/>
@@ -19602,6 +17677,25 @@
 </ds:datastoreItem>
 </file>
 
+<file path=customXml/itemProps2.xml><?xml version="1.0" encoding="utf-8"?>
+<ds:datastoreItem xmlns:ds="http://schemas.openxmlformats.org/officeDocument/2006/customXml" ds:itemID="{D6602E3C-70F5-412B-A646-0548AF3EB1F8}">
+  <ds:schemaRefs>
+    <ds:schemaRef ds:uri="http://schemas.microsoft.com/office/2006/metadata/properties"/>
+    <ds:schemaRef ds:uri="http://schemas.microsoft.com/office/infopath/2007/PartnerControls"/>
+    <ds:schemaRef ds:uri="2244256a-353e-4aaa-84de-68fbd58bc0b5"/>
+    <ds:schemaRef ds:uri="461e5654-0e9a-4527-837d-fdc364c1f1ed"/>
+  </ds:schemaRefs>
+</ds:datastoreItem>
+</file>
+
+<file path=customXml/itemProps3.xml><?xml version="1.0" encoding="utf-8"?>
+<ds:datastoreItem xmlns:ds="http://schemas.openxmlformats.org/officeDocument/2006/customXml" ds:itemID="{1AA002EC-9FAC-469B-886C-4AD0DF10DF17}">
+  <ds:schemaRefs>
+    <ds:schemaRef ds:uri="http://schemas.openxmlformats.org/officeDocument/2006/bibliography"/>
+  </ds:schemaRefs>
+</ds:datastoreItem>
+</file>
+
 <file path=customXml/itemProps4.xml><?xml version="1.0" encoding="utf-8"?>
 <ds:datastoreItem xmlns:ds="http://schemas.openxmlformats.org/officeDocument/2006/customXml" ds:itemID="{9C893AAC-1781-44C1-940F-A467E506D9D1}">
   <ds:schemaRefs>

</xml_diff>

<commit_message>
MRD-3132 Update FTR56 Q4 filling (#1282)
</commit_message>
<xml_diff>
--- a/src/main/resources/templates/partA/2026-03-31 - FTR56/Part A Template.docx
+++ b/src/main/resources/templates/partA/2026-03-31 - FTR56/Part A Template.docx
@@ -344,67 +344,35 @@
           <w:rFonts w:ascii="Arial" w:hAnsi="Arial" w:cs="Arial"/>
           <w:b/>
         </w:rPr>
-        <w:t xml:space="preserve">an </w:t>
-      </w:r>
-      <w:proofErr w:type="gramStart"/>
-      <w:r>
-        <w:rPr>
-          <w:rFonts w:ascii="Arial" w:hAnsi="Arial" w:cs="Arial"/>
-          <w:b/>
-        </w:rPr>
-        <w:t>Emergency</w:t>
-      </w:r>
-      <w:proofErr w:type="gramEnd"/>
-      <w:r>
-        <w:rPr>
-          <w:rFonts w:ascii="Arial" w:hAnsi="Arial" w:cs="Arial"/>
-          <w:b/>
+        <w:t xml:space="preserve">an Emergency </w:t>
+      </w:r>
+      <w:r>
+        <w:rPr>
+          <w:rFonts w:ascii="Arial" w:hAnsi="Arial" w:cs="Arial"/>
+          <w:b/>
+          <w:bCs/>
+        </w:rPr>
+        <w:t>recall</w:t>
+      </w:r>
+      <w:r>
+        <w:rPr>
+          <w:rFonts w:ascii="Arial" w:hAnsi="Arial" w:cs="Arial"/>
+          <w:b/>
+        </w:rPr>
+        <w:t>?</w:t>
+      </w:r>
+      <w:r>
+        <w:rPr>
+          <w:rFonts w:ascii="Arial" w:hAnsi="Arial" w:cs="Arial"/>
         </w:rPr>
         <w:t xml:space="preserve"> </w:t>
       </w:r>
       <w:r>
         <w:rPr>
           <w:rFonts w:ascii="Arial" w:hAnsi="Arial" w:cs="Arial"/>
-          <w:b/>
-          <w:bCs/>
-        </w:rPr>
-        <w:t>recall</w:t>
-      </w:r>
-      <w:r>
-        <w:rPr>
-          <w:rFonts w:ascii="Arial" w:hAnsi="Arial" w:cs="Arial"/>
-          <w:b/>
-        </w:rPr>
-        <w:t>?</w:t>
-      </w:r>
-      <w:r>
-        <w:rPr>
-          <w:rFonts w:ascii="Arial" w:hAnsi="Arial" w:cs="Arial"/>
-        </w:rPr>
-        <w:t xml:space="preserve"> </w:t>
-      </w:r>
-      <w:r>
-        <w:rPr>
-          <w:rFonts w:ascii="Arial" w:hAnsi="Arial" w:cs="Arial"/>
-          <w:bCs/>
-        </w:rPr>
-        <w:t>{{</w:t>
-      </w:r>
-      <w:proofErr w:type="spellStart"/>
-      <w:r>
-        <w:rPr>
-          <w:rFonts w:ascii="Arial" w:hAnsi="Arial" w:cs="Arial"/>
-          <w:bCs/>
-        </w:rPr>
-        <w:t>is_this_an_emergency_recall</w:t>
-      </w:r>
-      <w:proofErr w:type="spellEnd"/>
-      <w:r>
-        <w:rPr>
-          <w:rFonts w:ascii="Arial" w:hAnsi="Arial" w:cs="Arial"/>
-          <w:bCs/>
-        </w:rPr>
-        <w:t>}}</w:t>
+          <w:bCs/>
+        </w:rPr>
+        <w:t>{{is_this_an_emergency_recall}}</w:t>
       </w:r>
     </w:p>
     <w:p>
@@ -450,23 +418,7 @@
           <w:rFonts w:ascii="Arial" w:hAnsi="Arial" w:cs="Arial"/>
           <w:bCs/>
         </w:rPr>
-        <w:t>{{</w:t>
-      </w:r>
-      <w:proofErr w:type="spellStart"/>
-      <w:r>
-        <w:rPr>
-          <w:rFonts w:ascii="Arial" w:hAnsi="Arial" w:cs="Arial"/>
-          <w:bCs/>
-        </w:rPr>
-        <w:t>indeterminate_sentence_type</w:t>
-      </w:r>
-      <w:proofErr w:type="spellEnd"/>
-      <w:r>
-        <w:rPr>
-          <w:rFonts w:ascii="Arial" w:hAnsi="Arial" w:cs="Arial"/>
-          <w:bCs/>
-        </w:rPr>
-        <w:t xml:space="preserve">}} </w:t>
+        <w:t xml:space="preserve">{{indeterminate_sentence_type}} </w:t>
       </w:r>
       <w:r>
         <w:rPr>
@@ -540,23 +492,7 @@
           <w:rFonts w:ascii="Arial" w:hAnsi="Arial" w:cs="Arial"/>
           <w:bCs/>
         </w:rPr>
-        <w:t>{{</w:t>
-      </w:r>
-      <w:proofErr w:type="spellStart"/>
-      <w:r>
-        <w:rPr>
-          <w:rFonts w:ascii="Arial" w:hAnsi="Arial" w:cs="Arial"/>
-          <w:bCs/>
-        </w:rPr>
-        <w:t>is_extended_sentence</w:t>
-      </w:r>
-      <w:proofErr w:type="spellEnd"/>
-      <w:r>
-        <w:rPr>
-          <w:rFonts w:ascii="Arial" w:hAnsi="Arial" w:cs="Arial"/>
-          <w:bCs/>
-        </w:rPr>
-        <w:t>}}</w:t>
+        <w:t>{{is_extended_sentence}}</w:t>
       </w:r>
       <w:r>
         <w:rPr>
@@ -709,7 +645,28 @@
           <w:rFonts w:ascii="Arial" w:hAnsi="Arial" w:cs="Arial"/>
           <w:bCs/>
         </w:rPr>
-        <w:t xml:space="preserve"> Yes</w:t>
+        <w:t xml:space="preserve"> </w:t>
+      </w:r>
+      <w:r>
+        <w:rPr>
+          <w:rFonts w:ascii="Arial" w:hAnsi="Arial" w:cs="Arial"/>
+          <w:bCs/>
+        </w:rPr>
+        <w:t>{{</w:t>
+      </w:r>
+      <w:r>
+        <w:rPr>
+          <w:rFonts w:ascii="Arial" w:hAnsi="Arial" w:cs="Arial"/>
+          <w:bCs/>
+        </w:rPr>
+        <w:t>is_serving_youth_sentence</w:t>
+      </w:r>
+      <w:r>
+        <w:rPr>
+          <w:rFonts w:ascii="Arial" w:hAnsi="Arial" w:cs="Arial"/>
+          <w:bCs/>
+        </w:rPr>
+        <w:t>}}</w:t>
       </w:r>
     </w:p>
     <w:p>
@@ -824,23 +781,7 @@
           <w:rFonts w:ascii="Arial" w:hAnsi="Arial" w:cs="Arial"/>
           <w:bCs/>
         </w:rPr>
-        <w:t>{{</w:t>
-      </w:r>
-      <w:proofErr w:type="spellStart"/>
-      <w:r>
-        <w:rPr>
-          <w:rFonts w:ascii="Arial" w:hAnsi="Arial" w:cs="Arial"/>
-          <w:bCs/>
-        </w:rPr>
-        <w:t>is_serving_youth_sentence</w:t>
-      </w:r>
-      <w:proofErr w:type="spellEnd"/>
-      <w:r>
-        <w:rPr>
-          <w:rFonts w:ascii="Arial" w:hAnsi="Arial" w:cs="Arial"/>
-          <w:bCs/>
-        </w:rPr>
-        <w:t>}}</w:t>
+        <w:t>{{is_serving_youth_sentence}}</w:t>
       </w:r>
       <w:r>
         <w:rPr>
@@ -1285,15 +1226,7 @@
           <w:rFonts w:ascii="Arial" w:hAnsi="Arial" w:cs="Arial"/>
           <w:bCs/>
         </w:rPr>
-        <w:t>{{</w:t>
-      </w:r>
-      <w:proofErr w:type="spellStart"/>
-      <w:r>
-        <w:rPr>
-          <w:rFonts w:ascii="Arial" w:hAnsi="Arial" w:cs="Arial"/>
-          <w:bCs/>
-        </w:rPr>
-        <w:t>is_</w:t>
+        <w:t>{{is_</w:t>
       </w:r>
       <w:r>
         <w:rPr>
@@ -1321,15 +1254,7 @@
           <w:rFonts w:ascii="Arial" w:hAnsi="Arial" w:cs="Arial"/>
           <w:bCs/>
         </w:rPr>
-        <w:t>_serious_offence</w:t>
-      </w:r>
-      <w:proofErr w:type="spellEnd"/>
-      <w:r>
-        <w:rPr>
-          <w:rFonts w:ascii="Arial" w:hAnsi="Arial" w:cs="Arial"/>
-          <w:bCs/>
-        </w:rPr>
-        <w:t>}}</w:t>
+        <w:t>_serious_offence}}</w:t>
       </w:r>
     </w:p>
     <w:p>
@@ -1490,15 +1415,7 @@
           <w:rFonts w:ascii="Arial" w:hAnsi="Arial" w:cs="Arial"/>
           <w:bCs/>
         </w:rPr>
-        <w:t>{{</w:t>
-      </w:r>
-      <w:proofErr w:type="spellStart"/>
-      <w:r>
-        <w:rPr>
-          <w:rFonts w:ascii="Arial" w:hAnsi="Arial" w:cs="Arial"/>
-          <w:bCs/>
-        </w:rPr>
-        <w:t>is_</w:t>
+        <w:t>{{is_</w:t>
       </w:r>
       <w:r>
         <w:rPr>
@@ -1512,15 +1429,7 @@
           <w:rFonts w:ascii="Arial" w:hAnsi="Arial" w:cs="Arial"/>
           <w:bCs/>
         </w:rPr>
-        <w:t>_offence</w:t>
-      </w:r>
-      <w:proofErr w:type="spellEnd"/>
-      <w:r>
-        <w:rPr>
-          <w:rFonts w:ascii="Arial" w:hAnsi="Arial" w:cs="Arial"/>
-          <w:bCs/>
-        </w:rPr>
-        <w:t>}}</w:t>
+        <w:t>_offence}}</w:t>
       </w:r>
     </w:p>
     <w:p>
@@ -1563,7 +1472,6 @@
         </w:rPr>
         <w:t>{{</w:t>
       </w:r>
-      <w:proofErr w:type="spellStart"/>
       <w:r>
         <w:rPr>
           <w:rFonts w:ascii="Arial" w:hAnsi="Arial" w:cs="Arial"/>
@@ -1590,15 +1498,7 @@
           <w:rFonts w:ascii="Arial" w:hAnsi="Arial" w:cs="Arial"/>
           <w:bCs/>
         </w:rPr>
-        <w:t>SOPC_Sentence</w:t>
-      </w:r>
-      <w:proofErr w:type="spellEnd"/>
-      <w:r>
-        <w:rPr>
-          <w:rFonts w:ascii="Arial" w:hAnsi="Arial" w:cs="Arial"/>
-          <w:bCs/>
-        </w:rPr>
-        <w:t>}}</w:t>
+        <w:t>SOPC_Sentence}}</w:t>
       </w:r>
     </w:p>
     <w:p>
@@ -1629,7 +1529,6 @@
         </w:rPr>
         <w:t>{{</w:t>
       </w:r>
-      <w:proofErr w:type="spellStart"/>
       <w:r>
         <w:rPr>
           <w:rFonts w:ascii="Arial" w:hAnsi="Arial" w:cs="Arial"/>
@@ -1656,15 +1555,7 @@
           <w:rFonts w:ascii="Arial" w:hAnsi="Arial" w:cs="Arial"/>
           <w:bCs/>
         </w:rPr>
-        <w:t>erving_DCR_sentence</w:t>
-      </w:r>
-      <w:proofErr w:type="spellEnd"/>
-      <w:r>
-        <w:rPr>
-          <w:rFonts w:ascii="Arial" w:hAnsi="Arial" w:cs="Arial"/>
-          <w:bCs/>
-        </w:rPr>
-        <w:t>}}</w:t>
+        <w:t>erving_DCR_sentence}}</w:t>
       </w:r>
     </w:p>
     <w:p>
@@ -1784,7 +1675,6 @@
         </w:rPr>
         <w:t>{{</w:t>
       </w:r>
-      <w:proofErr w:type="spellStart"/>
       <w:r>
         <w:rPr>
           <w:rFonts w:ascii="Arial" w:hAnsi="Arial" w:cs="Arial"/>
@@ -1797,15 +1687,7 @@
           <w:rFonts w:ascii="Arial" w:hAnsi="Arial" w:cs="Arial"/>
           <w:bCs/>
         </w:rPr>
-        <w:t>s_repatriated_for_murder</w:t>
-      </w:r>
-      <w:proofErr w:type="spellEnd"/>
-      <w:r>
-        <w:rPr>
-          <w:rFonts w:ascii="Arial" w:hAnsi="Arial" w:cs="Arial"/>
-          <w:bCs/>
-        </w:rPr>
-        <w:t>}}</w:t>
+        <w:t>s_repatriated_for_murder}}</w:t>
       </w:r>
     </w:p>
     <w:p>
@@ -1881,7 +1763,6 @@
         </w:rPr>
         <w:t>{{</w:t>
       </w:r>
-      <w:proofErr w:type="spellStart"/>
       <w:r>
         <w:rPr>
           <w:rFonts w:ascii="Arial" w:hAnsi="Arial" w:cs="Arial"/>
@@ -1908,15 +1789,7 @@
           <w:rFonts w:ascii="Arial" w:hAnsi="Arial" w:cs="Arial"/>
           <w:bCs/>
         </w:rPr>
-        <w:t>involved_in_foreign_power_threat</w:t>
-      </w:r>
-      <w:proofErr w:type="spellEnd"/>
-      <w:r>
-        <w:rPr>
-          <w:rFonts w:ascii="Arial" w:hAnsi="Arial" w:cs="Arial"/>
-          <w:bCs/>
-        </w:rPr>
-        <w:t>}}</w:t>
+        <w:t>involved_in_foreign_power_threat}}</w:t>
       </w:r>
     </w:p>
     <w:p>
@@ -1948,7 +1821,6 @@
         </w:rPr>
         <w:t>{{</w:t>
       </w:r>
-      <w:proofErr w:type="spellStart"/>
       <w:r>
         <w:rPr>
           <w:rFonts w:ascii="Arial" w:hAnsi="Arial" w:cs="Arial"/>
@@ -1963,7 +1835,6 @@
         </w:rPr>
         <w:t>security_offence</w:t>
       </w:r>
-      <w:proofErr w:type="spellEnd"/>
       <w:r>
         <w:rPr>
           <w:rFonts w:ascii="Arial" w:hAnsi="Arial" w:cs="Arial"/>
@@ -2101,23 +1972,7 @@
           <w:rFonts w:ascii="Arial" w:hAnsi="Arial" w:cs="Arial"/>
           <w:bCs/>
         </w:rPr>
-        <w:t>{{</w:t>
-      </w:r>
-      <w:proofErr w:type="spellStart"/>
-      <w:r>
-        <w:rPr>
-          <w:rFonts w:ascii="Arial" w:hAnsi="Arial" w:cs="Arial"/>
-          <w:bCs/>
-        </w:rPr>
-        <w:t>date_of_birth</w:t>
-      </w:r>
-      <w:proofErr w:type="spellEnd"/>
-      <w:r>
-        <w:rPr>
-          <w:rFonts w:ascii="Arial" w:hAnsi="Arial" w:cs="Arial"/>
-          <w:bCs/>
-        </w:rPr>
-        <w:t>}}</w:t>
+        <w:t>{{date_of_birth}}</w:t>
       </w:r>
     </w:p>
     <w:p>
@@ -2187,23 +2042,7 @@
           <w:rFonts w:ascii="Arial" w:hAnsi="Arial" w:cs="Arial"/>
           <w:bCs/>
         </w:rPr>
-        <w:t>{{</w:t>
-      </w:r>
-      <w:proofErr w:type="spellStart"/>
-      <w:r>
-        <w:rPr>
-          <w:rFonts w:ascii="Arial" w:hAnsi="Arial" w:cs="Arial"/>
-          <w:bCs/>
-        </w:rPr>
-        <w:t>primary_language</w:t>
-      </w:r>
-      <w:proofErr w:type="spellEnd"/>
-      <w:r>
-        <w:rPr>
-          <w:rFonts w:ascii="Arial" w:hAnsi="Arial" w:cs="Arial"/>
-          <w:bCs/>
-        </w:rPr>
-        <w:t>}}</w:t>
+        <w:t>{{primary_language}}</w:t>
       </w:r>
       <w:r>
         <w:rPr>
@@ -2217,23 +2056,7 @@
           <w:rFonts w:ascii="Arial" w:hAnsi="Arial" w:cs="Arial"/>
           <w:bCs/>
         </w:rPr>
-        <w:t>{{</w:t>
-      </w:r>
-      <w:proofErr w:type="spellStart"/>
-      <w:r>
-        <w:rPr>
-          <w:rFonts w:ascii="Arial" w:hAnsi="Arial" w:cs="Arial"/>
-          <w:bCs/>
-        </w:rPr>
-        <w:t>primary_language</w:t>
-      </w:r>
-      <w:proofErr w:type="spellEnd"/>
-      <w:r>
-        <w:rPr>
-          <w:rFonts w:ascii="Arial" w:hAnsi="Arial" w:cs="Arial"/>
-          <w:bCs/>
-        </w:rPr>
-        <w:t>}}</w:t>
+        <w:t>{{primary_language}}</w:t>
       </w:r>
     </w:p>
     <w:p>
@@ -2331,23 +2154,7 @@
           <w:rFonts w:ascii="Arial" w:hAnsi="Arial" w:cs="Arial"/>
           <w:bCs/>
         </w:rPr>
-        <w:t>{{</w:t>
-      </w:r>
-      <w:proofErr w:type="spellStart"/>
-      <w:r>
-        <w:rPr>
-          <w:rFonts w:ascii="Arial" w:hAnsi="Arial" w:cs="Arial"/>
-          <w:bCs/>
-        </w:rPr>
-        <w:t>crn</w:t>
-      </w:r>
-      <w:proofErr w:type="spellEnd"/>
-      <w:r>
-        <w:rPr>
-          <w:rFonts w:ascii="Arial" w:hAnsi="Arial" w:cs="Arial"/>
-          <w:bCs/>
-        </w:rPr>
-        <w:t>}}</w:t>
+        <w:t>{{crn}}</w:t>
       </w:r>
     </w:p>
     <w:p>
@@ -2387,23 +2194,7 @@
           <w:rFonts w:ascii="Arial" w:hAnsi="Arial" w:cs="Arial"/>
           <w:bCs/>
         </w:rPr>
-        <w:t>{{</w:t>
-      </w:r>
-      <w:proofErr w:type="spellStart"/>
-      <w:r>
-        <w:rPr>
-          <w:rFonts w:ascii="Arial" w:hAnsi="Arial" w:cs="Arial"/>
-          <w:bCs/>
-        </w:rPr>
-        <w:t>cro_number</w:t>
-      </w:r>
-      <w:proofErr w:type="spellEnd"/>
-      <w:r>
-        <w:rPr>
-          <w:rFonts w:ascii="Arial" w:hAnsi="Arial" w:cs="Arial"/>
-          <w:bCs/>
-        </w:rPr>
-        <w:t>}}</w:t>
+        <w:t>{{cro_number}}</w:t>
       </w:r>
     </w:p>
     <w:p>
@@ -2436,23 +2227,7 @@
           <w:rFonts w:ascii="Arial" w:hAnsi="Arial" w:cs="Arial"/>
           <w:bCs/>
         </w:rPr>
-        <w:t>{{</w:t>
-      </w:r>
-      <w:proofErr w:type="spellStart"/>
-      <w:r>
-        <w:rPr>
-          <w:rFonts w:ascii="Arial" w:hAnsi="Arial" w:cs="Arial"/>
-          <w:bCs/>
-        </w:rPr>
-        <w:t>pnc_number</w:t>
-      </w:r>
-      <w:proofErr w:type="spellEnd"/>
-      <w:r>
-        <w:rPr>
-          <w:rFonts w:ascii="Arial" w:hAnsi="Arial" w:cs="Arial"/>
-          <w:bCs/>
-        </w:rPr>
-        <w:t>}}</w:t>
+        <w:t>{{pnc_number}}</w:t>
       </w:r>
     </w:p>
     <w:p>
@@ -2484,23 +2259,7 @@
           <w:rFonts w:ascii="Arial" w:hAnsi="Arial" w:cs="Arial"/>
           <w:bCs/>
         </w:rPr>
-        <w:t>{{</w:t>
-      </w:r>
-      <w:proofErr w:type="spellStart"/>
-      <w:r>
-        <w:rPr>
-          <w:rFonts w:ascii="Arial" w:hAnsi="Arial" w:cs="Arial"/>
-          <w:bCs/>
-        </w:rPr>
-        <w:t>most_recent_prisoner_number</w:t>
-      </w:r>
-      <w:proofErr w:type="spellEnd"/>
-      <w:r>
-        <w:rPr>
-          <w:rFonts w:ascii="Arial" w:hAnsi="Arial" w:cs="Arial"/>
-          <w:bCs/>
-        </w:rPr>
-        <w:t>}}</w:t>
+        <w:t>{{most_recent_prisoner_number}}</w:t>
       </w:r>
     </w:p>
     <w:p>
@@ -2540,23 +2299,7 @@
           <w:rFonts w:ascii="Arial" w:hAnsi="Arial" w:cs="Arial"/>
           <w:bCs/>
         </w:rPr>
-        <w:t>{{</w:t>
-      </w:r>
-      <w:proofErr w:type="spellStart"/>
-      <w:r>
-        <w:rPr>
-          <w:rFonts w:ascii="Arial" w:hAnsi="Arial" w:cs="Arial"/>
-          <w:bCs/>
-        </w:rPr>
-        <w:t>noms_number</w:t>
-      </w:r>
-      <w:proofErr w:type="spellEnd"/>
-      <w:r>
-        <w:rPr>
-          <w:rFonts w:ascii="Arial" w:hAnsi="Arial" w:cs="Arial"/>
-          <w:bCs/>
-        </w:rPr>
-        <w:t>}}</w:t>
+        <w:t>{{noms_number}}</w:t>
       </w:r>
     </w:p>
     <w:p>
@@ -2588,23 +2331,7 @@
           <w:rFonts w:ascii="Arial" w:hAnsi="Arial" w:cs="Arial"/>
           <w:bCs/>
         </w:rPr>
-        <w:t>{{</w:t>
-      </w:r>
-      <w:proofErr w:type="spellStart"/>
-      <w:r>
-        <w:rPr>
-          <w:rFonts w:ascii="Arial" w:hAnsi="Arial" w:cs="Arial"/>
-          <w:bCs/>
-        </w:rPr>
-        <w:t>last_releasing_prison</w:t>
-      </w:r>
-      <w:proofErr w:type="spellEnd"/>
-      <w:r>
-        <w:rPr>
-          <w:rFonts w:ascii="Arial" w:hAnsi="Arial" w:cs="Arial"/>
-          <w:bCs/>
-        </w:rPr>
-        <w:t>}}</w:t>
+        <w:t>{{last_releasing_prison}}</w:t>
       </w:r>
     </w:p>
     <w:p>
@@ -2665,23 +2392,7 @@
           <w:rFonts w:ascii="Arial" w:hAnsi="Arial" w:cs="Arial"/>
           <w:bCs/>
         </w:rPr>
-        <w:t>{{</w:t>
-      </w:r>
-      <w:proofErr w:type="spellStart"/>
-      <w:r>
-        <w:rPr>
-          <w:rFonts w:ascii="Arial" w:hAnsi="Arial" w:cs="Arial"/>
-          <w:bCs/>
-        </w:rPr>
-        <w:t>date_of_release</w:t>
-      </w:r>
-      <w:proofErr w:type="spellEnd"/>
-      <w:r>
-        <w:rPr>
-          <w:rFonts w:ascii="Arial" w:hAnsi="Arial" w:cs="Arial"/>
-          <w:bCs/>
-        </w:rPr>
-        <w:t>}}</w:t>
+        <w:t>{{date_of_release}}</w:t>
       </w:r>
     </w:p>
     <w:p>
@@ -2793,23 +2504,7 @@
           <w:rFonts w:ascii="Arial" w:hAnsi="Arial" w:cs="Arial"/>
           <w:bCs/>
         </w:rPr>
-        <w:t>{{</w:t>
-      </w:r>
-      <w:proofErr w:type="spellStart"/>
-      <w:r>
-        <w:rPr>
-          <w:rFonts w:ascii="Arial" w:hAnsi="Arial" w:cs="Arial"/>
-          <w:bCs/>
-        </w:rPr>
-        <w:t>index_offence_description</w:t>
-      </w:r>
-      <w:proofErr w:type="spellEnd"/>
-      <w:r>
-        <w:rPr>
-          <w:rFonts w:ascii="Arial" w:hAnsi="Arial" w:cs="Arial"/>
-          <w:bCs/>
-        </w:rPr>
-        <w:t>}}</w:t>
+        <w:t>{{index_offence_description}}</w:t>
       </w:r>
       <w:r>
         <w:rPr>
@@ -2907,23 +2602,7 @@
           <w:rFonts w:ascii="Arial" w:hAnsi="Arial" w:cs="Arial"/>
           <w:bCs/>
         </w:rPr>
-        <w:t>{{</w:t>
-      </w:r>
-      <w:proofErr w:type="spellStart"/>
-      <w:r>
-        <w:rPr>
-          <w:rFonts w:ascii="Arial" w:hAnsi="Arial" w:cs="Arial"/>
-          <w:bCs/>
-        </w:rPr>
-        <w:t>date_of_original_offence</w:t>
-      </w:r>
-      <w:proofErr w:type="spellEnd"/>
-      <w:r>
-        <w:rPr>
-          <w:rFonts w:ascii="Arial" w:hAnsi="Arial" w:cs="Arial"/>
-          <w:bCs/>
-        </w:rPr>
-        <w:t>}}</w:t>
+        <w:t>{{date_of_original_offence}}</w:t>
       </w:r>
     </w:p>
     <w:p>
@@ -2964,23 +2643,7 @@
           <w:rFonts w:ascii="Arial" w:hAnsi="Arial" w:cs="Arial"/>
           <w:bCs/>
         </w:rPr>
-        <w:t>{{</w:t>
-      </w:r>
-      <w:proofErr w:type="spellStart"/>
-      <w:r>
-        <w:rPr>
-          <w:rFonts w:ascii="Arial" w:hAnsi="Arial" w:cs="Arial"/>
-          <w:bCs/>
-        </w:rPr>
-        <w:t>date_of_sentence</w:t>
-      </w:r>
-      <w:proofErr w:type="spellEnd"/>
-      <w:r>
-        <w:rPr>
-          <w:rFonts w:ascii="Arial" w:hAnsi="Arial" w:cs="Arial"/>
-          <w:bCs/>
-        </w:rPr>
-        <w:t>}}</w:t>
+        <w:t>{{date_of_sentence}}</w:t>
       </w:r>
     </w:p>
     <w:p>
@@ -3021,23 +2684,7 @@
           <w:rFonts w:ascii="Arial" w:hAnsi="Arial" w:cs="Arial"/>
           <w:bCs/>
         </w:rPr>
-        <w:t>{{</w:t>
-      </w:r>
-      <w:proofErr w:type="spellStart"/>
-      <w:r>
-        <w:rPr>
-          <w:rFonts w:ascii="Arial" w:hAnsi="Arial" w:cs="Arial"/>
-          <w:bCs/>
-        </w:rPr>
-        <w:t>length_of_sentence</w:t>
-      </w:r>
-      <w:proofErr w:type="spellEnd"/>
-      <w:r>
-        <w:rPr>
-          <w:rFonts w:ascii="Arial" w:hAnsi="Arial" w:cs="Arial"/>
-          <w:bCs/>
-        </w:rPr>
-        <w:t>}}</w:t>
+        <w:t>{{length_of_sentence}}</w:t>
       </w:r>
     </w:p>
     <w:p>
@@ -3079,23 +2726,7 @@
           <w:rFonts w:ascii="Arial" w:hAnsi="Arial" w:cs="Arial"/>
           <w:bCs/>
         </w:rPr>
-        <w:t>{{</w:t>
-      </w:r>
-      <w:proofErr w:type="spellStart"/>
-      <w:r>
-        <w:rPr>
-          <w:rFonts w:ascii="Arial" w:hAnsi="Arial" w:cs="Arial"/>
-          <w:bCs/>
-        </w:rPr>
-        <w:t>licence_expiry_date</w:t>
-      </w:r>
-      <w:proofErr w:type="spellEnd"/>
-      <w:r>
-        <w:rPr>
-          <w:rFonts w:ascii="Arial" w:hAnsi="Arial" w:cs="Arial"/>
-          <w:bCs/>
-        </w:rPr>
-        <w:t>}}</w:t>
+        <w:t>{{licence_expiry_date}}</w:t>
       </w:r>
     </w:p>
     <w:p>
@@ -3137,23 +2768,7 @@
           <w:rFonts w:ascii="Arial" w:hAnsi="Arial" w:cs="Arial"/>
           <w:bCs/>
         </w:rPr>
-        <w:t>{{</w:t>
-      </w:r>
-      <w:proofErr w:type="spellStart"/>
-      <w:r>
-        <w:rPr>
-          <w:rFonts w:ascii="Arial" w:hAnsi="Arial" w:cs="Arial"/>
-          <w:bCs/>
-        </w:rPr>
-        <w:t>sentence_expiry_date</w:t>
-      </w:r>
-      <w:proofErr w:type="spellEnd"/>
-      <w:r>
-        <w:rPr>
-          <w:rFonts w:ascii="Arial" w:hAnsi="Arial" w:cs="Arial"/>
-          <w:bCs/>
-        </w:rPr>
-        <w:t>}}</w:t>
+        <w:t>{{sentence_expiry_date}}</w:t>
       </w:r>
     </w:p>
     <w:p>
@@ -3226,23 +2841,7 @@
           <w:rFonts w:ascii="Arial" w:hAnsi="Arial" w:cs="Arial"/>
           <w:bCs/>
         </w:rPr>
-        <w:t>{{</w:t>
-      </w:r>
-      <w:proofErr w:type="spellStart"/>
-      <w:r>
-        <w:rPr>
-          <w:rFonts w:ascii="Arial" w:hAnsi="Arial" w:cs="Arial"/>
-          <w:bCs/>
-        </w:rPr>
-        <w:t>custodial_term</w:t>
-      </w:r>
-      <w:proofErr w:type="spellEnd"/>
-      <w:r>
-        <w:rPr>
-          <w:rFonts w:ascii="Arial" w:hAnsi="Arial" w:cs="Arial"/>
-          <w:bCs/>
-        </w:rPr>
-        <w:t>}}</w:t>
+        <w:t>{{custodial_term}}</w:t>
       </w:r>
     </w:p>
     <w:p>
@@ -3295,23 +2894,7 @@
           <w:rFonts w:ascii="Arial" w:hAnsi="Arial" w:cs="Arial"/>
           <w:bCs/>
         </w:rPr>
-        <w:t>{{</w:t>
-      </w:r>
-      <w:proofErr w:type="spellStart"/>
-      <w:r>
-        <w:rPr>
-          <w:rFonts w:ascii="Arial" w:hAnsi="Arial" w:cs="Arial"/>
-          <w:bCs/>
-        </w:rPr>
-        <w:t>extended_term</w:t>
-      </w:r>
-      <w:proofErr w:type="spellEnd"/>
-      <w:r>
-        <w:rPr>
-          <w:rFonts w:ascii="Arial" w:hAnsi="Arial" w:cs="Arial"/>
-          <w:bCs/>
-        </w:rPr>
-        <w:t>}}</w:t>
+        <w:t>{{extended_term}}</w:t>
       </w:r>
     </w:p>
     <w:p>
@@ -3359,23 +2942,7 @@
           <w:rFonts w:ascii="Arial" w:hAnsi="Arial" w:cs="Arial"/>
           <w:bCs/>
         </w:rPr>
-        <w:t xml:space="preserve">(Any information presented here should be disclosable to the </w:t>
-      </w:r>
-      <w:proofErr w:type="gramStart"/>
-      <w:r>
-        <w:rPr>
-          <w:rFonts w:ascii="Arial" w:hAnsi="Arial" w:cs="Arial"/>
-          <w:bCs/>
-        </w:rPr>
-        <w:t xml:space="preserve">prisoner)   </w:t>
-      </w:r>
-      <w:proofErr w:type="gramEnd"/>
-      <w:r>
-        <w:rPr>
-          <w:rFonts w:ascii="Arial" w:hAnsi="Arial" w:cs="Arial"/>
-          <w:bCs/>
-        </w:rPr>
-        <w:t xml:space="preserve">   </w:t>
+        <w:t xml:space="preserve">(Any information presented here should be disclosable to the prisoner)      </w:t>
       </w:r>
       <w:r>
         <w:rPr>
@@ -3389,39 +2956,14 @@
           <w:rFonts w:ascii="Arial" w:hAnsi="Arial" w:cs="Arial"/>
           <w:bCs/>
         </w:rPr>
-        <w:t>{{</w:t>
-      </w:r>
-      <w:proofErr w:type="spellStart"/>
-      <w:r>
-        <w:rPr>
-          <w:rFonts w:ascii="Arial" w:hAnsi="Arial" w:cs="Arial"/>
-          <w:bCs/>
-        </w:rPr>
-        <w:t>has_victims_in_contact_scheme</w:t>
-      </w:r>
-      <w:proofErr w:type="spellEnd"/>
-      <w:proofErr w:type="gramStart"/>
-      <w:r>
-        <w:rPr>
-          <w:rFonts w:ascii="Arial" w:hAnsi="Arial" w:cs="Arial"/>
-          <w:bCs/>
-        </w:rPr>
-        <w:t>}}</w:t>
-      </w:r>
-      <w:r>
-        <w:rPr>
-          <w:rFonts w:ascii="Arial" w:hAnsi="Arial" w:cs="Arial"/>
-          <w:b/>
-        </w:rPr>
-        <w:t>Date</w:t>
-      </w:r>
-      <w:proofErr w:type="gramEnd"/>
-      <w:r>
-        <w:rPr>
-          <w:rFonts w:ascii="Arial" w:hAnsi="Arial" w:cs="Arial"/>
-          <w:b/>
-        </w:rPr>
-        <w:t xml:space="preserve"> contact was </w:t>
+        <w:t>{{has_victims_in_contact_scheme}}</w:t>
+      </w:r>
+      <w:r>
+        <w:rPr>
+          <w:rFonts w:ascii="Arial" w:hAnsi="Arial" w:cs="Arial"/>
+          <w:b/>
+        </w:rPr>
+        <w:t xml:space="preserve">Date contact was </w:t>
       </w:r>
       <w:r>
         <w:rPr>
@@ -3443,23 +2985,7 @@
           <w:rFonts w:ascii="Arial" w:hAnsi="Arial" w:cs="Arial"/>
           <w:bCs/>
         </w:rPr>
-        <w:t>{{</w:t>
-      </w:r>
-      <w:proofErr w:type="spellStart"/>
-      <w:r>
-        <w:rPr>
-          <w:rFonts w:ascii="Arial" w:hAnsi="Arial" w:cs="Arial"/>
-          <w:bCs/>
-        </w:rPr>
-        <w:t>date_vlo_informed</w:t>
-      </w:r>
-      <w:proofErr w:type="spellEnd"/>
-      <w:r>
-        <w:rPr>
-          <w:rFonts w:ascii="Arial" w:hAnsi="Arial" w:cs="Arial"/>
-          <w:bCs/>
-        </w:rPr>
-        <w:t>}}</w:t>
+        <w:t>{{date_vlo_informed}}</w:t>
       </w:r>
       <w:r>
         <w:rPr>
@@ -3552,23 +3078,7 @@
           <w:rFonts w:ascii="Arial" w:hAnsi="Arial" w:cs="Arial"/>
           <w:bCs/>
         </w:rPr>
-        <w:t>{{</w:t>
-      </w:r>
-      <w:proofErr w:type="spellStart"/>
-      <w:r>
-        <w:rPr>
-          <w:rFonts w:ascii="Arial" w:hAnsi="Arial" w:cs="Arial"/>
-          <w:bCs/>
-        </w:rPr>
-        <w:t>custody_status</w:t>
-      </w:r>
-      <w:proofErr w:type="spellEnd"/>
-      <w:r>
-        <w:rPr>
-          <w:rFonts w:ascii="Arial" w:hAnsi="Arial" w:cs="Arial"/>
-          <w:bCs/>
-        </w:rPr>
-        <w:t>}}</w:t>
+        <w:t>{{custody_status}}</w:t>
       </w:r>
     </w:p>
     <w:p>
@@ -3601,23 +3111,7 @@
           <w:rFonts w:ascii="Arial" w:hAnsi="Arial" w:cs="Arial"/>
           <w:bCs/>
         </w:rPr>
-        <w:t>{{</w:t>
-      </w:r>
-      <w:proofErr w:type="spellStart"/>
-      <w:r>
-        <w:rPr>
-          <w:rFonts w:ascii="Arial" w:hAnsi="Arial" w:cs="Arial"/>
-          <w:bCs/>
-        </w:rPr>
-        <w:t>has_arrest_issues</w:t>
-      </w:r>
-      <w:proofErr w:type="spellEnd"/>
-      <w:r>
-        <w:rPr>
-          <w:rFonts w:ascii="Arial" w:hAnsi="Arial" w:cs="Arial"/>
-          <w:bCs/>
-        </w:rPr>
-        <w:t>}}</w:t>
+        <w:t>{{has_arrest_issues}}</w:t>
       </w:r>
     </w:p>
     <w:p>
@@ -3657,23 +3151,7 @@
           <w:rFonts w:ascii="Arial" w:hAnsi="Arial" w:cs="Arial"/>
           <w:bCs/>
         </w:rPr>
-        <w:t>{{</w:t>
-      </w:r>
-      <w:proofErr w:type="spellStart"/>
-      <w:r>
-        <w:rPr>
-          <w:rFonts w:ascii="Arial" w:hAnsi="Arial" w:cs="Arial"/>
-          <w:bCs/>
-        </w:rPr>
-        <w:t>has_arrest_issues_details</w:t>
-      </w:r>
-      <w:proofErr w:type="spellEnd"/>
-      <w:r>
-        <w:rPr>
-          <w:rFonts w:ascii="Arial" w:hAnsi="Arial" w:cs="Arial"/>
-          <w:bCs/>
-        </w:rPr>
-        <w:t>}}</w:t>
+        <w:t>{{has_arrest_issues_details}}</w:t>
       </w:r>
     </w:p>
     <w:p>
@@ -3712,23 +3190,7 @@
           <w:rFonts w:ascii="Arial" w:hAnsi="Arial" w:cs="Arial"/>
           <w:bCs/>
         </w:rPr>
-        <w:t>{{</w:t>
-      </w:r>
-      <w:proofErr w:type="spellStart"/>
-      <w:r>
-        <w:rPr>
-          <w:rFonts w:ascii="Arial" w:hAnsi="Arial" w:cs="Arial"/>
-          <w:bCs/>
-        </w:rPr>
-        <w:t>contact_name</w:t>
-      </w:r>
-      <w:proofErr w:type="spellEnd"/>
-      <w:r>
-        <w:rPr>
-          <w:rFonts w:ascii="Arial" w:hAnsi="Arial" w:cs="Arial"/>
-          <w:bCs/>
-        </w:rPr>
-        <w:t>}}</w:t>
+        <w:t>{{contact_name}}</w:t>
       </w:r>
     </w:p>
     <w:p>
@@ -3767,23 +3229,7 @@
           <w:rFonts w:ascii="Arial" w:hAnsi="Arial" w:cs="Arial"/>
           <w:bCs/>
         </w:rPr>
-        <w:t>{{</w:t>
-      </w:r>
-      <w:proofErr w:type="spellStart"/>
-      <w:r>
-        <w:rPr>
-          <w:rFonts w:ascii="Arial" w:hAnsi="Arial" w:cs="Arial"/>
-          <w:bCs/>
-        </w:rPr>
-        <w:t>email_address</w:t>
-      </w:r>
-      <w:proofErr w:type="spellEnd"/>
-      <w:r>
-        <w:rPr>
-          <w:rFonts w:ascii="Arial" w:hAnsi="Arial" w:cs="Arial"/>
-          <w:bCs/>
-        </w:rPr>
-        <w:t>}}</w:t>
+        <w:t>{{email_address}}</w:t>
       </w:r>
     </w:p>
     <w:p>
@@ -3848,23 +3294,7 @@
           <w:rFonts w:ascii="Arial" w:hAnsi="Arial" w:cs="Arial"/>
           <w:bCs/>
         </w:rPr>
-        <w:t>{{</w:t>
-      </w:r>
-      <w:proofErr w:type="spellStart"/>
-      <w:r>
-        <w:rPr>
-          <w:rFonts w:ascii="Arial" w:hAnsi="Arial" w:cs="Arial"/>
-          <w:bCs/>
-        </w:rPr>
-        <w:t>last_recorded_address</w:t>
-      </w:r>
-      <w:proofErr w:type="spellEnd"/>
-      <w:r>
-        <w:rPr>
-          <w:rFonts w:ascii="Arial" w:hAnsi="Arial" w:cs="Arial"/>
-          <w:bCs/>
-        </w:rPr>
-        <w:t>}}</w:t>
+        <w:t>{{last_recorded_address}}</w:t>
       </w:r>
     </w:p>
     <w:p>
@@ -3896,23 +3326,7 @@
           <w:rFonts w:ascii="Arial" w:hAnsi="Arial" w:cs="Arial"/>
           <w:bCs/>
         </w:rPr>
-        <w:t>{{</w:t>
-      </w:r>
-      <w:proofErr w:type="spellStart"/>
-      <w:r>
-        <w:rPr>
-          <w:rFonts w:ascii="Arial" w:hAnsi="Arial" w:cs="Arial"/>
-          <w:bCs/>
-        </w:rPr>
-        <w:t>no_fixed_abode</w:t>
-      </w:r>
-      <w:proofErr w:type="spellEnd"/>
-      <w:r>
-        <w:rPr>
-          <w:rFonts w:ascii="Arial" w:hAnsi="Arial" w:cs="Arial"/>
-          <w:bCs/>
-        </w:rPr>
-        <w:t>}}</w:t>
+        <w:t>{{no_fixed_abode}}</w:t>
       </w:r>
     </w:p>
     <w:p>
@@ -3944,23 +3358,7 @@
           <w:rFonts w:ascii="Arial" w:hAnsi="Arial" w:cs="Arial"/>
           <w:bCs/>
         </w:rPr>
-        <w:t>{{</w:t>
-      </w:r>
-      <w:proofErr w:type="spellStart"/>
-      <w:r>
-        <w:rPr>
-          <w:rFonts w:ascii="Arial" w:hAnsi="Arial" w:cs="Arial"/>
-          <w:bCs/>
-        </w:rPr>
-        <w:t>other_possible_addresses</w:t>
-      </w:r>
-      <w:proofErr w:type="spellEnd"/>
-      <w:r>
-        <w:rPr>
-          <w:rFonts w:ascii="Arial" w:hAnsi="Arial" w:cs="Arial"/>
-          <w:bCs/>
-        </w:rPr>
-        <w:t>}}</w:t>
+        <w:t>{{other_possible_addresses}}</w:t>
       </w:r>
     </w:p>
     <w:p>
@@ -4068,23 +3466,7 @@
           <w:rFonts w:ascii="Arial" w:hAnsi="Arial" w:cs="Arial"/>
           <w:bCs/>
         </w:rPr>
-        <w:t>{{</w:t>
-      </w:r>
-      <w:proofErr w:type="spellStart"/>
-      <w:r>
-        <w:rPr>
-          <w:rFonts w:ascii="Arial" w:hAnsi="Arial" w:cs="Arial"/>
-          <w:bCs/>
-        </w:rPr>
-        <w:t>has_vulnerabilities</w:t>
-      </w:r>
-      <w:proofErr w:type="spellEnd"/>
-      <w:r>
-        <w:rPr>
-          <w:rFonts w:ascii="Arial" w:hAnsi="Arial" w:cs="Arial"/>
-          <w:bCs/>
-        </w:rPr>
-        <w:t>}}</w:t>
+        <w:t>{{has_vulnerabilities}}</w:t>
       </w:r>
     </w:p>
     <w:p>
@@ -4170,23 +3552,7 @@
           <w:rFonts w:ascii="Arial" w:hAnsi="Arial" w:cs="Arial"/>
           <w:bCs/>
         </w:rPr>
-        <w:t>{{</w:t>
-      </w:r>
-      <w:proofErr w:type="spellStart"/>
-      <w:r>
-        <w:rPr>
-          <w:rFonts w:ascii="Arial" w:hAnsi="Arial" w:cs="Arial"/>
-          <w:bCs/>
-        </w:rPr>
-        <w:t>has_contraband_risk</w:t>
-      </w:r>
-      <w:proofErr w:type="spellEnd"/>
-      <w:r>
-        <w:rPr>
-          <w:rFonts w:ascii="Arial" w:hAnsi="Arial" w:cs="Arial"/>
-          <w:bCs/>
-        </w:rPr>
-        <w:t>}}</w:t>
+        <w:t>{{has_contraband_risk}}</w:t>
       </w:r>
       <w:r>
         <w:rPr>
@@ -4224,23 +3590,7 @@
           <w:rFonts w:ascii="Arial" w:hAnsi="Arial" w:cs="Arial"/>
           <w:bCs/>
         </w:rPr>
-        <w:t>{{</w:t>
-      </w:r>
-      <w:proofErr w:type="spellStart"/>
-      <w:r>
-        <w:rPr>
-          <w:rFonts w:ascii="Arial" w:hAnsi="Arial" w:cs="Arial"/>
-          <w:bCs/>
-        </w:rPr>
-        <w:t>has_contraband_risk_details</w:t>
-      </w:r>
-      <w:proofErr w:type="spellEnd"/>
-      <w:r>
-        <w:rPr>
-          <w:rFonts w:ascii="Arial" w:hAnsi="Arial" w:cs="Arial"/>
-          <w:bCs/>
-        </w:rPr>
-        <w:t>}}</w:t>
+        <w:t>{{has_contraband_risk_details}}</w:t>
       </w:r>
     </w:p>
     <w:p>
@@ -4316,23 +3666,7 @@
           <w:rFonts w:ascii="Arial" w:hAnsi="Arial" w:cs="Arial"/>
           <w:bCs/>
         </w:rPr>
-        <w:t>{{</w:t>
-      </w:r>
-      <w:proofErr w:type="spellStart"/>
-      <w:r>
-        <w:rPr>
-          <w:rFonts w:ascii="Arial" w:hAnsi="Arial" w:cs="Arial"/>
-          <w:bCs/>
-        </w:rPr>
-        <w:t>mappa_category</w:t>
-      </w:r>
-      <w:proofErr w:type="spellEnd"/>
-      <w:r>
-        <w:rPr>
-          <w:rFonts w:ascii="Arial" w:hAnsi="Arial" w:cs="Arial"/>
-          <w:bCs/>
-        </w:rPr>
-        <w:t>}}</w:t>
+        <w:t>{{mappa_category}}</w:t>
       </w:r>
     </w:p>
     <w:p>
@@ -4363,23 +3697,7 @@
           <w:rFonts w:ascii="Arial" w:hAnsi="Arial" w:cs="Arial"/>
           <w:bCs/>
         </w:rPr>
-        <w:t>{{</w:t>
-      </w:r>
-      <w:proofErr w:type="spellStart"/>
-      <w:r>
-        <w:rPr>
-          <w:rFonts w:ascii="Arial" w:hAnsi="Arial" w:cs="Arial"/>
-          <w:bCs/>
-        </w:rPr>
-        <w:t>mappa_level</w:t>
-      </w:r>
-      <w:proofErr w:type="spellEnd"/>
-      <w:r>
-        <w:rPr>
-          <w:rFonts w:ascii="Arial" w:hAnsi="Arial" w:cs="Arial"/>
-          <w:bCs/>
-        </w:rPr>
-        <w:t>}}</w:t>
+        <w:t>{{mappa_level}}</w:t>
       </w:r>
     </w:p>
     <w:p>
@@ -4439,23 +3757,7 @@
           <w:rFonts w:ascii="Arial" w:hAnsi="Arial" w:cs="Arial"/>
           <w:bCs/>
         </w:rPr>
-        <w:t>{{</w:t>
-      </w:r>
-      <w:proofErr w:type="spellStart"/>
-      <w:r>
-        <w:rPr>
-          <w:rFonts w:ascii="Arial" w:hAnsi="Arial" w:cs="Arial"/>
-          <w:bCs/>
-        </w:rPr>
-        <w:t>risk_to_public</w:t>
-      </w:r>
-      <w:proofErr w:type="spellEnd"/>
-      <w:r>
-        <w:rPr>
-          <w:rFonts w:ascii="Arial" w:hAnsi="Arial" w:cs="Arial"/>
-          <w:bCs/>
-        </w:rPr>
-        <w:t>}}</w:t>
+        <w:t>{{risk_to_public}}</w:t>
       </w:r>
     </w:p>
     <w:p>
@@ -4494,23 +3796,7 @@
           <w:rFonts w:ascii="Arial" w:hAnsi="Arial" w:cs="Arial"/>
           <w:bCs/>
         </w:rPr>
-        <w:t>{{</w:t>
-      </w:r>
-      <w:proofErr w:type="spellStart"/>
-      <w:r>
-        <w:rPr>
-          <w:rFonts w:ascii="Arial" w:hAnsi="Arial" w:cs="Arial"/>
-          <w:bCs/>
-        </w:rPr>
-        <w:t>risk_to_known_adult</w:t>
-      </w:r>
-      <w:proofErr w:type="spellEnd"/>
-      <w:r>
-        <w:rPr>
-          <w:rFonts w:ascii="Arial" w:hAnsi="Arial" w:cs="Arial"/>
-          <w:bCs/>
-        </w:rPr>
-        <w:t>}}</w:t>
+        <w:t>{{risk_to_known_adult}}</w:t>
       </w:r>
       <w:r>
         <w:tab/>
@@ -4556,23 +3842,7 @@
           <w:rFonts w:ascii="Arial" w:hAnsi="Arial" w:cs="Arial"/>
           <w:bCs/>
         </w:rPr>
-        <w:t>{{</w:t>
-      </w:r>
-      <w:proofErr w:type="spellStart"/>
-      <w:r>
-        <w:rPr>
-          <w:rFonts w:ascii="Arial" w:hAnsi="Arial" w:cs="Arial"/>
-          <w:bCs/>
-        </w:rPr>
-        <w:t>risk_to_children</w:t>
-      </w:r>
-      <w:proofErr w:type="spellEnd"/>
-      <w:r>
-        <w:rPr>
-          <w:rFonts w:ascii="Arial" w:hAnsi="Arial" w:cs="Arial"/>
-          <w:bCs/>
-        </w:rPr>
-        <w:t>}}</w:t>
+        <w:t>{{risk_to_children}}</w:t>
       </w:r>
     </w:p>
     <w:p>
@@ -4615,23 +3885,7 @@
           <w:rFonts w:ascii="Arial" w:hAnsi="Arial" w:cs="Arial"/>
           <w:bCs/>
         </w:rPr>
-        <w:t>{{</w:t>
-      </w:r>
-      <w:proofErr w:type="spellStart"/>
-      <w:r>
-        <w:rPr>
-          <w:rFonts w:ascii="Arial" w:hAnsi="Arial" w:cs="Arial"/>
-          <w:bCs/>
-        </w:rPr>
-        <w:t>risk_to_prisoners</w:t>
-      </w:r>
-      <w:proofErr w:type="spellEnd"/>
-      <w:r>
-        <w:rPr>
-          <w:rFonts w:ascii="Arial" w:hAnsi="Arial" w:cs="Arial"/>
-          <w:bCs/>
-        </w:rPr>
-        <w:t>}}</w:t>
+        <w:t>{{risk_to_prisoners}}</w:t>
       </w:r>
     </w:p>
     <w:p>
@@ -4667,23 +3921,7 @@
           <w:rFonts w:ascii="Arial" w:hAnsi="Arial" w:cs="Arial"/>
           <w:bCs/>
         </w:rPr>
-        <w:t>{{</w:t>
-      </w:r>
-      <w:proofErr w:type="spellStart"/>
-      <w:r>
-        <w:rPr>
-          <w:rFonts w:ascii="Arial" w:hAnsi="Arial" w:cs="Arial"/>
-          <w:bCs/>
-        </w:rPr>
-        <w:t>risk_to_staff</w:t>
-      </w:r>
-      <w:proofErr w:type="spellEnd"/>
-      <w:r>
-        <w:rPr>
-          <w:rFonts w:ascii="Arial" w:hAnsi="Arial" w:cs="Arial"/>
-          <w:bCs/>
-        </w:rPr>
-        <w:t>}}</w:t>
+        <w:t>{{risk_to_staff}}</w:t>
       </w:r>
     </w:p>
     <w:p>
@@ -4764,23 +4002,7 @@
           <w:rFonts w:ascii="Arial" w:hAnsi="Arial" w:cs="Arial"/>
           <w:bCs/>
         </w:rPr>
-        <w:t>{{</w:t>
-      </w:r>
-      <w:proofErr w:type="spellStart"/>
-      <w:r>
-        <w:rPr>
-          <w:rFonts w:ascii="Arial" w:hAnsi="Arial" w:cs="Arial"/>
-          <w:bCs/>
-        </w:rPr>
-        <w:t>index_offence_details</w:t>
-      </w:r>
-      <w:proofErr w:type="spellEnd"/>
-      <w:r>
-        <w:rPr>
-          <w:rFonts w:ascii="Arial" w:hAnsi="Arial" w:cs="Arial"/>
-          <w:bCs/>
-        </w:rPr>
-        <w:t>}}</w:t>
+        <w:t>{{index_offence_details}}</w:t>
       </w:r>
     </w:p>
     <w:p>
@@ -4893,27 +4115,7 @@
                 <w:sz w:val="22"/>
                 <w:szCs w:val="22"/>
               </w:rPr>
-              <w:t>{{</w:t>
-            </w:r>
-            <w:proofErr w:type="spellStart"/>
-            <w:r>
-              <w:rPr>
-                <w:rFonts w:ascii="Arial" w:hAnsi="Arial" w:cs="Arial"/>
-                <w:bCs/>
-                <w:sz w:val="22"/>
-                <w:szCs w:val="22"/>
-              </w:rPr>
-              <w:t>good_behaviour_condition</w:t>
-            </w:r>
-            <w:proofErr w:type="spellEnd"/>
-            <w:r>
-              <w:rPr>
-                <w:rFonts w:ascii="Arial" w:hAnsi="Arial" w:cs="Arial"/>
-                <w:bCs/>
-                <w:sz w:val="22"/>
-                <w:szCs w:val="22"/>
-              </w:rPr>
-              <w:t>}}</w:t>
+              <w:t>{{good_behaviour_condition}}</w:t>
             </w:r>
             <w:r>
               <w:rPr>
@@ -4958,27 +4160,7 @@
                 <w:sz w:val="22"/>
                 <w:szCs w:val="22"/>
               </w:rPr>
-              <w:t>{{</w:t>
-            </w:r>
-            <w:proofErr w:type="spellStart"/>
-            <w:r>
-              <w:rPr>
-                <w:rFonts w:ascii="Arial" w:hAnsi="Arial" w:cs="Arial"/>
-                <w:bCs/>
-                <w:sz w:val="22"/>
-                <w:szCs w:val="22"/>
-              </w:rPr>
-              <w:t>no_offence_condition</w:t>
-            </w:r>
-            <w:proofErr w:type="spellEnd"/>
-            <w:r>
-              <w:rPr>
-                <w:rFonts w:ascii="Arial" w:hAnsi="Arial" w:cs="Arial"/>
-                <w:bCs/>
-                <w:sz w:val="22"/>
-                <w:szCs w:val="22"/>
-              </w:rPr>
-              <w:t xml:space="preserve">}} </w:t>
+              <w:t xml:space="preserve">{{no_offence_condition}} </w:t>
             </w:r>
             <w:r>
               <w:rPr>
@@ -5013,27 +4195,7 @@
                 <w:sz w:val="22"/>
                 <w:szCs w:val="22"/>
               </w:rPr>
-              <w:t>{{</w:t>
-            </w:r>
-            <w:proofErr w:type="spellStart"/>
-            <w:r>
-              <w:rPr>
-                <w:rFonts w:ascii="Arial" w:hAnsi="Arial" w:cs="Arial"/>
-                <w:bCs/>
-                <w:sz w:val="22"/>
-                <w:szCs w:val="22"/>
-              </w:rPr>
-              <w:t>keep_in_touch_condition</w:t>
-            </w:r>
-            <w:proofErr w:type="spellEnd"/>
-            <w:r>
-              <w:rPr>
-                <w:rFonts w:ascii="Arial" w:hAnsi="Arial" w:cs="Arial"/>
-                <w:bCs/>
-                <w:sz w:val="22"/>
-                <w:szCs w:val="22"/>
-              </w:rPr>
-              <w:t xml:space="preserve">}} </w:t>
+              <w:t xml:space="preserve">{{keep_in_touch_condition}} </w:t>
             </w:r>
             <w:r>
               <w:rPr>
@@ -5068,27 +4230,7 @@
                 <w:sz w:val="22"/>
                 <w:szCs w:val="22"/>
               </w:rPr>
-              <w:t>{{</w:t>
-            </w:r>
-            <w:proofErr w:type="spellStart"/>
-            <w:r>
-              <w:rPr>
-                <w:rFonts w:ascii="Arial" w:hAnsi="Arial" w:cs="Arial"/>
-                <w:bCs/>
-                <w:sz w:val="22"/>
-                <w:szCs w:val="22"/>
-              </w:rPr>
-              <w:t>officer_visit_condition</w:t>
-            </w:r>
-            <w:proofErr w:type="spellEnd"/>
-            <w:r>
-              <w:rPr>
-                <w:rFonts w:ascii="Arial" w:hAnsi="Arial" w:cs="Arial"/>
-                <w:bCs/>
-                <w:sz w:val="22"/>
-                <w:szCs w:val="22"/>
-              </w:rPr>
-              <w:t xml:space="preserve">}} </w:t>
+              <w:t xml:space="preserve">{{officer_visit_condition}} </w:t>
             </w:r>
             <w:r>
               <w:rPr>
@@ -5123,27 +4265,7 @@
                 <w:sz w:val="22"/>
                 <w:szCs w:val="22"/>
               </w:rPr>
-              <w:t>{{</w:t>
-            </w:r>
-            <w:proofErr w:type="spellStart"/>
-            <w:r>
-              <w:rPr>
-                <w:rFonts w:ascii="Arial" w:hAnsi="Arial" w:cs="Arial"/>
-                <w:bCs/>
-                <w:sz w:val="22"/>
-                <w:szCs w:val="22"/>
-              </w:rPr>
-              <w:t>address_approved_condition</w:t>
-            </w:r>
-            <w:proofErr w:type="spellEnd"/>
-            <w:r>
-              <w:rPr>
-                <w:rFonts w:ascii="Arial" w:hAnsi="Arial" w:cs="Arial"/>
-                <w:bCs/>
-                <w:sz w:val="22"/>
-                <w:szCs w:val="22"/>
-              </w:rPr>
-              <w:t xml:space="preserve">}} </w:t>
+              <w:t xml:space="preserve">{{address_approved_condition}} </w:t>
             </w:r>
             <w:r>
               <w:rPr>
@@ -5188,27 +4310,7 @@
                 <w:szCs w:val="22"/>
               </w:rPr>
               <w:lastRenderedPageBreak/>
-              <w:t>{{</w:t>
-            </w:r>
-            <w:proofErr w:type="spellStart"/>
-            <w:r>
-              <w:rPr>
-                <w:rFonts w:ascii="Arial" w:hAnsi="Arial" w:cs="Arial"/>
-                <w:bCs/>
-                <w:sz w:val="22"/>
-                <w:szCs w:val="22"/>
-              </w:rPr>
-              <w:t>no_work_undertaken_condition</w:t>
-            </w:r>
-            <w:proofErr w:type="spellEnd"/>
-            <w:r>
-              <w:rPr>
-                <w:rFonts w:ascii="Arial" w:hAnsi="Arial" w:cs="Arial"/>
-                <w:bCs/>
-                <w:sz w:val="22"/>
-                <w:szCs w:val="22"/>
-              </w:rPr>
-              <w:t xml:space="preserve">}} </w:t>
+              <w:t xml:space="preserve">{{no_work_undertaken_condition}} </w:t>
             </w:r>
             <w:r>
               <w:rPr>
@@ -5243,27 +4345,7 @@
                 <w:sz w:val="22"/>
                 <w:szCs w:val="22"/>
               </w:rPr>
-              <w:t>{{</w:t>
-            </w:r>
-            <w:proofErr w:type="spellStart"/>
-            <w:r>
-              <w:rPr>
-                <w:rFonts w:ascii="Arial" w:hAnsi="Arial" w:cs="Arial"/>
-                <w:bCs/>
-                <w:sz w:val="22"/>
-                <w:szCs w:val="22"/>
-              </w:rPr>
-              <w:t>no_travel_condition</w:t>
-            </w:r>
-            <w:proofErr w:type="spellEnd"/>
-            <w:r>
-              <w:rPr>
-                <w:rFonts w:ascii="Arial" w:hAnsi="Arial" w:cs="Arial"/>
-                <w:bCs/>
-                <w:sz w:val="22"/>
-                <w:szCs w:val="22"/>
-              </w:rPr>
-              <w:t>}}</w:t>
+              <w:t>{{no_travel_condition}}</w:t>
             </w:r>
             <w:r>
               <w:rPr>
@@ -5309,27 +4391,7 @@
                 <w:sz w:val="22"/>
                 <w:szCs w:val="22"/>
               </w:rPr>
-              <w:t>{{</w:t>
-            </w:r>
-            <w:proofErr w:type="spellStart"/>
-            <w:r>
-              <w:rPr>
-                <w:rFonts w:ascii="Arial" w:hAnsi="Arial" w:cs="Arial"/>
-                <w:bCs/>
-                <w:sz w:val="22"/>
-                <w:szCs w:val="22"/>
-              </w:rPr>
-              <w:t>other_name_known_by</w:t>
-            </w:r>
-            <w:proofErr w:type="spellEnd"/>
-            <w:r>
-              <w:rPr>
-                <w:rFonts w:ascii="Arial" w:hAnsi="Arial" w:cs="Arial"/>
-                <w:bCs/>
-                <w:sz w:val="22"/>
-                <w:szCs w:val="22"/>
-              </w:rPr>
-              <w:t>}}</w:t>
+              <w:t>{{other_name_known_by}}</w:t>
             </w:r>
             <w:r>
               <w:rPr>
@@ -5386,27 +4448,7 @@
                 <w:sz w:val="22"/>
                 <w:szCs w:val="22"/>
               </w:rPr>
-              <w:t>{{</w:t>
-            </w:r>
-            <w:proofErr w:type="spellStart"/>
-            <w:r>
-              <w:rPr>
-                <w:rFonts w:ascii="Arial" w:hAnsi="Arial" w:cs="Arial"/>
-                <w:bCs/>
-                <w:sz w:val="22"/>
-                <w:szCs w:val="22"/>
-              </w:rPr>
-              <w:t>contact_details_changed</w:t>
-            </w:r>
-            <w:proofErr w:type="spellEnd"/>
-            <w:r>
-              <w:rPr>
-                <w:rFonts w:ascii="Arial" w:hAnsi="Arial" w:cs="Arial"/>
-                <w:bCs/>
-                <w:sz w:val="22"/>
-                <w:szCs w:val="22"/>
-              </w:rPr>
-              <w:t>}}</w:t>
+              <w:t>{{contact_details_changed}}</w:t>
             </w:r>
             <w:r>
               <w:rPr>
@@ -5529,23 +4571,7 @@
           <w:rFonts w:ascii="Arial" w:hAnsi="Arial" w:cs="Arial"/>
           <w:bCs/>
         </w:rPr>
-        <w:t>{{</w:t>
-      </w:r>
-      <w:proofErr w:type="spellStart"/>
-      <w:r>
-        <w:rPr>
-          <w:rFonts w:ascii="Arial" w:hAnsi="Arial" w:cs="Arial"/>
-          <w:bCs/>
-        </w:rPr>
-        <w:t>additional_conditions_breached</w:t>
-      </w:r>
-      <w:proofErr w:type="spellEnd"/>
-      <w:r>
-        <w:rPr>
-          <w:rFonts w:ascii="Arial" w:hAnsi="Arial" w:cs="Arial"/>
-          <w:bCs/>
-        </w:rPr>
-        <w:t>}}</w:t>
+        <w:t>{{additional_conditions_breached}}</w:t>
       </w:r>
     </w:p>
     <w:p>
@@ -5699,23 +4725,7 @@
           <w:rFonts w:ascii="Arial" w:hAnsi="Arial" w:cs="Arial"/>
           <w:bCs/>
         </w:rPr>
-        <w:t>{{</w:t>
-      </w:r>
-      <w:proofErr w:type="spellStart"/>
-      <w:r>
-        <w:rPr>
-          <w:rFonts w:ascii="Arial" w:hAnsi="Arial" w:cs="Arial"/>
-          <w:bCs/>
-        </w:rPr>
-        <w:t>what_led_to_recall</w:t>
-      </w:r>
-      <w:proofErr w:type="spellEnd"/>
-      <w:r>
-        <w:rPr>
-          <w:rFonts w:ascii="Arial" w:hAnsi="Arial" w:cs="Arial"/>
-          <w:bCs/>
-        </w:rPr>
-        <w:t>}}</w:t>
+        <w:t>{{what_led_to_recall}}</w:t>
       </w:r>
     </w:p>
     <w:tbl>
@@ -5970,27 +4980,7 @@
                 <w:sz w:val="22"/>
                 <w:szCs w:val="22"/>
               </w:rPr>
-              <w:t>{{</w:t>
-            </w:r>
-            <w:proofErr w:type="spellStart"/>
-            <w:r>
-              <w:rPr>
-                <w:rFonts w:ascii="Arial" w:hAnsi="Arial" w:cs="Arial"/>
-                <w:bCs/>
-                <w:sz w:val="22"/>
-                <w:szCs w:val="22"/>
-              </w:rPr>
-              <w:t>warning_letter_details</w:t>
-            </w:r>
-            <w:proofErr w:type="spellEnd"/>
-            <w:r>
-              <w:rPr>
-                <w:rFonts w:ascii="Arial" w:hAnsi="Arial" w:cs="Arial"/>
-                <w:bCs/>
-                <w:sz w:val="22"/>
-                <w:szCs w:val="22"/>
-              </w:rPr>
-              <w:t>}}</w:t>
+              <w:t>{{warning_letter_details}}</w:t>
             </w:r>
           </w:p>
         </w:tc>
@@ -6047,27 +5037,7 @@
                 <w:sz w:val="22"/>
                 <w:szCs w:val="22"/>
               </w:rPr>
-              <w:t>{{</w:t>
-            </w:r>
-            <w:proofErr w:type="spellStart"/>
-            <w:r>
-              <w:rPr>
-                <w:rFonts w:ascii="Arial" w:hAnsi="Arial" w:cs="Arial"/>
-                <w:bCs/>
-                <w:sz w:val="22"/>
-                <w:szCs w:val="22"/>
-              </w:rPr>
-              <w:t>increased_frequency_details</w:t>
-            </w:r>
-            <w:proofErr w:type="spellEnd"/>
-            <w:r>
-              <w:rPr>
-                <w:rFonts w:ascii="Arial" w:hAnsi="Arial" w:cs="Arial"/>
-                <w:bCs/>
-                <w:sz w:val="22"/>
-                <w:szCs w:val="22"/>
-              </w:rPr>
-              <w:t>}}</w:t>
+              <w:t>{{increased_frequency_details}}</w:t>
             </w:r>
           </w:p>
         </w:tc>
@@ -6124,27 +5094,7 @@
                 <w:sz w:val="22"/>
                 <w:szCs w:val="22"/>
               </w:rPr>
-              <w:t>{{</w:t>
-            </w:r>
-            <w:proofErr w:type="spellStart"/>
-            <w:r>
-              <w:rPr>
-                <w:rFonts w:ascii="Arial" w:hAnsi="Arial" w:cs="Arial"/>
-                <w:bCs/>
-                <w:sz w:val="22"/>
-                <w:szCs w:val="22"/>
-              </w:rPr>
-              <w:t>extra_licence_conditions_details</w:t>
-            </w:r>
-            <w:proofErr w:type="spellEnd"/>
-            <w:r>
-              <w:rPr>
-                <w:rFonts w:ascii="Arial" w:hAnsi="Arial" w:cs="Arial"/>
-                <w:bCs/>
-                <w:sz w:val="22"/>
-                <w:szCs w:val="22"/>
-              </w:rPr>
-              <w:t>}}</w:t>
+              <w:t>{{extra_licence_conditions_details}}</w:t>
             </w:r>
           </w:p>
         </w:tc>
@@ -6201,27 +5151,7 @@
                 <w:sz w:val="22"/>
                 <w:szCs w:val="22"/>
               </w:rPr>
-              <w:t>{{</w:t>
-            </w:r>
-            <w:proofErr w:type="spellStart"/>
-            <w:r>
-              <w:rPr>
-                <w:rFonts w:ascii="Arial" w:hAnsi="Arial" w:cs="Arial"/>
-                <w:bCs/>
-                <w:sz w:val="22"/>
-                <w:szCs w:val="22"/>
-              </w:rPr>
-              <w:t>referral_to_other_teams_details</w:t>
-            </w:r>
-            <w:proofErr w:type="spellEnd"/>
-            <w:r>
-              <w:rPr>
-                <w:rFonts w:ascii="Arial" w:hAnsi="Arial" w:cs="Arial"/>
-                <w:bCs/>
-                <w:sz w:val="22"/>
-                <w:szCs w:val="22"/>
-              </w:rPr>
-              <w:t>}}</w:t>
+              <w:t>{{referral_to_other_teams_details}}</w:t>
             </w:r>
           </w:p>
         </w:tc>
@@ -6278,27 +5208,7 @@
                 <w:sz w:val="22"/>
                 <w:szCs w:val="22"/>
               </w:rPr>
-              <w:t>{{</w:t>
-            </w:r>
-            <w:proofErr w:type="spellStart"/>
-            <w:r>
-              <w:rPr>
-                <w:rFonts w:ascii="Arial" w:hAnsi="Arial" w:cs="Arial"/>
-                <w:bCs/>
-                <w:sz w:val="22"/>
-                <w:szCs w:val="22"/>
-              </w:rPr>
-              <w:t>referral_to_partnership_agencies_details</w:t>
-            </w:r>
-            <w:proofErr w:type="spellEnd"/>
-            <w:r>
-              <w:rPr>
-                <w:rFonts w:ascii="Arial" w:hAnsi="Arial" w:cs="Arial"/>
-                <w:bCs/>
-                <w:sz w:val="22"/>
-                <w:szCs w:val="22"/>
-              </w:rPr>
-              <w:t>}}</w:t>
+              <w:t>{{referral_to_partnership_agencies_details}}</w:t>
             </w:r>
           </w:p>
         </w:tc>
@@ -6355,27 +5265,7 @@
                 <w:sz w:val="22"/>
                 <w:szCs w:val="22"/>
               </w:rPr>
-              <w:t>{{</w:t>
-            </w:r>
-            <w:proofErr w:type="spellStart"/>
-            <w:r>
-              <w:rPr>
-                <w:rFonts w:ascii="Arial" w:hAnsi="Arial" w:cs="Arial"/>
-                <w:bCs/>
-                <w:sz w:val="22"/>
-                <w:szCs w:val="22"/>
-              </w:rPr>
-              <w:t>referral_to_approved_premises_details</w:t>
-            </w:r>
-            <w:proofErr w:type="spellEnd"/>
-            <w:r>
-              <w:rPr>
-                <w:rFonts w:ascii="Arial" w:hAnsi="Arial" w:cs="Arial"/>
-                <w:bCs/>
-                <w:sz w:val="22"/>
-                <w:szCs w:val="22"/>
-              </w:rPr>
-              <w:t>}}</w:t>
+              <w:t>{{referral_to_approved_premises_details}}</w:t>
             </w:r>
           </w:p>
         </w:tc>
@@ -6432,27 +5322,7 @@
                 <w:sz w:val="22"/>
                 <w:szCs w:val="22"/>
               </w:rPr>
-              <w:t>{{</w:t>
-            </w:r>
-            <w:proofErr w:type="spellStart"/>
-            <w:r>
-              <w:rPr>
-                <w:rFonts w:ascii="Arial" w:hAnsi="Arial" w:cs="Arial"/>
-                <w:bCs/>
-                <w:sz w:val="22"/>
-                <w:szCs w:val="22"/>
-              </w:rPr>
-              <w:t>drug_testing_details</w:t>
-            </w:r>
-            <w:proofErr w:type="spellEnd"/>
-            <w:r>
-              <w:rPr>
-                <w:rFonts w:ascii="Arial" w:hAnsi="Arial" w:cs="Arial"/>
-                <w:bCs/>
-                <w:sz w:val="22"/>
-                <w:szCs w:val="22"/>
-              </w:rPr>
-              <w:t>}}</w:t>
+              <w:t>{{drug_testing_details}}</w:t>
             </w:r>
           </w:p>
         </w:tc>
@@ -6509,27 +5379,7 @@
                 <w:sz w:val="22"/>
                 <w:szCs w:val="22"/>
               </w:rPr>
-              <w:t>{{</w:t>
-            </w:r>
-            <w:proofErr w:type="spellStart"/>
-            <w:r>
-              <w:rPr>
-                <w:rFonts w:ascii="Arial" w:hAnsi="Arial" w:cs="Arial"/>
-                <w:bCs/>
-                <w:sz w:val="22"/>
-                <w:szCs w:val="22"/>
-              </w:rPr>
-              <w:t>alternative_to_recall_other_details</w:t>
-            </w:r>
-            <w:proofErr w:type="spellEnd"/>
-            <w:r>
-              <w:rPr>
-                <w:rFonts w:ascii="Arial" w:hAnsi="Arial" w:cs="Arial"/>
-                <w:bCs/>
-                <w:sz w:val="22"/>
-                <w:szCs w:val="22"/>
-              </w:rPr>
-              <w:t>}}</w:t>
+              <w:t>{{alternative_to_recall_other_details}}</w:t>
             </w:r>
           </w:p>
         </w:tc>
@@ -6680,23 +5530,7 @@
           <w:rFonts w:ascii="Arial" w:hAnsi="Arial" w:cs="Arial"/>
           <w:bCs/>
         </w:rPr>
-        <w:t>{{</w:t>
-      </w:r>
-      <w:proofErr w:type="spellStart"/>
-      <w:r>
-        <w:rPr>
-          <w:rFonts w:ascii="Arial" w:hAnsi="Arial" w:cs="Arial"/>
-          <w:bCs/>
-        </w:rPr>
-        <w:t>recall_type</w:t>
-      </w:r>
-      <w:proofErr w:type="spellEnd"/>
-      <w:r>
-        <w:rPr>
-          <w:rFonts w:ascii="Arial" w:hAnsi="Arial" w:cs="Arial"/>
-          <w:bCs/>
-        </w:rPr>
-        <w:t>}}</w:t>
+        <w:t>{{recall_type}}</w:t>
       </w:r>
       <w:r>
         <w:rPr>
@@ -6737,24 +5571,14 @@
           <w:rFonts w:ascii="Arial" w:hAnsi="Arial" w:cs="Arial"/>
           <w:bCs/>
         </w:rPr>
-        <w:t>{{</w:t>
-      </w:r>
-      <w:proofErr w:type="spellStart"/>
-      <w:r>
-        <w:rPr>
-          <w:rFonts w:ascii="Arial" w:hAnsi="Arial" w:cs="Arial"/>
-          <w:bCs/>
-        </w:rPr>
-        <w:t>recall_type_details</w:t>
-      </w:r>
-      <w:proofErr w:type="spellEnd"/>
-      <w:proofErr w:type="gramStart"/>
-      <w:r>
-        <w:rPr>
-          <w:rFonts w:ascii="Arial" w:hAnsi="Arial" w:cs="Arial"/>
-          <w:bCs/>
-        </w:rPr>
-        <w:t>}}</w:t>
+        <w:t>{{recall_type_details}}</w:t>
+      </w:r>
+      <w:r>
+        <w:rPr>
+          <w:rFonts w:ascii="Arial" w:hAnsi="Arial" w:cs="Arial"/>
+          <w:b/>
+        </w:rPr>
+        <w:t xml:space="preserve">                          </w:t>
       </w:r>
       <w:r>
         <w:rPr>
@@ -6763,21 +5587,6 @@
         </w:rPr>
         <w:t xml:space="preserve">   </w:t>
       </w:r>
-      <w:proofErr w:type="gramEnd"/>
-      <w:r>
-        <w:rPr>
-          <w:rFonts w:ascii="Arial" w:hAnsi="Arial" w:cs="Arial"/>
-          <w:b/>
-        </w:rPr>
-        <w:t xml:space="preserve">                       </w:t>
-      </w:r>
-      <w:r>
-        <w:rPr>
-          <w:rFonts w:ascii="Arial" w:hAnsi="Arial" w:cs="Arial"/>
-          <w:b/>
-        </w:rPr>
-        <w:t xml:space="preserve">   </w:t>
-      </w:r>
       <w:r>
         <w:rPr>
           <w:rFonts w:ascii="Arial" w:hAnsi="Arial" w:cs="Arial"/>
@@ -6909,23 +5718,7 @@
           <w:rFonts w:ascii="Arial" w:hAnsi="Arial" w:cs="Arial"/>
           <w:bCs/>
         </w:rPr>
-        <w:t>{{</w:t>
-      </w:r>
-      <w:proofErr w:type="spellStart"/>
-      <w:r>
-        <w:rPr>
-          <w:rFonts w:ascii="Arial" w:hAnsi="Arial" w:cs="Arial"/>
-          <w:bCs/>
-        </w:rPr>
-        <w:t>fixed_term_additional_licence_conditions</w:t>
-      </w:r>
-      <w:proofErr w:type="spellEnd"/>
-      <w:r>
-        <w:rPr>
-          <w:rFonts w:ascii="Arial" w:hAnsi="Arial" w:cs="Arial"/>
-          <w:bCs/>
-        </w:rPr>
-        <w:t>}}</w:t>
+        <w:t>{{fixed_term_additional_licence_conditions}}</w:t>
       </w:r>
     </w:p>
     <w:p>
@@ -7123,37 +5916,12 @@
           <w:rFonts w:ascii="Arial" w:hAnsi="Arial" w:cs="Arial"/>
         </w:rPr>
       </w:pPr>
-      <w:proofErr w:type="spellStart"/>
-      <w:r>
-        <w:rPr>
-          <w:rFonts w:ascii="Arial" w:hAnsi="Arial" w:cs="Arial"/>
-          <w:b/>
-        </w:rPr>
-        <w:t>i</w:t>
-      </w:r>
-      <w:proofErr w:type="spellEnd"/>
-      <w:r>
-        <w:rPr>
-          <w:rFonts w:ascii="Arial" w:hAnsi="Arial" w:cs="Arial"/>
-          <w:b/>
-        </w:rPr>
-        <w:t xml:space="preserve">) Has the offender exhibited behaviour </w:t>
-      </w:r>
-      <w:proofErr w:type="gramStart"/>
-      <w:r>
-        <w:rPr>
-          <w:rFonts w:ascii="Arial" w:hAnsi="Arial" w:cs="Arial"/>
-          <w:b/>
-        </w:rPr>
-        <w:t>similar to</w:t>
-      </w:r>
-      <w:proofErr w:type="gramEnd"/>
-      <w:r>
-        <w:rPr>
-          <w:rFonts w:ascii="Arial" w:hAnsi="Arial" w:cs="Arial"/>
-          <w:b/>
-        </w:rPr>
-        <w:t xml:space="preserve"> the circumstances surrounding the index offence</w:t>
+      <w:r>
+        <w:rPr>
+          <w:rFonts w:ascii="Arial" w:hAnsi="Arial" w:cs="Arial"/>
+          <w:b/>
+        </w:rPr>
+        <w:t>i) Has the offender exhibited behaviour similar to the circumstances surrounding the index offence</w:t>
       </w:r>
       <w:r>
         <w:rPr>
@@ -7174,23 +5942,7 @@
           <w:rFonts w:ascii="Arial" w:hAnsi="Arial" w:cs="Arial"/>
           <w:bCs/>
         </w:rPr>
-        <w:t>{{</w:t>
-      </w:r>
-      <w:proofErr w:type="spellStart"/>
-      <w:r>
-        <w:rPr>
-          <w:rFonts w:ascii="Arial" w:hAnsi="Arial" w:cs="Arial"/>
-          <w:bCs/>
-        </w:rPr>
-        <w:t>behaviour_similar_to_index_offence_present</w:t>
-      </w:r>
-      <w:proofErr w:type="spellEnd"/>
-      <w:r>
-        <w:rPr>
-          <w:rFonts w:ascii="Arial" w:hAnsi="Arial" w:cs="Arial"/>
-          <w:bCs/>
-        </w:rPr>
-        <w:t>}}</w:t>
+        <w:t>{{behaviour_similar_to_index_offence_present}}</w:t>
       </w:r>
       <w:r>
         <w:rPr>
@@ -7225,23 +5977,7 @@
           <w:rFonts w:ascii="Arial" w:hAnsi="Arial" w:cs="Arial"/>
           <w:bCs/>
         </w:rPr>
-        <w:t>{{</w:t>
-      </w:r>
-      <w:proofErr w:type="spellStart"/>
-      <w:r>
-        <w:rPr>
-          <w:rFonts w:ascii="Arial" w:hAnsi="Arial" w:cs="Arial"/>
-          <w:bCs/>
-        </w:rPr>
-        <w:t>behaviour_similar_to_index_offence</w:t>
-      </w:r>
-      <w:proofErr w:type="spellEnd"/>
-      <w:r>
-        <w:rPr>
-          <w:rFonts w:ascii="Arial" w:hAnsi="Arial" w:cs="Arial"/>
-          <w:bCs/>
-        </w:rPr>
-        <w:t>}}</w:t>
+        <w:t>{{behaviour_similar_to_index_offence}}</w:t>
       </w:r>
     </w:p>
     <w:p>
@@ -7278,23 +6014,63 @@
           <w:rFonts w:ascii="Arial" w:hAnsi="Arial" w:cs="Arial"/>
           <w:b/>
         </w:rPr>
-        <w:t xml:space="preserve">ii) Has the offender exhibited behaviour likely to give rise, or does give rise </w:t>
-      </w:r>
-      <w:proofErr w:type="gramStart"/>
-      <w:r>
-        <w:rPr>
-          <w:rFonts w:ascii="Arial" w:hAnsi="Arial" w:cs="Arial"/>
-          <w:b/>
-        </w:rPr>
-        <w:t>to  a</w:t>
-      </w:r>
-      <w:proofErr w:type="gramEnd"/>
-      <w:r>
-        <w:rPr>
-          <w:rFonts w:ascii="Arial" w:hAnsi="Arial" w:cs="Arial"/>
-          <w:b/>
-        </w:rPr>
-        <w:t xml:space="preserve"> sexual or violent offence? </w:t>
+        <w:t xml:space="preserve">ii) Has the offender exhibited behaviour likely to give rise, or does give rise to  a sexual or violent offence? </w:t>
+      </w:r>
+      <w:r>
+        <w:rPr>
+          <w:rFonts w:ascii="Arial" w:hAnsi="Arial" w:cs="Arial"/>
+          <w:bCs/>
+        </w:rPr>
+        <w:t>{{behaviour_</w:t>
+      </w:r>
+      <w:r>
+        <w:rPr>
+          <w:rFonts w:ascii="Arial" w:hAnsi="Arial" w:cs="Arial"/>
+          <w:bCs/>
+        </w:rPr>
+        <w:t>likely</w:t>
+      </w:r>
+      <w:r>
+        <w:rPr>
+          <w:rFonts w:ascii="Arial" w:hAnsi="Arial" w:cs="Arial"/>
+          <w:bCs/>
+        </w:rPr>
+        <w:t>_to</w:t>
+      </w:r>
+      <w:r>
+        <w:rPr>
+          <w:rFonts w:ascii="Arial" w:hAnsi="Arial" w:cs="Arial"/>
+          <w:bCs/>
+        </w:rPr>
+        <w:t>_result</w:t>
+      </w:r>
+      <w:r>
+        <w:rPr>
+          <w:rFonts w:ascii="Arial" w:hAnsi="Arial" w:cs="Arial"/>
+          <w:bCs/>
+        </w:rPr>
+        <w:t>_sexual_or_violent_offence_present}}</w:t>
+      </w:r>
+      <w:r>
+        <w:rPr>
+          <w:rFonts w:ascii="Arial" w:hAnsi="Arial" w:cs="Arial"/>
+          <w:b/>
+        </w:rPr>
+        <w:t xml:space="preserve"> </w:t>
+      </w:r>
+      <w:r>
+        <w:rPr>
+          <w:rFonts w:ascii="Arial" w:hAnsi="Arial" w:cs="Arial"/>
+          <w:b/>
+        </w:rPr>
+        <w:t>Provide details</w:t>
+      </w:r>
+      <w:r>
+        <w:rPr>
+          <w:rFonts w:ascii="Arial" w:hAnsi="Arial" w:cs="Arial"/>
+          <w:b/>
+        </w:rPr>
+        <w:t xml:space="preserve">: </w:t>
       </w:r>
       <w:r>
         <w:rPr>
@@ -7303,79 +6079,6 @@
         </w:rPr>
         <w:t>{{</w:t>
       </w:r>
-      <w:proofErr w:type="spellStart"/>
-      <w:r>
-        <w:rPr>
-          <w:rFonts w:ascii="Arial" w:hAnsi="Arial" w:cs="Arial"/>
-          <w:bCs/>
-        </w:rPr>
-        <w:t>behaviour_</w:t>
-      </w:r>
-      <w:r>
-        <w:rPr>
-          <w:rFonts w:ascii="Arial" w:hAnsi="Arial" w:cs="Arial"/>
-          <w:bCs/>
-        </w:rPr>
-        <w:t>likely</w:t>
-      </w:r>
-      <w:r>
-        <w:rPr>
-          <w:rFonts w:ascii="Arial" w:hAnsi="Arial" w:cs="Arial"/>
-          <w:bCs/>
-        </w:rPr>
-        <w:t>_to</w:t>
-      </w:r>
-      <w:r>
-        <w:rPr>
-          <w:rFonts w:ascii="Arial" w:hAnsi="Arial" w:cs="Arial"/>
-          <w:bCs/>
-        </w:rPr>
-        <w:t>_result</w:t>
-      </w:r>
-      <w:r>
-        <w:rPr>
-          <w:rFonts w:ascii="Arial" w:hAnsi="Arial" w:cs="Arial"/>
-          <w:bCs/>
-        </w:rPr>
-        <w:t>_sexual_or_violent_offence_present</w:t>
-      </w:r>
-      <w:proofErr w:type="spellEnd"/>
-      <w:r>
-        <w:rPr>
-          <w:rFonts w:ascii="Arial" w:hAnsi="Arial" w:cs="Arial"/>
-          <w:bCs/>
-        </w:rPr>
-        <w:t>}}</w:t>
-      </w:r>
-      <w:r>
-        <w:rPr>
-          <w:rFonts w:ascii="Arial" w:hAnsi="Arial" w:cs="Arial"/>
-          <w:b/>
-        </w:rPr>
-        <w:t xml:space="preserve"> </w:t>
-      </w:r>
-      <w:r>
-        <w:rPr>
-          <w:rFonts w:ascii="Arial" w:hAnsi="Arial" w:cs="Arial"/>
-          <w:b/>
-        </w:rPr>
-        <w:t>Provide details</w:t>
-      </w:r>
-      <w:r>
-        <w:rPr>
-          <w:rFonts w:ascii="Arial" w:hAnsi="Arial" w:cs="Arial"/>
-          <w:b/>
-        </w:rPr>
-        <w:t xml:space="preserve">: </w:t>
-      </w:r>
-      <w:r>
-        <w:rPr>
-          <w:rFonts w:ascii="Arial" w:hAnsi="Arial" w:cs="Arial"/>
-          <w:bCs/>
-        </w:rPr>
-        <w:t>{{</w:t>
-      </w:r>
-      <w:proofErr w:type="spellStart"/>
       <w:r>
         <w:rPr>
           <w:rFonts w:ascii="Arial" w:hAnsi="Arial" w:cs="Arial"/>
@@ -7388,15 +6091,7 @@
           <w:rFonts w:ascii="Arial" w:hAnsi="Arial" w:cs="Arial"/>
           <w:bCs/>
         </w:rPr>
-        <w:t>_sexual_or_violent_offence</w:t>
-      </w:r>
-      <w:proofErr w:type="spellEnd"/>
-      <w:r>
-        <w:rPr>
-          <w:rFonts w:ascii="Arial" w:hAnsi="Arial" w:cs="Arial"/>
-          <w:bCs/>
-        </w:rPr>
-        <w:t>}}</w:t>
+        <w:t>_sexual_or_violent_offence}}</w:t>
       </w:r>
     </w:p>
     <w:p>
@@ -7454,23 +6149,7 @@
           <w:rFonts w:ascii="Arial" w:hAnsi="Arial" w:cs="Arial"/>
           <w:bCs/>
         </w:rPr>
-        <w:t>{{</w:t>
-      </w:r>
-      <w:proofErr w:type="spellStart"/>
-      <w:r>
-        <w:rPr>
-          <w:rFonts w:ascii="Arial" w:hAnsi="Arial" w:cs="Arial"/>
-          <w:bCs/>
-        </w:rPr>
-        <w:t>behaviour_leading_to_sexual_or_violent_offence_present</w:t>
-      </w:r>
-      <w:proofErr w:type="spellEnd"/>
-      <w:r>
-        <w:rPr>
-          <w:rFonts w:ascii="Arial" w:hAnsi="Arial" w:cs="Arial"/>
-          <w:bCs/>
-        </w:rPr>
-        <w:t>}}</w:t>
+        <w:t>{{behaviour_leading_to_sexual_or_violent_offence_present}}</w:t>
       </w:r>
       <w:r>
         <w:rPr>
@@ -7491,23 +6170,7 @@
           <w:rFonts w:ascii="Arial" w:hAnsi="Arial" w:cs="Arial"/>
           <w:bCs/>
         </w:rPr>
-        <w:t>{{</w:t>
-      </w:r>
-      <w:proofErr w:type="spellStart"/>
-      <w:r>
-        <w:rPr>
-          <w:rFonts w:ascii="Arial" w:hAnsi="Arial" w:cs="Arial"/>
-          <w:bCs/>
-        </w:rPr>
-        <w:t>behaviour_leading_to_sexual_or_violent_offence</w:t>
-      </w:r>
-      <w:proofErr w:type="spellEnd"/>
-      <w:r>
-        <w:rPr>
-          <w:rFonts w:ascii="Arial" w:hAnsi="Arial" w:cs="Arial"/>
-          <w:bCs/>
-        </w:rPr>
-        <w:t>}}</w:t>
+        <w:t>{{behaviour_leading_to_sexual_or_violent_offence}}</w:t>
       </w:r>
     </w:p>
     <w:p>
@@ -7552,24 +6215,7 @@
           <w:rFonts w:ascii="Arial" w:hAnsi="Arial" w:cs="Arial"/>
           <w:bCs/>
         </w:rPr>
-        <w:t>{{</w:t>
-      </w:r>
-      <w:proofErr w:type="spellStart"/>
-      <w:r>
-        <w:rPr>
-          <w:rFonts w:ascii="Arial" w:hAnsi="Arial" w:cs="Arial"/>
-          <w:bCs/>
-        </w:rPr>
-        <w:t>out_of_touch_present</w:t>
-      </w:r>
-      <w:proofErr w:type="spellEnd"/>
-      <w:proofErr w:type="gramStart"/>
-      <w:r>
-        <w:rPr>
-          <w:rFonts w:ascii="Arial" w:hAnsi="Arial" w:cs="Arial"/>
-          <w:bCs/>
-        </w:rPr>
-        <w:t>}}</w:t>
+        <w:t>{{out_of_touch_present}}</w:t>
       </w:r>
       <w:r>
         <w:rPr>
@@ -7583,38 +6229,14 @@
           <w:rFonts w:ascii="Arial" w:hAnsi="Arial" w:cs="Arial"/>
           <w:b/>
         </w:rPr>
-        <w:t xml:space="preserve"> Provide</w:t>
-      </w:r>
-      <w:proofErr w:type="gramEnd"/>
-      <w:r>
-        <w:rPr>
-          <w:rFonts w:ascii="Arial" w:hAnsi="Arial" w:cs="Arial"/>
-          <w:b/>
-        </w:rPr>
-        <w:t xml:space="preserve"> details: </w:t>
-      </w:r>
-      <w:r>
-        <w:rPr>
-          <w:rFonts w:ascii="Arial" w:hAnsi="Arial" w:cs="Arial"/>
-          <w:bCs/>
-        </w:rPr>
-        <w:t>{{</w:t>
-      </w:r>
-      <w:proofErr w:type="spellStart"/>
-      <w:r>
-        <w:rPr>
-          <w:rFonts w:ascii="Arial" w:hAnsi="Arial" w:cs="Arial"/>
-          <w:bCs/>
-        </w:rPr>
-        <w:t>out_of_touch</w:t>
-      </w:r>
-      <w:proofErr w:type="spellEnd"/>
-      <w:r>
-        <w:rPr>
-          <w:rFonts w:ascii="Arial" w:hAnsi="Arial" w:cs="Arial"/>
-          <w:bCs/>
-        </w:rPr>
-        <w:t>}}</w:t>
+        <w:t xml:space="preserve"> Provide details: </w:t>
+      </w:r>
+      <w:r>
+        <w:rPr>
+          <w:rFonts w:ascii="Arial" w:hAnsi="Arial" w:cs="Arial"/>
+          <w:bCs/>
+        </w:rPr>
+        <w:t>{{out_of_touch}}</w:t>
       </w:r>
       <w:r>
         <w:rPr>
@@ -7672,46 +6294,14 @@
           <w:rFonts w:ascii="Arial" w:hAnsi="Arial" w:cs="Arial"/>
           <w:b/>
         </w:rPr>
-        <w:t>be made that (</w:t>
-      </w:r>
-      <w:proofErr w:type="spellStart"/>
-      <w:r>
-        <w:rPr>
-          <w:rFonts w:ascii="Arial" w:hAnsi="Arial" w:cs="Arial"/>
-          <w:b/>
-        </w:rPr>
-        <w:t>i</w:t>
-      </w:r>
-      <w:proofErr w:type="spellEnd"/>
-      <w:r>
-        <w:rPr>
-          <w:rFonts w:ascii="Arial" w:hAnsi="Arial" w:cs="Arial"/>
-          <w:b/>
-        </w:rPr>
-        <w:t xml:space="preserve">), (ii) or (iii) may arise? </w:t>
-      </w:r>
-      <w:r>
-        <w:rPr>
-          <w:rFonts w:ascii="Arial" w:hAnsi="Arial" w:cs="Arial"/>
-          <w:bCs/>
-        </w:rPr>
-        <w:t>{{</w:t>
-      </w:r>
-      <w:proofErr w:type="spellStart"/>
-      <w:r>
-        <w:rPr>
-          <w:rFonts w:ascii="Arial" w:hAnsi="Arial" w:cs="Arial"/>
-          <w:bCs/>
-        </w:rPr>
-        <w:t>out_of_touch</w:t>
-      </w:r>
-      <w:proofErr w:type="spellEnd"/>
-      <w:r>
-        <w:rPr>
-          <w:rFonts w:ascii="Arial" w:hAnsi="Arial" w:cs="Arial"/>
-          <w:bCs/>
-        </w:rPr>
-        <w:t>}}</w:t>
+        <w:t xml:space="preserve">be made that (i), (ii) or (iii) may arise? </w:t>
+      </w:r>
+      <w:r>
+        <w:rPr>
+          <w:rFonts w:ascii="Arial" w:hAnsi="Arial" w:cs="Arial"/>
+          <w:bCs/>
+        </w:rPr>
+        <w:t>{{out_of_touch}}</w:t>
       </w:r>
     </w:p>
     <w:p>
@@ -7893,23 +6483,7 @@
           <w:rFonts w:ascii="Arial" w:hAnsi="Arial" w:cs="Arial"/>
           <w:bCs/>
         </w:rPr>
-        <w:t>{{</w:t>
-      </w:r>
-      <w:proofErr w:type="spellStart"/>
-      <w:r>
-        <w:rPr>
-          <w:rFonts w:ascii="Arial" w:hAnsi="Arial" w:cs="Arial"/>
-          <w:bCs/>
-        </w:rPr>
-        <w:t>practitioner_name</w:t>
-      </w:r>
-      <w:proofErr w:type="spellEnd"/>
-      <w:r>
-        <w:rPr>
-          <w:rFonts w:ascii="Arial" w:hAnsi="Arial" w:cs="Arial"/>
-          <w:bCs/>
-        </w:rPr>
-        <w:t>}}</w:t>
+        <w:t>{{practitioner_name}}</w:t>
       </w:r>
     </w:p>
     <w:p>
@@ -7940,23 +6514,7 @@
           <w:rFonts w:ascii="Arial" w:hAnsi="Arial" w:cs="Arial"/>
           <w:bCs/>
         </w:rPr>
-        <w:t>{{</w:t>
-      </w:r>
-      <w:proofErr w:type="spellStart"/>
-      <w:r>
-        <w:rPr>
-          <w:rFonts w:ascii="Arial" w:hAnsi="Arial" w:cs="Arial"/>
-          <w:bCs/>
-        </w:rPr>
-        <w:t>practitioner_telephone</w:t>
-      </w:r>
-      <w:proofErr w:type="spellEnd"/>
-      <w:r>
-        <w:rPr>
-          <w:rFonts w:ascii="Arial" w:hAnsi="Arial" w:cs="Arial"/>
-          <w:bCs/>
-        </w:rPr>
-        <w:t>}}</w:t>
+        <w:t>{{practitioner_telephone}}</w:t>
       </w:r>
     </w:p>
     <w:p>
@@ -7987,23 +6545,7 @@
           <w:rFonts w:ascii="Arial" w:hAnsi="Arial" w:cs="Arial"/>
           <w:bCs/>
         </w:rPr>
-        <w:t>{{</w:t>
-      </w:r>
-      <w:proofErr w:type="spellStart"/>
-      <w:r>
-        <w:rPr>
-          <w:rFonts w:ascii="Arial" w:hAnsi="Arial" w:cs="Arial"/>
-          <w:bCs/>
-        </w:rPr>
-        <w:t>practitioner_email</w:t>
-      </w:r>
-      <w:proofErr w:type="spellEnd"/>
-      <w:r>
-        <w:rPr>
-          <w:rFonts w:ascii="Arial" w:hAnsi="Arial" w:cs="Arial"/>
-          <w:bCs/>
-        </w:rPr>
-        <w:t>}}</w:t>
+        <w:t>{{practitioner_email}}</w:t>
       </w:r>
       <w:r>
         <w:rPr>
@@ -8054,23 +6596,7 @@
           <w:rFonts w:ascii="Arial" w:hAnsi="Arial" w:cs="Arial"/>
           <w:bCs/>
         </w:rPr>
-        <w:t>{{</w:t>
-      </w:r>
-      <w:proofErr w:type="spellStart"/>
-      <w:r>
-        <w:rPr>
-          <w:rFonts w:ascii="Arial" w:hAnsi="Arial" w:cs="Arial"/>
-          <w:bCs/>
-        </w:rPr>
-        <w:t>completed_by_name</w:t>
-      </w:r>
-      <w:proofErr w:type="spellEnd"/>
-      <w:r>
-        <w:rPr>
-          <w:rFonts w:ascii="Arial" w:hAnsi="Arial" w:cs="Arial"/>
-          <w:bCs/>
-        </w:rPr>
-        <w:t>}}</w:t>
+        <w:t>{{completed_by_name}}</w:t>
       </w:r>
     </w:p>
     <w:p>
@@ -8108,23 +6634,7 @@
           <w:rFonts w:ascii="Arial" w:hAnsi="Arial" w:cs="Arial"/>
           <w:bCs/>
         </w:rPr>
-        <w:t>{{</w:t>
-      </w:r>
-      <w:proofErr w:type="spellStart"/>
-      <w:r>
-        <w:rPr>
-          <w:rFonts w:ascii="Arial" w:hAnsi="Arial" w:cs="Arial"/>
-          <w:bCs/>
-        </w:rPr>
-        <w:t>completed_by_telephone</w:t>
-      </w:r>
-      <w:proofErr w:type="spellEnd"/>
-      <w:r>
-        <w:rPr>
-          <w:rFonts w:ascii="Arial" w:hAnsi="Arial" w:cs="Arial"/>
-          <w:bCs/>
-        </w:rPr>
-        <w:t>}}</w:t>
+        <w:t>{{completed_by_telephone}}</w:t>
       </w:r>
     </w:p>
     <w:p>
@@ -8162,23 +6672,7 @@
           <w:rFonts w:ascii="Arial" w:hAnsi="Arial" w:cs="Arial"/>
           <w:bCs/>
         </w:rPr>
-        <w:t>{{</w:t>
-      </w:r>
-      <w:proofErr w:type="spellStart"/>
-      <w:r>
-        <w:rPr>
-          <w:rFonts w:ascii="Arial" w:hAnsi="Arial" w:cs="Arial"/>
-          <w:bCs/>
-        </w:rPr>
-        <w:t>completed_by_email</w:t>
-      </w:r>
-      <w:proofErr w:type="spellEnd"/>
-      <w:r>
-        <w:rPr>
-          <w:rFonts w:ascii="Arial" w:hAnsi="Arial" w:cs="Arial"/>
-          <w:bCs/>
-        </w:rPr>
-        <w:t>}}</w:t>
+        <w:t>{{completed_by_email}}</w:t>
       </w:r>
     </w:p>
     <w:p>
@@ -8216,23 +6710,7 @@
           <w:rFonts w:ascii="Arial" w:hAnsi="Arial" w:cs="Arial"/>
           <w:bCs/>
         </w:rPr>
-        <w:t>{{</w:t>
-      </w:r>
-      <w:proofErr w:type="spellStart"/>
-      <w:r>
-        <w:rPr>
-          <w:rFonts w:ascii="Arial" w:hAnsi="Arial" w:cs="Arial"/>
-          <w:bCs/>
-        </w:rPr>
-        <w:t>completed_by_region</w:t>
-      </w:r>
-      <w:proofErr w:type="spellEnd"/>
-      <w:r>
-        <w:rPr>
-          <w:rFonts w:ascii="Arial" w:hAnsi="Arial" w:cs="Arial"/>
-          <w:bCs/>
-        </w:rPr>
-        <w:t>}}</w:t>
+        <w:t>{{completed_by_region}}</w:t>
       </w:r>
     </w:p>
     <w:p>
@@ -8287,23 +6765,7 @@
           <w:rFonts w:ascii="Arial" w:hAnsi="Arial" w:cs="Arial"/>
           <w:bCs/>
         </w:rPr>
-        <w:t>{{</w:t>
-      </w:r>
-      <w:proofErr w:type="spellStart"/>
-      <w:r>
-        <w:rPr>
-          <w:rFonts w:ascii="Arial" w:hAnsi="Arial" w:cs="Arial"/>
-          <w:bCs/>
-        </w:rPr>
-        <w:t>completed_by_local_delivery_unit</w:t>
-      </w:r>
-      <w:proofErr w:type="spellEnd"/>
-      <w:r>
-        <w:rPr>
-          <w:rFonts w:ascii="Arial" w:hAnsi="Arial" w:cs="Arial"/>
-          <w:bCs/>
-        </w:rPr>
-        <w:t>}}</w:t>
+        <w:t>{{completed_by_local_delivery_unit}}</w:t>
       </w:r>
     </w:p>
     <w:p>
@@ -8364,23 +6826,7 @@
           <w:rFonts w:ascii="Arial" w:hAnsi="Arial" w:cs="Arial"/>
           <w:bCs/>
         </w:rPr>
-        <w:t>{{</w:t>
-      </w:r>
-      <w:proofErr w:type="spellStart"/>
-      <w:r>
-        <w:rPr>
-          <w:rFonts w:ascii="Arial" w:hAnsi="Arial" w:cs="Arial"/>
-          <w:bCs/>
-        </w:rPr>
-        <w:t>completed_by_ppcs_query_emails</w:t>
-      </w:r>
-      <w:proofErr w:type="spellEnd"/>
-      <w:r>
-        <w:rPr>
-          <w:rFonts w:ascii="Arial" w:hAnsi="Arial" w:cs="Arial"/>
-          <w:bCs/>
-        </w:rPr>
-        <w:t>}}</w:t>
+        <w:t>{{completed_by_ppcs_query_emails}}</w:t>
       </w:r>
     </w:p>
     <w:p>
@@ -8418,23 +6864,7 @@
           <w:rFonts w:ascii="Arial" w:hAnsi="Arial" w:cs="Arial"/>
           <w:bCs/>
         </w:rPr>
-        <w:t>{{</w:t>
-      </w:r>
-      <w:proofErr w:type="spellStart"/>
-      <w:r>
-        <w:rPr>
-          <w:rFonts w:ascii="Arial" w:hAnsi="Arial" w:cs="Arial"/>
-          <w:bCs/>
-        </w:rPr>
-        <w:t>date_of_decision</w:t>
-      </w:r>
-      <w:proofErr w:type="spellEnd"/>
-      <w:r>
-        <w:rPr>
-          <w:rFonts w:ascii="Arial" w:hAnsi="Arial" w:cs="Arial"/>
-          <w:bCs/>
-        </w:rPr>
-        <w:t>}}</w:t>
+        <w:t>{{date_of_decision}}</w:t>
       </w:r>
     </w:p>
     <w:p>
@@ -8471,23 +6901,7 @@
           <w:rFonts w:ascii="Arial" w:hAnsi="Arial" w:cs="Arial"/>
           <w:bCs/>
         </w:rPr>
-        <w:t>{{</w:t>
-      </w:r>
-      <w:proofErr w:type="spellStart"/>
-      <w:r>
-        <w:rPr>
-          <w:rFonts w:ascii="Arial" w:hAnsi="Arial" w:cs="Arial"/>
-          <w:bCs/>
-        </w:rPr>
-        <w:t>time_of_decision</w:t>
-      </w:r>
-      <w:proofErr w:type="spellEnd"/>
-      <w:r>
-        <w:rPr>
-          <w:rFonts w:ascii="Arial" w:hAnsi="Arial" w:cs="Arial"/>
-          <w:bCs/>
-        </w:rPr>
-        <w:t>}}</w:t>
+        <w:t>{{time_of_decision}}</w:t>
       </w:r>
     </w:p>
     <w:p>
@@ -8599,23 +7013,7 @@
           <w:rFonts w:ascii="Arial" w:hAnsi="Arial" w:cs="Arial"/>
           <w:bCs/>
         </w:rPr>
-        <w:t>{{</w:t>
-      </w:r>
-      <w:proofErr w:type="spellStart"/>
-      <w:r>
-        <w:rPr>
-          <w:rFonts w:ascii="Arial" w:hAnsi="Arial" w:cs="Arial"/>
-          <w:bCs/>
-        </w:rPr>
-        <w:t>spo_countersign_complete</w:t>
-      </w:r>
-      <w:proofErr w:type="spellEnd"/>
-      <w:r>
-        <w:rPr>
-          <w:rFonts w:ascii="Arial" w:hAnsi="Arial" w:cs="Arial"/>
-          <w:bCs/>
-        </w:rPr>
-        <w:t>}}</w:t>
+        <w:t>{{spo_countersign_complete}}</w:t>
       </w:r>
       <w:r>
         <w:rPr>
@@ -8704,23 +7102,7 @@
           <w:rFonts w:ascii="Arial" w:hAnsi="Arial" w:cs="Arial"/>
           <w:bCs/>
         </w:rPr>
-        <w:t>{{</w:t>
-      </w:r>
-      <w:proofErr w:type="spellStart"/>
-      <w:r>
-        <w:rPr>
-          <w:rFonts w:ascii="Arial" w:hAnsi="Arial" w:cs="Arial"/>
-          <w:bCs/>
-        </w:rPr>
-        <w:t>spo_countersign_complete</w:t>
-      </w:r>
-      <w:proofErr w:type="spellEnd"/>
-      <w:r>
-        <w:rPr>
-          <w:rFonts w:ascii="Arial" w:hAnsi="Arial" w:cs="Arial"/>
-          <w:bCs/>
-        </w:rPr>
-        <w:t>}}</w:t>
+        <w:t>{{spo_countersign_complete}}</w:t>
       </w:r>
       <w:r>
         <w:rPr>
@@ -8761,23 +7143,7 @@
           <w:rFonts w:ascii="Arial" w:hAnsi="Arial" w:cs="Arial"/>
           <w:bCs/>
         </w:rPr>
-        <w:t>{{</w:t>
-      </w:r>
-      <w:proofErr w:type="spellStart"/>
-      <w:r>
-        <w:rPr>
-          <w:rFonts w:ascii="Arial" w:hAnsi="Arial" w:cs="Arial"/>
-          <w:bCs/>
-        </w:rPr>
-        <w:t>spo_countersign_complete</w:t>
-      </w:r>
-      <w:proofErr w:type="spellEnd"/>
-      <w:r>
-        <w:rPr>
-          <w:rFonts w:ascii="Arial" w:hAnsi="Arial" w:cs="Arial"/>
-          <w:bCs/>
-        </w:rPr>
-        <w:t>}}</w:t>
+        <w:t>{{spo_countersign_complete}}</w:t>
       </w:r>
       <w:r>
         <w:rPr>
@@ -8821,23 +7187,7 @@
           <w:rFonts w:ascii="Arial" w:hAnsi="Arial" w:cs="Arial"/>
           <w:bCs/>
         </w:rPr>
-        <w:t>{{</w:t>
-      </w:r>
-      <w:proofErr w:type="spellStart"/>
-      <w:r>
-        <w:rPr>
-          <w:rFonts w:ascii="Arial" w:hAnsi="Arial" w:cs="Arial"/>
-          <w:bCs/>
-        </w:rPr>
-        <w:t>spo_countersign_complete</w:t>
-      </w:r>
-      <w:proofErr w:type="spellEnd"/>
-      <w:r>
-        <w:rPr>
-          <w:rFonts w:ascii="Arial" w:hAnsi="Arial" w:cs="Arial"/>
-          <w:bCs/>
-        </w:rPr>
-        <w:t>}}</w:t>
+        <w:t>{{spo_countersign_complete}}</w:t>
       </w:r>
       <w:r>
         <w:rPr>
@@ -8878,23 +7228,7 @@
           <w:rFonts w:ascii="Arial" w:hAnsi="Arial" w:cs="Arial"/>
           <w:bCs/>
         </w:rPr>
-        <w:t>{{</w:t>
-      </w:r>
-      <w:proofErr w:type="spellStart"/>
-      <w:r>
-        <w:rPr>
-          <w:rFonts w:ascii="Arial" w:hAnsi="Arial" w:cs="Arial"/>
-          <w:bCs/>
-        </w:rPr>
-        <w:t>spo_countersign_complete</w:t>
-      </w:r>
-      <w:proofErr w:type="spellEnd"/>
-      <w:r>
-        <w:rPr>
-          <w:rFonts w:ascii="Arial" w:hAnsi="Arial" w:cs="Arial"/>
-          <w:bCs/>
-        </w:rPr>
-        <w:t>}}</w:t>
+        <w:t>{{spo_countersign_complete}}</w:t>
       </w:r>
       <w:r>
         <w:rPr>
@@ -8962,23 +7296,7 @@
           <w:rFonts w:ascii="Arial" w:hAnsi="Arial" w:cs="Arial"/>
           <w:bCs/>
         </w:rPr>
-        <w:t>{{</w:t>
-      </w:r>
-      <w:proofErr w:type="spellStart"/>
-      <w:r>
-        <w:rPr>
-          <w:rFonts w:ascii="Arial" w:hAnsi="Arial" w:cs="Arial"/>
-          <w:bCs/>
-        </w:rPr>
-        <w:t>countersign_spo_exposition</w:t>
-      </w:r>
-      <w:proofErr w:type="spellEnd"/>
-      <w:r>
-        <w:rPr>
-          <w:rFonts w:ascii="Arial" w:hAnsi="Arial" w:cs="Arial"/>
-          <w:bCs/>
-        </w:rPr>
-        <w:t>}</w:t>
+        <w:t>{{countersign_spo_exposition}</w:t>
       </w:r>
       <w:r>
         <w:rPr>
@@ -9017,23 +7335,7 @@
           <w:rFonts w:ascii="Arial" w:hAnsi="Arial" w:cs="Arial"/>
           <w:bCs/>
         </w:rPr>
-        <w:t>{{</w:t>
-      </w:r>
-      <w:proofErr w:type="spellStart"/>
-      <w:r>
-        <w:rPr>
-          <w:rFonts w:ascii="Arial" w:hAnsi="Arial" w:cs="Arial"/>
-          <w:bCs/>
-        </w:rPr>
-        <w:t>countersign_spo_name</w:t>
-      </w:r>
-      <w:proofErr w:type="spellEnd"/>
-      <w:r>
-        <w:rPr>
-          <w:rFonts w:ascii="Arial" w:hAnsi="Arial" w:cs="Arial"/>
-          <w:bCs/>
-        </w:rPr>
-        <w:t>}}</w:t>
+        <w:t>{{countersign_spo_name}}</w:t>
       </w:r>
     </w:p>
     <w:p>
@@ -9064,23 +7366,7 @@
           <w:rFonts w:ascii="Arial" w:hAnsi="Arial" w:cs="Arial"/>
           <w:bCs/>
         </w:rPr>
-        <w:t>{{</w:t>
-      </w:r>
-      <w:proofErr w:type="spellStart"/>
-      <w:r>
-        <w:rPr>
-          <w:rFonts w:ascii="Arial" w:hAnsi="Arial" w:cs="Arial"/>
-          <w:bCs/>
-        </w:rPr>
-        <w:t>countersign_spo_email</w:t>
-      </w:r>
-      <w:proofErr w:type="spellEnd"/>
-      <w:r>
-        <w:rPr>
-          <w:rFonts w:ascii="Arial" w:hAnsi="Arial" w:cs="Arial"/>
-          <w:bCs/>
-        </w:rPr>
-        <w:t>}}</w:t>
+        <w:t>{{countersign_spo_email}}</w:t>
       </w:r>
     </w:p>
     <w:p>
@@ -9118,23 +7404,7 @@
           <w:rFonts w:ascii="Arial" w:hAnsi="Arial" w:cs="Arial"/>
           <w:bCs/>
         </w:rPr>
-        <w:t>{{</w:t>
-      </w:r>
-      <w:proofErr w:type="spellStart"/>
-      <w:r>
-        <w:rPr>
-          <w:rFonts w:ascii="Arial" w:hAnsi="Arial" w:cs="Arial"/>
-          <w:bCs/>
-        </w:rPr>
-        <w:t>countersign_spo_telephone</w:t>
-      </w:r>
-      <w:proofErr w:type="spellEnd"/>
-      <w:r>
-        <w:rPr>
-          <w:rFonts w:ascii="Arial" w:hAnsi="Arial" w:cs="Arial"/>
-          <w:bCs/>
-        </w:rPr>
-        <w:t>}}</w:t>
+        <w:t>{{countersign_spo_telephone}}</w:t>
       </w:r>
     </w:p>
     <w:p>
@@ -9201,23 +7471,7 @@
           <w:rFonts w:ascii="Arial" w:hAnsi="Arial" w:cs="Arial"/>
           <w:bCs/>
         </w:rPr>
-        <w:t>{{</w:t>
-      </w:r>
-      <w:proofErr w:type="spellStart"/>
-      <w:r>
-        <w:rPr>
-          <w:rFonts w:ascii="Arial" w:hAnsi="Arial" w:cs="Arial"/>
-          <w:bCs/>
-        </w:rPr>
-        <w:t>date_of_decision</w:t>
-      </w:r>
-      <w:proofErr w:type="spellEnd"/>
-      <w:r>
-        <w:rPr>
-          <w:rFonts w:ascii="Arial" w:hAnsi="Arial" w:cs="Arial"/>
-          <w:bCs/>
-        </w:rPr>
-        <w:t>}}</w:t>
+        <w:t>{{date_of_decision}}</w:t>
       </w:r>
       <w:r>
         <w:rPr>
@@ -9231,23 +7485,7 @@
           <w:rFonts w:ascii="Arial" w:hAnsi="Arial" w:cs="Arial"/>
           <w:bCs/>
         </w:rPr>
-        <w:t>{{</w:t>
-      </w:r>
-      <w:proofErr w:type="spellStart"/>
-      <w:r>
-        <w:rPr>
-          <w:rFonts w:ascii="Arial" w:hAnsi="Arial" w:cs="Arial"/>
-          <w:bCs/>
-        </w:rPr>
-        <w:t>time_of_decision</w:t>
-      </w:r>
-      <w:proofErr w:type="spellEnd"/>
-      <w:r>
-        <w:rPr>
-          <w:rFonts w:ascii="Arial" w:hAnsi="Arial" w:cs="Arial"/>
-          <w:bCs/>
-        </w:rPr>
-        <w:t>}}</w:t>
+        <w:t>{{time_of_decision}}</w:t>
       </w:r>
     </w:p>
     <w:p>
@@ -9305,23 +7543,7 @@
           <w:rFonts w:ascii="Arial" w:hAnsi="Arial" w:cs="Arial"/>
           <w:bCs/>
         </w:rPr>
-        <w:t>{{</w:t>
-      </w:r>
-      <w:proofErr w:type="spellStart"/>
-      <w:r>
-        <w:rPr>
-          <w:rFonts w:ascii="Arial" w:hAnsi="Arial" w:cs="Arial"/>
-          <w:bCs/>
-        </w:rPr>
-        <w:t>countersign_spo_date</w:t>
-      </w:r>
-      <w:proofErr w:type="spellEnd"/>
-      <w:r>
-        <w:rPr>
-          <w:rFonts w:ascii="Arial" w:hAnsi="Arial" w:cs="Arial"/>
-          <w:bCs/>
-        </w:rPr>
-        <w:t>}}</w:t>
+        <w:t>{{countersign_spo_date}}</w:t>
       </w:r>
     </w:p>
     <w:p>
@@ -9375,23 +7597,7 @@
           <w:rFonts w:ascii="Arial" w:hAnsi="Arial" w:cs="Arial"/>
           <w:bCs/>
         </w:rPr>
-        <w:t>{{</w:t>
-      </w:r>
-      <w:proofErr w:type="spellStart"/>
-      <w:r>
-        <w:rPr>
-          <w:rFonts w:ascii="Arial" w:hAnsi="Arial" w:cs="Arial"/>
-          <w:bCs/>
-        </w:rPr>
-        <w:t>countersign_spo_time</w:t>
-      </w:r>
-      <w:proofErr w:type="spellEnd"/>
-      <w:r>
-        <w:rPr>
-          <w:rFonts w:ascii="Arial" w:hAnsi="Arial" w:cs="Arial"/>
-          <w:bCs/>
-        </w:rPr>
-        <w:t>}}</w:t>
+        <w:t>{{countersign_spo_time}}</w:t>
       </w:r>
     </w:p>
     <w:p>
@@ -9505,23 +7711,7 @@
           <w:rFonts w:ascii="Arial" w:hAnsi="Arial" w:cs="Arial"/>
           <w:bCs/>
         </w:rPr>
-        <w:t>{{</w:t>
-      </w:r>
-      <w:proofErr w:type="spellStart"/>
-      <w:r>
-        <w:rPr>
-          <w:rFonts w:ascii="Arial" w:hAnsi="Arial" w:cs="Arial"/>
-          <w:bCs/>
-        </w:rPr>
-        <w:t>aco_countersign_complete</w:t>
-      </w:r>
-      <w:proofErr w:type="spellEnd"/>
-      <w:r>
-        <w:rPr>
-          <w:rFonts w:ascii="Arial" w:hAnsi="Arial" w:cs="Arial"/>
-          <w:bCs/>
-        </w:rPr>
-        <w:t>}}</w:t>
+        <w:t>{{aco_countersign_complete}}</w:t>
       </w:r>
       <w:r>
         <w:rPr>
@@ -9647,23 +7837,7 @@
           <w:rFonts w:ascii="Arial" w:hAnsi="Arial" w:cs="Arial"/>
           <w:bCs/>
         </w:rPr>
-        <w:t>{{</w:t>
-      </w:r>
-      <w:proofErr w:type="spellStart"/>
-      <w:r>
-        <w:rPr>
-          <w:rFonts w:ascii="Arial" w:hAnsi="Arial" w:cs="Arial"/>
-          <w:bCs/>
-        </w:rPr>
-        <w:t>countersign_aco_exposition</w:t>
-      </w:r>
-      <w:proofErr w:type="spellEnd"/>
-      <w:r>
-        <w:rPr>
-          <w:rFonts w:ascii="Arial" w:hAnsi="Arial" w:cs="Arial"/>
-          <w:bCs/>
-        </w:rPr>
-        <w:t>}}</w:t>
+        <w:t>{{countersign_aco_exposition}}</w:t>
       </w:r>
     </w:p>
     <w:p>
@@ -9695,23 +7869,7 @@
           <w:rFonts w:ascii="Arial" w:hAnsi="Arial" w:cs="Arial"/>
           <w:bCs/>
         </w:rPr>
-        <w:t>{{</w:t>
-      </w:r>
-      <w:proofErr w:type="spellStart"/>
-      <w:r>
-        <w:rPr>
-          <w:rFonts w:ascii="Arial" w:hAnsi="Arial" w:cs="Arial"/>
-          <w:bCs/>
-        </w:rPr>
-        <w:t>countersign_aco_name</w:t>
-      </w:r>
-      <w:proofErr w:type="spellEnd"/>
-      <w:r>
-        <w:rPr>
-          <w:rFonts w:ascii="Arial" w:hAnsi="Arial" w:cs="Arial"/>
-          <w:bCs/>
-        </w:rPr>
-        <w:t>}}</w:t>
+        <w:t>{{countersign_aco_name}}</w:t>
       </w:r>
     </w:p>
     <w:p>
@@ -9743,23 +7901,7 @@
           <w:rFonts w:ascii="Arial" w:hAnsi="Arial" w:cs="Arial"/>
           <w:bCs/>
         </w:rPr>
-        <w:t>{{</w:t>
-      </w:r>
-      <w:proofErr w:type="spellStart"/>
-      <w:r>
-        <w:rPr>
-          <w:rFonts w:ascii="Arial" w:hAnsi="Arial" w:cs="Arial"/>
-          <w:bCs/>
-        </w:rPr>
-        <w:t>countersign_aco_telephone</w:t>
-      </w:r>
-      <w:proofErr w:type="spellEnd"/>
-      <w:r>
-        <w:rPr>
-          <w:rFonts w:ascii="Arial" w:hAnsi="Arial" w:cs="Arial"/>
-          <w:bCs/>
-        </w:rPr>
-        <w:t>}}</w:t>
+        <w:t>{{countersign_aco_telephone}}</w:t>
       </w:r>
     </w:p>
     <w:p>
@@ -9791,23 +7933,7 @@
           <w:rFonts w:ascii="Arial" w:hAnsi="Arial" w:cs="Arial"/>
           <w:bCs/>
         </w:rPr>
-        <w:t>{{</w:t>
-      </w:r>
-      <w:proofErr w:type="spellStart"/>
-      <w:r>
-        <w:rPr>
-          <w:rFonts w:ascii="Arial" w:hAnsi="Arial" w:cs="Arial"/>
-          <w:bCs/>
-        </w:rPr>
-        <w:t>countersign_aco_email</w:t>
-      </w:r>
-      <w:proofErr w:type="spellEnd"/>
-      <w:r>
-        <w:rPr>
-          <w:rFonts w:ascii="Arial" w:hAnsi="Arial" w:cs="Arial"/>
-          <w:bCs/>
-        </w:rPr>
-        <w:t>}}</w:t>
+        <w:t>{{countersign_aco_email}}</w:t>
       </w:r>
     </w:p>
     <w:p>
@@ -9839,23 +7965,7 @@
           <w:rFonts w:ascii="Arial" w:hAnsi="Arial" w:cs="Arial"/>
           <w:bCs/>
         </w:rPr>
-        <w:t>{{</w:t>
-      </w:r>
-      <w:proofErr w:type="spellStart"/>
-      <w:r>
-        <w:rPr>
-          <w:rFonts w:ascii="Arial" w:hAnsi="Arial" w:cs="Arial"/>
-          <w:bCs/>
-        </w:rPr>
-        <w:t>countersign_aco_date</w:t>
-      </w:r>
-      <w:proofErr w:type="spellEnd"/>
-      <w:r>
-        <w:rPr>
-          <w:rFonts w:ascii="Arial" w:hAnsi="Arial" w:cs="Arial"/>
-          <w:bCs/>
-        </w:rPr>
-        <w:t>}}</w:t>
+        <w:t>{{countersign_aco_date}}</w:t>
       </w:r>
     </w:p>
     <w:p>
@@ -9887,23 +7997,7 @@
           <w:rFonts w:ascii="Arial" w:hAnsi="Arial" w:cs="Arial"/>
           <w:bCs/>
         </w:rPr>
-        <w:t>{{</w:t>
-      </w:r>
-      <w:proofErr w:type="spellStart"/>
-      <w:r>
-        <w:rPr>
-          <w:rFonts w:ascii="Arial" w:hAnsi="Arial" w:cs="Arial"/>
-          <w:bCs/>
-        </w:rPr>
-        <w:t>countersign_aco_time</w:t>
-      </w:r>
-      <w:proofErr w:type="spellEnd"/>
-      <w:r>
-        <w:rPr>
-          <w:rFonts w:ascii="Arial" w:hAnsi="Arial" w:cs="Arial"/>
-          <w:bCs/>
-        </w:rPr>
-        <w:t>}}</w:t>
+        <w:t>{{countersign_aco_time}}</w:t>
       </w:r>
     </w:p>
     <w:p>
@@ -9934,23 +8028,7 @@
           <w:rFonts w:ascii="Arial" w:hAnsi="Arial" w:cs="Arial"/>
           <w:bCs/>
         </w:rPr>
-        <w:t>{{</w:t>
-      </w:r>
-      <w:proofErr w:type="spellStart"/>
-      <w:r>
-        <w:rPr>
-          <w:rFonts w:ascii="Arial" w:hAnsi="Arial" w:cs="Arial"/>
-          <w:bCs/>
-        </w:rPr>
-        <w:t>revocation_order_recipients</w:t>
-      </w:r>
-      <w:proofErr w:type="spellEnd"/>
-      <w:r>
-        <w:rPr>
-          <w:rFonts w:ascii="Arial" w:hAnsi="Arial" w:cs="Arial"/>
-          <w:bCs/>
-        </w:rPr>
-        <w:t>}}</w:t>
+        <w:t>{{revocation_order_recipients}}</w:t>
       </w:r>
     </w:p>
     <w:p>
@@ -18478,6 +16556,7 @@
     <w:rsid w:val="004D7232"/>
     <w:rsid w:val="004D7B0C"/>
     <w:rsid w:val="004F6B84"/>
+    <w:rsid w:val="00510E43"/>
     <w:rsid w:val="0051613B"/>
     <w:rsid w:val="00561FFB"/>
     <w:rsid w:val="0056357E"/>
@@ -18526,8 +16605,10 @@
     <w:rsid w:val="00C45073"/>
     <w:rsid w:val="00C73BA4"/>
     <w:rsid w:val="00C827E2"/>
+    <w:rsid w:val="00CD3DCA"/>
     <w:rsid w:val="00CE5DE0"/>
     <w:rsid w:val="00CF7AD2"/>
+    <w:rsid w:val="00D004B7"/>
     <w:rsid w:val="00D13037"/>
     <w:rsid w:val="00D64F8F"/>
     <w:rsid w:val="00D72393"/>
@@ -19327,10 +17408,19 @@
 </file>
 
 <file path=customXml/item1.xml><?xml version="1.0" encoding="utf-8"?>
+<?mso-contentType ?>
+<FormTemplates xmlns="http://schemas.microsoft.com/sharepoint/v3/contenttype/forms">
+  <Display>DocumentLibraryForm</Display>
+  <Edit>DocumentLibraryForm</Edit>
+  <New>DocumentLibraryForm</New>
+</FormTemplates>
+</file>
+
+<file path=customXml/item2.xml><?xml version="1.0" encoding="utf-8"?>
 <b:Sources xmlns:b="http://schemas.openxmlformats.org/officeDocument/2006/bibliography" xmlns="http://schemas.openxmlformats.org/officeDocument/2006/bibliography" SelectedStyle="" StyleName="" Version="0"/>
 </file>
 
-<file path=customXml/item2.xml><?xml version="1.0" encoding="utf-8"?>
+<file path=customXml/item3.xml><?xml version="1.0" encoding="utf-8"?>
 <p:properties xmlns:p="http://schemas.microsoft.com/office/2006/metadata/properties" xmlns:xsi="http://www.w3.org/2001/XMLSchema-instance" xmlns:pc="http://schemas.microsoft.com/office/infopath/2007/PartnerControls">
   <documentManagement>
     <lcf76f155ced4ddcb4097134ff3c332f xmlns="2244256a-353e-4aaa-84de-68fbd58bc0b5">
@@ -19342,7 +17432,7 @@
 </p:properties>
 </file>
 
-<file path=customXml/item3.xml><?xml version="1.0" encoding="utf-8"?>
+<file path=customXml/item4.xml><?xml version="1.0" encoding="utf-8"?>
 <ct:contentTypeSchema xmlns:ct="http://schemas.microsoft.com/office/2006/metadata/contentType" xmlns:ma="http://schemas.microsoft.com/office/2006/metadata/properties/metaAttributes" ct:_="" ma:_="" ma:contentTypeName="Document" ma:contentTypeID="0x010100BB15E224CEB19F4BA17DCD08B156C20E" ma:contentTypeVersion="14" ma:contentTypeDescription="Create a new document." ma:contentTypeScope="" ma:versionID="7cd304efa23d0061db26e2f05b6414b1">
   <xsd:schema xmlns:xsd="http://www.w3.org/2001/XMLSchema" xmlns:xs="http://www.w3.org/2001/XMLSchema" xmlns:p="http://schemas.microsoft.com/office/2006/metadata/properties" xmlns:ns2="2244256a-353e-4aaa-84de-68fbd58bc0b5" xmlns:ns3="461e5654-0e9a-4527-837d-fdc364c1f1ed" targetNamespace="http://schemas.microsoft.com/office/2006/metadata/properties" ma:root="true" ma:fieldsID="44df93feef4834377720eaaf16faf4fa" ns2:_="" ns3:_="">
     <xsd:import namespace="2244256a-353e-4aaa-84de-68fbd58bc0b5"/>
@@ -19555,16 +17645,15 @@
 </ct:contentTypeSchema>
 </file>
 
-<file path=customXml/item4.xml><?xml version="1.0" encoding="utf-8"?>
-<?mso-contentType ?>
-<FormTemplates xmlns="http://schemas.microsoft.com/sharepoint/v3/contenttype/forms">
-  <Display>DocumentLibraryForm</Display>
-  <Edit>DocumentLibraryForm</Edit>
-  <New>DocumentLibraryForm</New>
-</FormTemplates>
+<file path=customXml/itemProps1.xml><?xml version="1.0" encoding="utf-8"?>
+<ds:datastoreItem xmlns:ds="http://schemas.openxmlformats.org/officeDocument/2006/customXml" ds:itemID="{9C893AAC-1781-44C1-940F-A467E506D9D1}">
+  <ds:schemaRefs>
+    <ds:schemaRef ds:uri="http://schemas.microsoft.com/sharepoint/v3/contenttype/forms"/>
+  </ds:schemaRefs>
+</ds:datastoreItem>
 </file>
 
-<file path=customXml/itemProps1.xml><?xml version="1.0" encoding="utf-8"?>
+<file path=customXml/itemProps2.xml><?xml version="1.0" encoding="utf-8"?>
 <ds:datastoreItem xmlns:ds="http://schemas.openxmlformats.org/officeDocument/2006/customXml" ds:itemID="{1AA002EC-9FAC-469B-886C-4AD0DF10DF17}">
   <ds:schemaRefs>
     <ds:schemaRef ds:uri="http://schemas.openxmlformats.org/officeDocument/2006/bibliography"/>
@@ -19572,7 +17661,7 @@
 </ds:datastoreItem>
 </file>
 
-<file path=customXml/itemProps2.xml><?xml version="1.0" encoding="utf-8"?>
+<file path=customXml/itemProps3.xml><?xml version="1.0" encoding="utf-8"?>
 <ds:datastoreItem xmlns:ds="http://schemas.openxmlformats.org/officeDocument/2006/customXml" ds:itemID="{D6602E3C-70F5-412B-A646-0548AF3EB1F8}">
   <ds:schemaRefs>
     <ds:schemaRef ds:uri="http://schemas.microsoft.com/office/2006/metadata/properties"/>
@@ -19583,7 +17672,7 @@
 </ds:datastoreItem>
 </file>
 
-<file path=customXml/itemProps3.xml><?xml version="1.0" encoding="utf-8"?>
+<file path=customXml/itemProps4.xml><?xml version="1.0" encoding="utf-8"?>
 <ds:datastoreItem xmlns:ds="http://schemas.openxmlformats.org/officeDocument/2006/customXml" ds:itemID="{79C448BA-7A2C-492D-9615-F080CE57201F}">
   <ds:schemaRefs>
     <ds:schemaRef ds:uri="http://schemas.microsoft.com/office/2006/metadata/contentType"/>
@@ -19600,12 +17689,4 @@
     <ds:schemaRef ds:uri="http://schemas.microsoft.com/internal/obd"/>
   </ds:schemaRefs>
 </ds:datastoreItem>
-</file>
-
-<file path=customXml/itemProps4.xml><?xml version="1.0" encoding="utf-8"?>
-<ds:datastoreItem xmlns:ds="http://schemas.openxmlformats.org/officeDocument/2006/customXml" ds:itemID="{9C893AAC-1781-44C1-940F-A467E506D9D1}">
-  <ds:schemaRefs>
-    <ds:schemaRef ds:uri="http://schemas.microsoft.com/sharepoint/v3/contenttype/forms"/>
-  </ds:schemaRefs>
-</ds:datastoreItem>
 </file>
</xml_diff>

<commit_message>
MRD-3133 fix sopc and dcr exclusion criteria fields
</commit_message>
<xml_diff>
--- a/src/main/resources/templates/partA/2026-03-31 - FTR56/Part A Template.docx
+++ b/src/main/resources/templates/partA/2026-03-31 - FTR56/Part A Template.docx
@@ -1498,7 +1498,28 @@
           <w:rFonts w:ascii="Arial" w:hAnsi="Arial" w:cs="Arial"/>
           <w:bCs/>
         </w:rPr>
-        <w:t>SOPC_Sentence}}</w:t>
+        <w:t>sopc</w:t>
+      </w:r>
+      <w:r>
+        <w:rPr>
+          <w:rFonts w:ascii="Arial" w:hAnsi="Arial" w:cs="Arial"/>
+          <w:bCs/>
+        </w:rPr>
+        <w:t>_</w:t>
+      </w:r>
+      <w:r>
+        <w:rPr>
+          <w:rFonts w:ascii="Arial" w:hAnsi="Arial" w:cs="Arial"/>
+          <w:bCs/>
+        </w:rPr>
+        <w:t>s</w:t>
+      </w:r>
+      <w:r>
+        <w:rPr>
+          <w:rFonts w:ascii="Arial" w:hAnsi="Arial" w:cs="Arial"/>
+          <w:bCs/>
+        </w:rPr>
+        <w:t>entence}}</w:t>
       </w:r>
     </w:p>
     <w:p>
@@ -1555,7 +1576,21 @@
           <w:rFonts w:ascii="Arial" w:hAnsi="Arial" w:cs="Arial"/>
           <w:bCs/>
         </w:rPr>
-        <w:t>erving_DCR_sentence}}</w:t>
+        <w:t>erving_</w:t>
+      </w:r>
+      <w:r>
+        <w:rPr>
+          <w:rFonts w:ascii="Arial" w:hAnsi="Arial" w:cs="Arial"/>
+          <w:bCs/>
+        </w:rPr>
+        <w:t>dcr</w:t>
+      </w:r>
+      <w:r>
+        <w:rPr>
+          <w:rFonts w:ascii="Arial" w:hAnsi="Arial" w:cs="Arial"/>
+          <w:bCs/>
+        </w:rPr>
+        <w:t>_sentence}}</w:t>
       </w:r>
     </w:p>
     <w:p>
@@ -16574,6 +16609,7 @@
     <w:rsid w:val="00773BF2"/>
     <w:rsid w:val="00784076"/>
     <w:rsid w:val="007A179D"/>
+    <w:rsid w:val="007A4FA3"/>
     <w:rsid w:val="007B2F8D"/>
     <w:rsid w:val="00843451"/>
     <w:rsid w:val="008456B3"/>
@@ -16601,6 +16637,7 @@
     <w:rsid w:val="00B60D5F"/>
     <w:rsid w:val="00BA6EAB"/>
     <w:rsid w:val="00C02EAD"/>
+    <w:rsid w:val="00C03963"/>
     <w:rsid w:val="00C22920"/>
     <w:rsid w:val="00C45073"/>
     <w:rsid w:val="00C73BA4"/>
@@ -17417,22 +17454,6 @@
 </file>
 
 <file path=customXml/item2.xml><?xml version="1.0" encoding="utf-8"?>
-<b:Sources xmlns:b="http://schemas.openxmlformats.org/officeDocument/2006/bibliography" xmlns="http://schemas.openxmlformats.org/officeDocument/2006/bibliography" SelectedStyle="" StyleName="" Version="0"/>
-</file>
-
-<file path=customXml/item3.xml><?xml version="1.0" encoding="utf-8"?>
-<p:properties xmlns:p="http://schemas.microsoft.com/office/2006/metadata/properties" xmlns:xsi="http://www.w3.org/2001/XMLSchema-instance" xmlns:pc="http://schemas.microsoft.com/office/infopath/2007/PartnerControls">
-  <documentManagement>
-    <lcf76f155ced4ddcb4097134ff3c332f xmlns="2244256a-353e-4aaa-84de-68fbd58bc0b5">
-      <Terms xmlns="http://schemas.microsoft.com/office/infopath/2007/PartnerControls"/>
-    </lcf76f155ced4ddcb4097134ff3c332f>
-    <TaxCatchAll xmlns="461e5654-0e9a-4527-837d-fdc364c1f1ed" xsi:nil="true"/>
-    <Number xmlns="2244256a-353e-4aaa-84de-68fbd58bc0b5" xsi:nil="true"/>
-  </documentManagement>
-</p:properties>
-</file>
-
-<file path=customXml/item4.xml><?xml version="1.0" encoding="utf-8"?>
 <ct:contentTypeSchema xmlns:ct="http://schemas.microsoft.com/office/2006/metadata/contentType" xmlns:ma="http://schemas.microsoft.com/office/2006/metadata/properties/metaAttributes" ct:_="" ma:_="" ma:contentTypeName="Document" ma:contentTypeID="0x010100BB15E224CEB19F4BA17DCD08B156C20E" ma:contentTypeVersion="14" ma:contentTypeDescription="Create a new document." ma:contentTypeScope="" ma:versionID="7cd304efa23d0061db26e2f05b6414b1">
   <xsd:schema xmlns:xsd="http://www.w3.org/2001/XMLSchema" xmlns:xs="http://www.w3.org/2001/XMLSchema" xmlns:p="http://schemas.microsoft.com/office/2006/metadata/properties" xmlns:ns2="2244256a-353e-4aaa-84de-68fbd58bc0b5" xmlns:ns3="461e5654-0e9a-4527-837d-fdc364c1f1ed" targetNamespace="http://schemas.microsoft.com/office/2006/metadata/properties" ma:root="true" ma:fieldsID="44df93feef4834377720eaaf16faf4fa" ns2:_="" ns3:_="">
     <xsd:import namespace="2244256a-353e-4aaa-84de-68fbd58bc0b5"/>
@@ -17645,6 +17666,22 @@
 </ct:contentTypeSchema>
 </file>
 
+<file path=customXml/item3.xml><?xml version="1.0" encoding="utf-8"?>
+<p:properties xmlns:p="http://schemas.microsoft.com/office/2006/metadata/properties" xmlns:xsi="http://www.w3.org/2001/XMLSchema-instance" xmlns:pc="http://schemas.microsoft.com/office/infopath/2007/PartnerControls">
+  <documentManagement>
+    <lcf76f155ced4ddcb4097134ff3c332f xmlns="2244256a-353e-4aaa-84de-68fbd58bc0b5">
+      <Terms xmlns="http://schemas.microsoft.com/office/infopath/2007/PartnerControls"/>
+    </lcf76f155ced4ddcb4097134ff3c332f>
+    <TaxCatchAll xmlns="461e5654-0e9a-4527-837d-fdc364c1f1ed" xsi:nil="true"/>
+    <Number xmlns="2244256a-353e-4aaa-84de-68fbd58bc0b5" xsi:nil="true"/>
+  </documentManagement>
+</p:properties>
+</file>
+
+<file path=customXml/item4.xml><?xml version="1.0" encoding="utf-8"?>
+<b:Sources xmlns:b="http://schemas.openxmlformats.org/officeDocument/2006/bibliography" xmlns="http://schemas.openxmlformats.org/officeDocument/2006/bibliography" SelectedStyle="" StyleName="" Version="0"/>
+</file>
+
 <file path=customXml/itemProps1.xml><?xml version="1.0" encoding="utf-8"?>
 <ds:datastoreItem xmlns:ds="http://schemas.openxmlformats.org/officeDocument/2006/customXml" ds:itemID="{9C893AAC-1781-44C1-940F-A467E506D9D1}">
   <ds:schemaRefs>
@@ -17654,9 +17691,20 @@
 </file>
 
 <file path=customXml/itemProps2.xml><?xml version="1.0" encoding="utf-8"?>
-<ds:datastoreItem xmlns:ds="http://schemas.openxmlformats.org/officeDocument/2006/customXml" ds:itemID="{1AA002EC-9FAC-469B-886C-4AD0DF10DF17}">
+<ds:datastoreItem xmlns:ds="http://schemas.openxmlformats.org/officeDocument/2006/customXml" ds:itemID="{79C448BA-7A2C-492D-9615-F080CE57201F}">
   <ds:schemaRefs>
-    <ds:schemaRef ds:uri="http://schemas.openxmlformats.org/officeDocument/2006/bibliography"/>
+    <ds:schemaRef ds:uri="http://schemas.microsoft.com/office/2006/metadata/contentType"/>
+    <ds:schemaRef ds:uri="http://schemas.microsoft.com/office/2006/metadata/properties/metaAttributes"/>
+    <ds:schemaRef ds:uri="http://www.w3.org/2001/XMLSchema"/>
+    <ds:schemaRef ds:uri="http://schemas.microsoft.com/office/2006/metadata/properties"/>
+    <ds:schemaRef ds:uri="2244256a-353e-4aaa-84de-68fbd58bc0b5"/>
+    <ds:schemaRef ds:uri="461e5654-0e9a-4527-837d-fdc364c1f1ed"/>
+    <ds:schemaRef ds:uri="http://schemas.microsoft.com/office/2006/documentManagement/types"/>
+    <ds:schemaRef ds:uri="http://schemas.microsoft.com/office/infopath/2007/PartnerControls"/>
+    <ds:schemaRef ds:uri="http://schemas.openxmlformats.org/package/2006/metadata/core-properties"/>
+    <ds:schemaRef ds:uri="http://purl.org/dc/elements/1.1/"/>
+    <ds:schemaRef ds:uri="http://purl.org/dc/terms/"/>
+    <ds:schemaRef ds:uri="http://schemas.microsoft.com/internal/obd"/>
   </ds:schemaRefs>
 </ds:datastoreItem>
 </file>
@@ -17673,20 +17721,9 @@
 </file>
 
 <file path=customXml/itemProps4.xml><?xml version="1.0" encoding="utf-8"?>
-<ds:datastoreItem xmlns:ds="http://schemas.openxmlformats.org/officeDocument/2006/customXml" ds:itemID="{79C448BA-7A2C-492D-9615-F080CE57201F}">
+<ds:datastoreItem xmlns:ds="http://schemas.openxmlformats.org/officeDocument/2006/customXml" ds:itemID="{1AA002EC-9FAC-469B-886C-4AD0DF10DF17}">
   <ds:schemaRefs>
-    <ds:schemaRef ds:uri="http://schemas.microsoft.com/office/2006/metadata/contentType"/>
-    <ds:schemaRef ds:uri="http://schemas.microsoft.com/office/2006/metadata/properties/metaAttributes"/>
-    <ds:schemaRef ds:uri="http://www.w3.org/2001/XMLSchema"/>
-    <ds:schemaRef ds:uri="http://schemas.microsoft.com/office/2006/metadata/properties"/>
-    <ds:schemaRef ds:uri="2244256a-353e-4aaa-84de-68fbd58bc0b5"/>
-    <ds:schemaRef ds:uri="461e5654-0e9a-4527-837d-fdc364c1f1ed"/>
-    <ds:schemaRef ds:uri="http://schemas.microsoft.com/office/2006/documentManagement/types"/>
-    <ds:schemaRef ds:uri="http://schemas.microsoft.com/office/infopath/2007/PartnerControls"/>
-    <ds:schemaRef ds:uri="http://schemas.openxmlformats.org/package/2006/metadata/core-properties"/>
-    <ds:schemaRef ds:uri="http://purl.org/dc/elements/1.1/"/>
-    <ds:schemaRef ds:uri="http://purl.org/dc/terms/"/>
-    <ds:schemaRef ds:uri="http://schemas.microsoft.com/internal/obd"/>
+    <ds:schemaRef ds:uri="http://schemas.openxmlformats.org/officeDocument/2006/bibliography"/>
   </ds:schemaRefs>
 </ds:datastoreItem>
 </file>
</xml_diff>

<commit_message>
MRD-3133 fix sopc and dcr exclusion criteria fields (#1285)
</commit_message>
<xml_diff>
--- a/src/main/resources/templates/partA/2026-03-31 - FTR56/Part A Template.docx
+++ b/src/main/resources/templates/partA/2026-03-31 - FTR56/Part A Template.docx
@@ -1498,7 +1498,28 @@
           <w:rFonts w:ascii="Arial" w:hAnsi="Arial" w:cs="Arial"/>
           <w:bCs/>
         </w:rPr>
-        <w:t>SOPC_Sentence}}</w:t>
+        <w:t>sopc</w:t>
+      </w:r>
+      <w:r>
+        <w:rPr>
+          <w:rFonts w:ascii="Arial" w:hAnsi="Arial" w:cs="Arial"/>
+          <w:bCs/>
+        </w:rPr>
+        <w:t>_</w:t>
+      </w:r>
+      <w:r>
+        <w:rPr>
+          <w:rFonts w:ascii="Arial" w:hAnsi="Arial" w:cs="Arial"/>
+          <w:bCs/>
+        </w:rPr>
+        <w:t>s</w:t>
+      </w:r>
+      <w:r>
+        <w:rPr>
+          <w:rFonts w:ascii="Arial" w:hAnsi="Arial" w:cs="Arial"/>
+          <w:bCs/>
+        </w:rPr>
+        <w:t>entence}}</w:t>
       </w:r>
     </w:p>
     <w:p>
@@ -1555,7 +1576,21 @@
           <w:rFonts w:ascii="Arial" w:hAnsi="Arial" w:cs="Arial"/>
           <w:bCs/>
         </w:rPr>
-        <w:t>erving_DCR_sentence}}</w:t>
+        <w:t>erving_</w:t>
+      </w:r>
+      <w:r>
+        <w:rPr>
+          <w:rFonts w:ascii="Arial" w:hAnsi="Arial" w:cs="Arial"/>
+          <w:bCs/>
+        </w:rPr>
+        <w:t>dcr</w:t>
+      </w:r>
+      <w:r>
+        <w:rPr>
+          <w:rFonts w:ascii="Arial" w:hAnsi="Arial" w:cs="Arial"/>
+          <w:bCs/>
+        </w:rPr>
+        <w:t>_sentence}}</w:t>
       </w:r>
     </w:p>
     <w:p>
@@ -16574,6 +16609,7 @@
     <w:rsid w:val="00773BF2"/>
     <w:rsid w:val="00784076"/>
     <w:rsid w:val="007A179D"/>
+    <w:rsid w:val="007A4FA3"/>
     <w:rsid w:val="007B2F8D"/>
     <w:rsid w:val="00843451"/>
     <w:rsid w:val="008456B3"/>
@@ -16601,6 +16637,7 @@
     <w:rsid w:val="00B60D5F"/>
     <w:rsid w:val="00BA6EAB"/>
     <w:rsid w:val="00C02EAD"/>
+    <w:rsid w:val="00C03963"/>
     <w:rsid w:val="00C22920"/>
     <w:rsid w:val="00C45073"/>
     <w:rsid w:val="00C73BA4"/>
@@ -17417,22 +17454,6 @@
 </file>
 
 <file path=customXml/item2.xml><?xml version="1.0" encoding="utf-8"?>
-<b:Sources xmlns:b="http://schemas.openxmlformats.org/officeDocument/2006/bibliography" xmlns="http://schemas.openxmlformats.org/officeDocument/2006/bibliography" SelectedStyle="" StyleName="" Version="0"/>
-</file>
-
-<file path=customXml/item3.xml><?xml version="1.0" encoding="utf-8"?>
-<p:properties xmlns:p="http://schemas.microsoft.com/office/2006/metadata/properties" xmlns:xsi="http://www.w3.org/2001/XMLSchema-instance" xmlns:pc="http://schemas.microsoft.com/office/infopath/2007/PartnerControls">
-  <documentManagement>
-    <lcf76f155ced4ddcb4097134ff3c332f xmlns="2244256a-353e-4aaa-84de-68fbd58bc0b5">
-      <Terms xmlns="http://schemas.microsoft.com/office/infopath/2007/PartnerControls"/>
-    </lcf76f155ced4ddcb4097134ff3c332f>
-    <TaxCatchAll xmlns="461e5654-0e9a-4527-837d-fdc364c1f1ed" xsi:nil="true"/>
-    <Number xmlns="2244256a-353e-4aaa-84de-68fbd58bc0b5" xsi:nil="true"/>
-  </documentManagement>
-</p:properties>
-</file>
-
-<file path=customXml/item4.xml><?xml version="1.0" encoding="utf-8"?>
 <ct:contentTypeSchema xmlns:ct="http://schemas.microsoft.com/office/2006/metadata/contentType" xmlns:ma="http://schemas.microsoft.com/office/2006/metadata/properties/metaAttributes" ct:_="" ma:_="" ma:contentTypeName="Document" ma:contentTypeID="0x010100BB15E224CEB19F4BA17DCD08B156C20E" ma:contentTypeVersion="14" ma:contentTypeDescription="Create a new document." ma:contentTypeScope="" ma:versionID="7cd304efa23d0061db26e2f05b6414b1">
   <xsd:schema xmlns:xsd="http://www.w3.org/2001/XMLSchema" xmlns:xs="http://www.w3.org/2001/XMLSchema" xmlns:p="http://schemas.microsoft.com/office/2006/metadata/properties" xmlns:ns2="2244256a-353e-4aaa-84de-68fbd58bc0b5" xmlns:ns3="461e5654-0e9a-4527-837d-fdc364c1f1ed" targetNamespace="http://schemas.microsoft.com/office/2006/metadata/properties" ma:root="true" ma:fieldsID="44df93feef4834377720eaaf16faf4fa" ns2:_="" ns3:_="">
     <xsd:import namespace="2244256a-353e-4aaa-84de-68fbd58bc0b5"/>
@@ -17645,6 +17666,22 @@
 </ct:contentTypeSchema>
 </file>
 
+<file path=customXml/item3.xml><?xml version="1.0" encoding="utf-8"?>
+<p:properties xmlns:p="http://schemas.microsoft.com/office/2006/metadata/properties" xmlns:xsi="http://www.w3.org/2001/XMLSchema-instance" xmlns:pc="http://schemas.microsoft.com/office/infopath/2007/PartnerControls">
+  <documentManagement>
+    <lcf76f155ced4ddcb4097134ff3c332f xmlns="2244256a-353e-4aaa-84de-68fbd58bc0b5">
+      <Terms xmlns="http://schemas.microsoft.com/office/infopath/2007/PartnerControls"/>
+    </lcf76f155ced4ddcb4097134ff3c332f>
+    <TaxCatchAll xmlns="461e5654-0e9a-4527-837d-fdc364c1f1ed" xsi:nil="true"/>
+    <Number xmlns="2244256a-353e-4aaa-84de-68fbd58bc0b5" xsi:nil="true"/>
+  </documentManagement>
+</p:properties>
+</file>
+
+<file path=customXml/item4.xml><?xml version="1.0" encoding="utf-8"?>
+<b:Sources xmlns:b="http://schemas.openxmlformats.org/officeDocument/2006/bibliography" xmlns="http://schemas.openxmlformats.org/officeDocument/2006/bibliography" SelectedStyle="" StyleName="" Version="0"/>
+</file>
+
 <file path=customXml/itemProps1.xml><?xml version="1.0" encoding="utf-8"?>
 <ds:datastoreItem xmlns:ds="http://schemas.openxmlformats.org/officeDocument/2006/customXml" ds:itemID="{9C893AAC-1781-44C1-940F-A467E506D9D1}">
   <ds:schemaRefs>
@@ -17654,9 +17691,20 @@
 </file>
 
 <file path=customXml/itemProps2.xml><?xml version="1.0" encoding="utf-8"?>
-<ds:datastoreItem xmlns:ds="http://schemas.openxmlformats.org/officeDocument/2006/customXml" ds:itemID="{1AA002EC-9FAC-469B-886C-4AD0DF10DF17}">
+<ds:datastoreItem xmlns:ds="http://schemas.openxmlformats.org/officeDocument/2006/customXml" ds:itemID="{79C448BA-7A2C-492D-9615-F080CE57201F}">
   <ds:schemaRefs>
-    <ds:schemaRef ds:uri="http://schemas.openxmlformats.org/officeDocument/2006/bibliography"/>
+    <ds:schemaRef ds:uri="http://schemas.microsoft.com/office/2006/metadata/contentType"/>
+    <ds:schemaRef ds:uri="http://schemas.microsoft.com/office/2006/metadata/properties/metaAttributes"/>
+    <ds:schemaRef ds:uri="http://www.w3.org/2001/XMLSchema"/>
+    <ds:schemaRef ds:uri="http://schemas.microsoft.com/office/2006/metadata/properties"/>
+    <ds:schemaRef ds:uri="2244256a-353e-4aaa-84de-68fbd58bc0b5"/>
+    <ds:schemaRef ds:uri="461e5654-0e9a-4527-837d-fdc364c1f1ed"/>
+    <ds:schemaRef ds:uri="http://schemas.microsoft.com/office/2006/documentManagement/types"/>
+    <ds:schemaRef ds:uri="http://schemas.microsoft.com/office/infopath/2007/PartnerControls"/>
+    <ds:schemaRef ds:uri="http://schemas.openxmlformats.org/package/2006/metadata/core-properties"/>
+    <ds:schemaRef ds:uri="http://purl.org/dc/elements/1.1/"/>
+    <ds:schemaRef ds:uri="http://purl.org/dc/terms/"/>
+    <ds:schemaRef ds:uri="http://schemas.microsoft.com/internal/obd"/>
   </ds:schemaRefs>
 </ds:datastoreItem>
 </file>
@@ -17673,20 +17721,9 @@
 </file>
 
 <file path=customXml/itemProps4.xml><?xml version="1.0" encoding="utf-8"?>
-<ds:datastoreItem xmlns:ds="http://schemas.openxmlformats.org/officeDocument/2006/customXml" ds:itemID="{79C448BA-7A2C-492D-9615-F080CE57201F}">
+<ds:datastoreItem xmlns:ds="http://schemas.openxmlformats.org/officeDocument/2006/customXml" ds:itemID="{1AA002EC-9FAC-469B-886C-4AD0DF10DF17}">
   <ds:schemaRefs>
-    <ds:schemaRef ds:uri="http://schemas.microsoft.com/office/2006/metadata/contentType"/>
-    <ds:schemaRef ds:uri="http://schemas.microsoft.com/office/2006/metadata/properties/metaAttributes"/>
-    <ds:schemaRef ds:uri="http://www.w3.org/2001/XMLSchema"/>
-    <ds:schemaRef ds:uri="http://schemas.microsoft.com/office/2006/metadata/properties"/>
-    <ds:schemaRef ds:uri="2244256a-353e-4aaa-84de-68fbd58bc0b5"/>
-    <ds:schemaRef ds:uri="461e5654-0e9a-4527-837d-fdc364c1f1ed"/>
-    <ds:schemaRef ds:uri="http://schemas.microsoft.com/office/2006/documentManagement/types"/>
-    <ds:schemaRef ds:uri="http://schemas.microsoft.com/office/infopath/2007/PartnerControls"/>
-    <ds:schemaRef ds:uri="http://schemas.openxmlformats.org/package/2006/metadata/core-properties"/>
-    <ds:schemaRef ds:uri="http://purl.org/dc/elements/1.1/"/>
-    <ds:schemaRef ds:uri="http://purl.org/dc/terms/"/>
-    <ds:schemaRef ds:uri="http://schemas.microsoft.com/internal/obd"/>
+    <ds:schemaRef ds:uri="http://schemas.openxmlformats.org/officeDocument/2006/bibliography"/>
   </ds:schemaRefs>
 </ds:datastoreItem>
 </file>
</xml_diff>

<commit_message>
MRD-3150 Fix spacing on question 8 of Part A
</commit_message>
<xml_diff>
--- a/src/main/resources/templates/partA/2026-03-31 - FTR56/Part A Template.docx
+++ b/src/main/resources/templates/partA/2026-03-31 - FTR56/Part A Template.docx
@@ -344,7 +344,23 @@
           <w:rFonts w:ascii="Arial" w:hAnsi="Arial" w:cs="Arial"/>
           <w:b/>
         </w:rPr>
-        <w:t xml:space="preserve">an Emergency </w:t>
+        <w:t xml:space="preserve">an </w:t>
+      </w:r>
+      <w:proofErr w:type="gramStart"/>
+      <w:r>
+        <w:rPr>
+          <w:rFonts w:ascii="Arial" w:hAnsi="Arial" w:cs="Arial"/>
+          <w:b/>
+        </w:rPr>
+        <w:t>Emergency</w:t>
+      </w:r>
+      <w:proofErr w:type="gramEnd"/>
+      <w:r>
+        <w:rPr>
+          <w:rFonts w:ascii="Arial" w:hAnsi="Arial" w:cs="Arial"/>
+          <w:b/>
+        </w:rPr>
+        <w:t xml:space="preserve"> </w:t>
       </w:r>
       <w:r>
         <w:rPr>
@@ -372,7 +388,23 @@
           <w:rFonts w:ascii="Arial" w:hAnsi="Arial" w:cs="Arial"/>
           <w:bCs/>
         </w:rPr>
-        <w:t>{{is_this_an_emergency_recall}}</w:t>
+        <w:t>{{</w:t>
+      </w:r>
+      <w:proofErr w:type="spellStart"/>
+      <w:r>
+        <w:rPr>
+          <w:rFonts w:ascii="Arial" w:hAnsi="Arial" w:cs="Arial"/>
+          <w:bCs/>
+        </w:rPr>
+        <w:t>is_this_an_emergency_recall</w:t>
+      </w:r>
+      <w:proofErr w:type="spellEnd"/>
+      <w:r>
+        <w:rPr>
+          <w:rFonts w:ascii="Arial" w:hAnsi="Arial" w:cs="Arial"/>
+          <w:bCs/>
+        </w:rPr>
+        <w:t>}}</w:t>
       </w:r>
     </w:p>
     <w:p>
@@ -418,7 +450,23 @@
           <w:rFonts w:ascii="Arial" w:hAnsi="Arial" w:cs="Arial"/>
           <w:bCs/>
         </w:rPr>
-        <w:t xml:space="preserve">{{indeterminate_sentence_type}} </w:t>
+        <w:t>{{</w:t>
+      </w:r>
+      <w:proofErr w:type="spellStart"/>
+      <w:r>
+        <w:rPr>
+          <w:rFonts w:ascii="Arial" w:hAnsi="Arial" w:cs="Arial"/>
+          <w:bCs/>
+        </w:rPr>
+        <w:t>indeterminate_sentence_type</w:t>
+      </w:r>
+      <w:proofErr w:type="spellEnd"/>
+      <w:r>
+        <w:rPr>
+          <w:rFonts w:ascii="Arial" w:hAnsi="Arial" w:cs="Arial"/>
+          <w:bCs/>
+        </w:rPr>
+        <w:t xml:space="preserve">}} </w:t>
       </w:r>
       <w:r>
         <w:rPr>
@@ -492,7 +540,23 @@
           <w:rFonts w:ascii="Arial" w:hAnsi="Arial" w:cs="Arial"/>
           <w:bCs/>
         </w:rPr>
-        <w:t>{{is_extended_sentence}}</w:t>
+        <w:t>{{</w:t>
+      </w:r>
+      <w:proofErr w:type="spellStart"/>
+      <w:r>
+        <w:rPr>
+          <w:rFonts w:ascii="Arial" w:hAnsi="Arial" w:cs="Arial"/>
+          <w:bCs/>
+        </w:rPr>
+        <w:t>is_extended_sentence</w:t>
+      </w:r>
+      <w:proofErr w:type="spellEnd"/>
+      <w:r>
+        <w:rPr>
+          <w:rFonts w:ascii="Arial" w:hAnsi="Arial" w:cs="Arial"/>
+          <w:bCs/>
+        </w:rPr>
+        <w:t>}}</w:t>
       </w:r>
       <w:r>
         <w:rPr>
@@ -654,6 +718,7 @@
         </w:rPr>
         <w:t>{{</w:t>
       </w:r>
+      <w:proofErr w:type="spellStart"/>
       <w:r>
         <w:rPr>
           <w:rFonts w:ascii="Arial" w:hAnsi="Arial" w:cs="Arial"/>
@@ -661,6 +726,7 @@
         </w:rPr>
         <w:t>is_serving_youth_sentence</w:t>
       </w:r>
+      <w:proofErr w:type="spellEnd"/>
       <w:r>
         <w:rPr>
           <w:rFonts w:ascii="Arial" w:hAnsi="Arial" w:cs="Arial"/>
@@ -781,7 +847,23 @@
           <w:rFonts w:ascii="Arial" w:hAnsi="Arial" w:cs="Arial"/>
           <w:bCs/>
         </w:rPr>
-        <w:t>{{is_serving_youth_sentence}}</w:t>
+        <w:t>{{</w:t>
+      </w:r>
+      <w:proofErr w:type="spellStart"/>
+      <w:r>
+        <w:rPr>
+          <w:rFonts w:ascii="Arial" w:hAnsi="Arial" w:cs="Arial"/>
+          <w:bCs/>
+        </w:rPr>
+        <w:t>is_serving_youth_sentence</w:t>
+      </w:r>
+      <w:proofErr w:type="spellEnd"/>
+      <w:r>
+        <w:rPr>
+          <w:rFonts w:ascii="Arial" w:hAnsi="Arial" w:cs="Arial"/>
+          <w:bCs/>
+        </w:rPr>
+        <w:t>}}</w:t>
       </w:r>
       <w:r>
         <w:rPr>
@@ -1226,7 +1308,15 @@
           <w:rFonts w:ascii="Arial" w:hAnsi="Arial" w:cs="Arial"/>
           <w:bCs/>
         </w:rPr>
-        <w:t>{{is_</w:t>
+        <w:t>{{</w:t>
+      </w:r>
+      <w:proofErr w:type="spellStart"/>
+      <w:r>
+        <w:rPr>
+          <w:rFonts w:ascii="Arial" w:hAnsi="Arial" w:cs="Arial"/>
+          <w:bCs/>
+        </w:rPr>
+        <w:t>is_</w:t>
       </w:r>
       <w:r>
         <w:rPr>
@@ -1254,7 +1344,15 @@
           <w:rFonts w:ascii="Arial" w:hAnsi="Arial" w:cs="Arial"/>
           <w:bCs/>
         </w:rPr>
-        <w:t>_serious_offence}}</w:t>
+        <w:t>_serious_offence</w:t>
+      </w:r>
+      <w:proofErr w:type="spellEnd"/>
+      <w:r>
+        <w:rPr>
+          <w:rFonts w:ascii="Arial" w:hAnsi="Arial" w:cs="Arial"/>
+          <w:bCs/>
+        </w:rPr>
+        <w:t>}}</w:t>
       </w:r>
     </w:p>
     <w:p>
@@ -1415,7 +1513,15 @@
           <w:rFonts w:ascii="Arial" w:hAnsi="Arial" w:cs="Arial"/>
           <w:bCs/>
         </w:rPr>
-        <w:t>{{is_</w:t>
+        <w:t>{{</w:t>
+      </w:r>
+      <w:proofErr w:type="spellStart"/>
+      <w:r>
+        <w:rPr>
+          <w:rFonts w:ascii="Arial" w:hAnsi="Arial" w:cs="Arial"/>
+          <w:bCs/>
+        </w:rPr>
+        <w:t>is_</w:t>
       </w:r>
       <w:r>
         <w:rPr>
@@ -1429,7 +1535,15 @@
           <w:rFonts w:ascii="Arial" w:hAnsi="Arial" w:cs="Arial"/>
           <w:bCs/>
         </w:rPr>
-        <w:t>_offence}}</w:t>
+        <w:t>_offence</w:t>
+      </w:r>
+      <w:proofErr w:type="spellEnd"/>
+      <w:r>
+        <w:rPr>
+          <w:rFonts w:ascii="Arial" w:hAnsi="Arial" w:cs="Arial"/>
+          <w:bCs/>
+        </w:rPr>
+        <w:t>}}</w:t>
       </w:r>
     </w:p>
     <w:p>
@@ -1472,6 +1586,7 @@
         </w:rPr>
         <w:t>{{</w:t>
       </w:r>
+      <w:proofErr w:type="spellStart"/>
       <w:r>
         <w:rPr>
           <w:rFonts w:ascii="Arial" w:hAnsi="Arial" w:cs="Arial"/>
@@ -1519,7 +1634,15 @@
           <w:rFonts w:ascii="Arial" w:hAnsi="Arial" w:cs="Arial"/>
           <w:bCs/>
         </w:rPr>
-        <w:t>entence}}</w:t>
+        <w:t>entence</w:t>
+      </w:r>
+      <w:proofErr w:type="spellEnd"/>
+      <w:r>
+        <w:rPr>
+          <w:rFonts w:ascii="Arial" w:hAnsi="Arial" w:cs="Arial"/>
+          <w:bCs/>
+        </w:rPr>
+        <w:t>}}</w:t>
       </w:r>
     </w:p>
     <w:p>
@@ -1550,6 +1673,7 @@
         </w:rPr>
         <w:t>{{</w:t>
       </w:r>
+      <w:proofErr w:type="spellStart"/>
       <w:r>
         <w:rPr>
           <w:rFonts w:ascii="Arial" w:hAnsi="Arial" w:cs="Arial"/>
@@ -1590,7 +1714,15 @@
           <w:rFonts w:ascii="Arial" w:hAnsi="Arial" w:cs="Arial"/>
           <w:bCs/>
         </w:rPr>
-        <w:t>_sentence}}</w:t>
+        <w:t>_sentence</w:t>
+      </w:r>
+      <w:proofErr w:type="spellEnd"/>
+      <w:r>
+        <w:rPr>
+          <w:rFonts w:ascii="Arial" w:hAnsi="Arial" w:cs="Arial"/>
+          <w:bCs/>
+        </w:rPr>
+        <w:t>}}</w:t>
       </w:r>
     </w:p>
     <w:p>
@@ -1710,6 +1842,7 @@
         </w:rPr>
         <w:t>{{</w:t>
       </w:r>
+      <w:proofErr w:type="spellStart"/>
       <w:r>
         <w:rPr>
           <w:rFonts w:ascii="Arial" w:hAnsi="Arial" w:cs="Arial"/>
@@ -1722,7 +1855,15 @@
           <w:rFonts w:ascii="Arial" w:hAnsi="Arial" w:cs="Arial"/>
           <w:bCs/>
         </w:rPr>
-        <w:t>s_repatriated_for_murder}}</w:t>
+        <w:t>s_repatriated_for_murder</w:t>
+      </w:r>
+      <w:proofErr w:type="spellEnd"/>
+      <w:r>
+        <w:rPr>
+          <w:rFonts w:ascii="Arial" w:hAnsi="Arial" w:cs="Arial"/>
+          <w:bCs/>
+        </w:rPr>
+        <w:t>}}</w:t>
       </w:r>
     </w:p>
     <w:p>
@@ -1798,6 +1939,7 @@
         </w:rPr>
         <w:t>{{</w:t>
       </w:r>
+      <w:proofErr w:type="spellStart"/>
       <w:r>
         <w:rPr>
           <w:rFonts w:ascii="Arial" w:hAnsi="Arial" w:cs="Arial"/>
@@ -1824,7 +1966,15 @@
           <w:rFonts w:ascii="Arial" w:hAnsi="Arial" w:cs="Arial"/>
           <w:bCs/>
         </w:rPr>
-        <w:t>involved_in_foreign_power_threat}}</w:t>
+        <w:t>involved_in_foreign_power_threat</w:t>
+      </w:r>
+      <w:proofErr w:type="spellEnd"/>
+      <w:r>
+        <w:rPr>
+          <w:rFonts w:ascii="Arial" w:hAnsi="Arial" w:cs="Arial"/>
+          <w:bCs/>
+        </w:rPr>
+        <w:t>}}</w:t>
       </w:r>
     </w:p>
     <w:p>
@@ -1856,6 +2006,7 @@
         </w:rPr>
         <w:t>{{</w:t>
       </w:r>
+      <w:proofErr w:type="spellStart"/>
       <w:r>
         <w:rPr>
           <w:rFonts w:ascii="Arial" w:hAnsi="Arial" w:cs="Arial"/>
@@ -1870,6 +2021,7 @@
         </w:rPr>
         <w:t>security_offence</w:t>
       </w:r>
+      <w:proofErr w:type="spellEnd"/>
       <w:r>
         <w:rPr>
           <w:rFonts w:ascii="Arial" w:hAnsi="Arial" w:cs="Arial"/>
@@ -2007,7 +2159,23 @@
           <w:rFonts w:ascii="Arial" w:hAnsi="Arial" w:cs="Arial"/>
           <w:bCs/>
         </w:rPr>
-        <w:t>{{date_of_birth}}</w:t>
+        <w:t>{{</w:t>
+      </w:r>
+      <w:proofErr w:type="spellStart"/>
+      <w:r>
+        <w:rPr>
+          <w:rFonts w:ascii="Arial" w:hAnsi="Arial" w:cs="Arial"/>
+          <w:bCs/>
+        </w:rPr>
+        <w:t>date_of_birth</w:t>
+      </w:r>
+      <w:proofErr w:type="spellEnd"/>
+      <w:r>
+        <w:rPr>
+          <w:rFonts w:ascii="Arial" w:hAnsi="Arial" w:cs="Arial"/>
+          <w:bCs/>
+        </w:rPr>
+        <w:t>}}</w:t>
       </w:r>
     </w:p>
     <w:p>
@@ -2077,7 +2245,23 @@
           <w:rFonts w:ascii="Arial" w:hAnsi="Arial" w:cs="Arial"/>
           <w:bCs/>
         </w:rPr>
-        <w:t>{{primary_language}}</w:t>
+        <w:t>{{</w:t>
+      </w:r>
+      <w:proofErr w:type="spellStart"/>
+      <w:r>
+        <w:rPr>
+          <w:rFonts w:ascii="Arial" w:hAnsi="Arial" w:cs="Arial"/>
+          <w:bCs/>
+        </w:rPr>
+        <w:t>primary_language</w:t>
+      </w:r>
+      <w:proofErr w:type="spellEnd"/>
+      <w:r>
+        <w:rPr>
+          <w:rFonts w:ascii="Arial" w:hAnsi="Arial" w:cs="Arial"/>
+          <w:bCs/>
+        </w:rPr>
+        <w:t>}}</w:t>
       </w:r>
       <w:r>
         <w:rPr>
@@ -2091,7 +2275,23 @@
           <w:rFonts w:ascii="Arial" w:hAnsi="Arial" w:cs="Arial"/>
           <w:bCs/>
         </w:rPr>
-        <w:t>{{primary_language}}</w:t>
+        <w:t>{{</w:t>
+      </w:r>
+      <w:proofErr w:type="spellStart"/>
+      <w:r>
+        <w:rPr>
+          <w:rFonts w:ascii="Arial" w:hAnsi="Arial" w:cs="Arial"/>
+          <w:bCs/>
+        </w:rPr>
+        <w:t>primary_language</w:t>
+      </w:r>
+      <w:proofErr w:type="spellEnd"/>
+      <w:r>
+        <w:rPr>
+          <w:rFonts w:ascii="Arial" w:hAnsi="Arial" w:cs="Arial"/>
+          <w:bCs/>
+        </w:rPr>
+        <w:t>}}</w:t>
       </w:r>
     </w:p>
     <w:p>
@@ -2189,7 +2389,23 @@
           <w:rFonts w:ascii="Arial" w:hAnsi="Arial" w:cs="Arial"/>
           <w:bCs/>
         </w:rPr>
-        <w:t>{{crn}}</w:t>
+        <w:t>{{</w:t>
+      </w:r>
+      <w:proofErr w:type="spellStart"/>
+      <w:r>
+        <w:rPr>
+          <w:rFonts w:ascii="Arial" w:hAnsi="Arial" w:cs="Arial"/>
+          <w:bCs/>
+        </w:rPr>
+        <w:t>crn</w:t>
+      </w:r>
+      <w:proofErr w:type="spellEnd"/>
+      <w:r>
+        <w:rPr>
+          <w:rFonts w:ascii="Arial" w:hAnsi="Arial" w:cs="Arial"/>
+          <w:bCs/>
+        </w:rPr>
+        <w:t>}}</w:t>
       </w:r>
     </w:p>
     <w:p>
@@ -2229,7 +2445,23 @@
           <w:rFonts w:ascii="Arial" w:hAnsi="Arial" w:cs="Arial"/>
           <w:bCs/>
         </w:rPr>
-        <w:t>{{cro_number}}</w:t>
+        <w:t>{{</w:t>
+      </w:r>
+      <w:proofErr w:type="spellStart"/>
+      <w:r>
+        <w:rPr>
+          <w:rFonts w:ascii="Arial" w:hAnsi="Arial" w:cs="Arial"/>
+          <w:bCs/>
+        </w:rPr>
+        <w:t>cro_number</w:t>
+      </w:r>
+      <w:proofErr w:type="spellEnd"/>
+      <w:r>
+        <w:rPr>
+          <w:rFonts w:ascii="Arial" w:hAnsi="Arial" w:cs="Arial"/>
+          <w:bCs/>
+        </w:rPr>
+        <w:t>}}</w:t>
       </w:r>
     </w:p>
     <w:p>
@@ -2262,7 +2494,23 @@
           <w:rFonts w:ascii="Arial" w:hAnsi="Arial" w:cs="Arial"/>
           <w:bCs/>
         </w:rPr>
-        <w:t>{{pnc_number}}</w:t>
+        <w:t>{{</w:t>
+      </w:r>
+      <w:proofErr w:type="spellStart"/>
+      <w:r>
+        <w:rPr>
+          <w:rFonts w:ascii="Arial" w:hAnsi="Arial" w:cs="Arial"/>
+          <w:bCs/>
+        </w:rPr>
+        <w:t>pnc_number</w:t>
+      </w:r>
+      <w:proofErr w:type="spellEnd"/>
+      <w:r>
+        <w:rPr>
+          <w:rFonts w:ascii="Arial" w:hAnsi="Arial" w:cs="Arial"/>
+          <w:bCs/>
+        </w:rPr>
+        <w:t>}}</w:t>
       </w:r>
     </w:p>
     <w:p>
@@ -2294,7 +2542,23 @@
           <w:rFonts w:ascii="Arial" w:hAnsi="Arial" w:cs="Arial"/>
           <w:bCs/>
         </w:rPr>
-        <w:t>{{most_recent_prisoner_number}}</w:t>
+        <w:t>{{</w:t>
+      </w:r>
+      <w:proofErr w:type="spellStart"/>
+      <w:r>
+        <w:rPr>
+          <w:rFonts w:ascii="Arial" w:hAnsi="Arial" w:cs="Arial"/>
+          <w:bCs/>
+        </w:rPr>
+        <w:t>most_recent_prisoner_number</w:t>
+      </w:r>
+      <w:proofErr w:type="spellEnd"/>
+      <w:r>
+        <w:rPr>
+          <w:rFonts w:ascii="Arial" w:hAnsi="Arial" w:cs="Arial"/>
+          <w:bCs/>
+        </w:rPr>
+        <w:t>}}</w:t>
       </w:r>
     </w:p>
     <w:p>
@@ -2334,7 +2598,23 @@
           <w:rFonts w:ascii="Arial" w:hAnsi="Arial" w:cs="Arial"/>
           <w:bCs/>
         </w:rPr>
-        <w:t>{{noms_number}}</w:t>
+        <w:t>{{</w:t>
+      </w:r>
+      <w:proofErr w:type="spellStart"/>
+      <w:r>
+        <w:rPr>
+          <w:rFonts w:ascii="Arial" w:hAnsi="Arial" w:cs="Arial"/>
+          <w:bCs/>
+        </w:rPr>
+        <w:t>noms_number</w:t>
+      </w:r>
+      <w:proofErr w:type="spellEnd"/>
+      <w:r>
+        <w:rPr>
+          <w:rFonts w:ascii="Arial" w:hAnsi="Arial" w:cs="Arial"/>
+          <w:bCs/>
+        </w:rPr>
+        <w:t>}}</w:t>
       </w:r>
     </w:p>
     <w:p>
@@ -2366,7 +2646,23 @@
           <w:rFonts w:ascii="Arial" w:hAnsi="Arial" w:cs="Arial"/>
           <w:bCs/>
         </w:rPr>
-        <w:t>{{last_releasing_prison}}</w:t>
+        <w:t>{{</w:t>
+      </w:r>
+      <w:proofErr w:type="spellStart"/>
+      <w:r>
+        <w:rPr>
+          <w:rFonts w:ascii="Arial" w:hAnsi="Arial" w:cs="Arial"/>
+          <w:bCs/>
+        </w:rPr>
+        <w:t>last_releasing_prison</w:t>
+      </w:r>
+      <w:proofErr w:type="spellEnd"/>
+      <w:r>
+        <w:rPr>
+          <w:rFonts w:ascii="Arial" w:hAnsi="Arial" w:cs="Arial"/>
+          <w:bCs/>
+        </w:rPr>
+        <w:t>}}</w:t>
       </w:r>
     </w:p>
     <w:p>
@@ -2427,7 +2723,23 @@
           <w:rFonts w:ascii="Arial" w:hAnsi="Arial" w:cs="Arial"/>
           <w:bCs/>
         </w:rPr>
-        <w:t>{{date_of_release}}</w:t>
+        <w:t>{{</w:t>
+      </w:r>
+      <w:proofErr w:type="spellStart"/>
+      <w:r>
+        <w:rPr>
+          <w:rFonts w:ascii="Arial" w:hAnsi="Arial" w:cs="Arial"/>
+          <w:bCs/>
+        </w:rPr>
+        <w:t>date_of_release</w:t>
+      </w:r>
+      <w:proofErr w:type="spellEnd"/>
+      <w:r>
+        <w:rPr>
+          <w:rFonts w:ascii="Arial" w:hAnsi="Arial" w:cs="Arial"/>
+          <w:bCs/>
+        </w:rPr>
+        <w:t>}}</w:t>
       </w:r>
     </w:p>
     <w:p>
@@ -2539,7 +2851,23 @@
           <w:rFonts w:ascii="Arial" w:hAnsi="Arial" w:cs="Arial"/>
           <w:bCs/>
         </w:rPr>
-        <w:t>{{index_offence_description}}</w:t>
+        <w:t>{{</w:t>
+      </w:r>
+      <w:proofErr w:type="spellStart"/>
+      <w:r>
+        <w:rPr>
+          <w:rFonts w:ascii="Arial" w:hAnsi="Arial" w:cs="Arial"/>
+          <w:bCs/>
+        </w:rPr>
+        <w:t>index_offence_description</w:t>
+      </w:r>
+      <w:proofErr w:type="spellEnd"/>
+      <w:r>
+        <w:rPr>
+          <w:rFonts w:ascii="Arial" w:hAnsi="Arial" w:cs="Arial"/>
+          <w:bCs/>
+        </w:rPr>
+        <w:t>}}</w:t>
       </w:r>
       <w:r>
         <w:rPr>
@@ -2637,7 +2965,23 @@
           <w:rFonts w:ascii="Arial" w:hAnsi="Arial" w:cs="Arial"/>
           <w:bCs/>
         </w:rPr>
-        <w:t>{{date_of_original_offence}}</w:t>
+        <w:t>{{</w:t>
+      </w:r>
+      <w:proofErr w:type="spellStart"/>
+      <w:r>
+        <w:rPr>
+          <w:rFonts w:ascii="Arial" w:hAnsi="Arial" w:cs="Arial"/>
+          <w:bCs/>
+        </w:rPr>
+        <w:t>date_of_original_offence</w:t>
+      </w:r>
+      <w:proofErr w:type="spellEnd"/>
+      <w:r>
+        <w:rPr>
+          <w:rFonts w:ascii="Arial" w:hAnsi="Arial" w:cs="Arial"/>
+          <w:bCs/>
+        </w:rPr>
+        <w:t>}}</w:t>
       </w:r>
     </w:p>
     <w:p>
@@ -2678,7 +3022,23 @@
           <w:rFonts w:ascii="Arial" w:hAnsi="Arial" w:cs="Arial"/>
           <w:bCs/>
         </w:rPr>
-        <w:t>{{date_of_sentence}}</w:t>
+        <w:t>{{</w:t>
+      </w:r>
+      <w:proofErr w:type="spellStart"/>
+      <w:r>
+        <w:rPr>
+          <w:rFonts w:ascii="Arial" w:hAnsi="Arial" w:cs="Arial"/>
+          <w:bCs/>
+        </w:rPr>
+        <w:t>date_of_sentence</w:t>
+      </w:r>
+      <w:proofErr w:type="spellEnd"/>
+      <w:r>
+        <w:rPr>
+          <w:rFonts w:ascii="Arial" w:hAnsi="Arial" w:cs="Arial"/>
+          <w:bCs/>
+        </w:rPr>
+        <w:t>}}</w:t>
       </w:r>
     </w:p>
     <w:p>
@@ -2719,7 +3079,23 @@
           <w:rFonts w:ascii="Arial" w:hAnsi="Arial" w:cs="Arial"/>
           <w:bCs/>
         </w:rPr>
-        <w:t>{{length_of_sentence}}</w:t>
+        <w:t>{{</w:t>
+      </w:r>
+      <w:proofErr w:type="spellStart"/>
+      <w:r>
+        <w:rPr>
+          <w:rFonts w:ascii="Arial" w:hAnsi="Arial" w:cs="Arial"/>
+          <w:bCs/>
+        </w:rPr>
+        <w:t>length_of_sentence</w:t>
+      </w:r>
+      <w:proofErr w:type="spellEnd"/>
+      <w:r>
+        <w:rPr>
+          <w:rFonts w:ascii="Arial" w:hAnsi="Arial" w:cs="Arial"/>
+          <w:bCs/>
+        </w:rPr>
+        <w:t>}}</w:t>
       </w:r>
     </w:p>
     <w:p>
@@ -2761,7 +3137,23 @@
           <w:rFonts w:ascii="Arial" w:hAnsi="Arial" w:cs="Arial"/>
           <w:bCs/>
         </w:rPr>
-        <w:t>{{licence_expiry_date}}</w:t>
+        <w:t>{{</w:t>
+      </w:r>
+      <w:proofErr w:type="spellStart"/>
+      <w:r>
+        <w:rPr>
+          <w:rFonts w:ascii="Arial" w:hAnsi="Arial" w:cs="Arial"/>
+          <w:bCs/>
+        </w:rPr>
+        <w:t>licence_expiry_date</w:t>
+      </w:r>
+      <w:proofErr w:type="spellEnd"/>
+      <w:r>
+        <w:rPr>
+          <w:rFonts w:ascii="Arial" w:hAnsi="Arial" w:cs="Arial"/>
+          <w:bCs/>
+        </w:rPr>
+        <w:t>}}</w:t>
       </w:r>
     </w:p>
     <w:p>
@@ -2803,7 +3195,23 @@
           <w:rFonts w:ascii="Arial" w:hAnsi="Arial" w:cs="Arial"/>
           <w:bCs/>
         </w:rPr>
-        <w:t>{{sentence_expiry_date}}</w:t>
+        <w:t>{{</w:t>
+      </w:r>
+      <w:proofErr w:type="spellStart"/>
+      <w:r>
+        <w:rPr>
+          <w:rFonts w:ascii="Arial" w:hAnsi="Arial" w:cs="Arial"/>
+          <w:bCs/>
+        </w:rPr>
+        <w:t>sentence_expiry_date</w:t>
+      </w:r>
+      <w:proofErr w:type="spellEnd"/>
+      <w:r>
+        <w:rPr>
+          <w:rFonts w:ascii="Arial" w:hAnsi="Arial" w:cs="Arial"/>
+          <w:bCs/>
+        </w:rPr>
+        <w:t>}}</w:t>
       </w:r>
     </w:p>
     <w:p>
@@ -2876,7 +3284,23 @@
           <w:rFonts w:ascii="Arial" w:hAnsi="Arial" w:cs="Arial"/>
           <w:bCs/>
         </w:rPr>
-        <w:t>{{custodial_term}}</w:t>
+        <w:t>{{</w:t>
+      </w:r>
+      <w:proofErr w:type="spellStart"/>
+      <w:r>
+        <w:rPr>
+          <w:rFonts w:ascii="Arial" w:hAnsi="Arial" w:cs="Arial"/>
+          <w:bCs/>
+        </w:rPr>
+        <w:t>custodial_term</w:t>
+      </w:r>
+      <w:proofErr w:type="spellEnd"/>
+      <w:r>
+        <w:rPr>
+          <w:rFonts w:ascii="Arial" w:hAnsi="Arial" w:cs="Arial"/>
+          <w:bCs/>
+        </w:rPr>
+        <w:t>}}</w:t>
       </w:r>
     </w:p>
     <w:p>
@@ -2929,7 +3353,23 @@
           <w:rFonts w:ascii="Arial" w:hAnsi="Arial" w:cs="Arial"/>
           <w:bCs/>
         </w:rPr>
-        <w:t>{{extended_term}}</w:t>
+        <w:t>{{</w:t>
+      </w:r>
+      <w:proofErr w:type="spellStart"/>
+      <w:r>
+        <w:rPr>
+          <w:rFonts w:ascii="Arial" w:hAnsi="Arial" w:cs="Arial"/>
+          <w:bCs/>
+        </w:rPr>
+        <w:t>extended_term</w:t>
+      </w:r>
+      <w:proofErr w:type="spellEnd"/>
+      <w:r>
+        <w:rPr>
+          <w:rFonts w:ascii="Arial" w:hAnsi="Arial" w:cs="Arial"/>
+          <w:bCs/>
+        </w:rPr>
+        <w:t>}}</w:t>
       </w:r>
     </w:p>
     <w:p>
@@ -2977,7 +3417,23 @@
           <w:rFonts w:ascii="Arial" w:hAnsi="Arial" w:cs="Arial"/>
           <w:bCs/>
         </w:rPr>
-        <w:t xml:space="preserve">(Any information presented here should be disclosable to the prisoner)      </w:t>
+        <w:t xml:space="preserve">(Any information presented here should be disclosable to the </w:t>
+      </w:r>
+      <w:proofErr w:type="gramStart"/>
+      <w:r>
+        <w:rPr>
+          <w:rFonts w:ascii="Arial" w:hAnsi="Arial" w:cs="Arial"/>
+          <w:bCs/>
+        </w:rPr>
+        <w:t xml:space="preserve">prisoner)   </w:t>
+      </w:r>
+      <w:proofErr w:type="gramEnd"/>
+      <w:r>
+        <w:rPr>
+          <w:rFonts w:ascii="Arial" w:hAnsi="Arial" w:cs="Arial"/>
+          <w:bCs/>
+        </w:rPr>
+        <w:t xml:space="preserve">   </w:t>
       </w:r>
       <w:r>
         <w:rPr>
@@ -2991,7 +3447,30 @@
           <w:rFonts w:ascii="Arial" w:hAnsi="Arial" w:cs="Arial"/>
           <w:bCs/>
         </w:rPr>
-        <w:t>{{has_victims_in_contact_scheme}}</w:t>
+        <w:t>{{</w:t>
+      </w:r>
+      <w:proofErr w:type="spellStart"/>
+      <w:r>
+        <w:rPr>
+          <w:rFonts w:ascii="Arial" w:hAnsi="Arial" w:cs="Arial"/>
+          <w:bCs/>
+        </w:rPr>
+        <w:t>has_victims_in_contact_scheme</w:t>
+      </w:r>
+      <w:proofErr w:type="spellEnd"/>
+      <w:r>
+        <w:rPr>
+          <w:rFonts w:ascii="Arial" w:hAnsi="Arial" w:cs="Arial"/>
+          <w:bCs/>
+        </w:rPr>
+        <w:t>}}</w:t>
+      </w:r>
+      <w:r>
+        <w:rPr>
+          <w:rFonts w:ascii="Arial" w:hAnsi="Arial" w:cs="Arial"/>
+          <w:bCs/>
+        </w:rPr>
+        <w:t xml:space="preserve"> </w:t>
       </w:r>
       <w:r>
         <w:rPr>
@@ -3020,7 +3499,23 @@
           <w:rFonts w:ascii="Arial" w:hAnsi="Arial" w:cs="Arial"/>
           <w:bCs/>
         </w:rPr>
-        <w:t>{{date_vlo_informed}}</w:t>
+        <w:t>{{</w:t>
+      </w:r>
+      <w:proofErr w:type="spellStart"/>
+      <w:r>
+        <w:rPr>
+          <w:rFonts w:ascii="Arial" w:hAnsi="Arial" w:cs="Arial"/>
+          <w:bCs/>
+        </w:rPr>
+        <w:t>date_vlo_informed</w:t>
+      </w:r>
+      <w:proofErr w:type="spellEnd"/>
+      <w:r>
+        <w:rPr>
+          <w:rFonts w:ascii="Arial" w:hAnsi="Arial" w:cs="Arial"/>
+          <w:bCs/>
+        </w:rPr>
+        <w:t>}}</w:t>
       </w:r>
       <w:r>
         <w:rPr>
@@ -3113,7 +3608,23 @@
           <w:rFonts w:ascii="Arial" w:hAnsi="Arial" w:cs="Arial"/>
           <w:bCs/>
         </w:rPr>
-        <w:t>{{custody_status}}</w:t>
+        <w:t>{{</w:t>
+      </w:r>
+      <w:proofErr w:type="spellStart"/>
+      <w:r>
+        <w:rPr>
+          <w:rFonts w:ascii="Arial" w:hAnsi="Arial" w:cs="Arial"/>
+          <w:bCs/>
+        </w:rPr>
+        <w:t>custody_status</w:t>
+      </w:r>
+      <w:proofErr w:type="spellEnd"/>
+      <w:r>
+        <w:rPr>
+          <w:rFonts w:ascii="Arial" w:hAnsi="Arial" w:cs="Arial"/>
+          <w:bCs/>
+        </w:rPr>
+        <w:t>}}</w:t>
       </w:r>
     </w:p>
     <w:p>
@@ -3146,7 +3657,23 @@
           <w:rFonts w:ascii="Arial" w:hAnsi="Arial" w:cs="Arial"/>
           <w:bCs/>
         </w:rPr>
-        <w:t>{{has_arrest_issues}}</w:t>
+        <w:t>{{</w:t>
+      </w:r>
+      <w:proofErr w:type="spellStart"/>
+      <w:r>
+        <w:rPr>
+          <w:rFonts w:ascii="Arial" w:hAnsi="Arial" w:cs="Arial"/>
+          <w:bCs/>
+        </w:rPr>
+        <w:t>has_arrest_issues</w:t>
+      </w:r>
+      <w:proofErr w:type="spellEnd"/>
+      <w:r>
+        <w:rPr>
+          <w:rFonts w:ascii="Arial" w:hAnsi="Arial" w:cs="Arial"/>
+          <w:bCs/>
+        </w:rPr>
+        <w:t>}}</w:t>
       </w:r>
     </w:p>
     <w:p>
@@ -3186,7 +3713,23 @@
           <w:rFonts w:ascii="Arial" w:hAnsi="Arial" w:cs="Arial"/>
           <w:bCs/>
         </w:rPr>
-        <w:t>{{has_arrest_issues_details}}</w:t>
+        <w:t>{{</w:t>
+      </w:r>
+      <w:proofErr w:type="spellStart"/>
+      <w:r>
+        <w:rPr>
+          <w:rFonts w:ascii="Arial" w:hAnsi="Arial" w:cs="Arial"/>
+          <w:bCs/>
+        </w:rPr>
+        <w:t>has_arrest_issues_details</w:t>
+      </w:r>
+      <w:proofErr w:type="spellEnd"/>
+      <w:r>
+        <w:rPr>
+          <w:rFonts w:ascii="Arial" w:hAnsi="Arial" w:cs="Arial"/>
+          <w:bCs/>
+        </w:rPr>
+        <w:t>}}</w:t>
       </w:r>
     </w:p>
     <w:p>
@@ -3225,7 +3768,23 @@
           <w:rFonts w:ascii="Arial" w:hAnsi="Arial" w:cs="Arial"/>
           <w:bCs/>
         </w:rPr>
-        <w:t>{{contact_name}}</w:t>
+        <w:t>{{</w:t>
+      </w:r>
+      <w:proofErr w:type="spellStart"/>
+      <w:r>
+        <w:rPr>
+          <w:rFonts w:ascii="Arial" w:hAnsi="Arial" w:cs="Arial"/>
+          <w:bCs/>
+        </w:rPr>
+        <w:t>contact_name</w:t>
+      </w:r>
+      <w:proofErr w:type="spellEnd"/>
+      <w:r>
+        <w:rPr>
+          <w:rFonts w:ascii="Arial" w:hAnsi="Arial" w:cs="Arial"/>
+          <w:bCs/>
+        </w:rPr>
+        <w:t>}}</w:t>
       </w:r>
     </w:p>
     <w:p>
@@ -3264,7 +3823,23 @@
           <w:rFonts w:ascii="Arial" w:hAnsi="Arial" w:cs="Arial"/>
           <w:bCs/>
         </w:rPr>
-        <w:t>{{email_address}}</w:t>
+        <w:t>{{</w:t>
+      </w:r>
+      <w:proofErr w:type="spellStart"/>
+      <w:r>
+        <w:rPr>
+          <w:rFonts w:ascii="Arial" w:hAnsi="Arial" w:cs="Arial"/>
+          <w:bCs/>
+        </w:rPr>
+        <w:t>email_address</w:t>
+      </w:r>
+      <w:proofErr w:type="spellEnd"/>
+      <w:r>
+        <w:rPr>
+          <w:rFonts w:ascii="Arial" w:hAnsi="Arial" w:cs="Arial"/>
+          <w:bCs/>
+        </w:rPr>
+        <w:t>}}</w:t>
       </w:r>
     </w:p>
     <w:p>
@@ -3329,7 +3904,23 @@
           <w:rFonts w:ascii="Arial" w:hAnsi="Arial" w:cs="Arial"/>
           <w:bCs/>
         </w:rPr>
-        <w:t>{{last_recorded_address}}</w:t>
+        <w:t>{{</w:t>
+      </w:r>
+      <w:proofErr w:type="spellStart"/>
+      <w:r>
+        <w:rPr>
+          <w:rFonts w:ascii="Arial" w:hAnsi="Arial" w:cs="Arial"/>
+          <w:bCs/>
+        </w:rPr>
+        <w:t>last_recorded_address</w:t>
+      </w:r>
+      <w:proofErr w:type="spellEnd"/>
+      <w:r>
+        <w:rPr>
+          <w:rFonts w:ascii="Arial" w:hAnsi="Arial" w:cs="Arial"/>
+          <w:bCs/>
+        </w:rPr>
+        <w:t>}}</w:t>
       </w:r>
     </w:p>
     <w:p>
@@ -3361,7 +3952,23 @@
           <w:rFonts w:ascii="Arial" w:hAnsi="Arial" w:cs="Arial"/>
           <w:bCs/>
         </w:rPr>
-        <w:t>{{no_fixed_abode}}</w:t>
+        <w:t>{{</w:t>
+      </w:r>
+      <w:proofErr w:type="spellStart"/>
+      <w:r>
+        <w:rPr>
+          <w:rFonts w:ascii="Arial" w:hAnsi="Arial" w:cs="Arial"/>
+          <w:bCs/>
+        </w:rPr>
+        <w:t>no_fixed_abode</w:t>
+      </w:r>
+      <w:proofErr w:type="spellEnd"/>
+      <w:r>
+        <w:rPr>
+          <w:rFonts w:ascii="Arial" w:hAnsi="Arial" w:cs="Arial"/>
+          <w:bCs/>
+        </w:rPr>
+        <w:t>}}</w:t>
       </w:r>
     </w:p>
     <w:p>
@@ -3393,7 +4000,23 @@
           <w:rFonts w:ascii="Arial" w:hAnsi="Arial" w:cs="Arial"/>
           <w:bCs/>
         </w:rPr>
-        <w:t>{{other_possible_addresses}}</w:t>
+        <w:t>{{</w:t>
+      </w:r>
+      <w:proofErr w:type="spellStart"/>
+      <w:r>
+        <w:rPr>
+          <w:rFonts w:ascii="Arial" w:hAnsi="Arial" w:cs="Arial"/>
+          <w:bCs/>
+        </w:rPr>
+        <w:t>other_possible_addresses</w:t>
+      </w:r>
+      <w:proofErr w:type="spellEnd"/>
+      <w:r>
+        <w:rPr>
+          <w:rFonts w:ascii="Arial" w:hAnsi="Arial" w:cs="Arial"/>
+          <w:bCs/>
+        </w:rPr>
+        <w:t>}}</w:t>
       </w:r>
     </w:p>
     <w:p>
@@ -3501,7 +4124,23 @@
           <w:rFonts w:ascii="Arial" w:hAnsi="Arial" w:cs="Arial"/>
           <w:bCs/>
         </w:rPr>
-        <w:t>{{has_vulnerabilities}}</w:t>
+        <w:t>{{</w:t>
+      </w:r>
+      <w:proofErr w:type="spellStart"/>
+      <w:r>
+        <w:rPr>
+          <w:rFonts w:ascii="Arial" w:hAnsi="Arial" w:cs="Arial"/>
+          <w:bCs/>
+        </w:rPr>
+        <w:t>has_vulnerabilities</w:t>
+      </w:r>
+      <w:proofErr w:type="spellEnd"/>
+      <w:r>
+        <w:rPr>
+          <w:rFonts w:ascii="Arial" w:hAnsi="Arial" w:cs="Arial"/>
+          <w:bCs/>
+        </w:rPr>
+        <w:t>}}</w:t>
       </w:r>
     </w:p>
     <w:p>
@@ -3587,7 +4226,23 @@
           <w:rFonts w:ascii="Arial" w:hAnsi="Arial" w:cs="Arial"/>
           <w:bCs/>
         </w:rPr>
-        <w:t>{{has_contraband_risk}}</w:t>
+        <w:t>{{</w:t>
+      </w:r>
+      <w:proofErr w:type="spellStart"/>
+      <w:r>
+        <w:rPr>
+          <w:rFonts w:ascii="Arial" w:hAnsi="Arial" w:cs="Arial"/>
+          <w:bCs/>
+        </w:rPr>
+        <w:t>has_contraband_risk</w:t>
+      </w:r>
+      <w:proofErr w:type="spellEnd"/>
+      <w:r>
+        <w:rPr>
+          <w:rFonts w:ascii="Arial" w:hAnsi="Arial" w:cs="Arial"/>
+          <w:bCs/>
+        </w:rPr>
+        <w:t>}}</w:t>
       </w:r>
       <w:r>
         <w:rPr>
@@ -3625,7 +4280,23 @@
           <w:rFonts w:ascii="Arial" w:hAnsi="Arial" w:cs="Arial"/>
           <w:bCs/>
         </w:rPr>
-        <w:t>{{has_contraband_risk_details}}</w:t>
+        <w:t>{{</w:t>
+      </w:r>
+      <w:proofErr w:type="spellStart"/>
+      <w:r>
+        <w:rPr>
+          <w:rFonts w:ascii="Arial" w:hAnsi="Arial" w:cs="Arial"/>
+          <w:bCs/>
+        </w:rPr>
+        <w:t>has_contraband_risk_details</w:t>
+      </w:r>
+      <w:proofErr w:type="spellEnd"/>
+      <w:r>
+        <w:rPr>
+          <w:rFonts w:ascii="Arial" w:hAnsi="Arial" w:cs="Arial"/>
+          <w:bCs/>
+        </w:rPr>
+        <w:t>}}</w:t>
       </w:r>
     </w:p>
     <w:p>
@@ -3701,7 +4372,23 @@
           <w:rFonts w:ascii="Arial" w:hAnsi="Arial" w:cs="Arial"/>
           <w:bCs/>
         </w:rPr>
-        <w:t>{{mappa_category}}</w:t>
+        <w:t>{{</w:t>
+      </w:r>
+      <w:proofErr w:type="spellStart"/>
+      <w:r>
+        <w:rPr>
+          <w:rFonts w:ascii="Arial" w:hAnsi="Arial" w:cs="Arial"/>
+          <w:bCs/>
+        </w:rPr>
+        <w:t>mappa_category</w:t>
+      </w:r>
+      <w:proofErr w:type="spellEnd"/>
+      <w:r>
+        <w:rPr>
+          <w:rFonts w:ascii="Arial" w:hAnsi="Arial" w:cs="Arial"/>
+          <w:bCs/>
+        </w:rPr>
+        <w:t>}}</w:t>
       </w:r>
     </w:p>
     <w:p>
@@ -3732,7 +4419,23 @@
           <w:rFonts w:ascii="Arial" w:hAnsi="Arial" w:cs="Arial"/>
           <w:bCs/>
         </w:rPr>
-        <w:t>{{mappa_level}}</w:t>
+        <w:t>{{</w:t>
+      </w:r>
+      <w:proofErr w:type="spellStart"/>
+      <w:r>
+        <w:rPr>
+          <w:rFonts w:ascii="Arial" w:hAnsi="Arial" w:cs="Arial"/>
+          <w:bCs/>
+        </w:rPr>
+        <w:t>mappa_level</w:t>
+      </w:r>
+      <w:proofErr w:type="spellEnd"/>
+      <w:r>
+        <w:rPr>
+          <w:rFonts w:ascii="Arial" w:hAnsi="Arial" w:cs="Arial"/>
+          <w:bCs/>
+        </w:rPr>
+        <w:t>}}</w:t>
       </w:r>
     </w:p>
     <w:p>
@@ -3792,7 +4495,23 @@
           <w:rFonts w:ascii="Arial" w:hAnsi="Arial" w:cs="Arial"/>
           <w:bCs/>
         </w:rPr>
-        <w:t>{{risk_to_public}}</w:t>
+        <w:t>{{</w:t>
+      </w:r>
+      <w:proofErr w:type="spellStart"/>
+      <w:r>
+        <w:rPr>
+          <w:rFonts w:ascii="Arial" w:hAnsi="Arial" w:cs="Arial"/>
+          <w:bCs/>
+        </w:rPr>
+        <w:t>risk_to_public</w:t>
+      </w:r>
+      <w:proofErr w:type="spellEnd"/>
+      <w:r>
+        <w:rPr>
+          <w:rFonts w:ascii="Arial" w:hAnsi="Arial" w:cs="Arial"/>
+          <w:bCs/>
+        </w:rPr>
+        <w:t>}}</w:t>
       </w:r>
     </w:p>
     <w:p>
@@ -3831,7 +4550,23 @@
           <w:rFonts w:ascii="Arial" w:hAnsi="Arial" w:cs="Arial"/>
           <w:bCs/>
         </w:rPr>
-        <w:t>{{risk_to_known_adult}}</w:t>
+        <w:t>{{</w:t>
+      </w:r>
+      <w:proofErr w:type="spellStart"/>
+      <w:r>
+        <w:rPr>
+          <w:rFonts w:ascii="Arial" w:hAnsi="Arial" w:cs="Arial"/>
+          <w:bCs/>
+        </w:rPr>
+        <w:t>risk_to_known_adult</w:t>
+      </w:r>
+      <w:proofErr w:type="spellEnd"/>
+      <w:r>
+        <w:rPr>
+          <w:rFonts w:ascii="Arial" w:hAnsi="Arial" w:cs="Arial"/>
+          <w:bCs/>
+        </w:rPr>
+        <w:t>}}</w:t>
       </w:r>
       <w:r>
         <w:tab/>
@@ -3877,7 +4612,23 @@
           <w:rFonts w:ascii="Arial" w:hAnsi="Arial" w:cs="Arial"/>
           <w:bCs/>
         </w:rPr>
-        <w:t>{{risk_to_children}}</w:t>
+        <w:t>{{</w:t>
+      </w:r>
+      <w:proofErr w:type="spellStart"/>
+      <w:r>
+        <w:rPr>
+          <w:rFonts w:ascii="Arial" w:hAnsi="Arial" w:cs="Arial"/>
+          <w:bCs/>
+        </w:rPr>
+        <w:t>risk_to_children</w:t>
+      </w:r>
+      <w:proofErr w:type="spellEnd"/>
+      <w:r>
+        <w:rPr>
+          <w:rFonts w:ascii="Arial" w:hAnsi="Arial" w:cs="Arial"/>
+          <w:bCs/>
+        </w:rPr>
+        <w:t>}}</w:t>
       </w:r>
     </w:p>
     <w:p>
@@ -3920,7 +4671,23 @@
           <w:rFonts w:ascii="Arial" w:hAnsi="Arial" w:cs="Arial"/>
           <w:bCs/>
         </w:rPr>
-        <w:t>{{risk_to_prisoners}}</w:t>
+        <w:t>{{</w:t>
+      </w:r>
+      <w:proofErr w:type="spellStart"/>
+      <w:r>
+        <w:rPr>
+          <w:rFonts w:ascii="Arial" w:hAnsi="Arial" w:cs="Arial"/>
+          <w:bCs/>
+        </w:rPr>
+        <w:t>risk_to_prisoners</w:t>
+      </w:r>
+      <w:proofErr w:type="spellEnd"/>
+      <w:r>
+        <w:rPr>
+          <w:rFonts w:ascii="Arial" w:hAnsi="Arial" w:cs="Arial"/>
+          <w:bCs/>
+        </w:rPr>
+        <w:t>}}</w:t>
       </w:r>
     </w:p>
     <w:p>
@@ -3956,7 +4723,23 @@
           <w:rFonts w:ascii="Arial" w:hAnsi="Arial" w:cs="Arial"/>
           <w:bCs/>
         </w:rPr>
-        <w:t>{{risk_to_staff}}</w:t>
+        <w:t>{{</w:t>
+      </w:r>
+      <w:proofErr w:type="spellStart"/>
+      <w:r>
+        <w:rPr>
+          <w:rFonts w:ascii="Arial" w:hAnsi="Arial" w:cs="Arial"/>
+          <w:bCs/>
+        </w:rPr>
+        <w:t>risk_to_staff</w:t>
+      </w:r>
+      <w:proofErr w:type="spellEnd"/>
+      <w:r>
+        <w:rPr>
+          <w:rFonts w:ascii="Arial" w:hAnsi="Arial" w:cs="Arial"/>
+          <w:bCs/>
+        </w:rPr>
+        <w:t>}}</w:t>
       </w:r>
     </w:p>
     <w:p>
@@ -4037,7 +4820,23 @@
           <w:rFonts w:ascii="Arial" w:hAnsi="Arial" w:cs="Arial"/>
           <w:bCs/>
         </w:rPr>
-        <w:t>{{index_offence_details}}</w:t>
+        <w:t>{{</w:t>
+      </w:r>
+      <w:proofErr w:type="spellStart"/>
+      <w:r>
+        <w:rPr>
+          <w:rFonts w:ascii="Arial" w:hAnsi="Arial" w:cs="Arial"/>
+          <w:bCs/>
+        </w:rPr>
+        <w:t>index_offence_details</w:t>
+      </w:r>
+      <w:proofErr w:type="spellEnd"/>
+      <w:r>
+        <w:rPr>
+          <w:rFonts w:ascii="Arial" w:hAnsi="Arial" w:cs="Arial"/>
+          <w:bCs/>
+        </w:rPr>
+        <w:t>}}</w:t>
       </w:r>
     </w:p>
     <w:p>
@@ -4150,7 +4949,27 @@
                 <w:sz w:val="22"/>
                 <w:szCs w:val="22"/>
               </w:rPr>
-              <w:t>{{good_behaviour_condition}}</w:t>
+              <w:t>{{</w:t>
+            </w:r>
+            <w:proofErr w:type="spellStart"/>
+            <w:r>
+              <w:rPr>
+                <w:rFonts w:ascii="Arial" w:hAnsi="Arial" w:cs="Arial"/>
+                <w:bCs/>
+                <w:sz w:val="22"/>
+                <w:szCs w:val="22"/>
+              </w:rPr>
+              <w:t>good_behaviour_condition</w:t>
+            </w:r>
+            <w:proofErr w:type="spellEnd"/>
+            <w:r>
+              <w:rPr>
+                <w:rFonts w:ascii="Arial" w:hAnsi="Arial" w:cs="Arial"/>
+                <w:bCs/>
+                <w:sz w:val="22"/>
+                <w:szCs w:val="22"/>
+              </w:rPr>
+              <w:t>}}</w:t>
             </w:r>
             <w:r>
               <w:rPr>
@@ -4195,7 +5014,27 @@
                 <w:sz w:val="22"/>
                 <w:szCs w:val="22"/>
               </w:rPr>
-              <w:t xml:space="preserve">{{no_offence_condition}} </w:t>
+              <w:t>{{</w:t>
+            </w:r>
+            <w:proofErr w:type="spellStart"/>
+            <w:r>
+              <w:rPr>
+                <w:rFonts w:ascii="Arial" w:hAnsi="Arial" w:cs="Arial"/>
+                <w:bCs/>
+                <w:sz w:val="22"/>
+                <w:szCs w:val="22"/>
+              </w:rPr>
+              <w:t>no_offence_condition</w:t>
+            </w:r>
+            <w:proofErr w:type="spellEnd"/>
+            <w:r>
+              <w:rPr>
+                <w:rFonts w:ascii="Arial" w:hAnsi="Arial" w:cs="Arial"/>
+                <w:bCs/>
+                <w:sz w:val="22"/>
+                <w:szCs w:val="22"/>
+              </w:rPr>
+              <w:t xml:space="preserve">}} </w:t>
             </w:r>
             <w:r>
               <w:rPr>
@@ -4230,7 +5069,27 @@
                 <w:sz w:val="22"/>
                 <w:szCs w:val="22"/>
               </w:rPr>
-              <w:t xml:space="preserve">{{keep_in_touch_condition}} </w:t>
+              <w:t>{{</w:t>
+            </w:r>
+            <w:proofErr w:type="spellStart"/>
+            <w:r>
+              <w:rPr>
+                <w:rFonts w:ascii="Arial" w:hAnsi="Arial" w:cs="Arial"/>
+                <w:bCs/>
+                <w:sz w:val="22"/>
+                <w:szCs w:val="22"/>
+              </w:rPr>
+              <w:t>keep_in_touch_condition</w:t>
+            </w:r>
+            <w:proofErr w:type="spellEnd"/>
+            <w:r>
+              <w:rPr>
+                <w:rFonts w:ascii="Arial" w:hAnsi="Arial" w:cs="Arial"/>
+                <w:bCs/>
+                <w:sz w:val="22"/>
+                <w:szCs w:val="22"/>
+              </w:rPr>
+              <w:t xml:space="preserve">}} </w:t>
             </w:r>
             <w:r>
               <w:rPr>
@@ -4265,7 +5124,27 @@
                 <w:sz w:val="22"/>
                 <w:szCs w:val="22"/>
               </w:rPr>
-              <w:t xml:space="preserve">{{officer_visit_condition}} </w:t>
+              <w:t>{{</w:t>
+            </w:r>
+            <w:proofErr w:type="spellStart"/>
+            <w:r>
+              <w:rPr>
+                <w:rFonts w:ascii="Arial" w:hAnsi="Arial" w:cs="Arial"/>
+                <w:bCs/>
+                <w:sz w:val="22"/>
+                <w:szCs w:val="22"/>
+              </w:rPr>
+              <w:t>officer_visit_condition</w:t>
+            </w:r>
+            <w:proofErr w:type="spellEnd"/>
+            <w:r>
+              <w:rPr>
+                <w:rFonts w:ascii="Arial" w:hAnsi="Arial" w:cs="Arial"/>
+                <w:bCs/>
+                <w:sz w:val="22"/>
+                <w:szCs w:val="22"/>
+              </w:rPr>
+              <w:t xml:space="preserve">}} </w:t>
             </w:r>
             <w:r>
               <w:rPr>
@@ -4300,7 +5179,27 @@
                 <w:sz w:val="22"/>
                 <w:szCs w:val="22"/>
               </w:rPr>
-              <w:t xml:space="preserve">{{address_approved_condition}} </w:t>
+              <w:t>{{</w:t>
+            </w:r>
+            <w:proofErr w:type="spellStart"/>
+            <w:r>
+              <w:rPr>
+                <w:rFonts w:ascii="Arial" w:hAnsi="Arial" w:cs="Arial"/>
+                <w:bCs/>
+                <w:sz w:val="22"/>
+                <w:szCs w:val="22"/>
+              </w:rPr>
+              <w:t>address_approved_condition</w:t>
+            </w:r>
+            <w:proofErr w:type="spellEnd"/>
+            <w:r>
+              <w:rPr>
+                <w:rFonts w:ascii="Arial" w:hAnsi="Arial" w:cs="Arial"/>
+                <w:bCs/>
+                <w:sz w:val="22"/>
+                <w:szCs w:val="22"/>
+              </w:rPr>
+              <w:t xml:space="preserve">}} </w:t>
             </w:r>
             <w:r>
               <w:rPr>
@@ -4345,7 +5244,27 @@
                 <w:szCs w:val="22"/>
               </w:rPr>
               <w:lastRenderedPageBreak/>
-              <w:t xml:space="preserve">{{no_work_undertaken_condition}} </w:t>
+              <w:t>{{</w:t>
+            </w:r>
+            <w:proofErr w:type="spellStart"/>
+            <w:r>
+              <w:rPr>
+                <w:rFonts w:ascii="Arial" w:hAnsi="Arial" w:cs="Arial"/>
+                <w:bCs/>
+                <w:sz w:val="22"/>
+                <w:szCs w:val="22"/>
+              </w:rPr>
+              <w:t>no_work_undertaken_condition</w:t>
+            </w:r>
+            <w:proofErr w:type="spellEnd"/>
+            <w:r>
+              <w:rPr>
+                <w:rFonts w:ascii="Arial" w:hAnsi="Arial" w:cs="Arial"/>
+                <w:bCs/>
+                <w:sz w:val="22"/>
+                <w:szCs w:val="22"/>
+              </w:rPr>
+              <w:t xml:space="preserve">}} </w:t>
             </w:r>
             <w:r>
               <w:rPr>
@@ -4380,7 +5299,27 @@
                 <w:sz w:val="22"/>
                 <w:szCs w:val="22"/>
               </w:rPr>
-              <w:t>{{no_travel_condition}}</w:t>
+              <w:t>{{</w:t>
+            </w:r>
+            <w:proofErr w:type="spellStart"/>
+            <w:r>
+              <w:rPr>
+                <w:rFonts w:ascii="Arial" w:hAnsi="Arial" w:cs="Arial"/>
+                <w:bCs/>
+                <w:sz w:val="22"/>
+                <w:szCs w:val="22"/>
+              </w:rPr>
+              <w:t>no_travel_condition</w:t>
+            </w:r>
+            <w:proofErr w:type="spellEnd"/>
+            <w:r>
+              <w:rPr>
+                <w:rFonts w:ascii="Arial" w:hAnsi="Arial" w:cs="Arial"/>
+                <w:bCs/>
+                <w:sz w:val="22"/>
+                <w:szCs w:val="22"/>
+              </w:rPr>
+              <w:t>}}</w:t>
             </w:r>
             <w:r>
               <w:rPr>
@@ -4426,7 +5365,27 @@
                 <w:sz w:val="22"/>
                 <w:szCs w:val="22"/>
               </w:rPr>
-              <w:t>{{other_name_known_by}}</w:t>
+              <w:t>{{</w:t>
+            </w:r>
+            <w:proofErr w:type="spellStart"/>
+            <w:r>
+              <w:rPr>
+                <w:rFonts w:ascii="Arial" w:hAnsi="Arial" w:cs="Arial"/>
+                <w:bCs/>
+                <w:sz w:val="22"/>
+                <w:szCs w:val="22"/>
+              </w:rPr>
+              <w:t>other_name_known_by</w:t>
+            </w:r>
+            <w:proofErr w:type="spellEnd"/>
+            <w:r>
+              <w:rPr>
+                <w:rFonts w:ascii="Arial" w:hAnsi="Arial" w:cs="Arial"/>
+                <w:bCs/>
+                <w:sz w:val="22"/>
+                <w:szCs w:val="22"/>
+              </w:rPr>
+              <w:t>}}</w:t>
             </w:r>
             <w:r>
               <w:rPr>
@@ -4483,7 +5442,27 @@
                 <w:sz w:val="22"/>
                 <w:szCs w:val="22"/>
               </w:rPr>
-              <w:t>{{contact_details_changed}}</w:t>
+              <w:t>{{</w:t>
+            </w:r>
+            <w:proofErr w:type="spellStart"/>
+            <w:r>
+              <w:rPr>
+                <w:rFonts w:ascii="Arial" w:hAnsi="Arial" w:cs="Arial"/>
+                <w:bCs/>
+                <w:sz w:val="22"/>
+                <w:szCs w:val="22"/>
+              </w:rPr>
+              <w:t>contact_details_changed</w:t>
+            </w:r>
+            <w:proofErr w:type="spellEnd"/>
+            <w:r>
+              <w:rPr>
+                <w:rFonts w:ascii="Arial" w:hAnsi="Arial" w:cs="Arial"/>
+                <w:bCs/>
+                <w:sz w:val="22"/>
+                <w:szCs w:val="22"/>
+              </w:rPr>
+              <w:t>}}</w:t>
             </w:r>
             <w:r>
               <w:rPr>
@@ -4606,7 +5585,23 @@
           <w:rFonts w:ascii="Arial" w:hAnsi="Arial" w:cs="Arial"/>
           <w:bCs/>
         </w:rPr>
-        <w:t>{{additional_conditions_breached}}</w:t>
+        <w:t>{{</w:t>
+      </w:r>
+      <w:proofErr w:type="spellStart"/>
+      <w:r>
+        <w:rPr>
+          <w:rFonts w:ascii="Arial" w:hAnsi="Arial" w:cs="Arial"/>
+          <w:bCs/>
+        </w:rPr>
+        <w:t>additional_conditions_breached</w:t>
+      </w:r>
+      <w:proofErr w:type="spellEnd"/>
+      <w:r>
+        <w:rPr>
+          <w:rFonts w:ascii="Arial" w:hAnsi="Arial" w:cs="Arial"/>
+          <w:bCs/>
+        </w:rPr>
+        <w:t>}}</w:t>
       </w:r>
     </w:p>
     <w:p>
@@ -4760,7 +5755,23 @@
           <w:rFonts w:ascii="Arial" w:hAnsi="Arial" w:cs="Arial"/>
           <w:bCs/>
         </w:rPr>
-        <w:t>{{what_led_to_recall}}</w:t>
+        <w:t>{{</w:t>
+      </w:r>
+      <w:proofErr w:type="spellStart"/>
+      <w:r>
+        <w:rPr>
+          <w:rFonts w:ascii="Arial" w:hAnsi="Arial" w:cs="Arial"/>
+          <w:bCs/>
+        </w:rPr>
+        <w:t>what_led_to_recall</w:t>
+      </w:r>
+      <w:proofErr w:type="spellEnd"/>
+      <w:r>
+        <w:rPr>
+          <w:rFonts w:ascii="Arial" w:hAnsi="Arial" w:cs="Arial"/>
+          <w:bCs/>
+        </w:rPr>
+        <w:t>}}</w:t>
       </w:r>
     </w:p>
     <w:tbl>
@@ -5015,7 +6026,27 @@
                 <w:sz w:val="22"/>
                 <w:szCs w:val="22"/>
               </w:rPr>
-              <w:t>{{warning_letter_details}}</w:t>
+              <w:t>{{</w:t>
+            </w:r>
+            <w:proofErr w:type="spellStart"/>
+            <w:r>
+              <w:rPr>
+                <w:rFonts w:ascii="Arial" w:hAnsi="Arial" w:cs="Arial"/>
+                <w:bCs/>
+                <w:sz w:val="22"/>
+                <w:szCs w:val="22"/>
+              </w:rPr>
+              <w:t>warning_letter_details</w:t>
+            </w:r>
+            <w:proofErr w:type="spellEnd"/>
+            <w:r>
+              <w:rPr>
+                <w:rFonts w:ascii="Arial" w:hAnsi="Arial" w:cs="Arial"/>
+                <w:bCs/>
+                <w:sz w:val="22"/>
+                <w:szCs w:val="22"/>
+              </w:rPr>
+              <w:t>}}</w:t>
             </w:r>
           </w:p>
         </w:tc>
@@ -5072,7 +6103,27 @@
                 <w:sz w:val="22"/>
                 <w:szCs w:val="22"/>
               </w:rPr>
-              <w:t>{{increased_frequency_details}}</w:t>
+              <w:t>{{</w:t>
+            </w:r>
+            <w:proofErr w:type="spellStart"/>
+            <w:r>
+              <w:rPr>
+                <w:rFonts w:ascii="Arial" w:hAnsi="Arial" w:cs="Arial"/>
+                <w:bCs/>
+                <w:sz w:val="22"/>
+                <w:szCs w:val="22"/>
+              </w:rPr>
+              <w:t>increased_frequency_details</w:t>
+            </w:r>
+            <w:proofErr w:type="spellEnd"/>
+            <w:r>
+              <w:rPr>
+                <w:rFonts w:ascii="Arial" w:hAnsi="Arial" w:cs="Arial"/>
+                <w:bCs/>
+                <w:sz w:val="22"/>
+                <w:szCs w:val="22"/>
+              </w:rPr>
+              <w:t>}}</w:t>
             </w:r>
           </w:p>
         </w:tc>
@@ -5129,7 +6180,27 @@
                 <w:sz w:val="22"/>
                 <w:szCs w:val="22"/>
               </w:rPr>
-              <w:t>{{extra_licence_conditions_details}}</w:t>
+              <w:t>{{</w:t>
+            </w:r>
+            <w:proofErr w:type="spellStart"/>
+            <w:r>
+              <w:rPr>
+                <w:rFonts w:ascii="Arial" w:hAnsi="Arial" w:cs="Arial"/>
+                <w:bCs/>
+                <w:sz w:val="22"/>
+                <w:szCs w:val="22"/>
+              </w:rPr>
+              <w:t>extra_licence_conditions_details</w:t>
+            </w:r>
+            <w:proofErr w:type="spellEnd"/>
+            <w:r>
+              <w:rPr>
+                <w:rFonts w:ascii="Arial" w:hAnsi="Arial" w:cs="Arial"/>
+                <w:bCs/>
+                <w:sz w:val="22"/>
+                <w:szCs w:val="22"/>
+              </w:rPr>
+              <w:t>}}</w:t>
             </w:r>
           </w:p>
         </w:tc>
@@ -5186,7 +6257,27 @@
                 <w:sz w:val="22"/>
                 <w:szCs w:val="22"/>
               </w:rPr>
-              <w:t>{{referral_to_other_teams_details}}</w:t>
+              <w:t>{{</w:t>
+            </w:r>
+            <w:proofErr w:type="spellStart"/>
+            <w:r>
+              <w:rPr>
+                <w:rFonts w:ascii="Arial" w:hAnsi="Arial" w:cs="Arial"/>
+                <w:bCs/>
+                <w:sz w:val="22"/>
+                <w:szCs w:val="22"/>
+              </w:rPr>
+              <w:t>referral_to_other_teams_details</w:t>
+            </w:r>
+            <w:proofErr w:type="spellEnd"/>
+            <w:r>
+              <w:rPr>
+                <w:rFonts w:ascii="Arial" w:hAnsi="Arial" w:cs="Arial"/>
+                <w:bCs/>
+                <w:sz w:val="22"/>
+                <w:szCs w:val="22"/>
+              </w:rPr>
+              <w:t>}}</w:t>
             </w:r>
           </w:p>
         </w:tc>
@@ -5243,7 +6334,27 @@
                 <w:sz w:val="22"/>
                 <w:szCs w:val="22"/>
               </w:rPr>
-              <w:t>{{referral_to_partnership_agencies_details}}</w:t>
+              <w:t>{{</w:t>
+            </w:r>
+            <w:proofErr w:type="spellStart"/>
+            <w:r>
+              <w:rPr>
+                <w:rFonts w:ascii="Arial" w:hAnsi="Arial" w:cs="Arial"/>
+                <w:bCs/>
+                <w:sz w:val="22"/>
+                <w:szCs w:val="22"/>
+              </w:rPr>
+              <w:t>referral_to_partnership_agencies_details</w:t>
+            </w:r>
+            <w:proofErr w:type="spellEnd"/>
+            <w:r>
+              <w:rPr>
+                <w:rFonts w:ascii="Arial" w:hAnsi="Arial" w:cs="Arial"/>
+                <w:bCs/>
+                <w:sz w:val="22"/>
+                <w:szCs w:val="22"/>
+              </w:rPr>
+              <w:t>}}</w:t>
             </w:r>
           </w:p>
         </w:tc>
@@ -5300,7 +6411,27 @@
                 <w:sz w:val="22"/>
                 <w:szCs w:val="22"/>
               </w:rPr>
-              <w:t>{{referral_to_approved_premises_details}}</w:t>
+              <w:t>{{</w:t>
+            </w:r>
+            <w:proofErr w:type="spellStart"/>
+            <w:r>
+              <w:rPr>
+                <w:rFonts w:ascii="Arial" w:hAnsi="Arial" w:cs="Arial"/>
+                <w:bCs/>
+                <w:sz w:val="22"/>
+                <w:szCs w:val="22"/>
+              </w:rPr>
+              <w:t>referral_to_approved_premises_details</w:t>
+            </w:r>
+            <w:proofErr w:type="spellEnd"/>
+            <w:r>
+              <w:rPr>
+                <w:rFonts w:ascii="Arial" w:hAnsi="Arial" w:cs="Arial"/>
+                <w:bCs/>
+                <w:sz w:val="22"/>
+                <w:szCs w:val="22"/>
+              </w:rPr>
+              <w:t>}}</w:t>
             </w:r>
           </w:p>
         </w:tc>
@@ -5357,7 +6488,27 @@
                 <w:sz w:val="22"/>
                 <w:szCs w:val="22"/>
               </w:rPr>
-              <w:t>{{drug_testing_details}}</w:t>
+              <w:t>{{</w:t>
+            </w:r>
+            <w:proofErr w:type="spellStart"/>
+            <w:r>
+              <w:rPr>
+                <w:rFonts w:ascii="Arial" w:hAnsi="Arial" w:cs="Arial"/>
+                <w:bCs/>
+                <w:sz w:val="22"/>
+                <w:szCs w:val="22"/>
+              </w:rPr>
+              <w:t>drug_testing_details</w:t>
+            </w:r>
+            <w:proofErr w:type="spellEnd"/>
+            <w:r>
+              <w:rPr>
+                <w:rFonts w:ascii="Arial" w:hAnsi="Arial" w:cs="Arial"/>
+                <w:bCs/>
+                <w:sz w:val="22"/>
+                <w:szCs w:val="22"/>
+              </w:rPr>
+              <w:t>}}</w:t>
             </w:r>
           </w:p>
         </w:tc>
@@ -5414,7 +6565,27 @@
                 <w:sz w:val="22"/>
                 <w:szCs w:val="22"/>
               </w:rPr>
-              <w:t>{{alternative_to_recall_other_details}}</w:t>
+              <w:t>{{</w:t>
+            </w:r>
+            <w:proofErr w:type="spellStart"/>
+            <w:r>
+              <w:rPr>
+                <w:rFonts w:ascii="Arial" w:hAnsi="Arial" w:cs="Arial"/>
+                <w:bCs/>
+                <w:sz w:val="22"/>
+                <w:szCs w:val="22"/>
+              </w:rPr>
+              <w:t>alternative_to_recall_other_details</w:t>
+            </w:r>
+            <w:proofErr w:type="spellEnd"/>
+            <w:r>
+              <w:rPr>
+                <w:rFonts w:ascii="Arial" w:hAnsi="Arial" w:cs="Arial"/>
+                <w:bCs/>
+                <w:sz w:val="22"/>
+                <w:szCs w:val="22"/>
+              </w:rPr>
+              <w:t>}}</w:t>
             </w:r>
           </w:p>
         </w:tc>
@@ -5565,7 +6736,23 @@
           <w:rFonts w:ascii="Arial" w:hAnsi="Arial" w:cs="Arial"/>
           <w:bCs/>
         </w:rPr>
-        <w:t>{{recall_type}}</w:t>
+        <w:t>{{</w:t>
+      </w:r>
+      <w:proofErr w:type="spellStart"/>
+      <w:r>
+        <w:rPr>
+          <w:rFonts w:ascii="Arial" w:hAnsi="Arial" w:cs="Arial"/>
+          <w:bCs/>
+        </w:rPr>
+        <w:t>recall_type</w:t>
+      </w:r>
+      <w:proofErr w:type="spellEnd"/>
+      <w:r>
+        <w:rPr>
+          <w:rFonts w:ascii="Arial" w:hAnsi="Arial" w:cs="Arial"/>
+          <w:bCs/>
+        </w:rPr>
+        <w:t>}}</w:t>
       </w:r>
       <w:r>
         <w:rPr>
@@ -5606,14 +6793,24 @@
           <w:rFonts w:ascii="Arial" w:hAnsi="Arial" w:cs="Arial"/>
           <w:bCs/>
         </w:rPr>
-        <w:t>{{recall_type_details}}</w:t>
-      </w:r>
-      <w:r>
-        <w:rPr>
-          <w:rFonts w:ascii="Arial" w:hAnsi="Arial" w:cs="Arial"/>
-          <w:b/>
-        </w:rPr>
-        <w:t xml:space="preserve">                          </w:t>
+        <w:t>{{</w:t>
+      </w:r>
+      <w:proofErr w:type="spellStart"/>
+      <w:r>
+        <w:rPr>
+          <w:rFonts w:ascii="Arial" w:hAnsi="Arial" w:cs="Arial"/>
+          <w:bCs/>
+        </w:rPr>
+        <w:t>recall_type_details</w:t>
+      </w:r>
+      <w:proofErr w:type="spellEnd"/>
+      <w:proofErr w:type="gramStart"/>
+      <w:r>
+        <w:rPr>
+          <w:rFonts w:ascii="Arial" w:hAnsi="Arial" w:cs="Arial"/>
+          <w:bCs/>
+        </w:rPr>
+        <w:t>}}</w:t>
       </w:r>
       <w:r>
         <w:rPr>
@@ -5622,6 +6819,21 @@
         </w:rPr>
         <w:t xml:space="preserve">   </w:t>
       </w:r>
+      <w:proofErr w:type="gramEnd"/>
+      <w:r>
+        <w:rPr>
+          <w:rFonts w:ascii="Arial" w:hAnsi="Arial" w:cs="Arial"/>
+          <w:b/>
+        </w:rPr>
+        <w:t xml:space="preserve">                       </w:t>
+      </w:r>
+      <w:r>
+        <w:rPr>
+          <w:rFonts w:ascii="Arial" w:hAnsi="Arial" w:cs="Arial"/>
+          <w:b/>
+        </w:rPr>
+        <w:t xml:space="preserve">   </w:t>
+      </w:r>
       <w:r>
         <w:rPr>
           <w:rFonts w:ascii="Arial" w:hAnsi="Arial" w:cs="Arial"/>
@@ -5753,7 +6965,23 @@
           <w:rFonts w:ascii="Arial" w:hAnsi="Arial" w:cs="Arial"/>
           <w:bCs/>
         </w:rPr>
-        <w:t>{{fixed_term_additional_licence_conditions}}</w:t>
+        <w:t>{{</w:t>
+      </w:r>
+      <w:proofErr w:type="spellStart"/>
+      <w:r>
+        <w:rPr>
+          <w:rFonts w:ascii="Arial" w:hAnsi="Arial" w:cs="Arial"/>
+          <w:bCs/>
+        </w:rPr>
+        <w:t>fixed_term_additional_licence_conditions</w:t>
+      </w:r>
+      <w:proofErr w:type="spellEnd"/>
+      <w:r>
+        <w:rPr>
+          <w:rFonts w:ascii="Arial" w:hAnsi="Arial" w:cs="Arial"/>
+          <w:bCs/>
+        </w:rPr>
+        <w:t>}}</w:t>
       </w:r>
     </w:p>
     <w:p>
@@ -5951,12 +7179,37 @@
           <w:rFonts w:ascii="Arial" w:hAnsi="Arial" w:cs="Arial"/>
         </w:rPr>
       </w:pPr>
-      <w:r>
-        <w:rPr>
-          <w:rFonts w:ascii="Arial" w:hAnsi="Arial" w:cs="Arial"/>
-          <w:b/>
-        </w:rPr>
-        <w:t>i) Has the offender exhibited behaviour similar to the circumstances surrounding the index offence</w:t>
+      <w:proofErr w:type="spellStart"/>
+      <w:r>
+        <w:rPr>
+          <w:rFonts w:ascii="Arial" w:hAnsi="Arial" w:cs="Arial"/>
+          <w:b/>
+        </w:rPr>
+        <w:t>i</w:t>
+      </w:r>
+      <w:proofErr w:type="spellEnd"/>
+      <w:r>
+        <w:rPr>
+          <w:rFonts w:ascii="Arial" w:hAnsi="Arial" w:cs="Arial"/>
+          <w:b/>
+        </w:rPr>
+        <w:t xml:space="preserve">) Has the offender exhibited behaviour </w:t>
+      </w:r>
+      <w:proofErr w:type="gramStart"/>
+      <w:r>
+        <w:rPr>
+          <w:rFonts w:ascii="Arial" w:hAnsi="Arial" w:cs="Arial"/>
+          <w:b/>
+        </w:rPr>
+        <w:t>similar to</w:t>
+      </w:r>
+      <w:proofErr w:type="gramEnd"/>
+      <w:r>
+        <w:rPr>
+          <w:rFonts w:ascii="Arial" w:hAnsi="Arial" w:cs="Arial"/>
+          <w:b/>
+        </w:rPr>
+        <w:t xml:space="preserve"> the circumstances surrounding the index offence</w:t>
       </w:r>
       <w:r>
         <w:rPr>
@@ -5977,7 +7230,23 @@
           <w:rFonts w:ascii="Arial" w:hAnsi="Arial" w:cs="Arial"/>
           <w:bCs/>
         </w:rPr>
-        <w:t>{{behaviour_similar_to_index_offence_present}}</w:t>
+        <w:t>{{</w:t>
+      </w:r>
+      <w:proofErr w:type="spellStart"/>
+      <w:r>
+        <w:rPr>
+          <w:rFonts w:ascii="Arial" w:hAnsi="Arial" w:cs="Arial"/>
+          <w:bCs/>
+        </w:rPr>
+        <w:t>behaviour_similar_to_index_offence_present</w:t>
+      </w:r>
+      <w:proofErr w:type="spellEnd"/>
+      <w:r>
+        <w:rPr>
+          <w:rFonts w:ascii="Arial" w:hAnsi="Arial" w:cs="Arial"/>
+          <w:bCs/>
+        </w:rPr>
+        <w:t>}}</w:t>
       </w:r>
       <w:r>
         <w:rPr>
@@ -6012,7 +7281,23 @@
           <w:rFonts w:ascii="Arial" w:hAnsi="Arial" w:cs="Arial"/>
           <w:bCs/>
         </w:rPr>
-        <w:t>{{behaviour_similar_to_index_offence}}</w:t>
+        <w:t>{{</w:t>
+      </w:r>
+      <w:proofErr w:type="spellStart"/>
+      <w:r>
+        <w:rPr>
+          <w:rFonts w:ascii="Arial" w:hAnsi="Arial" w:cs="Arial"/>
+          <w:bCs/>
+        </w:rPr>
+        <w:t>behaviour_similar_to_index_offence</w:t>
+      </w:r>
+      <w:proofErr w:type="spellEnd"/>
+      <w:r>
+        <w:rPr>
+          <w:rFonts w:ascii="Arial" w:hAnsi="Arial" w:cs="Arial"/>
+          <w:bCs/>
+        </w:rPr>
+        <w:t>}}</w:t>
       </w:r>
     </w:p>
     <w:p>
@@ -6049,14 +7334,38 @@
           <w:rFonts w:ascii="Arial" w:hAnsi="Arial" w:cs="Arial"/>
           <w:b/>
         </w:rPr>
-        <w:t xml:space="preserve">ii) Has the offender exhibited behaviour likely to give rise, or does give rise to  a sexual or violent offence? </w:t>
-      </w:r>
-      <w:r>
-        <w:rPr>
-          <w:rFonts w:ascii="Arial" w:hAnsi="Arial" w:cs="Arial"/>
-          <w:bCs/>
-        </w:rPr>
-        <w:t>{{behaviour_</w:t>
+        <w:t xml:space="preserve">ii) Has the offender exhibited behaviour likely to give rise, or does give rise </w:t>
+      </w:r>
+      <w:proofErr w:type="gramStart"/>
+      <w:r>
+        <w:rPr>
+          <w:rFonts w:ascii="Arial" w:hAnsi="Arial" w:cs="Arial"/>
+          <w:b/>
+        </w:rPr>
+        <w:t>to  a</w:t>
+      </w:r>
+      <w:proofErr w:type="gramEnd"/>
+      <w:r>
+        <w:rPr>
+          <w:rFonts w:ascii="Arial" w:hAnsi="Arial" w:cs="Arial"/>
+          <w:b/>
+        </w:rPr>
+        <w:t xml:space="preserve"> sexual or violent offence? </w:t>
+      </w:r>
+      <w:r>
+        <w:rPr>
+          <w:rFonts w:ascii="Arial" w:hAnsi="Arial" w:cs="Arial"/>
+          <w:bCs/>
+        </w:rPr>
+        <w:t>{{</w:t>
+      </w:r>
+      <w:proofErr w:type="spellStart"/>
+      <w:r>
+        <w:rPr>
+          <w:rFonts w:ascii="Arial" w:hAnsi="Arial" w:cs="Arial"/>
+          <w:bCs/>
+        </w:rPr>
+        <w:t>behaviour_</w:t>
       </w:r>
       <w:r>
         <w:rPr>
@@ -6084,7 +7393,15 @@
           <w:rFonts w:ascii="Arial" w:hAnsi="Arial" w:cs="Arial"/>
           <w:bCs/>
         </w:rPr>
-        <w:t>_sexual_or_violent_offence_present}}</w:t>
+        <w:t>_sexual_or_violent_offence_present</w:t>
+      </w:r>
+      <w:proofErr w:type="spellEnd"/>
+      <w:r>
+        <w:rPr>
+          <w:rFonts w:ascii="Arial" w:hAnsi="Arial" w:cs="Arial"/>
+          <w:bCs/>
+        </w:rPr>
+        <w:t>}}</w:t>
       </w:r>
       <w:r>
         <w:rPr>
@@ -6114,6 +7431,7 @@
         </w:rPr>
         <w:t>{{</w:t>
       </w:r>
+      <w:proofErr w:type="spellStart"/>
       <w:r>
         <w:rPr>
           <w:rFonts w:ascii="Arial" w:hAnsi="Arial" w:cs="Arial"/>
@@ -6126,7 +7444,15 @@
           <w:rFonts w:ascii="Arial" w:hAnsi="Arial" w:cs="Arial"/>
           <w:bCs/>
         </w:rPr>
-        <w:t>_sexual_or_violent_offence}}</w:t>
+        <w:t>_sexual_or_violent_offence</w:t>
+      </w:r>
+      <w:proofErr w:type="spellEnd"/>
+      <w:r>
+        <w:rPr>
+          <w:rFonts w:ascii="Arial" w:hAnsi="Arial" w:cs="Arial"/>
+          <w:bCs/>
+        </w:rPr>
+        <w:t>}}</w:t>
       </w:r>
     </w:p>
     <w:p>
@@ -6184,7 +7510,23 @@
           <w:rFonts w:ascii="Arial" w:hAnsi="Arial" w:cs="Arial"/>
           <w:bCs/>
         </w:rPr>
-        <w:t>{{behaviour_leading_to_sexual_or_violent_offence_present}}</w:t>
+        <w:t>{{</w:t>
+      </w:r>
+      <w:proofErr w:type="spellStart"/>
+      <w:r>
+        <w:rPr>
+          <w:rFonts w:ascii="Arial" w:hAnsi="Arial" w:cs="Arial"/>
+          <w:bCs/>
+        </w:rPr>
+        <w:t>behaviour_leading_to_sexual_or_violent_offence_present</w:t>
+      </w:r>
+      <w:proofErr w:type="spellEnd"/>
+      <w:r>
+        <w:rPr>
+          <w:rFonts w:ascii="Arial" w:hAnsi="Arial" w:cs="Arial"/>
+          <w:bCs/>
+        </w:rPr>
+        <w:t>}}</w:t>
       </w:r>
       <w:r>
         <w:rPr>
@@ -6205,7 +7547,23 @@
           <w:rFonts w:ascii="Arial" w:hAnsi="Arial" w:cs="Arial"/>
           <w:bCs/>
         </w:rPr>
-        <w:t>{{behaviour_leading_to_sexual_or_violent_offence}}</w:t>
+        <w:t>{{</w:t>
+      </w:r>
+      <w:proofErr w:type="spellStart"/>
+      <w:r>
+        <w:rPr>
+          <w:rFonts w:ascii="Arial" w:hAnsi="Arial" w:cs="Arial"/>
+          <w:bCs/>
+        </w:rPr>
+        <w:t>behaviour_leading_to_sexual_or_violent_offence</w:t>
+      </w:r>
+      <w:proofErr w:type="spellEnd"/>
+      <w:r>
+        <w:rPr>
+          <w:rFonts w:ascii="Arial" w:hAnsi="Arial" w:cs="Arial"/>
+          <w:bCs/>
+        </w:rPr>
+        <w:t>}}</w:t>
       </w:r>
     </w:p>
     <w:p>
@@ -6250,7 +7608,24 @@
           <w:rFonts w:ascii="Arial" w:hAnsi="Arial" w:cs="Arial"/>
           <w:bCs/>
         </w:rPr>
-        <w:t>{{out_of_touch_present}}</w:t>
+        <w:t>{{</w:t>
+      </w:r>
+      <w:proofErr w:type="spellStart"/>
+      <w:r>
+        <w:rPr>
+          <w:rFonts w:ascii="Arial" w:hAnsi="Arial" w:cs="Arial"/>
+          <w:bCs/>
+        </w:rPr>
+        <w:t>out_of_touch_present</w:t>
+      </w:r>
+      <w:proofErr w:type="spellEnd"/>
+      <w:proofErr w:type="gramStart"/>
+      <w:r>
+        <w:rPr>
+          <w:rFonts w:ascii="Arial" w:hAnsi="Arial" w:cs="Arial"/>
+          <w:bCs/>
+        </w:rPr>
+        <w:t>}}</w:t>
       </w:r>
       <w:r>
         <w:rPr>
@@ -6264,14 +7639,38 @@
           <w:rFonts w:ascii="Arial" w:hAnsi="Arial" w:cs="Arial"/>
           <w:b/>
         </w:rPr>
-        <w:t xml:space="preserve"> Provide details: </w:t>
-      </w:r>
-      <w:r>
-        <w:rPr>
-          <w:rFonts w:ascii="Arial" w:hAnsi="Arial" w:cs="Arial"/>
-          <w:bCs/>
-        </w:rPr>
-        <w:t>{{out_of_touch}}</w:t>
+        <w:t xml:space="preserve"> Provide</w:t>
+      </w:r>
+      <w:proofErr w:type="gramEnd"/>
+      <w:r>
+        <w:rPr>
+          <w:rFonts w:ascii="Arial" w:hAnsi="Arial" w:cs="Arial"/>
+          <w:b/>
+        </w:rPr>
+        <w:t xml:space="preserve"> details: </w:t>
+      </w:r>
+      <w:r>
+        <w:rPr>
+          <w:rFonts w:ascii="Arial" w:hAnsi="Arial" w:cs="Arial"/>
+          <w:bCs/>
+        </w:rPr>
+        <w:t>{{</w:t>
+      </w:r>
+      <w:proofErr w:type="spellStart"/>
+      <w:r>
+        <w:rPr>
+          <w:rFonts w:ascii="Arial" w:hAnsi="Arial" w:cs="Arial"/>
+          <w:bCs/>
+        </w:rPr>
+        <w:t>out_of_touch</w:t>
+      </w:r>
+      <w:proofErr w:type="spellEnd"/>
+      <w:r>
+        <w:rPr>
+          <w:rFonts w:ascii="Arial" w:hAnsi="Arial" w:cs="Arial"/>
+          <w:bCs/>
+        </w:rPr>
+        <w:t>}}</w:t>
       </w:r>
       <w:r>
         <w:rPr>
@@ -6329,14 +7728,46 @@
           <w:rFonts w:ascii="Arial" w:hAnsi="Arial" w:cs="Arial"/>
           <w:b/>
         </w:rPr>
-        <w:t xml:space="preserve">be made that (i), (ii) or (iii) may arise? </w:t>
-      </w:r>
-      <w:r>
-        <w:rPr>
-          <w:rFonts w:ascii="Arial" w:hAnsi="Arial" w:cs="Arial"/>
-          <w:bCs/>
-        </w:rPr>
-        <w:t>{{out_of_touch}}</w:t>
+        <w:t>be made that (</w:t>
+      </w:r>
+      <w:proofErr w:type="spellStart"/>
+      <w:r>
+        <w:rPr>
+          <w:rFonts w:ascii="Arial" w:hAnsi="Arial" w:cs="Arial"/>
+          <w:b/>
+        </w:rPr>
+        <w:t>i</w:t>
+      </w:r>
+      <w:proofErr w:type="spellEnd"/>
+      <w:r>
+        <w:rPr>
+          <w:rFonts w:ascii="Arial" w:hAnsi="Arial" w:cs="Arial"/>
+          <w:b/>
+        </w:rPr>
+        <w:t xml:space="preserve">), (ii) or (iii) may arise? </w:t>
+      </w:r>
+      <w:r>
+        <w:rPr>
+          <w:rFonts w:ascii="Arial" w:hAnsi="Arial" w:cs="Arial"/>
+          <w:bCs/>
+        </w:rPr>
+        <w:t>{{</w:t>
+      </w:r>
+      <w:proofErr w:type="spellStart"/>
+      <w:r>
+        <w:rPr>
+          <w:rFonts w:ascii="Arial" w:hAnsi="Arial" w:cs="Arial"/>
+          <w:bCs/>
+        </w:rPr>
+        <w:t>out_of_touch</w:t>
+      </w:r>
+      <w:proofErr w:type="spellEnd"/>
+      <w:r>
+        <w:rPr>
+          <w:rFonts w:ascii="Arial" w:hAnsi="Arial" w:cs="Arial"/>
+          <w:bCs/>
+        </w:rPr>
+        <w:t>}}</w:t>
       </w:r>
     </w:p>
     <w:p>
@@ -6518,7 +7949,23 @@
           <w:rFonts w:ascii="Arial" w:hAnsi="Arial" w:cs="Arial"/>
           <w:bCs/>
         </w:rPr>
-        <w:t>{{practitioner_name}}</w:t>
+        <w:t>{{</w:t>
+      </w:r>
+      <w:proofErr w:type="spellStart"/>
+      <w:r>
+        <w:rPr>
+          <w:rFonts w:ascii="Arial" w:hAnsi="Arial" w:cs="Arial"/>
+          <w:bCs/>
+        </w:rPr>
+        <w:t>practitioner_name</w:t>
+      </w:r>
+      <w:proofErr w:type="spellEnd"/>
+      <w:r>
+        <w:rPr>
+          <w:rFonts w:ascii="Arial" w:hAnsi="Arial" w:cs="Arial"/>
+          <w:bCs/>
+        </w:rPr>
+        <w:t>}}</w:t>
       </w:r>
     </w:p>
     <w:p>
@@ -6549,7 +7996,23 @@
           <w:rFonts w:ascii="Arial" w:hAnsi="Arial" w:cs="Arial"/>
           <w:bCs/>
         </w:rPr>
-        <w:t>{{practitioner_telephone}}</w:t>
+        <w:t>{{</w:t>
+      </w:r>
+      <w:proofErr w:type="spellStart"/>
+      <w:r>
+        <w:rPr>
+          <w:rFonts w:ascii="Arial" w:hAnsi="Arial" w:cs="Arial"/>
+          <w:bCs/>
+        </w:rPr>
+        <w:t>practitioner_telephone</w:t>
+      </w:r>
+      <w:proofErr w:type="spellEnd"/>
+      <w:r>
+        <w:rPr>
+          <w:rFonts w:ascii="Arial" w:hAnsi="Arial" w:cs="Arial"/>
+          <w:bCs/>
+        </w:rPr>
+        <w:t>}}</w:t>
       </w:r>
     </w:p>
     <w:p>
@@ -6580,7 +8043,23 @@
           <w:rFonts w:ascii="Arial" w:hAnsi="Arial" w:cs="Arial"/>
           <w:bCs/>
         </w:rPr>
-        <w:t>{{practitioner_email}}</w:t>
+        <w:t>{{</w:t>
+      </w:r>
+      <w:proofErr w:type="spellStart"/>
+      <w:r>
+        <w:rPr>
+          <w:rFonts w:ascii="Arial" w:hAnsi="Arial" w:cs="Arial"/>
+          <w:bCs/>
+        </w:rPr>
+        <w:t>practitioner_email</w:t>
+      </w:r>
+      <w:proofErr w:type="spellEnd"/>
+      <w:r>
+        <w:rPr>
+          <w:rFonts w:ascii="Arial" w:hAnsi="Arial" w:cs="Arial"/>
+          <w:bCs/>
+        </w:rPr>
+        <w:t>}}</w:t>
       </w:r>
       <w:r>
         <w:rPr>
@@ -6631,7 +8110,23 @@
           <w:rFonts w:ascii="Arial" w:hAnsi="Arial" w:cs="Arial"/>
           <w:bCs/>
         </w:rPr>
-        <w:t>{{completed_by_name}}</w:t>
+        <w:t>{{</w:t>
+      </w:r>
+      <w:proofErr w:type="spellStart"/>
+      <w:r>
+        <w:rPr>
+          <w:rFonts w:ascii="Arial" w:hAnsi="Arial" w:cs="Arial"/>
+          <w:bCs/>
+        </w:rPr>
+        <w:t>completed_by_name</w:t>
+      </w:r>
+      <w:proofErr w:type="spellEnd"/>
+      <w:r>
+        <w:rPr>
+          <w:rFonts w:ascii="Arial" w:hAnsi="Arial" w:cs="Arial"/>
+          <w:bCs/>
+        </w:rPr>
+        <w:t>}}</w:t>
       </w:r>
     </w:p>
     <w:p>
@@ -6669,7 +8164,23 @@
           <w:rFonts w:ascii="Arial" w:hAnsi="Arial" w:cs="Arial"/>
           <w:bCs/>
         </w:rPr>
-        <w:t>{{completed_by_telephone}}</w:t>
+        <w:t>{{</w:t>
+      </w:r>
+      <w:proofErr w:type="spellStart"/>
+      <w:r>
+        <w:rPr>
+          <w:rFonts w:ascii="Arial" w:hAnsi="Arial" w:cs="Arial"/>
+          <w:bCs/>
+        </w:rPr>
+        <w:t>completed_by_telephone</w:t>
+      </w:r>
+      <w:proofErr w:type="spellEnd"/>
+      <w:r>
+        <w:rPr>
+          <w:rFonts w:ascii="Arial" w:hAnsi="Arial" w:cs="Arial"/>
+          <w:bCs/>
+        </w:rPr>
+        <w:t>}}</w:t>
       </w:r>
     </w:p>
     <w:p>
@@ -6707,7 +8218,23 @@
           <w:rFonts w:ascii="Arial" w:hAnsi="Arial" w:cs="Arial"/>
           <w:bCs/>
         </w:rPr>
-        <w:t>{{completed_by_email}}</w:t>
+        <w:t>{{</w:t>
+      </w:r>
+      <w:proofErr w:type="spellStart"/>
+      <w:r>
+        <w:rPr>
+          <w:rFonts w:ascii="Arial" w:hAnsi="Arial" w:cs="Arial"/>
+          <w:bCs/>
+        </w:rPr>
+        <w:t>completed_by_email</w:t>
+      </w:r>
+      <w:proofErr w:type="spellEnd"/>
+      <w:r>
+        <w:rPr>
+          <w:rFonts w:ascii="Arial" w:hAnsi="Arial" w:cs="Arial"/>
+          <w:bCs/>
+        </w:rPr>
+        <w:t>}}</w:t>
       </w:r>
     </w:p>
     <w:p>
@@ -6745,7 +8272,23 @@
           <w:rFonts w:ascii="Arial" w:hAnsi="Arial" w:cs="Arial"/>
           <w:bCs/>
         </w:rPr>
-        <w:t>{{completed_by_region}}</w:t>
+        <w:t>{{</w:t>
+      </w:r>
+      <w:proofErr w:type="spellStart"/>
+      <w:r>
+        <w:rPr>
+          <w:rFonts w:ascii="Arial" w:hAnsi="Arial" w:cs="Arial"/>
+          <w:bCs/>
+        </w:rPr>
+        <w:t>completed_by_region</w:t>
+      </w:r>
+      <w:proofErr w:type="spellEnd"/>
+      <w:r>
+        <w:rPr>
+          <w:rFonts w:ascii="Arial" w:hAnsi="Arial" w:cs="Arial"/>
+          <w:bCs/>
+        </w:rPr>
+        <w:t>}}</w:t>
       </w:r>
     </w:p>
     <w:p>
@@ -6800,7 +8343,23 @@
           <w:rFonts w:ascii="Arial" w:hAnsi="Arial" w:cs="Arial"/>
           <w:bCs/>
         </w:rPr>
-        <w:t>{{completed_by_local_delivery_unit}}</w:t>
+        <w:t>{{</w:t>
+      </w:r>
+      <w:proofErr w:type="spellStart"/>
+      <w:r>
+        <w:rPr>
+          <w:rFonts w:ascii="Arial" w:hAnsi="Arial" w:cs="Arial"/>
+          <w:bCs/>
+        </w:rPr>
+        <w:t>completed_by_local_delivery_unit</w:t>
+      </w:r>
+      <w:proofErr w:type="spellEnd"/>
+      <w:r>
+        <w:rPr>
+          <w:rFonts w:ascii="Arial" w:hAnsi="Arial" w:cs="Arial"/>
+          <w:bCs/>
+        </w:rPr>
+        <w:t>}}</w:t>
       </w:r>
     </w:p>
     <w:p>
@@ -6861,7 +8420,23 @@
           <w:rFonts w:ascii="Arial" w:hAnsi="Arial" w:cs="Arial"/>
           <w:bCs/>
         </w:rPr>
-        <w:t>{{completed_by_ppcs_query_emails}}</w:t>
+        <w:t>{{</w:t>
+      </w:r>
+      <w:proofErr w:type="spellStart"/>
+      <w:r>
+        <w:rPr>
+          <w:rFonts w:ascii="Arial" w:hAnsi="Arial" w:cs="Arial"/>
+          <w:bCs/>
+        </w:rPr>
+        <w:t>completed_by_ppcs_query_emails</w:t>
+      </w:r>
+      <w:proofErr w:type="spellEnd"/>
+      <w:r>
+        <w:rPr>
+          <w:rFonts w:ascii="Arial" w:hAnsi="Arial" w:cs="Arial"/>
+          <w:bCs/>
+        </w:rPr>
+        <w:t>}}</w:t>
       </w:r>
     </w:p>
     <w:p>
@@ -6899,7 +8474,23 @@
           <w:rFonts w:ascii="Arial" w:hAnsi="Arial" w:cs="Arial"/>
           <w:bCs/>
         </w:rPr>
-        <w:t>{{date_of_decision}}</w:t>
+        <w:t>{{</w:t>
+      </w:r>
+      <w:proofErr w:type="spellStart"/>
+      <w:r>
+        <w:rPr>
+          <w:rFonts w:ascii="Arial" w:hAnsi="Arial" w:cs="Arial"/>
+          <w:bCs/>
+        </w:rPr>
+        <w:t>date_of_decision</w:t>
+      </w:r>
+      <w:proofErr w:type="spellEnd"/>
+      <w:r>
+        <w:rPr>
+          <w:rFonts w:ascii="Arial" w:hAnsi="Arial" w:cs="Arial"/>
+          <w:bCs/>
+        </w:rPr>
+        <w:t>}}</w:t>
       </w:r>
     </w:p>
     <w:p>
@@ -6936,7 +8527,23 @@
           <w:rFonts w:ascii="Arial" w:hAnsi="Arial" w:cs="Arial"/>
           <w:bCs/>
         </w:rPr>
-        <w:t>{{time_of_decision}}</w:t>
+        <w:t>{{</w:t>
+      </w:r>
+      <w:proofErr w:type="spellStart"/>
+      <w:r>
+        <w:rPr>
+          <w:rFonts w:ascii="Arial" w:hAnsi="Arial" w:cs="Arial"/>
+          <w:bCs/>
+        </w:rPr>
+        <w:t>time_of_decision</w:t>
+      </w:r>
+      <w:proofErr w:type="spellEnd"/>
+      <w:r>
+        <w:rPr>
+          <w:rFonts w:ascii="Arial" w:hAnsi="Arial" w:cs="Arial"/>
+          <w:bCs/>
+        </w:rPr>
+        <w:t>}}</w:t>
       </w:r>
     </w:p>
     <w:p>
@@ -7048,7 +8655,23 @@
           <w:rFonts w:ascii="Arial" w:hAnsi="Arial" w:cs="Arial"/>
           <w:bCs/>
         </w:rPr>
-        <w:t>{{spo_countersign_complete}}</w:t>
+        <w:t>{{</w:t>
+      </w:r>
+      <w:proofErr w:type="spellStart"/>
+      <w:r>
+        <w:rPr>
+          <w:rFonts w:ascii="Arial" w:hAnsi="Arial" w:cs="Arial"/>
+          <w:bCs/>
+        </w:rPr>
+        <w:t>spo_countersign_complete</w:t>
+      </w:r>
+      <w:proofErr w:type="spellEnd"/>
+      <w:r>
+        <w:rPr>
+          <w:rFonts w:ascii="Arial" w:hAnsi="Arial" w:cs="Arial"/>
+          <w:bCs/>
+        </w:rPr>
+        <w:t>}}</w:t>
       </w:r>
       <w:r>
         <w:rPr>
@@ -7137,7 +8760,23 @@
           <w:rFonts w:ascii="Arial" w:hAnsi="Arial" w:cs="Arial"/>
           <w:bCs/>
         </w:rPr>
-        <w:t>{{spo_countersign_complete}}</w:t>
+        <w:t>{{</w:t>
+      </w:r>
+      <w:proofErr w:type="spellStart"/>
+      <w:r>
+        <w:rPr>
+          <w:rFonts w:ascii="Arial" w:hAnsi="Arial" w:cs="Arial"/>
+          <w:bCs/>
+        </w:rPr>
+        <w:t>spo_countersign_complete</w:t>
+      </w:r>
+      <w:proofErr w:type="spellEnd"/>
+      <w:r>
+        <w:rPr>
+          <w:rFonts w:ascii="Arial" w:hAnsi="Arial" w:cs="Arial"/>
+          <w:bCs/>
+        </w:rPr>
+        <w:t>}}</w:t>
       </w:r>
       <w:r>
         <w:rPr>
@@ -7178,7 +8817,23 @@
           <w:rFonts w:ascii="Arial" w:hAnsi="Arial" w:cs="Arial"/>
           <w:bCs/>
         </w:rPr>
-        <w:t>{{spo_countersign_complete}}</w:t>
+        <w:t>{{</w:t>
+      </w:r>
+      <w:proofErr w:type="spellStart"/>
+      <w:r>
+        <w:rPr>
+          <w:rFonts w:ascii="Arial" w:hAnsi="Arial" w:cs="Arial"/>
+          <w:bCs/>
+        </w:rPr>
+        <w:t>spo_countersign_complete</w:t>
+      </w:r>
+      <w:proofErr w:type="spellEnd"/>
+      <w:r>
+        <w:rPr>
+          <w:rFonts w:ascii="Arial" w:hAnsi="Arial" w:cs="Arial"/>
+          <w:bCs/>
+        </w:rPr>
+        <w:t>}}</w:t>
       </w:r>
       <w:r>
         <w:rPr>
@@ -7222,7 +8877,23 @@
           <w:rFonts w:ascii="Arial" w:hAnsi="Arial" w:cs="Arial"/>
           <w:bCs/>
         </w:rPr>
-        <w:t>{{spo_countersign_complete}}</w:t>
+        <w:t>{{</w:t>
+      </w:r>
+      <w:proofErr w:type="spellStart"/>
+      <w:r>
+        <w:rPr>
+          <w:rFonts w:ascii="Arial" w:hAnsi="Arial" w:cs="Arial"/>
+          <w:bCs/>
+        </w:rPr>
+        <w:t>spo_countersign_complete</w:t>
+      </w:r>
+      <w:proofErr w:type="spellEnd"/>
+      <w:r>
+        <w:rPr>
+          <w:rFonts w:ascii="Arial" w:hAnsi="Arial" w:cs="Arial"/>
+          <w:bCs/>
+        </w:rPr>
+        <w:t>}}</w:t>
       </w:r>
       <w:r>
         <w:rPr>
@@ -7263,7 +8934,23 @@
           <w:rFonts w:ascii="Arial" w:hAnsi="Arial" w:cs="Arial"/>
           <w:bCs/>
         </w:rPr>
-        <w:t>{{spo_countersign_complete}}</w:t>
+        <w:t>{{</w:t>
+      </w:r>
+      <w:proofErr w:type="spellStart"/>
+      <w:r>
+        <w:rPr>
+          <w:rFonts w:ascii="Arial" w:hAnsi="Arial" w:cs="Arial"/>
+          <w:bCs/>
+        </w:rPr>
+        <w:t>spo_countersign_complete</w:t>
+      </w:r>
+      <w:proofErr w:type="spellEnd"/>
+      <w:r>
+        <w:rPr>
+          <w:rFonts w:ascii="Arial" w:hAnsi="Arial" w:cs="Arial"/>
+          <w:bCs/>
+        </w:rPr>
+        <w:t>}}</w:t>
       </w:r>
       <w:r>
         <w:rPr>
@@ -7331,7 +9018,23 @@
           <w:rFonts w:ascii="Arial" w:hAnsi="Arial" w:cs="Arial"/>
           <w:bCs/>
         </w:rPr>
-        <w:t>{{countersign_spo_exposition}</w:t>
+        <w:t>{{</w:t>
+      </w:r>
+      <w:proofErr w:type="spellStart"/>
+      <w:r>
+        <w:rPr>
+          <w:rFonts w:ascii="Arial" w:hAnsi="Arial" w:cs="Arial"/>
+          <w:bCs/>
+        </w:rPr>
+        <w:t>countersign_spo_exposition</w:t>
+      </w:r>
+      <w:proofErr w:type="spellEnd"/>
+      <w:r>
+        <w:rPr>
+          <w:rFonts w:ascii="Arial" w:hAnsi="Arial" w:cs="Arial"/>
+          <w:bCs/>
+        </w:rPr>
+        <w:t>}</w:t>
       </w:r>
       <w:r>
         <w:rPr>
@@ -7370,7 +9073,23 @@
           <w:rFonts w:ascii="Arial" w:hAnsi="Arial" w:cs="Arial"/>
           <w:bCs/>
         </w:rPr>
-        <w:t>{{countersign_spo_name}}</w:t>
+        <w:t>{{</w:t>
+      </w:r>
+      <w:proofErr w:type="spellStart"/>
+      <w:r>
+        <w:rPr>
+          <w:rFonts w:ascii="Arial" w:hAnsi="Arial" w:cs="Arial"/>
+          <w:bCs/>
+        </w:rPr>
+        <w:t>countersign_spo_name</w:t>
+      </w:r>
+      <w:proofErr w:type="spellEnd"/>
+      <w:r>
+        <w:rPr>
+          <w:rFonts w:ascii="Arial" w:hAnsi="Arial" w:cs="Arial"/>
+          <w:bCs/>
+        </w:rPr>
+        <w:t>}}</w:t>
       </w:r>
     </w:p>
     <w:p>
@@ -7401,7 +9120,23 @@
           <w:rFonts w:ascii="Arial" w:hAnsi="Arial" w:cs="Arial"/>
           <w:bCs/>
         </w:rPr>
-        <w:t>{{countersign_spo_email}}</w:t>
+        <w:t>{{</w:t>
+      </w:r>
+      <w:proofErr w:type="spellStart"/>
+      <w:r>
+        <w:rPr>
+          <w:rFonts w:ascii="Arial" w:hAnsi="Arial" w:cs="Arial"/>
+          <w:bCs/>
+        </w:rPr>
+        <w:t>countersign_spo_email</w:t>
+      </w:r>
+      <w:proofErr w:type="spellEnd"/>
+      <w:r>
+        <w:rPr>
+          <w:rFonts w:ascii="Arial" w:hAnsi="Arial" w:cs="Arial"/>
+          <w:bCs/>
+        </w:rPr>
+        <w:t>}}</w:t>
       </w:r>
     </w:p>
     <w:p>
@@ -7439,7 +9174,23 @@
           <w:rFonts w:ascii="Arial" w:hAnsi="Arial" w:cs="Arial"/>
           <w:bCs/>
         </w:rPr>
-        <w:t>{{countersign_spo_telephone}}</w:t>
+        <w:t>{{</w:t>
+      </w:r>
+      <w:proofErr w:type="spellStart"/>
+      <w:r>
+        <w:rPr>
+          <w:rFonts w:ascii="Arial" w:hAnsi="Arial" w:cs="Arial"/>
+          <w:bCs/>
+        </w:rPr>
+        <w:t>countersign_spo_telephone</w:t>
+      </w:r>
+      <w:proofErr w:type="spellEnd"/>
+      <w:r>
+        <w:rPr>
+          <w:rFonts w:ascii="Arial" w:hAnsi="Arial" w:cs="Arial"/>
+          <w:bCs/>
+        </w:rPr>
+        <w:t>}}</w:t>
       </w:r>
     </w:p>
     <w:p>
@@ -7506,7 +9257,23 @@
           <w:rFonts w:ascii="Arial" w:hAnsi="Arial" w:cs="Arial"/>
           <w:bCs/>
         </w:rPr>
-        <w:t>{{date_of_decision}}</w:t>
+        <w:t>{{</w:t>
+      </w:r>
+      <w:proofErr w:type="spellStart"/>
+      <w:r>
+        <w:rPr>
+          <w:rFonts w:ascii="Arial" w:hAnsi="Arial" w:cs="Arial"/>
+          <w:bCs/>
+        </w:rPr>
+        <w:t>date_of_decision</w:t>
+      </w:r>
+      <w:proofErr w:type="spellEnd"/>
+      <w:r>
+        <w:rPr>
+          <w:rFonts w:ascii="Arial" w:hAnsi="Arial" w:cs="Arial"/>
+          <w:bCs/>
+        </w:rPr>
+        <w:t>}}</w:t>
       </w:r>
       <w:r>
         <w:rPr>
@@ -7520,7 +9287,23 @@
           <w:rFonts w:ascii="Arial" w:hAnsi="Arial" w:cs="Arial"/>
           <w:bCs/>
         </w:rPr>
-        <w:t>{{time_of_decision}}</w:t>
+        <w:t>{{</w:t>
+      </w:r>
+      <w:proofErr w:type="spellStart"/>
+      <w:r>
+        <w:rPr>
+          <w:rFonts w:ascii="Arial" w:hAnsi="Arial" w:cs="Arial"/>
+          <w:bCs/>
+        </w:rPr>
+        <w:t>time_of_decision</w:t>
+      </w:r>
+      <w:proofErr w:type="spellEnd"/>
+      <w:r>
+        <w:rPr>
+          <w:rFonts w:ascii="Arial" w:hAnsi="Arial" w:cs="Arial"/>
+          <w:bCs/>
+        </w:rPr>
+        <w:t>}}</w:t>
       </w:r>
     </w:p>
     <w:p>
@@ -7578,7 +9361,23 @@
           <w:rFonts w:ascii="Arial" w:hAnsi="Arial" w:cs="Arial"/>
           <w:bCs/>
         </w:rPr>
-        <w:t>{{countersign_spo_date}}</w:t>
+        <w:t>{{</w:t>
+      </w:r>
+      <w:proofErr w:type="spellStart"/>
+      <w:r>
+        <w:rPr>
+          <w:rFonts w:ascii="Arial" w:hAnsi="Arial" w:cs="Arial"/>
+          <w:bCs/>
+        </w:rPr>
+        <w:t>countersign_spo_date</w:t>
+      </w:r>
+      <w:proofErr w:type="spellEnd"/>
+      <w:r>
+        <w:rPr>
+          <w:rFonts w:ascii="Arial" w:hAnsi="Arial" w:cs="Arial"/>
+          <w:bCs/>
+        </w:rPr>
+        <w:t>}}</w:t>
       </w:r>
     </w:p>
     <w:p>
@@ -7632,7 +9431,23 @@
           <w:rFonts w:ascii="Arial" w:hAnsi="Arial" w:cs="Arial"/>
           <w:bCs/>
         </w:rPr>
-        <w:t>{{countersign_spo_time}}</w:t>
+        <w:t>{{</w:t>
+      </w:r>
+      <w:proofErr w:type="spellStart"/>
+      <w:r>
+        <w:rPr>
+          <w:rFonts w:ascii="Arial" w:hAnsi="Arial" w:cs="Arial"/>
+          <w:bCs/>
+        </w:rPr>
+        <w:t>countersign_spo_time</w:t>
+      </w:r>
+      <w:proofErr w:type="spellEnd"/>
+      <w:r>
+        <w:rPr>
+          <w:rFonts w:ascii="Arial" w:hAnsi="Arial" w:cs="Arial"/>
+          <w:bCs/>
+        </w:rPr>
+        <w:t>}}</w:t>
       </w:r>
     </w:p>
     <w:p>
@@ -7746,7 +9561,23 @@
           <w:rFonts w:ascii="Arial" w:hAnsi="Arial" w:cs="Arial"/>
           <w:bCs/>
         </w:rPr>
-        <w:t>{{aco_countersign_complete}}</w:t>
+        <w:t>{{</w:t>
+      </w:r>
+      <w:proofErr w:type="spellStart"/>
+      <w:r>
+        <w:rPr>
+          <w:rFonts w:ascii="Arial" w:hAnsi="Arial" w:cs="Arial"/>
+          <w:bCs/>
+        </w:rPr>
+        <w:t>aco_countersign_complete</w:t>
+      </w:r>
+      <w:proofErr w:type="spellEnd"/>
+      <w:r>
+        <w:rPr>
+          <w:rFonts w:ascii="Arial" w:hAnsi="Arial" w:cs="Arial"/>
+          <w:bCs/>
+        </w:rPr>
+        <w:t>}}</w:t>
       </w:r>
       <w:r>
         <w:rPr>
@@ -7872,7 +9703,23 @@
           <w:rFonts w:ascii="Arial" w:hAnsi="Arial" w:cs="Arial"/>
           <w:bCs/>
         </w:rPr>
-        <w:t>{{countersign_aco_exposition}}</w:t>
+        <w:t>{{</w:t>
+      </w:r>
+      <w:proofErr w:type="spellStart"/>
+      <w:r>
+        <w:rPr>
+          <w:rFonts w:ascii="Arial" w:hAnsi="Arial" w:cs="Arial"/>
+          <w:bCs/>
+        </w:rPr>
+        <w:t>countersign_aco_exposition</w:t>
+      </w:r>
+      <w:proofErr w:type="spellEnd"/>
+      <w:r>
+        <w:rPr>
+          <w:rFonts w:ascii="Arial" w:hAnsi="Arial" w:cs="Arial"/>
+          <w:bCs/>
+        </w:rPr>
+        <w:t>}}</w:t>
       </w:r>
     </w:p>
     <w:p>
@@ -7904,7 +9751,23 @@
           <w:rFonts w:ascii="Arial" w:hAnsi="Arial" w:cs="Arial"/>
           <w:bCs/>
         </w:rPr>
-        <w:t>{{countersign_aco_name}}</w:t>
+        <w:t>{{</w:t>
+      </w:r>
+      <w:proofErr w:type="spellStart"/>
+      <w:r>
+        <w:rPr>
+          <w:rFonts w:ascii="Arial" w:hAnsi="Arial" w:cs="Arial"/>
+          <w:bCs/>
+        </w:rPr>
+        <w:t>countersign_aco_name</w:t>
+      </w:r>
+      <w:proofErr w:type="spellEnd"/>
+      <w:r>
+        <w:rPr>
+          <w:rFonts w:ascii="Arial" w:hAnsi="Arial" w:cs="Arial"/>
+          <w:bCs/>
+        </w:rPr>
+        <w:t>}}</w:t>
       </w:r>
     </w:p>
     <w:p>
@@ -7936,7 +9799,23 @@
           <w:rFonts w:ascii="Arial" w:hAnsi="Arial" w:cs="Arial"/>
           <w:bCs/>
         </w:rPr>
-        <w:t>{{countersign_aco_telephone}}</w:t>
+        <w:t>{{</w:t>
+      </w:r>
+      <w:proofErr w:type="spellStart"/>
+      <w:r>
+        <w:rPr>
+          <w:rFonts w:ascii="Arial" w:hAnsi="Arial" w:cs="Arial"/>
+          <w:bCs/>
+        </w:rPr>
+        <w:t>countersign_aco_telephone</w:t>
+      </w:r>
+      <w:proofErr w:type="spellEnd"/>
+      <w:r>
+        <w:rPr>
+          <w:rFonts w:ascii="Arial" w:hAnsi="Arial" w:cs="Arial"/>
+          <w:bCs/>
+        </w:rPr>
+        <w:t>}}</w:t>
       </w:r>
     </w:p>
     <w:p>
@@ -7968,7 +9847,23 @@
           <w:rFonts w:ascii="Arial" w:hAnsi="Arial" w:cs="Arial"/>
           <w:bCs/>
         </w:rPr>
-        <w:t>{{countersign_aco_email}}</w:t>
+        <w:t>{{</w:t>
+      </w:r>
+      <w:proofErr w:type="spellStart"/>
+      <w:r>
+        <w:rPr>
+          <w:rFonts w:ascii="Arial" w:hAnsi="Arial" w:cs="Arial"/>
+          <w:bCs/>
+        </w:rPr>
+        <w:t>countersign_aco_email</w:t>
+      </w:r>
+      <w:proofErr w:type="spellEnd"/>
+      <w:r>
+        <w:rPr>
+          <w:rFonts w:ascii="Arial" w:hAnsi="Arial" w:cs="Arial"/>
+          <w:bCs/>
+        </w:rPr>
+        <w:t>}}</w:t>
       </w:r>
     </w:p>
     <w:p>
@@ -8000,7 +9895,23 @@
           <w:rFonts w:ascii="Arial" w:hAnsi="Arial" w:cs="Arial"/>
           <w:bCs/>
         </w:rPr>
-        <w:t>{{countersign_aco_date}}</w:t>
+        <w:t>{{</w:t>
+      </w:r>
+      <w:proofErr w:type="spellStart"/>
+      <w:r>
+        <w:rPr>
+          <w:rFonts w:ascii="Arial" w:hAnsi="Arial" w:cs="Arial"/>
+          <w:bCs/>
+        </w:rPr>
+        <w:t>countersign_aco_date</w:t>
+      </w:r>
+      <w:proofErr w:type="spellEnd"/>
+      <w:r>
+        <w:rPr>
+          <w:rFonts w:ascii="Arial" w:hAnsi="Arial" w:cs="Arial"/>
+          <w:bCs/>
+        </w:rPr>
+        <w:t>}}</w:t>
       </w:r>
     </w:p>
     <w:p>
@@ -8032,7 +9943,23 @@
           <w:rFonts w:ascii="Arial" w:hAnsi="Arial" w:cs="Arial"/>
           <w:bCs/>
         </w:rPr>
-        <w:t>{{countersign_aco_time}}</w:t>
+        <w:t>{{</w:t>
+      </w:r>
+      <w:proofErr w:type="spellStart"/>
+      <w:r>
+        <w:rPr>
+          <w:rFonts w:ascii="Arial" w:hAnsi="Arial" w:cs="Arial"/>
+          <w:bCs/>
+        </w:rPr>
+        <w:t>countersign_aco_time</w:t>
+      </w:r>
+      <w:proofErr w:type="spellEnd"/>
+      <w:r>
+        <w:rPr>
+          <w:rFonts w:ascii="Arial" w:hAnsi="Arial" w:cs="Arial"/>
+          <w:bCs/>
+        </w:rPr>
+        <w:t>}}</w:t>
       </w:r>
     </w:p>
     <w:p>
@@ -8063,7 +9990,23 @@
           <w:rFonts w:ascii="Arial" w:hAnsi="Arial" w:cs="Arial"/>
           <w:bCs/>
         </w:rPr>
-        <w:t>{{revocation_order_recipients}}</w:t>
+        <w:t>{{</w:t>
+      </w:r>
+      <w:proofErr w:type="spellStart"/>
+      <w:r>
+        <w:rPr>
+          <w:rFonts w:ascii="Arial" w:hAnsi="Arial" w:cs="Arial"/>
+          <w:bCs/>
+        </w:rPr>
+        <w:t>revocation_order_recipients</w:t>
+      </w:r>
+      <w:proofErr w:type="spellEnd"/>
+      <w:r>
+        <w:rPr>
+          <w:rFonts w:ascii="Arial" w:hAnsi="Arial" w:cs="Arial"/>
+          <w:bCs/>
+        </w:rPr>
+        <w:t>}}</w:t>
       </w:r>
     </w:p>
     <w:p>
@@ -16662,6 +18605,7 @@
     <w:rsid w:val="00E94FFF"/>
     <w:rsid w:val="00EA65B2"/>
     <w:rsid w:val="00EC55F3"/>
+    <w:rsid w:val="00EF3301"/>
     <w:rsid w:val="00F13F92"/>
     <w:rsid w:val="00F3680B"/>
     <w:rsid w:val="00F444B8"/>
@@ -17445,15 +19389,6 @@
 </file>
 
 <file path=customXml/item1.xml><?xml version="1.0" encoding="utf-8"?>
-<?mso-contentType ?>
-<FormTemplates xmlns="http://schemas.microsoft.com/sharepoint/v3/contenttype/forms">
-  <Display>DocumentLibraryForm</Display>
-  <Edit>DocumentLibraryForm</Edit>
-  <New>DocumentLibraryForm</New>
-</FormTemplates>
-</file>
-
-<file path=customXml/item2.xml><?xml version="1.0" encoding="utf-8"?>
 <ct:contentTypeSchema xmlns:ct="http://schemas.microsoft.com/office/2006/metadata/contentType" xmlns:ma="http://schemas.microsoft.com/office/2006/metadata/properties/metaAttributes" ct:_="" ma:_="" ma:contentTypeName="Document" ma:contentTypeID="0x010100BB15E224CEB19F4BA17DCD08B156C20E" ma:contentTypeVersion="14" ma:contentTypeDescription="Create a new document." ma:contentTypeScope="" ma:versionID="7cd304efa23d0061db26e2f05b6414b1">
   <xsd:schema xmlns:xsd="http://www.w3.org/2001/XMLSchema" xmlns:xs="http://www.w3.org/2001/XMLSchema" xmlns:p="http://schemas.microsoft.com/office/2006/metadata/properties" xmlns:ns2="2244256a-353e-4aaa-84de-68fbd58bc0b5" xmlns:ns3="461e5654-0e9a-4527-837d-fdc364c1f1ed" targetNamespace="http://schemas.microsoft.com/office/2006/metadata/properties" ma:root="true" ma:fieldsID="44df93feef4834377720eaaf16faf4fa" ns2:_="" ns3:_="">
     <xsd:import namespace="2244256a-353e-4aaa-84de-68fbd58bc0b5"/>
@@ -17666,7 +19601,20 @@
 </ct:contentTypeSchema>
 </file>
 
+<file path=customXml/item2.xml><?xml version="1.0" encoding="utf-8"?>
+<?mso-contentType ?>
+<FormTemplates xmlns="http://schemas.microsoft.com/sharepoint/v3/contenttype/forms">
+  <Display>DocumentLibraryForm</Display>
+  <Edit>DocumentLibraryForm</Edit>
+  <New>DocumentLibraryForm</New>
+</FormTemplates>
+</file>
+
 <file path=customXml/item3.xml><?xml version="1.0" encoding="utf-8"?>
+<b:Sources xmlns:b="http://schemas.openxmlformats.org/officeDocument/2006/bibliography" xmlns="http://schemas.openxmlformats.org/officeDocument/2006/bibliography" SelectedStyle="" StyleName="" Version="0"/>
+</file>
+
+<file path=customXml/item4.xml><?xml version="1.0" encoding="utf-8"?>
 <p:properties xmlns:p="http://schemas.microsoft.com/office/2006/metadata/properties" xmlns:xsi="http://www.w3.org/2001/XMLSchema-instance" xmlns:pc="http://schemas.microsoft.com/office/infopath/2007/PartnerControls">
   <documentManagement>
     <lcf76f155ced4ddcb4097134ff3c332f xmlns="2244256a-353e-4aaa-84de-68fbd58bc0b5">
@@ -17678,19 +19626,7 @@
 </p:properties>
 </file>
 
-<file path=customXml/item4.xml><?xml version="1.0" encoding="utf-8"?>
-<b:Sources xmlns:b="http://schemas.openxmlformats.org/officeDocument/2006/bibliography" xmlns="http://schemas.openxmlformats.org/officeDocument/2006/bibliography" SelectedStyle="" StyleName="" Version="0"/>
-</file>
-
 <file path=customXml/itemProps1.xml><?xml version="1.0" encoding="utf-8"?>
-<ds:datastoreItem xmlns:ds="http://schemas.openxmlformats.org/officeDocument/2006/customXml" ds:itemID="{9C893AAC-1781-44C1-940F-A467E506D9D1}">
-  <ds:schemaRefs>
-    <ds:schemaRef ds:uri="http://schemas.microsoft.com/sharepoint/v3/contenttype/forms"/>
-  </ds:schemaRefs>
-</ds:datastoreItem>
-</file>
-
-<file path=customXml/itemProps2.xml><?xml version="1.0" encoding="utf-8"?>
 <ds:datastoreItem xmlns:ds="http://schemas.openxmlformats.org/officeDocument/2006/customXml" ds:itemID="{79C448BA-7A2C-492D-9615-F080CE57201F}">
   <ds:schemaRefs>
     <ds:schemaRef ds:uri="http://schemas.microsoft.com/office/2006/metadata/contentType"/>
@@ -17709,7 +19645,23 @@
 </ds:datastoreItem>
 </file>
 
+<file path=customXml/itemProps2.xml><?xml version="1.0" encoding="utf-8"?>
+<ds:datastoreItem xmlns:ds="http://schemas.openxmlformats.org/officeDocument/2006/customXml" ds:itemID="{9C893AAC-1781-44C1-940F-A467E506D9D1}">
+  <ds:schemaRefs>
+    <ds:schemaRef ds:uri="http://schemas.microsoft.com/sharepoint/v3/contenttype/forms"/>
+  </ds:schemaRefs>
+</ds:datastoreItem>
+</file>
+
 <file path=customXml/itemProps3.xml><?xml version="1.0" encoding="utf-8"?>
+<ds:datastoreItem xmlns:ds="http://schemas.openxmlformats.org/officeDocument/2006/customXml" ds:itemID="{1AA002EC-9FAC-469B-886C-4AD0DF10DF17}">
+  <ds:schemaRefs>
+    <ds:schemaRef ds:uri="http://schemas.openxmlformats.org/officeDocument/2006/bibliography"/>
+  </ds:schemaRefs>
+</ds:datastoreItem>
+</file>
+
+<file path=customXml/itemProps4.xml><?xml version="1.0" encoding="utf-8"?>
 <ds:datastoreItem xmlns:ds="http://schemas.openxmlformats.org/officeDocument/2006/customXml" ds:itemID="{D6602E3C-70F5-412B-A646-0548AF3EB1F8}">
   <ds:schemaRefs>
     <ds:schemaRef ds:uri="http://schemas.microsoft.com/office/2006/metadata/properties"/>
@@ -17718,12 +19670,4 @@
     <ds:schemaRef ds:uri="461e5654-0e9a-4527-837d-fdc364c1f1ed"/>
   </ds:schemaRefs>
 </ds:datastoreItem>
-</file>
-
-<file path=customXml/itemProps4.xml><?xml version="1.0" encoding="utf-8"?>
-<ds:datastoreItem xmlns:ds="http://schemas.openxmlformats.org/officeDocument/2006/customXml" ds:itemID="{1AA002EC-9FAC-469B-886C-4AD0DF10DF17}">
-  <ds:schemaRefs>
-    <ds:schemaRef ds:uri="http://schemas.openxmlformats.org/officeDocument/2006/bibliography"/>
-  </ds:schemaRefs>
-</ds:datastoreItem>
 </file>
</xml_diff>

<commit_message>
MRD-3150 Fix spacing on question 8 of Part A (#1287)
</commit_message>
<xml_diff>
--- a/src/main/resources/templates/partA/2026-03-31 - FTR56/Part A Template.docx
+++ b/src/main/resources/templates/partA/2026-03-31 - FTR56/Part A Template.docx
@@ -344,7 +344,23 @@
           <w:rFonts w:ascii="Arial" w:hAnsi="Arial" w:cs="Arial"/>
           <w:b/>
         </w:rPr>
-        <w:t xml:space="preserve">an Emergency </w:t>
+        <w:t xml:space="preserve">an </w:t>
+      </w:r>
+      <w:proofErr w:type="gramStart"/>
+      <w:r>
+        <w:rPr>
+          <w:rFonts w:ascii="Arial" w:hAnsi="Arial" w:cs="Arial"/>
+          <w:b/>
+        </w:rPr>
+        <w:t>Emergency</w:t>
+      </w:r>
+      <w:proofErr w:type="gramEnd"/>
+      <w:r>
+        <w:rPr>
+          <w:rFonts w:ascii="Arial" w:hAnsi="Arial" w:cs="Arial"/>
+          <w:b/>
+        </w:rPr>
+        <w:t xml:space="preserve"> </w:t>
       </w:r>
       <w:r>
         <w:rPr>
@@ -372,7 +388,23 @@
           <w:rFonts w:ascii="Arial" w:hAnsi="Arial" w:cs="Arial"/>
           <w:bCs/>
         </w:rPr>
-        <w:t>{{is_this_an_emergency_recall}}</w:t>
+        <w:t>{{</w:t>
+      </w:r>
+      <w:proofErr w:type="spellStart"/>
+      <w:r>
+        <w:rPr>
+          <w:rFonts w:ascii="Arial" w:hAnsi="Arial" w:cs="Arial"/>
+          <w:bCs/>
+        </w:rPr>
+        <w:t>is_this_an_emergency_recall</w:t>
+      </w:r>
+      <w:proofErr w:type="spellEnd"/>
+      <w:r>
+        <w:rPr>
+          <w:rFonts w:ascii="Arial" w:hAnsi="Arial" w:cs="Arial"/>
+          <w:bCs/>
+        </w:rPr>
+        <w:t>}}</w:t>
       </w:r>
     </w:p>
     <w:p>
@@ -418,7 +450,23 @@
           <w:rFonts w:ascii="Arial" w:hAnsi="Arial" w:cs="Arial"/>
           <w:bCs/>
         </w:rPr>
-        <w:t xml:space="preserve">{{indeterminate_sentence_type}} </w:t>
+        <w:t>{{</w:t>
+      </w:r>
+      <w:proofErr w:type="spellStart"/>
+      <w:r>
+        <w:rPr>
+          <w:rFonts w:ascii="Arial" w:hAnsi="Arial" w:cs="Arial"/>
+          <w:bCs/>
+        </w:rPr>
+        <w:t>indeterminate_sentence_type</w:t>
+      </w:r>
+      <w:proofErr w:type="spellEnd"/>
+      <w:r>
+        <w:rPr>
+          <w:rFonts w:ascii="Arial" w:hAnsi="Arial" w:cs="Arial"/>
+          <w:bCs/>
+        </w:rPr>
+        <w:t xml:space="preserve">}} </w:t>
       </w:r>
       <w:r>
         <w:rPr>
@@ -492,7 +540,23 @@
           <w:rFonts w:ascii="Arial" w:hAnsi="Arial" w:cs="Arial"/>
           <w:bCs/>
         </w:rPr>
-        <w:t>{{is_extended_sentence}}</w:t>
+        <w:t>{{</w:t>
+      </w:r>
+      <w:proofErr w:type="spellStart"/>
+      <w:r>
+        <w:rPr>
+          <w:rFonts w:ascii="Arial" w:hAnsi="Arial" w:cs="Arial"/>
+          <w:bCs/>
+        </w:rPr>
+        <w:t>is_extended_sentence</w:t>
+      </w:r>
+      <w:proofErr w:type="spellEnd"/>
+      <w:r>
+        <w:rPr>
+          <w:rFonts w:ascii="Arial" w:hAnsi="Arial" w:cs="Arial"/>
+          <w:bCs/>
+        </w:rPr>
+        <w:t>}}</w:t>
       </w:r>
       <w:r>
         <w:rPr>
@@ -654,6 +718,7 @@
         </w:rPr>
         <w:t>{{</w:t>
       </w:r>
+      <w:proofErr w:type="spellStart"/>
       <w:r>
         <w:rPr>
           <w:rFonts w:ascii="Arial" w:hAnsi="Arial" w:cs="Arial"/>
@@ -661,6 +726,7 @@
         </w:rPr>
         <w:t>is_serving_youth_sentence</w:t>
       </w:r>
+      <w:proofErr w:type="spellEnd"/>
       <w:r>
         <w:rPr>
           <w:rFonts w:ascii="Arial" w:hAnsi="Arial" w:cs="Arial"/>
@@ -781,7 +847,23 @@
           <w:rFonts w:ascii="Arial" w:hAnsi="Arial" w:cs="Arial"/>
           <w:bCs/>
         </w:rPr>
-        <w:t>{{is_serving_youth_sentence}}</w:t>
+        <w:t>{{</w:t>
+      </w:r>
+      <w:proofErr w:type="spellStart"/>
+      <w:r>
+        <w:rPr>
+          <w:rFonts w:ascii="Arial" w:hAnsi="Arial" w:cs="Arial"/>
+          <w:bCs/>
+        </w:rPr>
+        <w:t>is_serving_youth_sentence</w:t>
+      </w:r>
+      <w:proofErr w:type="spellEnd"/>
+      <w:r>
+        <w:rPr>
+          <w:rFonts w:ascii="Arial" w:hAnsi="Arial" w:cs="Arial"/>
+          <w:bCs/>
+        </w:rPr>
+        <w:t>}}</w:t>
       </w:r>
       <w:r>
         <w:rPr>
@@ -1226,7 +1308,15 @@
           <w:rFonts w:ascii="Arial" w:hAnsi="Arial" w:cs="Arial"/>
           <w:bCs/>
         </w:rPr>
-        <w:t>{{is_</w:t>
+        <w:t>{{</w:t>
+      </w:r>
+      <w:proofErr w:type="spellStart"/>
+      <w:r>
+        <w:rPr>
+          <w:rFonts w:ascii="Arial" w:hAnsi="Arial" w:cs="Arial"/>
+          <w:bCs/>
+        </w:rPr>
+        <w:t>is_</w:t>
       </w:r>
       <w:r>
         <w:rPr>
@@ -1254,7 +1344,15 @@
           <w:rFonts w:ascii="Arial" w:hAnsi="Arial" w:cs="Arial"/>
           <w:bCs/>
         </w:rPr>
-        <w:t>_serious_offence}}</w:t>
+        <w:t>_serious_offence</w:t>
+      </w:r>
+      <w:proofErr w:type="spellEnd"/>
+      <w:r>
+        <w:rPr>
+          <w:rFonts w:ascii="Arial" w:hAnsi="Arial" w:cs="Arial"/>
+          <w:bCs/>
+        </w:rPr>
+        <w:t>}}</w:t>
       </w:r>
     </w:p>
     <w:p>
@@ -1415,7 +1513,15 @@
           <w:rFonts w:ascii="Arial" w:hAnsi="Arial" w:cs="Arial"/>
           <w:bCs/>
         </w:rPr>
-        <w:t>{{is_</w:t>
+        <w:t>{{</w:t>
+      </w:r>
+      <w:proofErr w:type="spellStart"/>
+      <w:r>
+        <w:rPr>
+          <w:rFonts w:ascii="Arial" w:hAnsi="Arial" w:cs="Arial"/>
+          <w:bCs/>
+        </w:rPr>
+        <w:t>is_</w:t>
       </w:r>
       <w:r>
         <w:rPr>
@@ -1429,7 +1535,15 @@
           <w:rFonts w:ascii="Arial" w:hAnsi="Arial" w:cs="Arial"/>
           <w:bCs/>
         </w:rPr>
-        <w:t>_offence}}</w:t>
+        <w:t>_offence</w:t>
+      </w:r>
+      <w:proofErr w:type="spellEnd"/>
+      <w:r>
+        <w:rPr>
+          <w:rFonts w:ascii="Arial" w:hAnsi="Arial" w:cs="Arial"/>
+          <w:bCs/>
+        </w:rPr>
+        <w:t>}}</w:t>
       </w:r>
     </w:p>
     <w:p>
@@ -1472,6 +1586,7 @@
         </w:rPr>
         <w:t>{{</w:t>
       </w:r>
+      <w:proofErr w:type="spellStart"/>
       <w:r>
         <w:rPr>
           <w:rFonts w:ascii="Arial" w:hAnsi="Arial" w:cs="Arial"/>
@@ -1519,7 +1634,15 @@
           <w:rFonts w:ascii="Arial" w:hAnsi="Arial" w:cs="Arial"/>
           <w:bCs/>
         </w:rPr>
-        <w:t>entence}}</w:t>
+        <w:t>entence</w:t>
+      </w:r>
+      <w:proofErr w:type="spellEnd"/>
+      <w:r>
+        <w:rPr>
+          <w:rFonts w:ascii="Arial" w:hAnsi="Arial" w:cs="Arial"/>
+          <w:bCs/>
+        </w:rPr>
+        <w:t>}}</w:t>
       </w:r>
     </w:p>
     <w:p>
@@ -1550,6 +1673,7 @@
         </w:rPr>
         <w:t>{{</w:t>
       </w:r>
+      <w:proofErr w:type="spellStart"/>
       <w:r>
         <w:rPr>
           <w:rFonts w:ascii="Arial" w:hAnsi="Arial" w:cs="Arial"/>
@@ -1590,7 +1714,15 @@
           <w:rFonts w:ascii="Arial" w:hAnsi="Arial" w:cs="Arial"/>
           <w:bCs/>
         </w:rPr>
-        <w:t>_sentence}}</w:t>
+        <w:t>_sentence</w:t>
+      </w:r>
+      <w:proofErr w:type="spellEnd"/>
+      <w:r>
+        <w:rPr>
+          <w:rFonts w:ascii="Arial" w:hAnsi="Arial" w:cs="Arial"/>
+          <w:bCs/>
+        </w:rPr>
+        <w:t>}}</w:t>
       </w:r>
     </w:p>
     <w:p>
@@ -1710,6 +1842,7 @@
         </w:rPr>
         <w:t>{{</w:t>
       </w:r>
+      <w:proofErr w:type="spellStart"/>
       <w:r>
         <w:rPr>
           <w:rFonts w:ascii="Arial" w:hAnsi="Arial" w:cs="Arial"/>
@@ -1722,7 +1855,15 @@
           <w:rFonts w:ascii="Arial" w:hAnsi="Arial" w:cs="Arial"/>
           <w:bCs/>
         </w:rPr>
-        <w:t>s_repatriated_for_murder}}</w:t>
+        <w:t>s_repatriated_for_murder</w:t>
+      </w:r>
+      <w:proofErr w:type="spellEnd"/>
+      <w:r>
+        <w:rPr>
+          <w:rFonts w:ascii="Arial" w:hAnsi="Arial" w:cs="Arial"/>
+          <w:bCs/>
+        </w:rPr>
+        <w:t>}}</w:t>
       </w:r>
     </w:p>
     <w:p>
@@ -1798,6 +1939,7 @@
         </w:rPr>
         <w:t>{{</w:t>
       </w:r>
+      <w:proofErr w:type="spellStart"/>
       <w:r>
         <w:rPr>
           <w:rFonts w:ascii="Arial" w:hAnsi="Arial" w:cs="Arial"/>
@@ -1824,7 +1966,15 @@
           <w:rFonts w:ascii="Arial" w:hAnsi="Arial" w:cs="Arial"/>
           <w:bCs/>
         </w:rPr>
-        <w:t>involved_in_foreign_power_threat}}</w:t>
+        <w:t>involved_in_foreign_power_threat</w:t>
+      </w:r>
+      <w:proofErr w:type="spellEnd"/>
+      <w:r>
+        <w:rPr>
+          <w:rFonts w:ascii="Arial" w:hAnsi="Arial" w:cs="Arial"/>
+          <w:bCs/>
+        </w:rPr>
+        <w:t>}}</w:t>
       </w:r>
     </w:p>
     <w:p>
@@ -1856,6 +2006,7 @@
         </w:rPr>
         <w:t>{{</w:t>
       </w:r>
+      <w:proofErr w:type="spellStart"/>
       <w:r>
         <w:rPr>
           <w:rFonts w:ascii="Arial" w:hAnsi="Arial" w:cs="Arial"/>
@@ -1870,6 +2021,7 @@
         </w:rPr>
         <w:t>security_offence</w:t>
       </w:r>
+      <w:proofErr w:type="spellEnd"/>
       <w:r>
         <w:rPr>
           <w:rFonts w:ascii="Arial" w:hAnsi="Arial" w:cs="Arial"/>
@@ -2007,7 +2159,23 @@
           <w:rFonts w:ascii="Arial" w:hAnsi="Arial" w:cs="Arial"/>
           <w:bCs/>
         </w:rPr>
-        <w:t>{{date_of_birth}}</w:t>
+        <w:t>{{</w:t>
+      </w:r>
+      <w:proofErr w:type="spellStart"/>
+      <w:r>
+        <w:rPr>
+          <w:rFonts w:ascii="Arial" w:hAnsi="Arial" w:cs="Arial"/>
+          <w:bCs/>
+        </w:rPr>
+        <w:t>date_of_birth</w:t>
+      </w:r>
+      <w:proofErr w:type="spellEnd"/>
+      <w:r>
+        <w:rPr>
+          <w:rFonts w:ascii="Arial" w:hAnsi="Arial" w:cs="Arial"/>
+          <w:bCs/>
+        </w:rPr>
+        <w:t>}}</w:t>
       </w:r>
     </w:p>
     <w:p>
@@ -2077,7 +2245,23 @@
           <w:rFonts w:ascii="Arial" w:hAnsi="Arial" w:cs="Arial"/>
           <w:bCs/>
         </w:rPr>
-        <w:t>{{primary_language}}</w:t>
+        <w:t>{{</w:t>
+      </w:r>
+      <w:proofErr w:type="spellStart"/>
+      <w:r>
+        <w:rPr>
+          <w:rFonts w:ascii="Arial" w:hAnsi="Arial" w:cs="Arial"/>
+          <w:bCs/>
+        </w:rPr>
+        <w:t>primary_language</w:t>
+      </w:r>
+      <w:proofErr w:type="spellEnd"/>
+      <w:r>
+        <w:rPr>
+          <w:rFonts w:ascii="Arial" w:hAnsi="Arial" w:cs="Arial"/>
+          <w:bCs/>
+        </w:rPr>
+        <w:t>}}</w:t>
       </w:r>
       <w:r>
         <w:rPr>
@@ -2091,7 +2275,23 @@
           <w:rFonts w:ascii="Arial" w:hAnsi="Arial" w:cs="Arial"/>
           <w:bCs/>
         </w:rPr>
-        <w:t>{{primary_language}}</w:t>
+        <w:t>{{</w:t>
+      </w:r>
+      <w:proofErr w:type="spellStart"/>
+      <w:r>
+        <w:rPr>
+          <w:rFonts w:ascii="Arial" w:hAnsi="Arial" w:cs="Arial"/>
+          <w:bCs/>
+        </w:rPr>
+        <w:t>primary_language</w:t>
+      </w:r>
+      <w:proofErr w:type="spellEnd"/>
+      <w:r>
+        <w:rPr>
+          <w:rFonts w:ascii="Arial" w:hAnsi="Arial" w:cs="Arial"/>
+          <w:bCs/>
+        </w:rPr>
+        <w:t>}}</w:t>
       </w:r>
     </w:p>
     <w:p>
@@ -2189,7 +2389,23 @@
           <w:rFonts w:ascii="Arial" w:hAnsi="Arial" w:cs="Arial"/>
           <w:bCs/>
         </w:rPr>
-        <w:t>{{crn}}</w:t>
+        <w:t>{{</w:t>
+      </w:r>
+      <w:proofErr w:type="spellStart"/>
+      <w:r>
+        <w:rPr>
+          <w:rFonts w:ascii="Arial" w:hAnsi="Arial" w:cs="Arial"/>
+          <w:bCs/>
+        </w:rPr>
+        <w:t>crn</w:t>
+      </w:r>
+      <w:proofErr w:type="spellEnd"/>
+      <w:r>
+        <w:rPr>
+          <w:rFonts w:ascii="Arial" w:hAnsi="Arial" w:cs="Arial"/>
+          <w:bCs/>
+        </w:rPr>
+        <w:t>}}</w:t>
       </w:r>
     </w:p>
     <w:p>
@@ -2229,7 +2445,23 @@
           <w:rFonts w:ascii="Arial" w:hAnsi="Arial" w:cs="Arial"/>
           <w:bCs/>
         </w:rPr>
-        <w:t>{{cro_number}}</w:t>
+        <w:t>{{</w:t>
+      </w:r>
+      <w:proofErr w:type="spellStart"/>
+      <w:r>
+        <w:rPr>
+          <w:rFonts w:ascii="Arial" w:hAnsi="Arial" w:cs="Arial"/>
+          <w:bCs/>
+        </w:rPr>
+        <w:t>cro_number</w:t>
+      </w:r>
+      <w:proofErr w:type="spellEnd"/>
+      <w:r>
+        <w:rPr>
+          <w:rFonts w:ascii="Arial" w:hAnsi="Arial" w:cs="Arial"/>
+          <w:bCs/>
+        </w:rPr>
+        <w:t>}}</w:t>
       </w:r>
     </w:p>
     <w:p>
@@ -2262,7 +2494,23 @@
           <w:rFonts w:ascii="Arial" w:hAnsi="Arial" w:cs="Arial"/>
           <w:bCs/>
         </w:rPr>
-        <w:t>{{pnc_number}}</w:t>
+        <w:t>{{</w:t>
+      </w:r>
+      <w:proofErr w:type="spellStart"/>
+      <w:r>
+        <w:rPr>
+          <w:rFonts w:ascii="Arial" w:hAnsi="Arial" w:cs="Arial"/>
+          <w:bCs/>
+        </w:rPr>
+        <w:t>pnc_number</w:t>
+      </w:r>
+      <w:proofErr w:type="spellEnd"/>
+      <w:r>
+        <w:rPr>
+          <w:rFonts w:ascii="Arial" w:hAnsi="Arial" w:cs="Arial"/>
+          <w:bCs/>
+        </w:rPr>
+        <w:t>}}</w:t>
       </w:r>
     </w:p>
     <w:p>
@@ -2294,7 +2542,23 @@
           <w:rFonts w:ascii="Arial" w:hAnsi="Arial" w:cs="Arial"/>
           <w:bCs/>
         </w:rPr>
-        <w:t>{{most_recent_prisoner_number}}</w:t>
+        <w:t>{{</w:t>
+      </w:r>
+      <w:proofErr w:type="spellStart"/>
+      <w:r>
+        <w:rPr>
+          <w:rFonts w:ascii="Arial" w:hAnsi="Arial" w:cs="Arial"/>
+          <w:bCs/>
+        </w:rPr>
+        <w:t>most_recent_prisoner_number</w:t>
+      </w:r>
+      <w:proofErr w:type="spellEnd"/>
+      <w:r>
+        <w:rPr>
+          <w:rFonts w:ascii="Arial" w:hAnsi="Arial" w:cs="Arial"/>
+          <w:bCs/>
+        </w:rPr>
+        <w:t>}}</w:t>
       </w:r>
     </w:p>
     <w:p>
@@ -2334,7 +2598,23 @@
           <w:rFonts w:ascii="Arial" w:hAnsi="Arial" w:cs="Arial"/>
           <w:bCs/>
         </w:rPr>
-        <w:t>{{noms_number}}</w:t>
+        <w:t>{{</w:t>
+      </w:r>
+      <w:proofErr w:type="spellStart"/>
+      <w:r>
+        <w:rPr>
+          <w:rFonts w:ascii="Arial" w:hAnsi="Arial" w:cs="Arial"/>
+          <w:bCs/>
+        </w:rPr>
+        <w:t>noms_number</w:t>
+      </w:r>
+      <w:proofErr w:type="spellEnd"/>
+      <w:r>
+        <w:rPr>
+          <w:rFonts w:ascii="Arial" w:hAnsi="Arial" w:cs="Arial"/>
+          <w:bCs/>
+        </w:rPr>
+        <w:t>}}</w:t>
       </w:r>
     </w:p>
     <w:p>
@@ -2366,7 +2646,23 @@
           <w:rFonts w:ascii="Arial" w:hAnsi="Arial" w:cs="Arial"/>
           <w:bCs/>
         </w:rPr>
-        <w:t>{{last_releasing_prison}}</w:t>
+        <w:t>{{</w:t>
+      </w:r>
+      <w:proofErr w:type="spellStart"/>
+      <w:r>
+        <w:rPr>
+          <w:rFonts w:ascii="Arial" w:hAnsi="Arial" w:cs="Arial"/>
+          <w:bCs/>
+        </w:rPr>
+        <w:t>last_releasing_prison</w:t>
+      </w:r>
+      <w:proofErr w:type="spellEnd"/>
+      <w:r>
+        <w:rPr>
+          <w:rFonts w:ascii="Arial" w:hAnsi="Arial" w:cs="Arial"/>
+          <w:bCs/>
+        </w:rPr>
+        <w:t>}}</w:t>
       </w:r>
     </w:p>
     <w:p>
@@ -2427,7 +2723,23 @@
           <w:rFonts w:ascii="Arial" w:hAnsi="Arial" w:cs="Arial"/>
           <w:bCs/>
         </w:rPr>
-        <w:t>{{date_of_release}}</w:t>
+        <w:t>{{</w:t>
+      </w:r>
+      <w:proofErr w:type="spellStart"/>
+      <w:r>
+        <w:rPr>
+          <w:rFonts w:ascii="Arial" w:hAnsi="Arial" w:cs="Arial"/>
+          <w:bCs/>
+        </w:rPr>
+        <w:t>date_of_release</w:t>
+      </w:r>
+      <w:proofErr w:type="spellEnd"/>
+      <w:r>
+        <w:rPr>
+          <w:rFonts w:ascii="Arial" w:hAnsi="Arial" w:cs="Arial"/>
+          <w:bCs/>
+        </w:rPr>
+        <w:t>}}</w:t>
       </w:r>
     </w:p>
     <w:p>
@@ -2539,7 +2851,23 @@
           <w:rFonts w:ascii="Arial" w:hAnsi="Arial" w:cs="Arial"/>
           <w:bCs/>
         </w:rPr>
-        <w:t>{{index_offence_description}}</w:t>
+        <w:t>{{</w:t>
+      </w:r>
+      <w:proofErr w:type="spellStart"/>
+      <w:r>
+        <w:rPr>
+          <w:rFonts w:ascii="Arial" w:hAnsi="Arial" w:cs="Arial"/>
+          <w:bCs/>
+        </w:rPr>
+        <w:t>index_offence_description</w:t>
+      </w:r>
+      <w:proofErr w:type="spellEnd"/>
+      <w:r>
+        <w:rPr>
+          <w:rFonts w:ascii="Arial" w:hAnsi="Arial" w:cs="Arial"/>
+          <w:bCs/>
+        </w:rPr>
+        <w:t>}}</w:t>
       </w:r>
       <w:r>
         <w:rPr>
@@ -2637,7 +2965,23 @@
           <w:rFonts w:ascii="Arial" w:hAnsi="Arial" w:cs="Arial"/>
           <w:bCs/>
         </w:rPr>
-        <w:t>{{date_of_original_offence}}</w:t>
+        <w:t>{{</w:t>
+      </w:r>
+      <w:proofErr w:type="spellStart"/>
+      <w:r>
+        <w:rPr>
+          <w:rFonts w:ascii="Arial" w:hAnsi="Arial" w:cs="Arial"/>
+          <w:bCs/>
+        </w:rPr>
+        <w:t>date_of_original_offence</w:t>
+      </w:r>
+      <w:proofErr w:type="spellEnd"/>
+      <w:r>
+        <w:rPr>
+          <w:rFonts w:ascii="Arial" w:hAnsi="Arial" w:cs="Arial"/>
+          <w:bCs/>
+        </w:rPr>
+        <w:t>}}</w:t>
       </w:r>
     </w:p>
     <w:p>
@@ -2678,7 +3022,23 @@
           <w:rFonts w:ascii="Arial" w:hAnsi="Arial" w:cs="Arial"/>
           <w:bCs/>
         </w:rPr>
-        <w:t>{{date_of_sentence}}</w:t>
+        <w:t>{{</w:t>
+      </w:r>
+      <w:proofErr w:type="spellStart"/>
+      <w:r>
+        <w:rPr>
+          <w:rFonts w:ascii="Arial" w:hAnsi="Arial" w:cs="Arial"/>
+          <w:bCs/>
+        </w:rPr>
+        <w:t>date_of_sentence</w:t>
+      </w:r>
+      <w:proofErr w:type="spellEnd"/>
+      <w:r>
+        <w:rPr>
+          <w:rFonts w:ascii="Arial" w:hAnsi="Arial" w:cs="Arial"/>
+          <w:bCs/>
+        </w:rPr>
+        <w:t>}}</w:t>
       </w:r>
     </w:p>
     <w:p>
@@ -2719,7 +3079,23 @@
           <w:rFonts w:ascii="Arial" w:hAnsi="Arial" w:cs="Arial"/>
           <w:bCs/>
         </w:rPr>
-        <w:t>{{length_of_sentence}}</w:t>
+        <w:t>{{</w:t>
+      </w:r>
+      <w:proofErr w:type="spellStart"/>
+      <w:r>
+        <w:rPr>
+          <w:rFonts w:ascii="Arial" w:hAnsi="Arial" w:cs="Arial"/>
+          <w:bCs/>
+        </w:rPr>
+        <w:t>length_of_sentence</w:t>
+      </w:r>
+      <w:proofErr w:type="spellEnd"/>
+      <w:r>
+        <w:rPr>
+          <w:rFonts w:ascii="Arial" w:hAnsi="Arial" w:cs="Arial"/>
+          <w:bCs/>
+        </w:rPr>
+        <w:t>}}</w:t>
       </w:r>
     </w:p>
     <w:p>
@@ -2761,7 +3137,23 @@
           <w:rFonts w:ascii="Arial" w:hAnsi="Arial" w:cs="Arial"/>
           <w:bCs/>
         </w:rPr>
-        <w:t>{{licence_expiry_date}}</w:t>
+        <w:t>{{</w:t>
+      </w:r>
+      <w:proofErr w:type="spellStart"/>
+      <w:r>
+        <w:rPr>
+          <w:rFonts w:ascii="Arial" w:hAnsi="Arial" w:cs="Arial"/>
+          <w:bCs/>
+        </w:rPr>
+        <w:t>licence_expiry_date</w:t>
+      </w:r>
+      <w:proofErr w:type="spellEnd"/>
+      <w:r>
+        <w:rPr>
+          <w:rFonts w:ascii="Arial" w:hAnsi="Arial" w:cs="Arial"/>
+          <w:bCs/>
+        </w:rPr>
+        <w:t>}}</w:t>
       </w:r>
     </w:p>
     <w:p>
@@ -2803,7 +3195,23 @@
           <w:rFonts w:ascii="Arial" w:hAnsi="Arial" w:cs="Arial"/>
           <w:bCs/>
         </w:rPr>
-        <w:t>{{sentence_expiry_date}}</w:t>
+        <w:t>{{</w:t>
+      </w:r>
+      <w:proofErr w:type="spellStart"/>
+      <w:r>
+        <w:rPr>
+          <w:rFonts w:ascii="Arial" w:hAnsi="Arial" w:cs="Arial"/>
+          <w:bCs/>
+        </w:rPr>
+        <w:t>sentence_expiry_date</w:t>
+      </w:r>
+      <w:proofErr w:type="spellEnd"/>
+      <w:r>
+        <w:rPr>
+          <w:rFonts w:ascii="Arial" w:hAnsi="Arial" w:cs="Arial"/>
+          <w:bCs/>
+        </w:rPr>
+        <w:t>}}</w:t>
       </w:r>
     </w:p>
     <w:p>
@@ -2876,7 +3284,23 @@
           <w:rFonts w:ascii="Arial" w:hAnsi="Arial" w:cs="Arial"/>
           <w:bCs/>
         </w:rPr>
-        <w:t>{{custodial_term}}</w:t>
+        <w:t>{{</w:t>
+      </w:r>
+      <w:proofErr w:type="spellStart"/>
+      <w:r>
+        <w:rPr>
+          <w:rFonts w:ascii="Arial" w:hAnsi="Arial" w:cs="Arial"/>
+          <w:bCs/>
+        </w:rPr>
+        <w:t>custodial_term</w:t>
+      </w:r>
+      <w:proofErr w:type="spellEnd"/>
+      <w:r>
+        <w:rPr>
+          <w:rFonts w:ascii="Arial" w:hAnsi="Arial" w:cs="Arial"/>
+          <w:bCs/>
+        </w:rPr>
+        <w:t>}}</w:t>
       </w:r>
     </w:p>
     <w:p>
@@ -2929,7 +3353,23 @@
           <w:rFonts w:ascii="Arial" w:hAnsi="Arial" w:cs="Arial"/>
           <w:bCs/>
         </w:rPr>
-        <w:t>{{extended_term}}</w:t>
+        <w:t>{{</w:t>
+      </w:r>
+      <w:proofErr w:type="spellStart"/>
+      <w:r>
+        <w:rPr>
+          <w:rFonts w:ascii="Arial" w:hAnsi="Arial" w:cs="Arial"/>
+          <w:bCs/>
+        </w:rPr>
+        <w:t>extended_term</w:t>
+      </w:r>
+      <w:proofErr w:type="spellEnd"/>
+      <w:r>
+        <w:rPr>
+          <w:rFonts w:ascii="Arial" w:hAnsi="Arial" w:cs="Arial"/>
+          <w:bCs/>
+        </w:rPr>
+        <w:t>}}</w:t>
       </w:r>
     </w:p>
     <w:p>
@@ -2977,7 +3417,23 @@
           <w:rFonts w:ascii="Arial" w:hAnsi="Arial" w:cs="Arial"/>
           <w:bCs/>
         </w:rPr>
-        <w:t xml:space="preserve">(Any information presented here should be disclosable to the prisoner)      </w:t>
+        <w:t xml:space="preserve">(Any information presented here should be disclosable to the </w:t>
+      </w:r>
+      <w:proofErr w:type="gramStart"/>
+      <w:r>
+        <w:rPr>
+          <w:rFonts w:ascii="Arial" w:hAnsi="Arial" w:cs="Arial"/>
+          <w:bCs/>
+        </w:rPr>
+        <w:t xml:space="preserve">prisoner)   </w:t>
+      </w:r>
+      <w:proofErr w:type="gramEnd"/>
+      <w:r>
+        <w:rPr>
+          <w:rFonts w:ascii="Arial" w:hAnsi="Arial" w:cs="Arial"/>
+          <w:bCs/>
+        </w:rPr>
+        <w:t xml:space="preserve">   </w:t>
       </w:r>
       <w:r>
         <w:rPr>
@@ -2991,7 +3447,30 @@
           <w:rFonts w:ascii="Arial" w:hAnsi="Arial" w:cs="Arial"/>
           <w:bCs/>
         </w:rPr>
-        <w:t>{{has_victims_in_contact_scheme}}</w:t>
+        <w:t>{{</w:t>
+      </w:r>
+      <w:proofErr w:type="spellStart"/>
+      <w:r>
+        <w:rPr>
+          <w:rFonts w:ascii="Arial" w:hAnsi="Arial" w:cs="Arial"/>
+          <w:bCs/>
+        </w:rPr>
+        <w:t>has_victims_in_contact_scheme</w:t>
+      </w:r>
+      <w:proofErr w:type="spellEnd"/>
+      <w:r>
+        <w:rPr>
+          <w:rFonts w:ascii="Arial" w:hAnsi="Arial" w:cs="Arial"/>
+          <w:bCs/>
+        </w:rPr>
+        <w:t>}}</w:t>
+      </w:r>
+      <w:r>
+        <w:rPr>
+          <w:rFonts w:ascii="Arial" w:hAnsi="Arial" w:cs="Arial"/>
+          <w:bCs/>
+        </w:rPr>
+        <w:t xml:space="preserve"> </w:t>
       </w:r>
       <w:r>
         <w:rPr>
@@ -3020,7 +3499,23 @@
           <w:rFonts w:ascii="Arial" w:hAnsi="Arial" w:cs="Arial"/>
           <w:bCs/>
         </w:rPr>
-        <w:t>{{date_vlo_informed}}</w:t>
+        <w:t>{{</w:t>
+      </w:r>
+      <w:proofErr w:type="spellStart"/>
+      <w:r>
+        <w:rPr>
+          <w:rFonts w:ascii="Arial" w:hAnsi="Arial" w:cs="Arial"/>
+          <w:bCs/>
+        </w:rPr>
+        <w:t>date_vlo_informed</w:t>
+      </w:r>
+      <w:proofErr w:type="spellEnd"/>
+      <w:r>
+        <w:rPr>
+          <w:rFonts w:ascii="Arial" w:hAnsi="Arial" w:cs="Arial"/>
+          <w:bCs/>
+        </w:rPr>
+        <w:t>}}</w:t>
       </w:r>
       <w:r>
         <w:rPr>
@@ -3113,7 +3608,23 @@
           <w:rFonts w:ascii="Arial" w:hAnsi="Arial" w:cs="Arial"/>
           <w:bCs/>
         </w:rPr>
-        <w:t>{{custody_status}}</w:t>
+        <w:t>{{</w:t>
+      </w:r>
+      <w:proofErr w:type="spellStart"/>
+      <w:r>
+        <w:rPr>
+          <w:rFonts w:ascii="Arial" w:hAnsi="Arial" w:cs="Arial"/>
+          <w:bCs/>
+        </w:rPr>
+        <w:t>custody_status</w:t>
+      </w:r>
+      <w:proofErr w:type="spellEnd"/>
+      <w:r>
+        <w:rPr>
+          <w:rFonts w:ascii="Arial" w:hAnsi="Arial" w:cs="Arial"/>
+          <w:bCs/>
+        </w:rPr>
+        <w:t>}}</w:t>
       </w:r>
     </w:p>
     <w:p>
@@ -3146,7 +3657,23 @@
           <w:rFonts w:ascii="Arial" w:hAnsi="Arial" w:cs="Arial"/>
           <w:bCs/>
         </w:rPr>
-        <w:t>{{has_arrest_issues}}</w:t>
+        <w:t>{{</w:t>
+      </w:r>
+      <w:proofErr w:type="spellStart"/>
+      <w:r>
+        <w:rPr>
+          <w:rFonts w:ascii="Arial" w:hAnsi="Arial" w:cs="Arial"/>
+          <w:bCs/>
+        </w:rPr>
+        <w:t>has_arrest_issues</w:t>
+      </w:r>
+      <w:proofErr w:type="spellEnd"/>
+      <w:r>
+        <w:rPr>
+          <w:rFonts w:ascii="Arial" w:hAnsi="Arial" w:cs="Arial"/>
+          <w:bCs/>
+        </w:rPr>
+        <w:t>}}</w:t>
       </w:r>
     </w:p>
     <w:p>
@@ -3186,7 +3713,23 @@
           <w:rFonts w:ascii="Arial" w:hAnsi="Arial" w:cs="Arial"/>
           <w:bCs/>
         </w:rPr>
-        <w:t>{{has_arrest_issues_details}}</w:t>
+        <w:t>{{</w:t>
+      </w:r>
+      <w:proofErr w:type="spellStart"/>
+      <w:r>
+        <w:rPr>
+          <w:rFonts w:ascii="Arial" w:hAnsi="Arial" w:cs="Arial"/>
+          <w:bCs/>
+        </w:rPr>
+        <w:t>has_arrest_issues_details</w:t>
+      </w:r>
+      <w:proofErr w:type="spellEnd"/>
+      <w:r>
+        <w:rPr>
+          <w:rFonts w:ascii="Arial" w:hAnsi="Arial" w:cs="Arial"/>
+          <w:bCs/>
+        </w:rPr>
+        <w:t>}}</w:t>
       </w:r>
     </w:p>
     <w:p>
@@ -3225,7 +3768,23 @@
           <w:rFonts w:ascii="Arial" w:hAnsi="Arial" w:cs="Arial"/>
           <w:bCs/>
         </w:rPr>
-        <w:t>{{contact_name}}</w:t>
+        <w:t>{{</w:t>
+      </w:r>
+      <w:proofErr w:type="spellStart"/>
+      <w:r>
+        <w:rPr>
+          <w:rFonts w:ascii="Arial" w:hAnsi="Arial" w:cs="Arial"/>
+          <w:bCs/>
+        </w:rPr>
+        <w:t>contact_name</w:t>
+      </w:r>
+      <w:proofErr w:type="spellEnd"/>
+      <w:r>
+        <w:rPr>
+          <w:rFonts w:ascii="Arial" w:hAnsi="Arial" w:cs="Arial"/>
+          <w:bCs/>
+        </w:rPr>
+        <w:t>}}</w:t>
       </w:r>
     </w:p>
     <w:p>
@@ -3264,7 +3823,23 @@
           <w:rFonts w:ascii="Arial" w:hAnsi="Arial" w:cs="Arial"/>
           <w:bCs/>
         </w:rPr>
-        <w:t>{{email_address}}</w:t>
+        <w:t>{{</w:t>
+      </w:r>
+      <w:proofErr w:type="spellStart"/>
+      <w:r>
+        <w:rPr>
+          <w:rFonts w:ascii="Arial" w:hAnsi="Arial" w:cs="Arial"/>
+          <w:bCs/>
+        </w:rPr>
+        <w:t>email_address</w:t>
+      </w:r>
+      <w:proofErr w:type="spellEnd"/>
+      <w:r>
+        <w:rPr>
+          <w:rFonts w:ascii="Arial" w:hAnsi="Arial" w:cs="Arial"/>
+          <w:bCs/>
+        </w:rPr>
+        <w:t>}}</w:t>
       </w:r>
     </w:p>
     <w:p>
@@ -3329,7 +3904,23 @@
           <w:rFonts w:ascii="Arial" w:hAnsi="Arial" w:cs="Arial"/>
           <w:bCs/>
         </w:rPr>
-        <w:t>{{last_recorded_address}}</w:t>
+        <w:t>{{</w:t>
+      </w:r>
+      <w:proofErr w:type="spellStart"/>
+      <w:r>
+        <w:rPr>
+          <w:rFonts w:ascii="Arial" w:hAnsi="Arial" w:cs="Arial"/>
+          <w:bCs/>
+        </w:rPr>
+        <w:t>last_recorded_address</w:t>
+      </w:r>
+      <w:proofErr w:type="spellEnd"/>
+      <w:r>
+        <w:rPr>
+          <w:rFonts w:ascii="Arial" w:hAnsi="Arial" w:cs="Arial"/>
+          <w:bCs/>
+        </w:rPr>
+        <w:t>}}</w:t>
       </w:r>
     </w:p>
     <w:p>
@@ -3361,7 +3952,23 @@
           <w:rFonts w:ascii="Arial" w:hAnsi="Arial" w:cs="Arial"/>
           <w:bCs/>
         </w:rPr>
-        <w:t>{{no_fixed_abode}}</w:t>
+        <w:t>{{</w:t>
+      </w:r>
+      <w:proofErr w:type="spellStart"/>
+      <w:r>
+        <w:rPr>
+          <w:rFonts w:ascii="Arial" w:hAnsi="Arial" w:cs="Arial"/>
+          <w:bCs/>
+        </w:rPr>
+        <w:t>no_fixed_abode</w:t>
+      </w:r>
+      <w:proofErr w:type="spellEnd"/>
+      <w:r>
+        <w:rPr>
+          <w:rFonts w:ascii="Arial" w:hAnsi="Arial" w:cs="Arial"/>
+          <w:bCs/>
+        </w:rPr>
+        <w:t>}}</w:t>
       </w:r>
     </w:p>
     <w:p>
@@ -3393,7 +4000,23 @@
           <w:rFonts w:ascii="Arial" w:hAnsi="Arial" w:cs="Arial"/>
           <w:bCs/>
         </w:rPr>
-        <w:t>{{other_possible_addresses}}</w:t>
+        <w:t>{{</w:t>
+      </w:r>
+      <w:proofErr w:type="spellStart"/>
+      <w:r>
+        <w:rPr>
+          <w:rFonts w:ascii="Arial" w:hAnsi="Arial" w:cs="Arial"/>
+          <w:bCs/>
+        </w:rPr>
+        <w:t>other_possible_addresses</w:t>
+      </w:r>
+      <w:proofErr w:type="spellEnd"/>
+      <w:r>
+        <w:rPr>
+          <w:rFonts w:ascii="Arial" w:hAnsi="Arial" w:cs="Arial"/>
+          <w:bCs/>
+        </w:rPr>
+        <w:t>}}</w:t>
       </w:r>
     </w:p>
     <w:p>
@@ -3501,7 +4124,23 @@
           <w:rFonts w:ascii="Arial" w:hAnsi="Arial" w:cs="Arial"/>
           <w:bCs/>
         </w:rPr>
-        <w:t>{{has_vulnerabilities}}</w:t>
+        <w:t>{{</w:t>
+      </w:r>
+      <w:proofErr w:type="spellStart"/>
+      <w:r>
+        <w:rPr>
+          <w:rFonts w:ascii="Arial" w:hAnsi="Arial" w:cs="Arial"/>
+          <w:bCs/>
+        </w:rPr>
+        <w:t>has_vulnerabilities</w:t>
+      </w:r>
+      <w:proofErr w:type="spellEnd"/>
+      <w:r>
+        <w:rPr>
+          <w:rFonts w:ascii="Arial" w:hAnsi="Arial" w:cs="Arial"/>
+          <w:bCs/>
+        </w:rPr>
+        <w:t>}}</w:t>
       </w:r>
     </w:p>
     <w:p>
@@ -3587,7 +4226,23 @@
           <w:rFonts w:ascii="Arial" w:hAnsi="Arial" w:cs="Arial"/>
           <w:bCs/>
         </w:rPr>
-        <w:t>{{has_contraband_risk}}</w:t>
+        <w:t>{{</w:t>
+      </w:r>
+      <w:proofErr w:type="spellStart"/>
+      <w:r>
+        <w:rPr>
+          <w:rFonts w:ascii="Arial" w:hAnsi="Arial" w:cs="Arial"/>
+          <w:bCs/>
+        </w:rPr>
+        <w:t>has_contraband_risk</w:t>
+      </w:r>
+      <w:proofErr w:type="spellEnd"/>
+      <w:r>
+        <w:rPr>
+          <w:rFonts w:ascii="Arial" w:hAnsi="Arial" w:cs="Arial"/>
+          <w:bCs/>
+        </w:rPr>
+        <w:t>}}</w:t>
       </w:r>
       <w:r>
         <w:rPr>
@@ -3625,7 +4280,23 @@
           <w:rFonts w:ascii="Arial" w:hAnsi="Arial" w:cs="Arial"/>
           <w:bCs/>
         </w:rPr>
-        <w:t>{{has_contraband_risk_details}}</w:t>
+        <w:t>{{</w:t>
+      </w:r>
+      <w:proofErr w:type="spellStart"/>
+      <w:r>
+        <w:rPr>
+          <w:rFonts w:ascii="Arial" w:hAnsi="Arial" w:cs="Arial"/>
+          <w:bCs/>
+        </w:rPr>
+        <w:t>has_contraband_risk_details</w:t>
+      </w:r>
+      <w:proofErr w:type="spellEnd"/>
+      <w:r>
+        <w:rPr>
+          <w:rFonts w:ascii="Arial" w:hAnsi="Arial" w:cs="Arial"/>
+          <w:bCs/>
+        </w:rPr>
+        <w:t>}}</w:t>
       </w:r>
     </w:p>
     <w:p>
@@ -3701,7 +4372,23 @@
           <w:rFonts w:ascii="Arial" w:hAnsi="Arial" w:cs="Arial"/>
           <w:bCs/>
         </w:rPr>
-        <w:t>{{mappa_category}}</w:t>
+        <w:t>{{</w:t>
+      </w:r>
+      <w:proofErr w:type="spellStart"/>
+      <w:r>
+        <w:rPr>
+          <w:rFonts w:ascii="Arial" w:hAnsi="Arial" w:cs="Arial"/>
+          <w:bCs/>
+        </w:rPr>
+        <w:t>mappa_category</w:t>
+      </w:r>
+      <w:proofErr w:type="spellEnd"/>
+      <w:r>
+        <w:rPr>
+          <w:rFonts w:ascii="Arial" w:hAnsi="Arial" w:cs="Arial"/>
+          <w:bCs/>
+        </w:rPr>
+        <w:t>}}</w:t>
       </w:r>
     </w:p>
     <w:p>
@@ -3732,7 +4419,23 @@
           <w:rFonts w:ascii="Arial" w:hAnsi="Arial" w:cs="Arial"/>
           <w:bCs/>
         </w:rPr>
-        <w:t>{{mappa_level}}</w:t>
+        <w:t>{{</w:t>
+      </w:r>
+      <w:proofErr w:type="spellStart"/>
+      <w:r>
+        <w:rPr>
+          <w:rFonts w:ascii="Arial" w:hAnsi="Arial" w:cs="Arial"/>
+          <w:bCs/>
+        </w:rPr>
+        <w:t>mappa_level</w:t>
+      </w:r>
+      <w:proofErr w:type="spellEnd"/>
+      <w:r>
+        <w:rPr>
+          <w:rFonts w:ascii="Arial" w:hAnsi="Arial" w:cs="Arial"/>
+          <w:bCs/>
+        </w:rPr>
+        <w:t>}}</w:t>
       </w:r>
     </w:p>
     <w:p>
@@ -3792,7 +4495,23 @@
           <w:rFonts w:ascii="Arial" w:hAnsi="Arial" w:cs="Arial"/>
           <w:bCs/>
         </w:rPr>
-        <w:t>{{risk_to_public}}</w:t>
+        <w:t>{{</w:t>
+      </w:r>
+      <w:proofErr w:type="spellStart"/>
+      <w:r>
+        <w:rPr>
+          <w:rFonts w:ascii="Arial" w:hAnsi="Arial" w:cs="Arial"/>
+          <w:bCs/>
+        </w:rPr>
+        <w:t>risk_to_public</w:t>
+      </w:r>
+      <w:proofErr w:type="spellEnd"/>
+      <w:r>
+        <w:rPr>
+          <w:rFonts w:ascii="Arial" w:hAnsi="Arial" w:cs="Arial"/>
+          <w:bCs/>
+        </w:rPr>
+        <w:t>}}</w:t>
       </w:r>
     </w:p>
     <w:p>
@@ -3831,7 +4550,23 @@
           <w:rFonts w:ascii="Arial" w:hAnsi="Arial" w:cs="Arial"/>
           <w:bCs/>
         </w:rPr>
-        <w:t>{{risk_to_known_adult}}</w:t>
+        <w:t>{{</w:t>
+      </w:r>
+      <w:proofErr w:type="spellStart"/>
+      <w:r>
+        <w:rPr>
+          <w:rFonts w:ascii="Arial" w:hAnsi="Arial" w:cs="Arial"/>
+          <w:bCs/>
+        </w:rPr>
+        <w:t>risk_to_known_adult</w:t>
+      </w:r>
+      <w:proofErr w:type="spellEnd"/>
+      <w:r>
+        <w:rPr>
+          <w:rFonts w:ascii="Arial" w:hAnsi="Arial" w:cs="Arial"/>
+          <w:bCs/>
+        </w:rPr>
+        <w:t>}}</w:t>
       </w:r>
       <w:r>
         <w:tab/>
@@ -3877,7 +4612,23 @@
           <w:rFonts w:ascii="Arial" w:hAnsi="Arial" w:cs="Arial"/>
           <w:bCs/>
         </w:rPr>
-        <w:t>{{risk_to_children}}</w:t>
+        <w:t>{{</w:t>
+      </w:r>
+      <w:proofErr w:type="spellStart"/>
+      <w:r>
+        <w:rPr>
+          <w:rFonts w:ascii="Arial" w:hAnsi="Arial" w:cs="Arial"/>
+          <w:bCs/>
+        </w:rPr>
+        <w:t>risk_to_children</w:t>
+      </w:r>
+      <w:proofErr w:type="spellEnd"/>
+      <w:r>
+        <w:rPr>
+          <w:rFonts w:ascii="Arial" w:hAnsi="Arial" w:cs="Arial"/>
+          <w:bCs/>
+        </w:rPr>
+        <w:t>}}</w:t>
       </w:r>
     </w:p>
     <w:p>
@@ -3920,7 +4671,23 @@
           <w:rFonts w:ascii="Arial" w:hAnsi="Arial" w:cs="Arial"/>
           <w:bCs/>
         </w:rPr>
-        <w:t>{{risk_to_prisoners}}</w:t>
+        <w:t>{{</w:t>
+      </w:r>
+      <w:proofErr w:type="spellStart"/>
+      <w:r>
+        <w:rPr>
+          <w:rFonts w:ascii="Arial" w:hAnsi="Arial" w:cs="Arial"/>
+          <w:bCs/>
+        </w:rPr>
+        <w:t>risk_to_prisoners</w:t>
+      </w:r>
+      <w:proofErr w:type="spellEnd"/>
+      <w:r>
+        <w:rPr>
+          <w:rFonts w:ascii="Arial" w:hAnsi="Arial" w:cs="Arial"/>
+          <w:bCs/>
+        </w:rPr>
+        <w:t>}}</w:t>
       </w:r>
     </w:p>
     <w:p>
@@ -3956,7 +4723,23 @@
           <w:rFonts w:ascii="Arial" w:hAnsi="Arial" w:cs="Arial"/>
           <w:bCs/>
         </w:rPr>
-        <w:t>{{risk_to_staff}}</w:t>
+        <w:t>{{</w:t>
+      </w:r>
+      <w:proofErr w:type="spellStart"/>
+      <w:r>
+        <w:rPr>
+          <w:rFonts w:ascii="Arial" w:hAnsi="Arial" w:cs="Arial"/>
+          <w:bCs/>
+        </w:rPr>
+        <w:t>risk_to_staff</w:t>
+      </w:r>
+      <w:proofErr w:type="spellEnd"/>
+      <w:r>
+        <w:rPr>
+          <w:rFonts w:ascii="Arial" w:hAnsi="Arial" w:cs="Arial"/>
+          <w:bCs/>
+        </w:rPr>
+        <w:t>}}</w:t>
       </w:r>
     </w:p>
     <w:p>
@@ -4037,7 +4820,23 @@
           <w:rFonts w:ascii="Arial" w:hAnsi="Arial" w:cs="Arial"/>
           <w:bCs/>
         </w:rPr>
-        <w:t>{{index_offence_details}}</w:t>
+        <w:t>{{</w:t>
+      </w:r>
+      <w:proofErr w:type="spellStart"/>
+      <w:r>
+        <w:rPr>
+          <w:rFonts w:ascii="Arial" w:hAnsi="Arial" w:cs="Arial"/>
+          <w:bCs/>
+        </w:rPr>
+        <w:t>index_offence_details</w:t>
+      </w:r>
+      <w:proofErr w:type="spellEnd"/>
+      <w:r>
+        <w:rPr>
+          <w:rFonts w:ascii="Arial" w:hAnsi="Arial" w:cs="Arial"/>
+          <w:bCs/>
+        </w:rPr>
+        <w:t>}}</w:t>
       </w:r>
     </w:p>
     <w:p>
@@ -4150,7 +4949,27 @@
                 <w:sz w:val="22"/>
                 <w:szCs w:val="22"/>
               </w:rPr>
-              <w:t>{{good_behaviour_condition}}</w:t>
+              <w:t>{{</w:t>
+            </w:r>
+            <w:proofErr w:type="spellStart"/>
+            <w:r>
+              <w:rPr>
+                <w:rFonts w:ascii="Arial" w:hAnsi="Arial" w:cs="Arial"/>
+                <w:bCs/>
+                <w:sz w:val="22"/>
+                <w:szCs w:val="22"/>
+              </w:rPr>
+              <w:t>good_behaviour_condition</w:t>
+            </w:r>
+            <w:proofErr w:type="spellEnd"/>
+            <w:r>
+              <w:rPr>
+                <w:rFonts w:ascii="Arial" w:hAnsi="Arial" w:cs="Arial"/>
+                <w:bCs/>
+                <w:sz w:val="22"/>
+                <w:szCs w:val="22"/>
+              </w:rPr>
+              <w:t>}}</w:t>
             </w:r>
             <w:r>
               <w:rPr>
@@ -4195,7 +5014,27 @@
                 <w:sz w:val="22"/>
                 <w:szCs w:val="22"/>
               </w:rPr>
-              <w:t xml:space="preserve">{{no_offence_condition}} </w:t>
+              <w:t>{{</w:t>
+            </w:r>
+            <w:proofErr w:type="spellStart"/>
+            <w:r>
+              <w:rPr>
+                <w:rFonts w:ascii="Arial" w:hAnsi="Arial" w:cs="Arial"/>
+                <w:bCs/>
+                <w:sz w:val="22"/>
+                <w:szCs w:val="22"/>
+              </w:rPr>
+              <w:t>no_offence_condition</w:t>
+            </w:r>
+            <w:proofErr w:type="spellEnd"/>
+            <w:r>
+              <w:rPr>
+                <w:rFonts w:ascii="Arial" w:hAnsi="Arial" w:cs="Arial"/>
+                <w:bCs/>
+                <w:sz w:val="22"/>
+                <w:szCs w:val="22"/>
+              </w:rPr>
+              <w:t xml:space="preserve">}} </w:t>
             </w:r>
             <w:r>
               <w:rPr>
@@ -4230,7 +5069,27 @@
                 <w:sz w:val="22"/>
                 <w:szCs w:val="22"/>
               </w:rPr>
-              <w:t xml:space="preserve">{{keep_in_touch_condition}} </w:t>
+              <w:t>{{</w:t>
+            </w:r>
+            <w:proofErr w:type="spellStart"/>
+            <w:r>
+              <w:rPr>
+                <w:rFonts w:ascii="Arial" w:hAnsi="Arial" w:cs="Arial"/>
+                <w:bCs/>
+                <w:sz w:val="22"/>
+                <w:szCs w:val="22"/>
+              </w:rPr>
+              <w:t>keep_in_touch_condition</w:t>
+            </w:r>
+            <w:proofErr w:type="spellEnd"/>
+            <w:r>
+              <w:rPr>
+                <w:rFonts w:ascii="Arial" w:hAnsi="Arial" w:cs="Arial"/>
+                <w:bCs/>
+                <w:sz w:val="22"/>
+                <w:szCs w:val="22"/>
+              </w:rPr>
+              <w:t xml:space="preserve">}} </w:t>
             </w:r>
             <w:r>
               <w:rPr>
@@ -4265,7 +5124,27 @@
                 <w:sz w:val="22"/>
                 <w:szCs w:val="22"/>
               </w:rPr>
-              <w:t xml:space="preserve">{{officer_visit_condition}} </w:t>
+              <w:t>{{</w:t>
+            </w:r>
+            <w:proofErr w:type="spellStart"/>
+            <w:r>
+              <w:rPr>
+                <w:rFonts w:ascii="Arial" w:hAnsi="Arial" w:cs="Arial"/>
+                <w:bCs/>
+                <w:sz w:val="22"/>
+                <w:szCs w:val="22"/>
+              </w:rPr>
+              <w:t>officer_visit_condition</w:t>
+            </w:r>
+            <w:proofErr w:type="spellEnd"/>
+            <w:r>
+              <w:rPr>
+                <w:rFonts w:ascii="Arial" w:hAnsi="Arial" w:cs="Arial"/>
+                <w:bCs/>
+                <w:sz w:val="22"/>
+                <w:szCs w:val="22"/>
+              </w:rPr>
+              <w:t xml:space="preserve">}} </w:t>
             </w:r>
             <w:r>
               <w:rPr>
@@ -4300,7 +5179,27 @@
                 <w:sz w:val="22"/>
                 <w:szCs w:val="22"/>
               </w:rPr>
-              <w:t xml:space="preserve">{{address_approved_condition}} </w:t>
+              <w:t>{{</w:t>
+            </w:r>
+            <w:proofErr w:type="spellStart"/>
+            <w:r>
+              <w:rPr>
+                <w:rFonts w:ascii="Arial" w:hAnsi="Arial" w:cs="Arial"/>
+                <w:bCs/>
+                <w:sz w:val="22"/>
+                <w:szCs w:val="22"/>
+              </w:rPr>
+              <w:t>address_approved_condition</w:t>
+            </w:r>
+            <w:proofErr w:type="spellEnd"/>
+            <w:r>
+              <w:rPr>
+                <w:rFonts w:ascii="Arial" w:hAnsi="Arial" w:cs="Arial"/>
+                <w:bCs/>
+                <w:sz w:val="22"/>
+                <w:szCs w:val="22"/>
+              </w:rPr>
+              <w:t xml:space="preserve">}} </w:t>
             </w:r>
             <w:r>
               <w:rPr>
@@ -4345,7 +5244,27 @@
                 <w:szCs w:val="22"/>
               </w:rPr>
               <w:lastRenderedPageBreak/>
-              <w:t xml:space="preserve">{{no_work_undertaken_condition}} </w:t>
+              <w:t>{{</w:t>
+            </w:r>
+            <w:proofErr w:type="spellStart"/>
+            <w:r>
+              <w:rPr>
+                <w:rFonts w:ascii="Arial" w:hAnsi="Arial" w:cs="Arial"/>
+                <w:bCs/>
+                <w:sz w:val="22"/>
+                <w:szCs w:val="22"/>
+              </w:rPr>
+              <w:t>no_work_undertaken_condition</w:t>
+            </w:r>
+            <w:proofErr w:type="spellEnd"/>
+            <w:r>
+              <w:rPr>
+                <w:rFonts w:ascii="Arial" w:hAnsi="Arial" w:cs="Arial"/>
+                <w:bCs/>
+                <w:sz w:val="22"/>
+                <w:szCs w:val="22"/>
+              </w:rPr>
+              <w:t xml:space="preserve">}} </w:t>
             </w:r>
             <w:r>
               <w:rPr>
@@ -4380,7 +5299,27 @@
                 <w:sz w:val="22"/>
                 <w:szCs w:val="22"/>
               </w:rPr>
-              <w:t>{{no_travel_condition}}</w:t>
+              <w:t>{{</w:t>
+            </w:r>
+            <w:proofErr w:type="spellStart"/>
+            <w:r>
+              <w:rPr>
+                <w:rFonts w:ascii="Arial" w:hAnsi="Arial" w:cs="Arial"/>
+                <w:bCs/>
+                <w:sz w:val="22"/>
+                <w:szCs w:val="22"/>
+              </w:rPr>
+              <w:t>no_travel_condition</w:t>
+            </w:r>
+            <w:proofErr w:type="spellEnd"/>
+            <w:r>
+              <w:rPr>
+                <w:rFonts w:ascii="Arial" w:hAnsi="Arial" w:cs="Arial"/>
+                <w:bCs/>
+                <w:sz w:val="22"/>
+                <w:szCs w:val="22"/>
+              </w:rPr>
+              <w:t>}}</w:t>
             </w:r>
             <w:r>
               <w:rPr>
@@ -4426,7 +5365,27 @@
                 <w:sz w:val="22"/>
                 <w:szCs w:val="22"/>
               </w:rPr>
-              <w:t>{{other_name_known_by}}</w:t>
+              <w:t>{{</w:t>
+            </w:r>
+            <w:proofErr w:type="spellStart"/>
+            <w:r>
+              <w:rPr>
+                <w:rFonts w:ascii="Arial" w:hAnsi="Arial" w:cs="Arial"/>
+                <w:bCs/>
+                <w:sz w:val="22"/>
+                <w:szCs w:val="22"/>
+              </w:rPr>
+              <w:t>other_name_known_by</w:t>
+            </w:r>
+            <w:proofErr w:type="spellEnd"/>
+            <w:r>
+              <w:rPr>
+                <w:rFonts w:ascii="Arial" w:hAnsi="Arial" w:cs="Arial"/>
+                <w:bCs/>
+                <w:sz w:val="22"/>
+                <w:szCs w:val="22"/>
+              </w:rPr>
+              <w:t>}}</w:t>
             </w:r>
             <w:r>
               <w:rPr>
@@ -4483,7 +5442,27 @@
                 <w:sz w:val="22"/>
                 <w:szCs w:val="22"/>
               </w:rPr>
-              <w:t>{{contact_details_changed}}</w:t>
+              <w:t>{{</w:t>
+            </w:r>
+            <w:proofErr w:type="spellStart"/>
+            <w:r>
+              <w:rPr>
+                <w:rFonts w:ascii="Arial" w:hAnsi="Arial" w:cs="Arial"/>
+                <w:bCs/>
+                <w:sz w:val="22"/>
+                <w:szCs w:val="22"/>
+              </w:rPr>
+              <w:t>contact_details_changed</w:t>
+            </w:r>
+            <w:proofErr w:type="spellEnd"/>
+            <w:r>
+              <w:rPr>
+                <w:rFonts w:ascii="Arial" w:hAnsi="Arial" w:cs="Arial"/>
+                <w:bCs/>
+                <w:sz w:val="22"/>
+                <w:szCs w:val="22"/>
+              </w:rPr>
+              <w:t>}}</w:t>
             </w:r>
             <w:r>
               <w:rPr>
@@ -4606,7 +5585,23 @@
           <w:rFonts w:ascii="Arial" w:hAnsi="Arial" w:cs="Arial"/>
           <w:bCs/>
         </w:rPr>
-        <w:t>{{additional_conditions_breached}}</w:t>
+        <w:t>{{</w:t>
+      </w:r>
+      <w:proofErr w:type="spellStart"/>
+      <w:r>
+        <w:rPr>
+          <w:rFonts w:ascii="Arial" w:hAnsi="Arial" w:cs="Arial"/>
+          <w:bCs/>
+        </w:rPr>
+        <w:t>additional_conditions_breached</w:t>
+      </w:r>
+      <w:proofErr w:type="spellEnd"/>
+      <w:r>
+        <w:rPr>
+          <w:rFonts w:ascii="Arial" w:hAnsi="Arial" w:cs="Arial"/>
+          <w:bCs/>
+        </w:rPr>
+        <w:t>}}</w:t>
       </w:r>
     </w:p>
     <w:p>
@@ -4760,7 +5755,23 @@
           <w:rFonts w:ascii="Arial" w:hAnsi="Arial" w:cs="Arial"/>
           <w:bCs/>
         </w:rPr>
-        <w:t>{{what_led_to_recall}}</w:t>
+        <w:t>{{</w:t>
+      </w:r>
+      <w:proofErr w:type="spellStart"/>
+      <w:r>
+        <w:rPr>
+          <w:rFonts w:ascii="Arial" w:hAnsi="Arial" w:cs="Arial"/>
+          <w:bCs/>
+        </w:rPr>
+        <w:t>what_led_to_recall</w:t>
+      </w:r>
+      <w:proofErr w:type="spellEnd"/>
+      <w:r>
+        <w:rPr>
+          <w:rFonts w:ascii="Arial" w:hAnsi="Arial" w:cs="Arial"/>
+          <w:bCs/>
+        </w:rPr>
+        <w:t>}}</w:t>
       </w:r>
     </w:p>
     <w:tbl>
@@ -5015,7 +6026,27 @@
                 <w:sz w:val="22"/>
                 <w:szCs w:val="22"/>
               </w:rPr>
-              <w:t>{{warning_letter_details}}</w:t>
+              <w:t>{{</w:t>
+            </w:r>
+            <w:proofErr w:type="spellStart"/>
+            <w:r>
+              <w:rPr>
+                <w:rFonts w:ascii="Arial" w:hAnsi="Arial" w:cs="Arial"/>
+                <w:bCs/>
+                <w:sz w:val="22"/>
+                <w:szCs w:val="22"/>
+              </w:rPr>
+              <w:t>warning_letter_details</w:t>
+            </w:r>
+            <w:proofErr w:type="spellEnd"/>
+            <w:r>
+              <w:rPr>
+                <w:rFonts w:ascii="Arial" w:hAnsi="Arial" w:cs="Arial"/>
+                <w:bCs/>
+                <w:sz w:val="22"/>
+                <w:szCs w:val="22"/>
+              </w:rPr>
+              <w:t>}}</w:t>
             </w:r>
           </w:p>
         </w:tc>
@@ -5072,7 +6103,27 @@
                 <w:sz w:val="22"/>
                 <w:szCs w:val="22"/>
               </w:rPr>
-              <w:t>{{increased_frequency_details}}</w:t>
+              <w:t>{{</w:t>
+            </w:r>
+            <w:proofErr w:type="spellStart"/>
+            <w:r>
+              <w:rPr>
+                <w:rFonts w:ascii="Arial" w:hAnsi="Arial" w:cs="Arial"/>
+                <w:bCs/>
+                <w:sz w:val="22"/>
+                <w:szCs w:val="22"/>
+              </w:rPr>
+              <w:t>increased_frequency_details</w:t>
+            </w:r>
+            <w:proofErr w:type="spellEnd"/>
+            <w:r>
+              <w:rPr>
+                <w:rFonts w:ascii="Arial" w:hAnsi="Arial" w:cs="Arial"/>
+                <w:bCs/>
+                <w:sz w:val="22"/>
+                <w:szCs w:val="22"/>
+              </w:rPr>
+              <w:t>}}</w:t>
             </w:r>
           </w:p>
         </w:tc>
@@ -5129,7 +6180,27 @@
                 <w:sz w:val="22"/>
                 <w:szCs w:val="22"/>
               </w:rPr>
-              <w:t>{{extra_licence_conditions_details}}</w:t>
+              <w:t>{{</w:t>
+            </w:r>
+            <w:proofErr w:type="spellStart"/>
+            <w:r>
+              <w:rPr>
+                <w:rFonts w:ascii="Arial" w:hAnsi="Arial" w:cs="Arial"/>
+                <w:bCs/>
+                <w:sz w:val="22"/>
+                <w:szCs w:val="22"/>
+              </w:rPr>
+              <w:t>extra_licence_conditions_details</w:t>
+            </w:r>
+            <w:proofErr w:type="spellEnd"/>
+            <w:r>
+              <w:rPr>
+                <w:rFonts w:ascii="Arial" w:hAnsi="Arial" w:cs="Arial"/>
+                <w:bCs/>
+                <w:sz w:val="22"/>
+                <w:szCs w:val="22"/>
+              </w:rPr>
+              <w:t>}}</w:t>
             </w:r>
           </w:p>
         </w:tc>
@@ -5186,7 +6257,27 @@
                 <w:sz w:val="22"/>
                 <w:szCs w:val="22"/>
               </w:rPr>
-              <w:t>{{referral_to_other_teams_details}}</w:t>
+              <w:t>{{</w:t>
+            </w:r>
+            <w:proofErr w:type="spellStart"/>
+            <w:r>
+              <w:rPr>
+                <w:rFonts w:ascii="Arial" w:hAnsi="Arial" w:cs="Arial"/>
+                <w:bCs/>
+                <w:sz w:val="22"/>
+                <w:szCs w:val="22"/>
+              </w:rPr>
+              <w:t>referral_to_other_teams_details</w:t>
+            </w:r>
+            <w:proofErr w:type="spellEnd"/>
+            <w:r>
+              <w:rPr>
+                <w:rFonts w:ascii="Arial" w:hAnsi="Arial" w:cs="Arial"/>
+                <w:bCs/>
+                <w:sz w:val="22"/>
+                <w:szCs w:val="22"/>
+              </w:rPr>
+              <w:t>}}</w:t>
             </w:r>
           </w:p>
         </w:tc>
@@ -5243,7 +6334,27 @@
                 <w:sz w:val="22"/>
                 <w:szCs w:val="22"/>
               </w:rPr>
-              <w:t>{{referral_to_partnership_agencies_details}}</w:t>
+              <w:t>{{</w:t>
+            </w:r>
+            <w:proofErr w:type="spellStart"/>
+            <w:r>
+              <w:rPr>
+                <w:rFonts w:ascii="Arial" w:hAnsi="Arial" w:cs="Arial"/>
+                <w:bCs/>
+                <w:sz w:val="22"/>
+                <w:szCs w:val="22"/>
+              </w:rPr>
+              <w:t>referral_to_partnership_agencies_details</w:t>
+            </w:r>
+            <w:proofErr w:type="spellEnd"/>
+            <w:r>
+              <w:rPr>
+                <w:rFonts w:ascii="Arial" w:hAnsi="Arial" w:cs="Arial"/>
+                <w:bCs/>
+                <w:sz w:val="22"/>
+                <w:szCs w:val="22"/>
+              </w:rPr>
+              <w:t>}}</w:t>
             </w:r>
           </w:p>
         </w:tc>
@@ -5300,7 +6411,27 @@
                 <w:sz w:val="22"/>
                 <w:szCs w:val="22"/>
               </w:rPr>
-              <w:t>{{referral_to_approved_premises_details}}</w:t>
+              <w:t>{{</w:t>
+            </w:r>
+            <w:proofErr w:type="spellStart"/>
+            <w:r>
+              <w:rPr>
+                <w:rFonts w:ascii="Arial" w:hAnsi="Arial" w:cs="Arial"/>
+                <w:bCs/>
+                <w:sz w:val="22"/>
+                <w:szCs w:val="22"/>
+              </w:rPr>
+              <w:t>referral_to_approved_premises_details</w:t>
+            </w:r>
+            <w:proofErr w:type="spellEnd"/>
+            <w:r>
+              <w:rPr>
+                <w:rFonts w:ascii="Arial" w:hAnsi="Arial" w:cs="Arial"/>
+                <w:bCs/>
+                <w:sz w:val="22"/>
+                <w:szCs w:val="22"/>
+              </w:rPr>
+              <w:t>}}</w:t>
             </w:r>
           </w:p>
         </w:tc>
@@ -5357,7 +6488,27 @@
                 <w:sz w:val="22"/>
                 <w:szCs w:val="22"/>
               </w:rPr>
-              <w:t>{{drug_testing_details}}</w:t>
+              <w:t>{{</w:t>
+            </w:r>
+            <w:proofErr w:type="spellStart"/>
+            <w:r>
+              <w:rPr>
+                <w:rFonts w:ascii="Arial" w:hAnsi="Arial" w:cs="Arial"/>
+                <w:bCs/>
+                <w:sz w:val="22"/>
+                <w:szCs w:val="22"/>
+              </w:rPr>
+              <w:t>drug_testing_details</w:t>
+            </w:r>
+            <w:proofErr w:type="spellEnd"/>
+            <w:r>
+              <w:rPr>
+                <w:rFonts w:ascii="Arial" w:hAnsi="Arial" w:cs="Arial"/>
+                <w:bCs/>
+                <w:sz w:val="22"/>
+                <w:szCs w:val="22"/>
+              </w:rPr>
+              <w:t>}}</w:t>
             </w:r>
           </w:p>
         </w:tc>
@@ -5414,7 +6565,27 @@
                 <w:sz w:val="22"/>
                 <w:szCs w:val="22"/>
               </w:rPr>
-              <w:t>{{alternative_to_recall_other_details}}</w:t>
+              <w:t>{{</w:t>
+            </w:r>
+            <w:proofErr w:type="spellStart"/>
+            <w:r>
+              <w:rPr>
+                <w:rFonts w:ascii="Arial" w:hAnsi="Arial" w:cs="Arial"/>
+                <w:bCs/>
+                <w:sz w:val="22"/>
+                <w:szCs w:val="22"/>
+              </w:rPr>
+              <w:t>alternative_to_recall_other_details</w:t>
+            </w:r>
+            <w:proofErr w:type="spellEnd"/>
+            <w:r>
+              <w:rPr>
+                <w:rFonts w:ascii="Arial" w:hAnsi="Arial" w:cs="Arial"/>
+                <w:bCs/>
+                <w:sz w:val="22"/>
+                <w:szCs w:val="22"/>
+              </w:rPr>
+              <w:t>}}</w:t>
             </w:r>
           </w:p>
         </w:tc>
@@ -5565,7 +6736,23 @@
           <w:rFonts w:ascii="Arial" w:hAnsi="Arial" w:cs="Arial"/>
           <w:bCs/>
         </w:rPr>
-        <w:t>{{recall_type}}</w:t>
+        <w:t>{{</w:t>
+      </w:r>
+      <w:proofErr w:type="spellStart"/>
+      <w:r>
+        <w:rPr>
+          <w:rFonts w:ascii="Arial" w:hAnsi="Arial" w:cs="Arial"/>
+          <w:bCs/>
+        </w:rPr>
+        <w:t>recall_type</w:t>
+      </w:r>
+      <w:proofErr w:type="spellEnd"/>
+      <w:r>
+        <w:rPr>
+          <w:rFonts w:ascii="Arial" w:hAnsi="Arial" w:cs="Arial"/>
+          <w:bCs/>
+        </w:rPr>
+        <w:t>}}</w:t>
       </w:r>
       <w:r>
         <w:rPr>
@@ -5606,14 +6793,24 @@
           <w:rFonts w:ascii="Arial" w:hAnsi="Arial" w:cs="Arial"/>
           <w:bCs/>
         </w:rPr>
-        <w:t>{{recall_type_details}}</w:t>
-      </w:r>
-      <w:r>
-        <w:rPr>
-          <w:rFonts w:ascii="Arial" w:hAnsi="Arial" w:cs="Arial"/>
-          <w:b/>
-        </w:rPr>
-        <w:t xml:space="preserve">                          </w:t>
+        <w:t>{{</w:t>
+      </w:r>
+      <w:proofErr w:type="spellStart"/>
+      <w:r>
+        <w:rPr>
+          <w:rFonts w:ascii="Arial" w:hAnsi="Arial" w:cs="Arial"/>
+          <w:bCs/>
+        </w:rPr>
+        <w:t>recall_type_details</w:t>
+      </w:r>
+      <w:proofErr w:type="spellEnd"/>
+      <w:proofErr w:type="gramStart"/>
+      <w:r>
+        <w:rPr>
+          <w:rFonts w:ascii="Arial" w:hAnsi="Arial" w:cs="Arial"/>
+          <w:bCs/>
+        </w:rPr>
+        <w:t>}}</w:t>
       </w:r>
       <w:r>
         <w:rPr>
@@ -5622,6 +6819,21 @@
         </w:rPr>
         <w:t xml:space="preserve">   </w:t>
       </w:r>
+      <w:proofErr w:type="gramEnd"/>
+      <w:r>
+        <w:rPr>
+          <w:rFonts w:ascii="Arial" w:hAnsi="Arial" w:cs="Arial"/>
+          <w:b/>
+        </w:rPr>
+        <w:t xml:space="preserve">                       </w:t>
+      </w:r>
+      <w:r>
+        <w:rPr>
+          <w:rFonts w:ascii="Arial" w:hAnsi="Arial" w:cs="Arial"/>
+          <w:b/>
+        </w:rPr>
+        <w:t xml:space="preserve">   </w:t>
+      </w:r>
       <w:r>
         <w:rPr>
           <w:rFonts w:ascii="Arial" w:hAnsi="Arial" w:cs="Arial"/>
@@ -5753,7 +6965,23 @@
           <w:rFonts w:ascii="Arial" w:hAnsi="Arial" w:cs="Arial"/>
           <w:bCs/>
         </w:rPr>
-        <w:t>{{fixed_term_additional_licence_conditions}}</w:t>
+        <w:t>{{</w:t>
+      </w:r>
+      <w:proofErr w:type="spellStart"/>
+      <w:r>
+        <w:rPr>
+          <w:rFonts w:ascii="Arial" w:hAnsi="Arial" w:cs="Arial"/>
+          <w:bCs/>
+        </w:rPr>
+        <w:t>fixed_term_additional_licence_conditions</w:t>
+      </w:r>
+      <w:proofErr w:type="spellEnd"/>
+      <w:r>
+        <w:rPr>
+          <w:rFonts w:ascii="Arial" w:hAnsi="Arial" w:cs="Arial"/>
+          <w:bCs/>
+        </w:rPr>
+        <w:t>}}</w:t>
       </w:r>
     </w:p>
     <w:p>
@@ -5951,12 +7179,37 @@
           <w:rFonts w:ascii="Arial" w:hAnsi="Arial" w:cs="Arial"/>
         </w:rPr>
       </w:pPr>
-      <w:r>
-        <w:rPr>
-          <w:rFonts w:ascii="Arial" w:hAnsi="Arial" w:cs="Arial"/>
-          <w:b/>
-        </w:rPr>
-        <w:t>i) Has the offender exhibited behaviour similar to the circumstances surrounding the index offence</w:t>
+      <w:proofErr w:type="spellStart"/>
+      <w:r>
+        <w:rPr>
+          <w:rFonts w:ascii="Arial" w:hAnsi="Arial" w:cs="Arial"/>
+          <w:b/>
+        </w:rPr>
+        <w:t>i</w:t>
+      </w:r>
+      <w:proofErr w:type="spellEnd"/>
+      <w:r>
+        <w:rPr>
+          <w:rFonts w:ascii="Arial" w:hAnsi="Arial" w:cs="Arial"/>
+          <w:b/>
+        </w:rPr>
+        <w:t xml:space="preserve">) Has the offender exhibited behaviour </w:t>
+      </w:r>
+      <w:proofErr w:type="gramStart"/>
+      <w:r>
+        <w:rPr>
+          <w:rFonts w:ascii="Arial" w:hAnsi="Arial" w:cs="Arial"/>
+          <w:b/>
+        </w:rPr>
+        <w:t>similar to</w:t>
+      </w:r>
+      <w:proofErr w:type="gramEnd"/>
+      <w:r>
+        <w:rPr>
+          <w:rFonts w:ascii="Arial" w:hAnsi="Arial" w:cs="Arial"/>
+          <w:b/>
+        </w:rPr>
+        <w:t xml:space="preserve"> the circumstances surrounding the index offence</w:t>
       </w:r>
       <w:r>
         <w:rPr>
@@ -5977,7 +7230,23 @@
           <w:rFonts w:ascii="Arial" w:hAnsi="Arial" w:cs="Arial"/>
           <w:bCs/>
         </w:rPr>
-        <w:t>{{behaviour_similar_to_index_offence_present}}</w:t>
+        <w:t>{{</w:t>
+      </w:r>
+      <w:proofErr w:type="spellStart"/>
+      <w:r>
+        <w:rPr>
+          <w:rFonts w:ascii="Arial" w:hAnsi="Arial" w:cs="Arial"/>
+          <w:bCs/>
+        </w:rPr>
+        <w:t>behaviour_similar_to_index_offence_present</w:t>
+      </w:r>
+      <w:proofErr w:type="spellEnd"/>
+      <w:r>
+        <w:rPr>
+          <w:rFonts w:ascii="Arial" w:hAnsi="Arial" w:cs="Arial"/>
+          <w:bCs/>
+        </w:rPr>
+        <w:t>}}</w:t>
       </w:r>
       <w:r>
         <w:rPr>
@@ -6012,7 +7281,23 @@
           <w:rFonts w:ascii="Arial" w:hAnsi="Arial" w:cs="Arial"/>
           <w:bCs/>
         </w:rPr>
-        <w:t>{{behaviour_similar_to_index_offence}}</w:t>
+        <w:t>{{</w:t>
+      </w:r>
+      <w:proofErr w:type="spellStart"/>
+      <w:r>
+        <w:rPr>
+          <w:rFonts w:ascii="Arial" w:hAnsi="Arial" w:cs="Arial"/>
+          <w:bCs/>
+        </w:rPr>
+        <w:t>behaviour_similar_to_index_offence</w:t>
+      </w:r>
+      <w:proofErr w:type="spellEnd"/>
+      <w:r>
+        <w:rPr>
+          <w:rFonts w:ascii="Arial" w:hAnsi="Arial" w:cs="Arial"/>
+          <w:bCs/>
+        </w:rPr>
+        <w:t>}}</w:t>
       </w:r>
     </w:p>
     <w:p>
@@ -6049,14 +7334,38 @@
           <w:rFonts w:ascii="Arial" w:hAnsi="Arial" w:cs="Arial"/>
           <w:b/>
         </w:rPr>
-        <w:t xml:space="preserve">ii) Has the offender exhibited behaviour likely to give rise, or does give rise to  a sexual or violent offence? </w:t>
-      </w:r>
-      <w:r>
-        <w:rPr>
-          <w:rFonts w:ascii="Arial" w:hAnsi="Arial" w:cs="Arial"/>
-          <w:bCs/>
-        </w:rPr>
-        <w:t>{{behaviour_</w:t>
+        <w:t xml:space="preserve">ii) Has the offender exhibited behaviour likely to give rise, or does give rise </w:t>
+      </w:r>
+      <w:proofErr w:type="gramStart"/>
+      <w:r>
+        <w:rPr>
+          <w:rFonts w:ascii="Arial" w:hAnsi="Arial" w:cs="Arial"/>
+          <w:b/>
+        </w:rPr>
+        <w:t>to  a</w:t>
+      </w:r>
+      <w:proofErr w:type="gramEnd"/>
+      <w:r>
+        <w:rPr>
+          <w:rFonts w:ascii="Arial" w:hAnsi="Arial" w:cs="Arial"/>
+          <w:b/>
+        </w:rPr>
+        <w:t xml:space="preserve"> sexual or violent offence? </w:t>
+      </w:r>
+      <w:r>
+        <w:rPr>
+          <w:rFonts w:ascii="Arial" w:hAnsi="Arial" w:cs="Arial"/>
+          <w:bCs/>
+        </w:rPr>
+        <w:t>{{</w:t>
+      </w:r>
+      <w:proofErr w:type="spellStart"/>
+      <w:r>
+        <w:rPr>
+          <w:rFonts w:ascii="Arial" w:hAnsi="Arial" w:cs="Arial"/>
+          <w:bCs/>
+        </w:rPr>
+        <w:t>behaviour_</w:t>
       </w:r>
       <w:r>
         <w:rPr>
@@ -6084,7 +7393,15 @@
           <w:rFonts w:ascii="Arial" w:hAnsi="Arial" w:cs="Arial"/>
           <w:bCs/>
         </w:rPr>
-        <w:t>_sexual_or_violent_offence_present}}</w:t>
+        <w:t>_sexual_or_violent_offence_present</w:t>
+      </w:r>
+      <w:proofErr w:type="spellEnd"/>
+      <w:r>
+        <w:rPr>
+          <w:rFonts w:ascii="Arial" w:hAnsi="Arial" w:cs="Arial"/>
+          <w:bCs/>
+        </w:rPr>
+        <w:t>}}</w:t>
       </w:r>
       <w:r>
         <w:rPr>
@@ -6114,6 +7431,7 @@
         </w:rPr>
         <w:t>{{</w:t>
       </w:r>
+      <w:proofErr w:type="spellStart"/>
       <w:r>
         <w:rPr>
           <w:rFonts w:ascii="Arial" w:hAnsi="Arial" w:cs="Arial"/>
@@ -6126,7 +7444,15 @@
           <w:rFonts w:ascii="Arial" w:hAnsi="Arial" w:cs="Arial"/>
           <w:bCs/>
         </w:rPr>
-        <w:t>_sexual_or_violent_offence}}</w:t>
+        <w:t>_sexual_or_violent_offence</w:t>
+      </w:r>
+      <w:proofErr w:type="spellEnd"/>
+      <w:r>
+        <w:rPr>
+          <w:rFonts w:ascii="Arial" w:hAnsi="Arial" w:cs="Arial"/>
+          <w:bCs/>
+        </w:rPr>
+        <w:t>}}</w:t>
       </w:r>
     </w:p>
     <w:p>
@@ -6184,7 +7510,23 @@
           <w:rFonts w:ascii="Arial" w:hAnsi="Arial" w:cs="Arial"/>
           <w:bCs/>
         </w:rPr>
-        <w:t>{{behaviour_leading_to_sexual_or_violent_offence_present}}</w:t>
+        <w:t>{{</w:t>
+      </w:r>
+      <w:proofErr w:type="spellStart"/>
+      <w:r>
+        <w:rPr>
+          <w:rFonts w:ascii="Arial" w:hAnsi="Arial" w:cs="Arial"/>
+          <w:bCs/>
+        </w:rPr>
+        <w:t>behaviour_leading_to_sexual_or_violent_offence_present</w:t>
+      </w:r>
+      <w:proofErr w:type="spellEnd"/>
+      <w:r>
+        <w:rPr>
+          <w:rFonts w:ascii="Arial" w:hAnsi="Arial" w:cs="Arial"/>
+          <w:bCs/>
+        </w:rPr>
+        <w:t>}}</w:t>
       </w:r>
       <w:r>
         <w:rPr>
@@ -6205,7 +7547,23 @@
           <w:rFonts w:ascii="Arial" w:hAnsi="Arial" w:cs="Arial"/>
           <w:bCs/>
         </w:rPr>
-        <w:t>{{behaviour_leading_to_sexual_or_violent_offence}}</w:t>
+        <w:t>{{</w:t>
+      </w:r>
+      <w:proofErr w:type="spellStart"/>
+      <w:r>
+        <w:rPr>
+          <w:rFonts w:ascii="Arial" w:hAnsi="Arial" w:cs="Arial"/>
+          <w:bCs/>
+        </w:rPr>
+        <w:t>behaviour_leading_to_sexual_or_violent_offence</w:t>
+      </w:r>
+      <w:proofErr w:type="spellEnd"/>
+      <w:r>
+        <w:rPr>
+          <w:rFonts w:ascii="Arial" w:hAnsi="Arial" w:cs="Arial"/>
+          <w:bCs/>
+        </w:rPr>
+        <w:t>}}</w:t>
       </w:r>
     </w:p>
     <w:p>
@@ -6250,7 +7608,24 @@
           <w:rFonts w:ascii="Arial" w:hAnsi="Arial" w:cs="Arial"/>
           <w:bCs/>
         </w:rPr>
-        <w:t>{{out_of_touch_present}}</w:t>
+        <w:t>{{</w:t>
+      </w:r>
+      <w:proofErr w:type="spellStart"/>
+      <w:r>
+        <w:rPr>
+          <w:rFonts w:ascii="Arial" w:hAnsi="Arial" w:cs="Arial"/>
+          <w:bCs/>
+        </w:rPr>
+        <w:t>out_of_touch_present</w:t>
+      </w:r>
+      <w:proofErr w:type="spellEnd"/>
+      <w:proofErr w:type="gramStart"/>
+      <w:r>
+        <w:rPr>
+          <w:rFonts w:ascii="Arial" w:hAnsi="Arial" w:cs="Arial"/>
+          <w:bCs/>
+        </w:rPr>
+        <w:t>}}</w:t>
       </w:r>
       <w:r>
         <w:rPr>
@@ -6264,14 +7639,38 @@
           <w:rFonts w:ascii="Arial" w:hAnsi="Arial" w:cs="Arial"/>
           <w:b/>
         </w:rPr>
-        <w:t xml:space="preserve"> Provide details: </w:t>
-      </w:r>
-      <w:r>
-        <w:rPr>
-          <w:rFonts w:ascii="Arial" w:hAnsi="Arial" w:cs="Arial"/>
-          <w:bCs/>
-        </w:rPr>
-        <w:t>{{out_of_touch}}</w:t>
+        <w:t xml:space="preserve"> Provide</w:t>
+      </w:r>
+      <w:proofErr w:type="gramEnd"/>
+      <w:r>
+        <w:rPr>
+          <w:rFonts w:ascii="Arial" w:hAnsi="Arial" w:cs="Arial"/>
+          <w:b/>
+        </w:rPr>
+        <w:t xml:space="preserve"> details: </w:t>
+      </w:r>
+      <w:r>
+        <w:rPr>
+          <w:rFonts w:ascii="Arial" w:hAnsi="Arial" w:cs="Arial"/>
+          <w:bCs/>
+        </w:rPr>
+        <w:t>{{</w:t>
+      </w:r>
+      <w:proofErr w:type="spellStart"/>
+      <w:r>
+        <w:rPr>
+          <w:rFonts w:ascii="Arial" w:hAnsi="Arial" w:cs="Arial"/>
+          <w:bCs/>
+        </w:rPr>
+        <w:t>out_of_touch</w:t>
+      </w:r>
+      <w:proofErr w:type="spellEnd"/>
+      <w:r>
+        <w:rPr>
+          <w:rFonts w:ascii="Arial" w:hAnsi="Arial" w:cs="Arial"/>
+          <w:bCs/>
+        </w:rPr>
+        <w:t>}}</w:t>
       </w:r>
       <w:r>
         <w:rPr>
@@ -6329,14 +7728,46 @@
           <w:rFonts w:ascii="Arial" w:hAnsi="Arial" w:cs="Arial"/>
           <w:b/>
         </w:rPr>
-        <w:t xml:space="preserve">be made that (i), (ii) or (iii) may arise? </w:t>
-      </w:r>
-      <w:r>
-        <w:rPr>
-          <w:rFonts w:ascii="Arial" w:hAnsi="Arial" w:cs="Arial"/>
-          <w:bCs/>
-        </w:rPr>
-        <w:t>{{out_of_touch}}</w:t>
+        <w:t>be made that (</w:t>
+      </w:r>
+      <w:proofErr w:type="spellStart"/>
+      <w:r>
+        <w:rPr>
+          <w:rFonts w:ascii="Arial" w:hAnsi="Arial" w:cs="Arial"/>
+          <w:b/>
+        </w:rPr>
+        <w:t>i</w:t>
+      </w:r>
+      <w:proofErr w:type="spellEnd"/>
+      <w:r>
+        <w:rPr>
+          <w:rFonts w:ascii="Arial" w:hAnsi="Arial" w:cs="Arial"/>
+          <w:b/>
+        </w:rPr>
+        <w:t xml:space="preserve">), (ii) or (iii) may arise? </w:t>
+      </w:r>
+      <w:r>
+        <w:rPr>
+          <w:rFonts w:ascii="Arial" w:hAnsi="Arial" w:cs="Arial"/>
+          <w:bCs/>
+        </w:rPr>
+        <w:t>{{</w:t>
+      </w:r>
+      <w:proofErr w:type="spellStart"/>
+      <w:r>
+        <w:rPr>
+          <w:rFonts w:ascii="Arial" w:hAnsi="Arial" w:cs="Arial"/>
+          <w:bCs/>
+        </w:rPr>
+        <w:t>out_of_touch</w:t>
+      </w:r>
+      <w:proofErr w:type="spellEnd"/>
+      <w:r>
+        <w:rPr>
+          <w:rFonts w:ascii="Arial" w:hAnsi="Arial" w:cs="Arial"/>
+          <w:bCs/>
+        </w:rPr>
+        <w:t>}}</w:t>
       </w:r>
     </w:p>
     <w:p>
@@ -6518,7 +7949,23 @@
           <w:rFonts w:ascii="Arial" w:hAnsi="Arial" w:cs="Arial"/>
           <w:bCs/>
         </w:rPr>
-        <w:t>{{practitioner_name}}</w:t>
+        <w:t>{{</w:t>
+      </w:r>
+      <w:proofErr w:type="spellStart"/>
+      <w:r>
+        <w:rPr>
+          <w:rFonts w:ascii="Arial" w:hAnsi="Arial" w:cs="Arial"/>
+          <w:bCs/>
+        </w:rPr>
+        <w:t>practitioner_name</w:t>
+      </w:r>
+      <w:proofErr w:type="spellEnd"/>
+      <w:r>
+        <w:rPr>
+          <w:rFonts w:ascii="Arial" w:hAnsi="Arial" w:cs="Arial"/>
+          <w:bCs/>
+        </w:rPr>
+        <w:t>}}</w:t>
       </w:r>
     </w:p>
     <w:p>
@@ -6549,7 +7996,23 @@
           <w:rFonts w:ascii="Arial" w:hAnsi="Arial" w:cs="Arial"/>
           <w:bCs/>
         </w:rPr>
-        <w:t>{{practitioner_telephone}}</w:t>
+        <w:t>{{</w:t>
+      </w:r>
+      <w:proofErr w:type="spellStart"/>
+      <w:r>
+        <w:rPr>
+          <w:rFonts w:ascii="Arial" w:hAnsi="Arial" w:cs="Arial"/>
+          <w:bCs/>
+        </w:rPr>
+        <w:t>practitioner_telephone</w:t>
+      </w:r>
+      <w:proofErr w:type="spellEnd"/>
+      <w:r>
+        <w:rPr>
+          <w:rFonts w:ascii="Arial" w:hAnsi="Arial" w:cs="Arial"/>
+          <w:bCs/>
+        </w:rPr>
+        <w:t>}}</w:t>
       </w:r>
     </w:p>
     <w:p>
@@ -6580,7 +8043,23 @@
           <w:rFonts w:ascii="Arial" w:hAnsi="Arial" w:cs="Arial"/>
           <w:bCs/>
         </w:rPr>
-        <w:t>{{practitioner_email}}</w:t>
+        <w:t>{{</w:t>
+      </w:r>
+      <w:proofErr w:type="spellStart"/>
+      <w:r>
+        <w:rPr>
+          <w:rFonts w:ascii="Arial" w:hAnsi="Arial" w:cs="Arial"/>
+          <w:bCs/>
+        </w:rPr>
+        <w:t>practitioner_email</w:t>
+      </w:r>
+      <w:proofErr w:type="spellEnd"/>
+      <w:r>
+        <w:rPr>
+          <w:rFonts w:ascii="Arial" w:hAnsi="Arial" w:cs="Arial"/>
+          <w:bCs/>
+        </w:rPr>
+        <w:t>}}</w:t>
       </w:r>
       <w:r>
         <w:rPr>
@@ -6631,7 +8110,23 @@
           <w:rFonts w:ascii="Arial" w:hAnsi="Arial" w:cs="Arial"/>
           <w:bCs/>
         </w:rPr>
-        <w:t>{{completed_by_name}}</w:t>
+        <w:t>{{</w:t>
+      </w:r>
+      <w:proofErr w:type="spellStart"/>
+      <w:r>
+        <w:rPr>
+          <w:rFonts w:ascii="Arial" w:hAnsi="Arial" w:cs="Arial"/>
+          <w:bCs/>
+        </w:rPr>
+        <w:t>completed_by_name</w:t>
+      </w:r>
+      <w:proofErr w:type="spellEnd"/>
+      <w:r>
+        <w:rPr>
+          <w:rFonts w:ascii="Arial" w:hAnsi="Arial" w:cs="Arial"/>
+          <w:bCs/>
+        </w:rPr>
+        <w:t>}}</w:t>
       </w:r>
     </w:p>
     <w:p>
@@ -6669,7 +8164,23 @@
           <w:rFonts w:ascii="Arial" w:hAnsi="Arial" w:cs="Arial"/>
           <w:bCs/>
         </w:rPr>
-        <w:t>{{completed_by_telephone}}</w:t>
+        <w:t>{{</w:t>
+      </w:r>
+      <w:proofErr w:type="spellStart"/>
+      <w:r>
+        <w:rPr>
+          <w:rFonts w:ascii="Arial" w:hAnsi="Arial" w:cs="Arial"/>
+          <w:bCs/>
+        </w:rPr>
+        <w:t>completed_by_telephone</w:t>
+      </w:r>
+      <w:proofErr w:type="spellEnd"/>
+      <w:r>
+        <w:rPr>
+          <w:rFonts w:ascii="Arial" w:hAnsi="Arial" w:cs="Arial"/>
+          <w:bCs/>
+        </w:rPr>
+        <w:t>}}</w:t>
       </w:r>
     </w:p>
     <w:p>
@@ -6707,7 +8218,23 @@
           <w:rFonts w:ascii="Arial" w:hAnsi="Arial" w:cs="Arial"/>
           <w:bCs/>
         </w:rPr>
-        <w:t>{{completed_by_email}}</w:t>
+        <w:t>{{</w:t>
+      </w:r>
+      <w:proofErr w:type="spellStart"/>
+      <w:r>
+        <w:rPr>
+          <w:rFonts w:ascii="Arial" w:hAnsi="Arial" w:cs="Arial"/>
+          <w:bCs/>
+        </w:rPr>
+        <w:t>completed_by_email</w:t>
+      </w:r>
+      <w:proofErr w:type="spellEnd"/>
+      <w:r>
+        <w:rPr>
+          <w:rFonts w:ascii="Arial" w:hAnsi="Arial" w:cs="Arial"/>
+          <w:bCs/>
+        </w:rPr>
+        <w:t>}}</w:t>
       </w:r>
     </w:p>
     <w:p>
@@ -6745,7 +8272,23 @@
           <w:rFonts w:ascii="Arial" w:hAnsi="Arial" w:cs="Arial"/>
           <w:bCs/>
         </w:rPr>
-        <w:t>{{completed_by_region}}</w:t>
+        <w:t>{{</w:t>
+      </w:r>
+      <w:proofErr w:type="spellStart"/>
+      <w:r>
+        <w:rPr>
+          <w:rFonts w:ascii="Arial" w:hAnsi="Arial" w:cs="Arial"/>
+          <w:bCs/>
+        </w:rPr>
+        <w:t>completed_by_region</w:t>
+      </w:r>
+      <w:proofErr w:type="spellEnd"/>
+      <w:r>
+        <w:rPr>
+          <w:rFonts w:ascii="Arial" w:hAnsi="Arial" w:cs="Arial"/>
+          <w:bCs/>
+        </w:rPr>
+        <w:t>}}</w:t>
       </w:r>
     </w:p>
     <w:p>
@@ -6800,7 +8343,23 @@
           <w:rFonts w:ascii="Arial" w:hAnsi="Arial" w:cs="Arial"/>
           <w:bCs/>
         </w:rPr>
-        <w:t>{{completed_by_local_delivery_unit}}</w:t>
+        <w:t>{{</w:t>
+      </w:r>
+      <w:proofErr w:type="spellStart"/>
+      <w:r>
+        <w:rPr>
+          <w:rFonts w:ascii="Arial" w:hAnsi="Arial" w:cs="Arial"/>
+          <w:bCs/>
+        </w:rPr>
+        <w:t>completed_by_local_delivery_unit</w:t>
+      </w:r>
+      <w:proofErr w:type="spellEnd"/>
+      <w:r>
+        <w:rPr>
+          <w:rFonts w:ascii="Arial" w:hAnsi="Arial" w:cs="Arial"/>
+          <w:bCs/>
+        </w:rPr>
+        <w:t>}}</w:t>
       </w:r>
     </w:p>
     <w:p>
@@ -6861,7 +8420,23 @@
           <w:rFonts w:ascii="Arial" w:hAnsi="Arial" w:cs="Arial"/>
           <w:bCs/>
         </w:rPr>
-        <w:t>{{completed_by_ppcs_query_emails}}</w:t>
+        <w:t>{{</w:t>
+      </w:r>
+      <w:proofErr w:type="spellStart"/>
+      <w:r>
+        <w:rPr>
+          <w:rFonts w:ascii="Arial" w:hAnsi="Arial" w:cs="Arial"/>
+          <w:bCs/>
+        </w:rPr>
+        <w:t>completed_by_ppcs_query_emails</w:t>
+      </w:r>
+      <w:proofErr w:type="spellEnd"/>
+      <w:r>
+        <w:rPr>
+          <w:rFonts w:ascii="Arial" w:hAnsi="Arial" w:cs="Arial"/>
+          <w:bCs/>
+        </w:rPr>
+        <w:t>}}</w:t>
       </w:r>
     </w:p>
     <w:p>
@@ -6899,7 +8474,23 @@
           <w:rFonts w:ascii="Arial" w:hAnsi="Arial" w:cs="Arial"/>
           <w:bCs/>
         </w:rPr>
-        <w:t>{{date_of_decision}}</w:t>
+        <w:t>{{</w:t>
+      </w:r>
+      <w:proofErr w:type="spellStart"/>
+      <w:r>
+        <w:rPr>
+          <w:rFonts w:ascii="Arial" w:hAnsi="Arial" w:cs="Arial"/>
+          <w:bCs/>
+        </w:rPr>
+        <w:t>date_of_decision</w:t>
+      </w:r>
+      <w:proofErr w:type="spellEnd"/>
+      <w:r>
+        <w:rPr>
+          <w:rFonts w:ascii="Arial" w:hAnsi="Arial" w:cs="Arial"/>
+          <w:bCs/>
+        </w:rPr>
+        <w:t>}}</w:t>
       </w:r>
     </w:p>
     <w:p>
@@ -6936,7 +8527,23 @@
           <w:rFonts w:ascii="Arial" w:hAnsi="Arial" w:cs="Arial"/>
           <w:bCs/>
         </w:rPr>
-        <w:t>{{time_of_decision}}</w:t>
+        <w:t>{{</w:t>
+      </w:r>
+      <w:proofErr w:type="spellStart"/>
+      <w:r>
+        <w:rPr>
+          <w:rFonts w:ascii="Arial" w:hAnsi="Arial" w:cs="Arial"/>
+          <w:bCs/>
+        </w:rPr>
+        <w:t>time_of_decision</w:t>
+      </w:r>
+      <w:proofErr w:type="spellEnd"/>
+      <w:r>
+        <w:rPr>
+          <w:rFonts w:ascii="Arial" w:hAnsi="Arial" w:cs="Arial"/>
+          <w:bCs/>
+        </w:rPr>
+        <w:t>}}</w:t>
       </w:r>
     </w:p>
     <w:p>
@@ -7048,7 +8655,23 @@
           <w:rFonts w:ascii="Arial" w:hAnsi="Arial" w:cs="Arial"/>
           <w:bCs/>
         </w:rPr>
-        <w:t>{{spo_countersign_complete}}</w:t>
+        <w:t>{{</w:t>
+      </w:r>
+      <w:proofErr w:type="spellStart"/>
+      <w:r>
+        <w:rPr>
+          <w:rFonts w:ascii="Arial" w:hAnsi="Arial" w:cs="Arial"/>
+          <w:bCs/>
+        </w:rPr>
+        <w:t>spo_countersign_complete</w:t>
+      </w:r>
+      <w:proofErr w:type="spellEnd"/>
+      <w:r>
+        <w:rPr>
+          <w:rFonts w:ascii="Arial" w:hAnsi="Arial" w:cs="Arial"/>
+          <w:bCs/>
+        </w:rPr>
+        <w:t>}}</w:t>
       </w:r>
       <w:r>
         <w:rPr>
@@ -7137,7 +8760,23 @@
           <w:rFonts w:ascii="Arial" w:hAnsi="Arial" w:cs="Arial"/>
           <w:bCs/>
         </w:rPr>
-        <w:t>{{spo_countersign_complete}}</w:t>
+        <w:t>{{</w:t>
+      </w:r>
+      <w:proofErr w:type="spellStart"/>
+      <w:r>
+        <w:rPr>
+          <w:rFonts w:ascii="Arial" w:hAnsi="Arial" w:cs="Arial"/>
+          <w:bCs/>
+        </w:rPr>
+        <w:t>spo_countersign_complete</w:t>
+      </w:r>
+      <w:proofErr w:type="spellEnd"/>
+      <w:r>
+        <w:rPr>
+          <w:rFonts w:ascii="Arial" w:hAnsi="Arial" w:cs="Arial"/>
+          <w:bCs/>
+        </w:rPr>
+        <w:t>}}</w:t>
       </w:r>
       <w:r>
         <w:rPr>
@@ -7178,7 +8817,23 @@
           <w:rFonts w:ascii="Arial" w:hAnsi="Arial" w:cs="Arial"/>
           <w:bCs/>
         </w:rPr>
-        <w:t>{{spo_countersign_complete}}</w:t>
+        <w:t>{{</w:t>
+      </w:r>
+      <w:proofErr w:type="spellStart"/>
+      <w:r>
+        <w:rPr>
+          <w:rFonts w:ascii="Arial" w:hAnsi="Arial" w:cs="Arial"/>
+          <w:bCs/>
+        </w:rPr>
+        <w:t>spo_countersign_complete</w:t>
+      </w:r>
+      <w:proofErr w:type="spellEnd"/>
+      <w:r>
+        <w:rPr>
+          <w:rFonts w:ascii="Arial" w:hAnsi="Arial" w:cs="Arial"/>
+          <w:bCs/>
+        </w:rPr>
+        <w:t>}}</w:t>
       </w:r>
       <w:r>
         <w:rPr>
@@ -7222,7 +8877,23 @@
           <w:rFonts w:ascii="Arial" w:hAnsi="Arial" w:cs="Arial"/>
           <w:bCs/>
         </w:rPr>
-        <w:t>{{spo_countersign_complete}}</w:t>
+        <w:t>{{</w:t>
+      </w:r>
+      <w:proofErr w:type="spellStart"/>
+      <w:r>
+        <w:rPr>
+          <w:rFonts w:ascii="Arial" w:hAnsi="Arial" w:cs="Arial"/>
+          <w:bCs/>
+        </w:rPr>
+        <w:t>spo_countersign_complete</w:t>
+      </w:r>
+      <w:proofErr w:type="spellEnd"/>
+      <w:r>
+        <w:rPr>
+          <w:rFonts w:ascii="Arial" w:hAnsi="Arial" w:cs="Arial"/>
+          <w:bCs/>
+        </w:rPr>
+        <w:t>}}</w:t>
       </w:r>
       <w:r>
         <w:rPr>
@@ -7263,7 +8934,23 @@
           <w:rFonts w:ascii="Arial" w:hAnsi="Arial" w:cs="Arial"/>
           <w:bCs/>
         </w:rPr>
-        <w:t>{{spo_countersign_complete}}</w:t>
+        <w:t>{{</w:t>
+      </w:r>
+      <w:proofErr w:type="spellStart"/>
+      <w:r>
+        <w:rPr>
+          <w:rFonts w:ascii="Arial" w:hAnsi="Arial" w:cs="Arial"/>
+          <w:bCs/>
+        </w:rPr>
+        <w:t>spo_countersign_complete</w:t>
+      </w:r>
+      <w:proofErr w:type="spellEnd"/>
+      <w:r>
+        <w:rPr>
+          <w:rFonts w:ascii="Arial" w:hAnsi="Arial" w:cs="Arial"/>
+          <w:bCs/>
+        </w:rPr>
+        <w:t>}}</w:t>
       </w:r>
       <w:r>
         <w:rPr>
@@ -7331,7 +9018,23 @@
           <w:rFonts w:ascii="Arial" w:hAnsi="Arial" w:cs="Arial"/>
           <w:bCs/>
         </w:rPr>
-        <w:t>{{countersign_spo_exposition}</w:t>
+        <w:t>{{</w:t>
+      </w:r>
+      <w:proofErr w:type="spellStart"/>
+      <w:r>
+        <w:rPr>
+          <w:rFonts w:ascii="Arial" w:hAnsi="Arial" w:cs="Arial"/>
+          <w:bCs/>
+        </w:rPr>
+        <w:t>countersign_spo_exposition</w:t>
+      </w:r>
+      <w:proofErr w:type="spellEnd"/>
+      <w:r>
+        <w:rPr>
+          <w:rFonts w:ascii="Arial" w:hAnsi="Arial" w:cs="Arial"/>
+          <w:bCs/>
+        </w:rPr>
+        <w:t>}</w:t>
       </w:r>
       <w:r>
         <w:rPr>
@@ -7370,7 +9073,23 @@
           <w:rFonts w:ascii="Arial" w:hAnsi="Arial" w:cs="Arial"/>
           <w:bCs/>
         </w:rPr>
-        <w:t>{{countersign_spo_name}}</w:t>
+        <w:t>{{</w:t>
+      </w:r>
+      <w:proofErr w:type="spellStart"/>
+      <w:r>
+        <w:rPr>
+          <w:rFonts w:ascii="Arial" w:hAnsi="Arial" w:cs="Arial"/>
+          <w:bCs/>
+        </w:rPr>
+        <w:t>countersign_spo_name</w:t>
+      </w:r>
+      <w:proofErr w:type="spellEnd"/>
+      <w:r>
+        <w:rPr>
+          <w:rFonts w:ascii="Arial" w:hAnsi="Arial" w:cs="Arial"/>
+          <w:bCs/>
+        </w:rPr>
+        <w:t>}}</w:t>
       </w:r>
     </w:p>
     <w:p>
@@ -7401,7 +9120,23 @@
           <w:rFonts w:ascii="Arial" w:hAnsi="Arial" w:cs="Arial"/>
           <w:bCs/>
         </w:rPr>
-        <w:t>{{countersign_spo_email}}</w:t>
+        <w:t>{{</w:t>
+      </w:r>
+      <w:proofErr w:type="spellStart"/>
+      <w:r>
+        <w:rPr>
+          <w:rFonts w:ascii="Arial" w:hAnsi="Arial" w:cs="Arial"/>
+          <w:bCs/>
+        </w:rPr>
+        <w:t>countersign_spo_email</w:t>
+      </w:r>
+      <w:proofErr w:type="spellEnd"/>
+      <w:r>
+        <w:rPr>
+          <w:rFonts w:ascii="Arial" w:hAnsi="Arial" w:cs="Arial"/>
+          <w:bCs/>
+        </w:rPr>
+        <w:t>}}</w:t>
       </w:r>
     </w:p>
     <w:p>
@@ -7439,7 +9174,23 @@
           <w:rFonts w:ascii="Arial" w:hAnsi="Arial" w:cs="Arial"/>
           <w:bCs/>
         </w:rPr>
-        <w:t>{{countersign_spo_telephone}}</w:t>
+        <w:t>{{</w:t>
+      </w:r>
+      <w:proofErr w:type="spellStart"/>
+      <w:r>
+        <w:rPr>
+          <w:rFonts w:ascii="Arial" w:hAnsi="Arial" w:cs="Arial"/>
+          <w:bCs/>
+        </w:rPr>
+        <w:t>countersign_spo_telephone</w:t>
+      </w:r>
+      <w:proofErr w:type="spellEnd"/>
+      <w:r>
+        <w:rPr>
+          <w:rFonts w:ascii="Arial" w:hAnsi="Arial" w:cs="Arial"/>
+          <w:bCs/>
+        </w:rPr>
+        <w:t>}}</w:t>
       </w:r>
     </w:p>
     <w:p>
@@ -7506,7 +9257,23 @@
           <w:rFonts w:ascii="Arial" w:hAnsi="Arial" w:cs="Arial"/>
           <w:bCs/>
         </w:rPr>
-        <w:t>{{date_of_decision}}</w:t>
+        <w:t>{{</w:t>
+      </w:r>
+      <w:proofErr w:type="spellStart"/>
+      <w:r>
+        <w:rPr>
+          <w:rFonts w:ascii="Arial" w:hAnsi="Arial" w:cs="Arial"/>
+          <w:bCs/>
+        </w:rPr>
+        <w:t>date_of_decision</w:t>
+      </w:r>
+      <w:proofErr w:type="spellEnd"/>
+      <w:r>
+        <w:rPr>
+          <w:rFonts w:ascii="Arial" w:hAnsi="Arial" w:cs="Arial"/>
+          <w:bCs/>
+        </w:rPr>
+        <w:t>}}</w:t>
       </w:r>
       <w:r>
         <w:rPr>
@@ -7520,7 +9287,23 @@
           <w:rFonts w:ascii="Arial" w:hAnsi="Arial" w:cs="Arial"/>
           <w:bCs/>
         </w:rPr>
-        <w:t>{{time_of_decision}}</w:t>
+        <w:t>{{</w:t>
+      </w:r>
+      <w:proofErr w:type="spellStart"/>
+      <w:r>
+        <w:rPr>
+          <w:rFonts w:ascii="Arial" w:hAnsi="Arial" w:cs="Arial"/>
+          <w:bCs/>
+        </w:rPr>
+        <w:t>time_of_decision</w:t>
+      </w:r>
+      <w:proofErr w:type="spellEnd"/>
+      <w:r>
+        <w:rPr>
+          <w:rFonts w:ascii="Arial" w:hAnsi="Arial" w:cs="Arial"/>
+          <w:bCs/>
+        </w:rPr>
+        <w:t>}}</w:t>
       </w:r>
     </w:p>
     <w:p>
@@ -7578,7 +9361,23 @@
           <w:rFonts w:ascii="Arial" w:hAnsi="Arial" w:cs="Arial"/>
           <w:bCs/>
         </w:rPr>
-        <w:t>{{countersign_spo_date}}</w:t>
+        <w:t>{{</w:t>
+      </w:r>
+      <w:proofErr w:type="spellStart"/>
+      <w:r>
+        <w:rPr>
+          <w:rFonts w:ascii="Arial" w:hAnsi="Arial" w:cs="Arial"/>
+          <w:bCs/>
+        </w:rPr>
+        <w:t>countersign_spo_date</w:t>
+      </w:r>
+      <w:proofErr w:type="spellEnd"/>
+      <w:r>
+        <w:rPr>
+          <w:rFonts w:ascii="Arial" w:hAnsi="Arial" w:cs="Arial"/>
+          <w:bCs/>
+        </w:rPr>
+        <w:t>}}</w:t>
       </w:r>
     </w:p>
     <w:p>
@@ -7632,7 +9431,23 @@
           <w:rFonts w:ascii="Arial" w:hAnsi="Arial" w:cs="Arial"/>
           <w:bCs/>
         </w:rPr>
-        <w:t>{{countersign_spo_time}}</w:t>
+        <w:t>{{</w:t>
+      </w:r>
+      <w:proofErr w:type="spellStart"/>
+      <w:r>
+        <w:rPr>
+          <w:rFonts w:ascii="Arial" w:hAnsi="Arial" w:cs="Arial"/>
+          <w:bCs/>
+        </w:rPr>
+        <w:t>countersign_spo_time</w:t>
+      </w:r>
+      <w:proofErr w:type="spellEnd"/>
+      <w:r>
+        <w:rPr>
+          <w:rFonts w:ascii="Arial" w:hAnsi="Arial" w:cs="Arial"/>
+          <w:bCs/>
+        </w:rPr>
+        <w:t>}}</w:t>
       </w:r>
     </w:p>
     <w:p>
@@ -7746,7 +9561,23 @@
           <w:rFonts w:ascii="Arial" w:hAnsi="Arial" w:cs="Arial"/>
           <w:bCs/>
         </w:rPr>
-        <w:t>{{aco_countersign_complete}}</w:t>
+        <w:t>{{</w:t>
+      </w:r>
+      <w:proofErr w:type="spellStart"/>
+      <w:r>
+        <w:rPr>
+          <w:rFonts w:ascii="Arial" w:hAnsi="Arial" w:cs="Arial"/>
+          <w:bCs/>
+        </w:rPr>
+        <w:t>aco_countersign_complete</w:t>
+      </w:r>
+      <w:proofErr w:type="spellEnd"/>
+      <w:r>
+        <w:rPr>
+          <w:rFonts w:ascii="Arial" w:hAnsi="Arial" w:cs="Arial"/>
+          <w:bCs/>
+        </w:rPr>
+        <w:t>}}</w:t>
       </w:r>
       <w:r>
         <w:rPr>
@@ -7872,7 +9703,23 @@
           <w:rFonts w:ascii="Arial" w:hAnsi="Arial" w:cs="Arial"/>
           <w:bCs/>
         </w:rPr>
-        <w:t>{{countersign_aco_exposition}}</w:t>
+        <w:t>{{</w:t>
+      </w:r>
+      <w:proofErr w:type="spellStart"/>
+      <w:r>
+        <w:rPr>
+          <w:rFonts w:ascii="Arial" w:hAnsi="Arial" w:cs="Arial"/>
+          <w:bCs/>
+        </w:rPr>
+        <w:t>countersign_aco_exposition</w:t>
+      </w:r>
+      <w:proofErr w:type="spellEnd"/>
+      <w:r>
+        <w:rPr>
+          <w:rFonts w:ascii="Arial" w:hAnsi="Arial" w:cs="Arial"/>
+          <w:bCs/>
+        </w:rPr>
+        <w:t>}}</w:t>
       </w:r>
     </w:p>
     <w:p>
@@ -7904,7 +9751,23 @@
           <w:rFonts w:ascii="Arial" w:hAnsi="Arial" w:cs="Arial"/>
           <w:bCs/>
         </w:rPr>
-        <w:t>{{countersign_aco_name}}</w:t>
+        <w:t>{{</w:t>
+      </w:r>
+      <w:proofErr w:type="spellStart"/>
+      <w:r>
+        <w:rPr>
+          <w:rFonts w:ascii="Arial" w:hAnsi="Arial" w:cs="Arial"/>
+          <w:bCs/>
+        </w:rPr>
+        <w:t>countersign_aco_name</w:t>
+      </w:r>
+      <w:proofErr w:type="spellEnd"/>
+      <w:r>
+        <w:rPr>
+          <w:rFonts w:ascii="Arial" w:hAnsi="Arial" w:cs="Arial"/>
+          <w:bCs/>
+        </w:rPr>
+        <w:t>}}</w:t>
       </w:r>
     </w:p>
     <w:p>
@@ -7936,7 +9799,23 @@
           <w:rFonts w:ascii="Arial" w:hAnsi="Arial" w:cs="Arial"/>
           <w:bCs/>
         </w:rPr>
-        <w:t>{{countersign_aco_telephone}}</w:t>
+        <w:t>{{</w:t>
+      </w:r>
+      <w:proofErr w:type="spellStart"/>
+      <w:r>
+        <w:rPr>
+          <w:rFonts w:ascii="Arial" w:hAnsi="Arial" w:cs="Arial"/>
+          <w:bCs/>
+        </w:rPr>
+        <w:t>countersign_aco_telephone</w:t>
+      </w:r>
+      <w:proofErr w:type="spellEnd"/>
+      <w:r>
+        <w:rPr>
+          <w:rFonts w:ascii="Arial" w:hAnsi="Arial" w:cs="Arial"/>
+          <w:bCs/>
+        </w:rPr>
+        <w:t>}}</w:t>
       </w:r>
     </w:p>
     <w:p>
@@ -7968,7 +9847,23 @@
           <w:rFonts w:ascii="Arial" w:hAnsi="Arial" w:cs="Arial"/>
           <w:bCs/>
         </w:rPr>
-        <w:t>{{countersign_aco_email}}</w:t>
+        <w:t>{{</w:t>
+      </w:r>
+      <w:proofErr w:type="spellStart"/>
+      <w:r>
+        <w:rPr>
+          <w:rFonts w:ascii="Arial" w:hAnsi="Arial" w:cs="Arial"/>
+          <w:bCs/>
+        </w:rPr>
+        <w:t>countersign_aco_email</w:t>
+      </w:r>
+      <w:proofErr w:type="spellEnd"/>
+      <w:r>
+        <w:rPr>
+          <w:rFonts w:ascii="Arial" w:hAnsi="Arial" w:cs="Arial"/>
+          <w:bCs/>
+        </w:rPr>
+        <w:t>}}</w:t>
       </w:r>
     </w:p>
     <w:p>
@@ -8000,7 +9895,23 @@
           <w:rFonts w:ascii="Arial" w:hAnsi="Arial" w:cs="Arial"/>
           <w:bCs/>
         </w:rPr>
-        <w:t>{{countersign_aco_date}}</w:t>
+        <w:t>{{</w:t>
+      </w:r>
+      <w:proofErr w:type="spellStart"/>
+      <w:r>
+        <w:rPr>
+          <w:rFonts w:ascii="Arial" w:hAnsi="Arial" w:cs="Arial"/>
+          <w:bCs/>
+        </w:rPr>
+        <w:t>countersign_aco_date</w:t>
+      </w:r>
+      <w:proofErr w:type="spellEnd"/>
+      <w:r>
+        <w:rPr>
+          <w:rFonts w:ascii="Arial" w:hAnsi="Arial" w:cs="Arial"/>
+          <w:bCs/>
+        </w:rPr>
+        <w:t>}}</w:t>
       </w:r>
     </w:p>
     <w:p>
@@ -8032,7 +9943,23 @@
           <w:rFonts w:ascii="Arial" w:hAnsi="Arial" w:cs="Arial"/>
           <w:bCs/>
         </w:rPr>
-        <w:t>{{countersign_aco_time}}</w:t>
+        <w:t>{{</w:t>
+      </w:r>
+      <w:proofErr w:type="spellStart"/>
+      <w:r>
+        <w:rPr>
+          <w:rFonts w:ascii="Arial" w:hAnsi="Arial" w:cs="Arial"/>
+          <w:bCs/>
+        </w:rPr>
+        <w:t>countersign_aco_time</w:t>
+      </w:r>
+      <w:proofErr w:type="spellEnd"/>
+      <w:r>
+        <w:rPr>
+          <w:rFonts w:ascii="Arial" w:hAnsi="Arial" w:cs="Arial"/>
+          <w:bCs/>
+        </w:rPr>
+        <w:t>}}</w:t>
       </w:r>
     </w:p>
     <w:p>
@@ -8063,7 +9990,23 @@
           <w:rFonts w:ascii="Arial" w:hAnsi="Arial" w:cs="Arial"/>
           <w:bCs/>
         </w:rPr>
-        <w:t>{{revocation_order_recipients}}</w:t>
+        <w:t>{{</w:t>
+      </w:r>
+      <w:proofErr w:type="spellStart"/>
+      <w:r>
+        <w:rPr>
+          <w:rFonts w:ascii="Arial" w:hAnsi="Arial" w:cs="Arial"/>
+          <w:bCs/>
+        </w:rPr>
+        <w:t>revocation_order_recipients</w:t>
+      </w:r>
+      <w:proofErr w:type="spellEnd"/>
+      <w:r>
+        <w:rPr>
+          <w:rFonts w:ascii="Arial" w:hAnsi="Arial" w:cs="Arial"/>
+          <w:bCs/>
+        </w:rPr>
+        <w:t>}}</w:t>
       </w:r>
     </w:p>
     <w:p>
@@ -16662,6 +18605,7 @@
     <w:rsid w:val="00E94FFF"/>
     <w:rsid w:val="00EA65B2"/>
     <w:rsid w:val="00EC55F3"/>
+    <w:rsid w:val="00EF3301"/>
     <w:rsid w:val="00F13F92"/>
     <w:rsid w:val="00F3680B"/>
     <w:rsid w:val="00F444B8"/>
@@ -17445,15 +19389,6 @@
 </file>
 
 <file path=customXml/item1.xml><?xml version="1.0" encoding="utf-8"?>
-<?mso-contentType ?>
-<FormTemplates xmlns="http://schemas.microsoft.com/sharepoint/v3/contenttype/forms">
-  <Display>DocumentLibraryForm</Display>
-  <Edit>DocumentLibraryForm</Edit>
-  <New>DocumentLibraryForm</New>
-</FormTemplates>
-</file>
-
-<file path=customXml/item2.xml><?xml version="1.0" encoding="utf-8"?>
 <ct:contentTypeSchema xmlns:ct="http://schemas.microsoft.com/office/2006/metadata/contentType" xmlns:ma="http://schemas.microsoft.com/office/2006/metadata/properties/metaAttributes" ct:_="" ma:_="" ma:contentTypeName="Document" ma:contentTypeID="0x010100BB15E224CEB19F4BA17DCD08B156C20E" ma:contentTypeVersion="14" ma:contentTypeDescription="Create a new document." ma:contentTypeScope="" ma:versionID="7cd304efa23d0061db26e2f05b6414b1">
   <xsd:schema xmlns:xsd="http://www.w3.org/2001/XMLSchema" xmlns:xs="http://www.w3.org/2001/XMLSchema" xmlns:p="http://schemas.microsoft.com/office/2006/metadata/properties" xmlns:ns2="2244256a-353e-4aaa-84de-68fbd58bc0b5" xmlns:ns3="461e5654-0e9a-4527-837d-fdc364c1f1ed" targetNamespace="http://schemas.microsoft.com/office/2006/metadata/properties" ma:root="true" ma:fieldsID="44df93feef4834377720eaaf16faf4fa" ns2:_="" ns3:_="">
     <xsd:import namespace="2244256a-353e-4aaa-84de-68fbd58bc0b5"/>
@@ -17666,7 +19601,20 @@
 </ct:contentTypeSchema>
 </file>
 
+<file path=customXml/item2.xml><?xml version="1.0" encoding="utf-8"?>
+<?mso-contentType ?>
+<FormTemplates xmlns="http://schemas.microsoft.com/sharepoint/v3/contenttype/forms">
+  <Display>DocumentLibraryForm</Display>
+  <Edit>DocumentLibraryForm</Edit>
+  <New>DocumentLibraryForm</New>
+</FormTemplates>
+</file>
+
 <file path=customXml/item3.xml><?xml version="1.0" encoding="utf-8"?>
+<b:Sources xmlns:b="http://schemas.openxmlformats.org/officeDocument/2006/bibliography" xmlns="http://schemas.openxmlformats.org/officeDocument/2006/bibliography" SelectedStyle="" StyleName="" Version="0"/>
+</file>
+
+<file path=customXml/item4.xml><?xml version="1.0" encoding="utf-8"?>
 <p:properties xmlns:p="http://schemas.microsoft.com/office/2006/metadata/properties" xmlns:xsi="http://www.w3.org/2001/XMLSchema-instance" xmlns:pc="http://schemas.microsoft.com/office/infopath/2007/PartnerControls">
   <documentManagement>
     <lcf76f155ced4ddcb4097134ff3c332f xmlns="2244256a-353e-4aaa-84de-68fbd58bc0b5">
@@ -17678,19 +19626,7 @@
 </p:properties>
 </file>
 
-<file path=customXml/item4.xml><?xml version="1.0" encoding="utf-8"?>
-<b:Sources xmlns:b="http://schemas.openxmlformats.org/officeDocument/2006/bibliography" xmlns="http://schemas.openxmlformats.org/officeDocument/2006/bibliography" SelectedStyle="" StyleName="" Version="0"/>
-</file>
-
 <file path=customXml/itemProps1.xml><?xml version="1.0" encoding="utf-8"?>
-<ds:datastoreItem xmlns:ds="http://schemas.openxmlformats.org/officeDocument/2006/customXml" ds:itemID="{9C893AAC-1781-44C1-940F-A467E506D9D1}">
-  <ds:schemaRefs>
-    <ds:schemaRef ds:uri="http://schemas.microsoft.com/sharepoint/v3/contenttype/forms"/>
-  </ds:schemaRefs>
-</ds:datastoreItem>
-</file>
-
-<file path=customXml/itemProps2.xml><?xml version="1.0" encoding="utf-8"?>
 <ds:datastoreItem xmlns:ds="http://schemas.openxmlformats.org/officeDocument/2006/customXml" ds:itemID="{79C448BA-7A2C-492D-9615-F080CE57201F}">
   <ds:schemaRefs>
     <ds:schemaRef ds:uri="http://schemas.microsoft.com/office/2006/metadata/contentType"/>
@@ -17709,7 +19645,23 @@
 </ds:datastoreItem>
 </file>
 
+<file path=customXml/itemProps2.xml><?xml version="1.0" encoding="utf-8"?>
+<ds:datastoreItem xmlns:ds="http://schemas.openxmlformats.org/officeDocument/2006/customXml" ds:itemID="{9C893AAC-1781-44C1-940F-A467E506D9D1}">
+  <ds:schemaRefs>
+    <ds:schemaRef ds:uri="http://schemas.microsoft.com/sharepoint/v3/contenttype/forms"/>
+  </ds:schemaRefs>
+</ds:datastoreItem>
+</file>
+
 <file path=customXml/itemProps3.xml><?xml version="1.0" encoding="utf-8"?>
+<ds:datastoreItem xmlns:ds="http://schemas.openxmlformats.org/officeDocument/2006/customXml" ds:itemID="{1AA002EC-9FAC-469B-886C-4AD0DF10DF17}">
+  <ds:schemaRefs>
+    <ds:schemaRef ds:uri="http://schemas.openxmlformats.org/officeDocument/2006/bibliography"/>
+  </ds:schemaRefs>
+</ds:datastoreItem>
+</file>
+
+<file path=customXml/itemProps4.xml><?xml version="1.0" encoding="utf-8"?>
 <ds:datastoreItem xmlns:ds="http://schemas.openxmlformats.org/officeDocument/2006/customXml" ds:itemID="{D6602E3C-70F5-412B-A646-0548AF3EB1F8}">
   <ds:schemaRefs>
     <ds:schemaRef ds:uri="http://schemas.microsoft.com/office/2006/metadata/properties"/>
@@ -17718,12 +19670,4 @@
     <ds:schemaRef ds:uri="461e5654-0e9a-4527-837d-fdc364c1f1ed"/>
   </ds:schemaRefs>
 </ds:datastoreItem>
-</file>
-
-<file path=customXml/itemProps4.xml><?xml version="1.0" encoding="utf-8"?>
-<ds:datastoreItem xmlns:ds="http://schemas.openxmlformats.org/officeDocument/2006/customXml" ds:itemID="{1AA002EC-9FAC-469B-886C-4AD0DF10DF17}">
-  <ds:schemaRefs>
-    <ds:schemaRef ds:uri="http://schemas.openxmlformats.org/officeDocument/2006/bibliography"/>
-  </ds:schemaRefs>
-</ds:datastoreItem>
 </file>
</xml_diff>